<commit_message>
chapter 2 of PFE
</commit_message>
<xml_diff>
--- a/PFE.docx
+++ b/PFE.docx
@@ -13,6 +13,7 @@
           <w:color w:val="000000" w:themeColor="text1"/>
           <w:sz w:val="2"/>
           <w:szCs w:val="2"/>
+          <w:lang w:val="en-US"/>
           <w14:shadow w14:blurRad="38100" w14:dist="19050" w14:dir="2700000" w14:sx="100000" w14:sy="100000" w14:kx="0" w14:ky="0" w14:algn="tl">
             <w14:schemeClr w14:val="dk1">
               <w14:alpha w14:val="60000"/>
@@ -34,6 +35,7 @@
           <w:color w:val="000000" w:themeColor="text1"/>
           <w:sz w:val="72"/>
           <w:szCs w:val="72"/>
+          <w:lang w:val="en-US"/>
           <w14:shadow w14:blurRad="38100" w14:dist="19050" w14:dir="2700000" w14:sx="100000" w14:sy="100000" w14:kx="0" w14:ky="0" w14:algn="tl">
             <w14:schemeClr w14:val="dk1">
               <w14:alpha w14:val="60000"/>
@@ -56,6 +58,7 @@
           <w:color w:val="000000" w:themeColor="text1"/>
           <w:sz w:val="72"/>
           <w:szCs w:val="72"/>
+          <w:lang w:val="en-US"/>
           <w14:shadow w14:blurRad="38100" w14:dist="19050" w14:dir="2700000" w14:sx="100000" w14:sy="100000" w14:kx="0" w14:ky="0" w14:algn="tl">
             <w14:schemeClr w14:val="dk1">
               <w14:alpha w14:val="60000"/>
@@ -81,6 +84,7 @@
           <w:color w:val="000000" w:themeColor="text1"/>
           <w:sz w:val="2"/>
           <w:szCs w:val="2"/>
+          <w:lang w:val="en-US"/>
           <w14:shadow w14:blurRad="38100" w14:dist="19050" w14:dir="2700000" w14:sx="100000" w14:sy="100000" w14:kx="0" w14:ky="0" w14:algn="tl">
             <w14:schemeClr w14:val="dk1">
               <w14:alpha w14:val="60000"/>
@@ -102,6 +106,7 @@
           <w:color w:val="000000" w:themeColor="text1"/>
           <w:sz w:val="72"/>
           <w:szCs w:val="72"/>
+          <w:lang w:val="en-US"/>
           <w14:shadow w14:blurRad="38100" w14:dist="19050" w14:dir="2700000" w14:sx="100000" w14:sy="100000" w14:kx="0" w14:ky="0" w14:algn="tl">
             <w14:schemeClr w14:val="dk1">
               <w14:alpha w14:val="60000"/>
@@ -126,6 +131,7 @@
           <w:iCs/>
           <w:sz w:val="2"/>
           <w:szCs w:val="2"/>
+          <w:lang w:val="en-US"/>
           <w14:shadow w14:blurRad="50800" w14:dist="38100" w14:dir="5400000" w14:sx="100000" w14:sy="100000" w14:kx="0" w14:ky="0" w14:algn="t">
             <w14:srgbClr w14:val="000000">
               <w14:alpha w14:val="60000"/>
@@ -144,6 +150,7 @@
           <w:iCs/>
           <w:sz w:val="2"/>
           <w:szCs w:val="2"/>
+          <w:lang w:val="en-US"/>
           <w14:shadow w14:blurRad="50800" w14:dist="38100" w14:dir="5400000" w14:sx="100000" w14:sy="100000" w14:kx="0" w14:ky="0" w14:algn="t">
             <w14:srgbClr w14:val="000000">
               <w14:alpha w14:val="60000"/>
@@ -201,12 +208,14 @@
         <w:rPr>
           <w:sz w:val="24"/>
           <w:szCs w:val="24"/>
-        </w:rPr>
-      </w:pPr>
-      <w:r>
-        <w:rPr>
-          <w:sz w:val="24"/>
-          <w:szCs w:val="24"/>
+          <w:lang w:val="en-US"/>
+        </w:rPr>
+      </w:pPr>
+      <w:r>
+        <w:rPr>
+          <w:sz w:val="24"/>
+          <w:szCs w:val="24"/>
+          <w:lang w:val="en-US"/>
         </w:rPr>
         <w:t>1.1 Introduction ........................................................................... 1</w:t>
       </w:r>
@@ -217,12 +226,14 @@
         <w:rPr>
           <w:sz w:val="24"/>
           <w:szCs w:val="24"/>
-        </w:rPr>
-      </w:pPr>
-      <w:r>
-        <w:rPr>
-          <w:sz w:val="24"/>
-          <w:szCs w:val="24"/>
+          <w:lang w:val="en-US"/>
+        </w:rPr>
+      </w:pPr>
+      <w:r>
+        <w:rPr>
+          <w:sz w:val="24"/>
+          <w:szCs w:val="24"/>
+          <w:lang w:val="en-US"/>
         </w:rPr>
         <w:t xml:space="preserve">1.2 </w:t>
       </w:r>
@@ -230,6 +241,7 @@
         <w:rPr>
           <w:sz w:val="24"/>
           <w:szCs w:val="24"/>
+          <w:lang w:val="en-US"/>
         </w:rPr>
         <w:t>Problem Statement</w:t>
       </w:r>
@@ -237,6 +249,7 @@
         <w:rPr>
           <w:sz w:val="24"/>
           <w:szCs w:val="24"/>
+          <w:lang w:val="en-US"/>
         </w:rPr>
         <w:t>............................................. 1</w:t>
       </w:r>
@@ -247,12 +260,14 @@
         <w:rPr>
           <w:sz w:val="24"/>
           <w:szCs w:val="24"/>
-        </w:rPr>
-      </w:pPr>
-      <w:r>
-        <w:rPr>
-          <w:sz w:val="24"/>
-          <w:szCs w:val="24"/>
+          <w:lang w:val="en-US"/>
+        </w:rPr>
+      </w:pPr>
+      <w:r>
+        <w:rPr>
+          <w:sz w:val="24"/>
+          <w:szCs w:val="24"/>
+          <w:lang w:val="en-US"/>
         </w:rPr>
         <w:t xml:space="preserve">1.3 </w:t>
       </w:r>
@@ -260,6 +275,7 @@
         <w:rPr>
           <w:sz w:val="24"/>
           <w:szCs w:val="24"/>
+          <w:lang w:val="en-US"/>
         </w:rPr>
         <w:t>Proposed Solution</w:t>
       </w:r>
@@ -267,6 +283,7 @@
         <w:rPr>
           <w:sz w:val="24"/>
           <w:szCs w:val="24"/>
+          <w:lang w:val="en-US"/>
         </w:rPr>
         <w:t>................................................. 3</w:t>
       </w:r>
@@ -277,12 +294,14 @@
         <w:rPr>
           <w:sz w:val="24"/>
           <w:szCs w:val="24"/>
-        </w:rPr>
-      </w:pPr>
-      <w:r>
-        <w:rPr>
-          <w:sz w:val="24"/>
-          <w:szCs w:val="24"/>
+          <w:lang w:val="en-US"/>
+        </w:rPr>
+      </w:pPr>
+      <w:r>
+        <w:rPr>
+          <w:sz w:val="24"/>
+          <w:szCs w:val="24"/>
+          <w:lang w:val="en-US"/>
         </w:rPr>
         <w:t>1.4 Conclusion ........................................................................... 6</w:t>
       </w:r>
@@ -293,6 +312,7 @@
         <w:rPr>
           <w:sz w:val="22"/>
           <w:szCs w:val="22"/>
+          <w:lang w:val="en-US"/>
         </w:rPr>
       </w:pPr>
     </w:p>
@@ -315,15 +335,26 @@
           <w:sz w:val="52"/>
           <w:szCs w:val="52"/>
         </w:rPr>
-        <w:t>2       Étude de l’existant</w:t>
-      </w:r>
-    </w:p>
-    <w:p>
-      <w:pPr>
-        <w:spacing w:after="100"/>
-        <w:rPr>
-          <w:sz w:val="22"/>
-          <w:szCs w:val="22"/>
+        <w:t xml:space="preserve">2       </w:t>
+      </w:r>
+      <w:r>
+        <w:rPr>
+          <w:rFonts w:asciiTheme="minorBidi" w:hAnsiTheme="minorBidi"/>
+          <w:b/>
+          <w:bCs/>
+          <w:sz w:val="52"/>
+          <w:szCs w:val="52"/>
+        </w:rPr>
+        <w:t>Existing System Study</w:t>
+      </w:r>
+    </w:p>
+    <w:p>
+      <w:pPr>
+        <w:spacing w:after="100"/>
+        <w:rPr>
+          <w:sz w:val="22"/>
+          <w:szCs w:val="22"/>
+          <w:lang w:val="en-US"/>
         </w:rPr>
       </w:pPr>
     </w:p>
@@ -431,85 +462,112 @@
           <w:szCs w:val="24"/>
         </w:rPr>
       </w:pPr>
-    </w:p>
-    <w:p>
-      <w:pPr>
-        <w:spacing w:after="100"/>
-        <w:rPr>
-          <w:sz w:val="24"/>
-          <w:szCs w:val="24"/>
-        </w:rPr>
-      </w:pPr>
-      <w:r>
-        <w:rPr>
-          <w:sz w:val="24"/>
-          <w:szCs w:val="24"/>
-        </w:rPr>
-        <w:t>2.4 Critique de l’existant ....................................................... 16</w:t>
-      </w:r>
-    </w:p>
-    <w:p>
-      <w:pPr>
-        <w:spacing w:after="100"/>
-        <w:rPr>
-          <w:sz w:val="24"/>
-          <w:szCs w:val="24"/>
-        </w:rPr>
-      </w:pPr>
-      <w:r>
-        <w:rPr>
-          <w:sz w:val="24"/>
-          <w:szCs w:val="24"/>
-        </w:rPr>
-        <w:t>2.5 Problématique ..................................................................... 17</w:t>
-      </w:r>
-    </w:p>
-    <w:p>
-      <w:pPr>
-        <w:spacing w:after="100"/>
-        <w:rPr>
-          <w:sz w:val="24"/>
-          <w:szCs w:val="24"/>
-        </w:rPr>
-      </w:pPr>
-      <w:r>
-        <w:rPr>
-          <w:sz w:val="24"/>
-          <w:szCs w:val="24"/>
-        </w:rPr>
-        <w:t>2.6 Objectifs de la solution .................................................. 18</w:t>
-      </w:r>
-    </w:p>
-    <w:p>
-      <w:pPr>
-        <w:spacing w:after="100"/>
-        <w:rPr>
-          <w:sz w:val="24"/>
-          <w:szCs w:val="24"/>
-        </w:rPr>
-      </w:pPr>
-      <w:r>
-        <w:rPr>
-          <w:sz w:val="24"/>
-          <w:szCs w:val="24"/>
-        </w:rPr>
-        <w:t>2.7 Diagramme de flux ........................................................... 19</w:t>
-      </w:r>
-    </w:p>
-    <w:p>
-      <w:pPr>
-        <w:spacing w:after="100"/>
-        <w:rPr>
-          <w:sz w:val="24"/>
-          <w:szCs w:val="24"/>
-        </w:rPr>
-      </w:pPr>
-      <w:r>
-        <w:rPr>
-          <w:sz w:val="24"/>
-          <w:szCs w:val="24"/>
-        </w:rPr>
-        <w:t>2.8 Conclusion ........................................................................... 20</w:t>
+      <w:r>
+        <w:rPr>
+          <w:sz w:val="24"/>
+          <w:szCs w:val="24"/>
+          <w:lang w:val="en-US"/>
+        </w:rPr>
+        <w:t xml:space="preserve">2.4 </w:t>
+      </w:r>
+      <w:r>
+        <w:rPr>
+          <w:sz w:val="24"/>
+          <w:szCs w:val="24"/>
+          <w:lang w:val="en-US"/>
+        </w:rPr>
+        <w:t>Limitations of the Existing System</w:t>
+      </w:r>
+      <w:r>
+        <w:rPr>
+          <w:sz w:val="24"/>
+          <w:szCs w:val="24"/>
+          <w:lang w:val="en-US"/>
+        </w:rPr>
+        <w:t xml:space="preserve">....................................................... </w:t>
+      </w:r>
+      <w:r>
+        <w:rPr>
+          <w:sz w:val="24"/>
+          <w:szCs w:val="24"/>
+        </w:rPr>
+        <w:t>16</w:t>
+      </w:r>
+    </w:p>
+    <w:p>
+      <w:pPr>
+        <w:spacing w:after="100"/>
+        <w:rPr>
+          <w:sz w:val="24"/>
+          <w:szCs w:val="24"/>
+        </w:rPr>
+      </w:pPr>
+      <w:r>
+        <w:rPr>
+          <w:sz w:val="24"/>
+          <w:szCs w:val="24"/>
+        </w:rPr>
+        <w:t>2.</w:t>
+      </w:r>
+      <w:r>
+        <w:rPr>
+          <w:sz w:val="24"/>
+          <w:szCs w:val="24"/>
+        </w:rPr>
+        <w:t>5</w:t>
+      </w:r>
+      <w:r>
+        <w:rPr>
+          <w:sz w:val="24"/>
+          <w:szCs w:val="24"/>
+        </w:rPr>
+        <w:t xml:space="preserve"> Objectifs de la solution .................................................. 18</w:t>
+      </w:r>
+    </w:p>
+    <w:p>
+      <w:pPr>
+        <w:spacing w:after="100"/>
+        <w:rPr>
+          <w:sz w:val="24"/>
+          <w:szCs w:val="24"/>
+        </w:rPr>
+      </w:pPr>
+      <w:r>
+        <w:rPr>
+          <w:sz w:val="24"/>
+          <w:szCs w:val="24"/>
+        </w:rPr>
+        <w:t>2.6</w:t>
+      </w:r>
+      <w:r>
+        <w:rPr>
+          <w:sz w:val="24"/>
+          <w:szCs w:val="24"/>
+        </w:rPr>
+        <w:t xml:space="preserve"> Diagramme de flux ........................................................... 19</w:t>
+      </w:r>
+    </w:p>
+    <w:p>
+      <w:pPr>
+        <w:spacing w:after="100"/>
+        <w:rPr>
+          <w:sz w:val="24"/>
+          <w:szCs w:val="24"/>
+        </w:rPr>
+      </w:pPr>
+      <w:r>
+        <w:rPr>
+          <w:sz w:val="24"/>
+          <w:szCs w:val="24"/>
+        </w:rPr>
+        <w:t>2.7</w:t>
+      </w:r>
+      <w:r>
+        <w:rPr>
+          <w:sz w:val="24"/>
+          <w:szCs w:val="24"/>
+        </w:rPr>
+        <w:t xml:space="preserve"> Conclusion ........................................................................... 20</w:t>
       </w:r>
     </w:p>
     <w:p>
@@ -661,39 +719,39 @@
           <w:sz w:val="24"/>
           <w:szCs w:val="24"/>
         </w:rPr>
+        <w:t>3.4.3 Besoins non fonctionnels .......................................... 24</w:t>
+      </w:r>
+    </w:p>
+    <w:p>
+      <w:pPr>
+        <w:spacing w:after="100"/>
+        <w:rPr>
+          <w:sz w:val="24"/>
+          <w:szCs w:val="24"/>
+        </w:rPr>
+      </w:pPr>
+      <w:r>
+        <w:rPr>
+          <w:sz w:val="24"/>
+          <w:szCs w:val="24"/>
+        </w:rPr>
+        <w:t>3.5 Diagrammes UML .............................................................. 25</w:t>
+      </w:r>
+    </w:p>
+    <w:p>
+      <w:pPr>
+        <w:spacing w:after="100"/>
+        <w:rPr>
+          <w:sz w:val="24"/>
+          <w:szCs w:val="24"/>
+        </w:rPr>
+      </w:pPr>
+      <w:r>
+        <w:rPr>
+          <w:sz w:val="24"/>
+          <w:szCs w:val="24"/>
+        </w:rPr>
         <w:lastRenderedPageBreak/>
-        <w:t>3.4.3 Besoins non fonctionnels .......................................... 24</w:t>
-      </w:r>
-    </w:p>
-    <w:p>
-      <w:pPr>
-        <w:spacing w:after="100"/>
-        <w:rPr>
-          <w:sz w:val="24"/>
-          <w:szCs w:val="24"/>
-        </w:rPr>
-      </w:pPr>
-      <w:r>
-        <w:rPr>
-          <w:sz w:val="24"/>
-          <w:szCs w:val="24"/>
-        </w:rPr>
-        <w:t>3.5 Diagrammes UML .............................................................. 25</w:t>
-      </w:r>
-    </w:p>
-    <w:p>
-      <w:pPr>
-        <w:spacing w:after="100"/>
-        <w:rPr>
-          <w:sz w:val="24"/>
-          <w:szCs w:val="24"/>
-        </w:rPr>
-      </w:pPr>
-      <w:r>
-        <w:rPr>
-          <w:sz w:val="24"/>
-          <w:szCs w:val="24"/>
-        </w:rPr>
         <w:t>3.5.1 Diagramme de cas d’utilisation global ..................... 25</w:t>
       </w:r>
     </w:p>
@@ -920,16 +978,7 @@
           <w:sz w:val="24"/>
           <w:szCs w:val="24"/>
         </w:rPr>
-        <w:t>4.2.3 Base de données ( SQ</w:t>
-      </w:r>
-      <w:bookmarkStart w:id="0" w:name="_GoBack"/>
-      <w:bookmarkEnd w:id="0"/>
-      <w:r>
-        <w:rPr>
-          <w:sz w:val="24"/>
-          <w:szCs w:val="24"/>
-        </w:rPr>
-        <w:t>FLite) .............. 36</w:t>
+        <w:t>4.2.3 Base de données ( SQFLite) .............. 36</w:t>
       </w:r>
     </w:p>
     <w:p>
@@ -1242,6 +1291,7 @@
           <w:sz w:val="24"/>
           <w:szCs w:val="24"/>
         </w:rPr>
+        <w:lastRenderedPageBreak/>
         <w:t>4.7 Conclusion ........................................................................... 53</w:t>
       </w:r>
     </w:p>
@@ -1546,24 +1596,28 @@
           <w:sz w:val="56"/>
           <w:szCs w:val="56"/>
         </w:rPr>
-        <w:t xml:space="preserve">    </w:t>
-      </w:r>
-      <w:r>
+        <w:t xml:space="preserve">           </w:t>
+      </w:r>
+    </w:p>
+    <w:p>
+      <w:pPr>
+        <w:spacing w:after="100"/>
         <w:rPr>
           <w:rFonts w:asciiTheme="minorBidi" w:hAnsiTheme="minorBidi"/>
           <w:sz w:val="56"/>
           <w:szCs w:val="56"/>
         </w:rPr>
-        <w:t xml:space="preserve">      </w:t>
-      </w:r>
-      <w:r>
+      </w:pPr>
+    </w:p>
+    <w:p>
+      <w:pPr>
+        <w:spacing w:after="100"/>
         <w:rPr>
           <w:rFonts w:asciiTheme="minorBidi" w:hAnsiTheme="minorBidi"/>
           <w:sz w:val="56"/>
           <w:szCs w:val="56"/>
         </w:rPr>
-        <w:t xml:space="preserve"> </w:t>
-      </w:r>
+      </w:pPr>
     </w:p>
     <w:p>
       <w:pPr>
@@ -1579,26 +1633,6 @@
       <w:pPr>
         <w:spacing w:after="100"/>
         <w:rPr>
-          <w:rFonts w:asciiTheme="minorBidi" w:hAnsiTheme="minorBidi"/>
-          <w:sz w:val="56"/>
-          <w:szCs w:val="56"/>
-        </w:rPr>
-      </w:pPr>
-    </w:p>
-    <w:p>
-      <w:pPr>
-        <w:spacing w:after="100"/>
-        <w:rPr>
-          <w:rFonts w:asciiTheme="minorBidi" w:hAnsiTheme="minorBidi"/>
-          <w:sz w:val="56"/>
-          <w:szCs w:val="56"/>
-        </w:rPr>
-      </w:pPr>
-    </w:p>
-    <w:p>
-      <w:pPr>
-        <w:spacing w:after="100"/>
-        <w:rPr>
           <w:b/>
           <w:bCs/>
           <w:sz w:val="44"/>
@@ -1646,14 +1680,12 @@
         <w:rPr>
           <w:sz w:val="28"/>
           <w:szCs w:val="28"/>
-          <w:lang w:val="en-US"/>
         </w:rPr>
       </w:pPr>
       <w:r>
         <w:rPr>
           <w:sz w:val="28"/>
           <w:szCs w:val="28"/>
-          <w:lang w:val="en-US"/>
         </w:rPr>
         <w:t>In this chapter, we present the host organization, its main activities, and the services it provides.</w:t>
       </w:r>
@@ -1664,7 +1696,6 @@
         <w:rPr>
           <w:sz w:val="28"/>
           <w:szCs w:val="28"/>
-          <w:lang w:val="en-US"/>
         </w:rPr>
       </w:pPr>
     </w:p>
@@ -1674,6 +1705,7 @@
         <w:rPr>
           <w:sz w:val="44"/>
           <w:szCs w:val="44"/>
+          <w:lang w:val="en-US"/>
         </w:rPr>
       </w:pPr>
       <w:r>
@@ -1682,6 +1714,7 @@
           <w:bCs/>
           <w:sz w:val="44"/>
           <w:szCs w:val="44"/>
+          <w:lang w:val="en-US"/>
         </w:rPr>
         <w:t xml:space="preserve">— </w:t>
       </w:r>
@@ -1691,6 +1724,7 @@
           <w:bCs/>
           <w:sz w:val="44"/>
           <w:szCs w:val="44"/>
+          <w:lang w:val="en-US"/>
         </w:rPr>
         <w:t>Chapter 02: Existing System Study</w:t>
       </w:r>
@@ -1737,6 +1771,7 @@
         <w:rPr>
           <w:sz w:val="44"/>
           <w:szCs w:val="44"/>
+          <w:lang w:val="en-US"/>
         </w:rPr>
       </w:pPr>
       <w:r>
@@ -1745,6 +1780,7 @@
           <w:bCs/>
           <w:sz w:val="44"/>
           <w:szCs w:val="44"/>
+          <w:lang w:val="en-US"/>
         </w:rPr>
         <w:t xml:space="preserve">— </w:t>
       </w:r>
@@ -1754,6 +1790,7 @@
           <w:bCs/>
           <w:sz w:val="44"/>
           <w:szCs w:val="44"/>
+          <w:lang w:val="en-US"/>
         </w:rPr>
         <w:t>Chapter 03: Analysis and Design</w:t>
       </w:r>
@@ -1864,6 +1901,7 @@
           <w:bCs/>
           <w:sz w:val="44"/>
           <w:szCs w:val="44"/>
+          <w:lang w:val="en-US"/>
         </w:rPr>
       </w:pPr>
       <w:r>
@@ -1872,6 +1910,7 @@
           <w:bCs/>
           <w:sz w:val="44"/>
           <w:szCs w:val="44"/>
+          <w:lang w:val="en-US"/>
         </w:rPr>
         <w:t xml:space="preserve">— </w:t>
       </w:r>
@@ -1881,6 +1920,7 @@
           <w:bCs/>
           <w:sz w:val="44"/>
           <w:szCs w:val="44"/>
+          <w:lang w:val="en-US"/>
         </w:rPr>
         <w:t>General Conclusion</w:t>
       </w:r>
@@ -2002,6 +2042,7 @@
           <w:szCs w:val="96"/>
           <w:lang w:val="en-US"/>
         </w:rPr>
+        <w:lastRenderedPageBreak/>
         <w:t>Chaptre 01</w:t>
       </w:r>
     </w:p>
@@ -2320,8 +2361,8 @@
         <w:spacing w:after="100"/>
         <w:rPr>
           <w:rFonts w:ascii="Goudy Old Style" w:hAnsi="Goudy Old Style"/>
-          <w:sz w:val="56"/>
-          <w:szCs w:val="56"/>
+          <w:sz w:val="72"/>
+          <w:szCs w:val="72"/>
           <w:lang w:val="en-US"/>
         </w:rPr>
       </w:pPr>
@@ -2330,8 +2371,8 @@
           <w:rFonts w:ascii="Goudy Old Style" w:hAnsi="Goudy Old Style"/>
           <w:b/>
           <w:bCs/>
-          <w:sz w:val="56"/>
-          <w:szCs w:val="56"/>
+          <w:sz w:val="72"/>
+          <w:szCs w:val="72"/>
           <w:lang w:val="en-US"/>
         </w:rPr>
         <w:lastRenderedPageBreak/>
@@ -2499,6 +2540,9 @@
     <w:p>
       <w:pPr>
         <w:spacing w:after="100"/>
+        <w:rPr>
+          <w:lang w:val="en-US"/>
+        </w:rPr>
       </w:pPr>
     </w:p>
     <w:p>
@@ -2508,8 +2552,8 @@
           <w:rFonts w:ascii="Goudy Old Style" w:hAnsi="Goudy Old Style"/>
           <w:b/>
           <w:bCs/>
-          <w:sz w:val="56"/>
-          <w:szCs w:val="56"/>
+          <w:sz w:val="72"/>
+          <w:szCs w:val="72"/>
           <w:lang w:val="en-US"/>
         </w:rPr>
       </w:pPr>
@@ -2518,11 +2562,10 @@
           <w:rFonts w:ascii="Goudy Old Style" w:hAnsi="Goudy Old Style"/>
           <w:b/>
           <w:bCs/>
-          <w:sz w:val="56"/>
-          <w:szCs w:val="56"/>
-          <w:lang w:val="en-US"/>
-        </w:rPr>
-        <w:lastRenderedPageBreak/>
+          <w:sz w:val="72"/>
+          <w:szCs w:val="72"/>
+          <w:lang w:val="en-US"/>
+        </w:rPr>
         <w:t>Problem Statement</w:t>
       </w:r>
     </w:p>
@@ -2752,41 +2795,12 @@
       <w:pPr>
         <w:spacing w:after="100"/>
         <w:rPr>
-          <w:sz w:val="22"/>
-          <w:szCs w:val="22"/>
-          <w:lang w:val="en-US" w:bidi="ar-DZ"/>
-        </w:rPr>
-      </w:pPr>
-    </w:p>
-    <w:p>
-      <w:pPr>
-        <w:spacing w:after="100"/>
-        <w:rPr>
-          <w:sz w:val="22"/>
-          <w:szCs w:val="22"/>
-          <w:lang w:val="en-US" w:bidi="ar-DZ"/>
-        </w:rPr>
-      </w:pPr>
-    </w:p>
-    <w:p>
-      <w:pPr>
-        <w:spacing w:after="100"/>
-        <w:rPr>
-          <w:sz w:val="22"/>
-          <w:szCs w:val="22"/>
-          <w:lang w:val="en-US" w:bidi="ar-DZ"/>
-        </w:rPr>
-      </w:pPr>
-    </w:p>
-    <w:p>
-      <w:pPr>
-        <w:spacing w:after="100"/>
-        <w:rPr>
           <w:rFonts w:ascii="Goudy Old Style" w:hAnsi="Goudy Old Style"/>
           <w:b/>
           <w:bCs/>
-          <w:sz w:val="56"/>
-          <w:szCs w:val="56"/>
+          <w:sz w:val="72"/>
+          <w:szCs w:val="72"/>
+          <w:lang w:val="en-US"/>
         </w:rPr>
       </w:pPr>
       <w:r>
@@ -2794,9 +2808,11 @@
           <w:rFonts w:ascii="Goudy Old Style" w:hAnsi="Goudy Old Style"/>
           <w:b/>
           <w:bCs/>
-          <w:sz w:val="56"/>
-          <w:szCs w:val="56"/>
-        </w:rPr>
+          <w:sz w:val="72"/>
+          <w:szCs w:val="72"/>
+          <w:lang w:val="en-US"/>
+        </w:rPr>
+        <w:lastRenderedPageBreak/>
         <w:t>Proposed Solution</w:t>
       </w:r>
     </w:p>
@@ -2809,6 +2825,7 @@
           <w:bCs/>
           <w:sz w:val="36"/>
           <w:szCs w:val="36"/>
+          <w:lang w:val="en-US"/>
         </w:rPr>
       </w:pPr>
     </w:p>
@@ -3018,93 +3035,2898 @@
           <w:rFonts w:ascii="Goudy Old Style" w:hAnsi="Goudy Old Style" w:cstheme="majorBidi"/>
           <w:b/>
           <w:bCs/>
+          <w:sz w:val="40"/>
+          <w:szCs w:val="40"/>
+          <w:lang w:val="en-US"/>
+        </w:rPr>
+      </w:pPr>
+      <w:r>
+        <w:rPr>
+          <w:rFonts w:ascii="Goudy Old Style" w:hAnsi="Goudy Old Style" w:cstheme="majorBidi"/>
+          <w:b/>
+          <w:bCs/>
+          <w:sz w:val="72"/>
+          <w:szCs w:val="72"/>
+          <w:lang w:val="en-US"/>
+        </w:rPr>
+        <w:lastRenderedPageBreak/>
+        <w:t>Conclusion</w:t>
+      </w:r>
+    </w:p>
+    <w:p>
+      <w:pPr>
+        <w:spacing w:after="100"/>
+        <w:rPr>
+          <w:rFonts w:ascii="Goudy Old Style" w:hAnsi="Goudy Old Style" w:cstheme="majorBidi"/>
+          <w:b/>
+          <w:bCs/>
           <w:sz w:val="36"/>
           <w:szCs w:val="36"/>
-        </w:rPr>
-      </w:pPr>
-      <w:r>
-        <w:rPr>
-          <w:rFonts w:ascii="Goudy Old Style" w:hAnsi="Goudy Old Style" w:cstheme="majorBidi"/>
-          <w:b/>
-          <w:bCs/>
-          <w:sz w:val="56"/>
-          <w:szCs w:val="56"/>
-        </w:rPr>
-        <w:lastRenderedPageBreak/>
-        <w:t>Conclusion</w:t>
-      </w:r>
-    </w:p>
-    <w:p>
-      <w:pPr>
-        <w:spacing w:after="100"/>
-        <w:rPr>
-          <w:rFonts w:ascii="Goudy Old Style" w:hAnsi="Goudy Old Style" w:cstheme="majorBidi"/>
-          <w:b/>
-          <w:bCs/>
+          <w:lang w:val="en-US"/>
+        </w:rPr>
+      </w:pPr>
+    </w:p>
+    <w:p>
+      <w:pPr>
+        <w:spacing w:after="100"/>
+        <w:rPr>
+          <w:rFonts w:asciiTheme="majorBidi" w:hAnsiTheme="majorBidi" w:cstheme="majorBidi"/>
           <w:sz w:val="36"/>
           <w:szCs w:val="36"/>
-        </w:rPr>
-      </w:pPr>
-    </w:p>
-    <w:p>
-      <w:pPr>
-        <w:spacing w:after="100"/>
+          <w:lang w:val="en-US"/>
+        </w:rPr>
+      </w:pPr>
+      <w:r>
         <w:rPr>
           <w:rFonts w:asciiTheme="majorBidi" w:hAnsiTheme="majorBidi" w:cstheme="majorBidi"/>
           <w:sz w:val="36"/>
           <w:szCs w:val="36"/>
           <w:lang w:val="en-US"/>
         </w:rPr>
-      </w:pPr>
-      <w:r>
+        <w:t xml:space="preserve">In this chapter, we have introduced the general scenario in which our system will work in, emphasizing the significance of daycare centers along with their role in helping children develop and assist families. In addition to this, we explained the current situation of these institutions wherein most of them use conventional and manual systems for handling their routine activities. </w:t>
+      </w:r>
+    </w:p>
+    <w:p>
+      <w:pPr>
+        <w:spacing w:after="100"/>
         <w:rPr>
           <w:rFonts w:asciiTheme="majorBidi" w:hAnsiTheme="majorBidi" w:cstheme="majorBidi"/>
           <w:sz w:val="36"/>
           <w:szCs w:val="36"/>
           <w:lang w:val="en-US"/>
         </w:rPr>
-        <w:t xml:space="preserve">In this chapter, we have introduced the general scenario in which our system will work in, emphasizing the significance of daycare centers along with their role in helping children develop and assist families. In addition to this, we explained the current situation of these institutions wherein most of them use conventional and manual systems for handling their routine activities. </w:t>
-      </w:r>
-    </w:p>
-    <w:p>
-      <w:pPr>
-        <w:spacing w:after="100"/>
+      </w:pPr>
+      <w:r>
         <w:rPr>
           <w:rFonts w:asciiTheme="majorBidi" w:hAnsiTheme="majorBidi" w:cstheme="majorBidi"/>
           <w:sz w:val="36"/>
           <w:szCs w:val="36"/>
           <w:lang w:val="en-US"/>
         </w:rPr>
-      </w:pPr>
-      <w:r>
+        <w:t xml:space="preserve">Following the discussion regarding these shortcomings, we determined some important challenges that make the day-to-day operation at these places difficult. It is clear from these limitations that there is a need for adopting a more advanced approach in order to ensure the improvement in their operations. </w:t>
+      </w:r>
+    </w:p>
+    <w:p>
+      <w:pPr>
+        <w:spacing w:after="100"/>
         <w:rPr>
           <w:rFonts w:asciiTheme="majorBidi" w:hAnsiTheme="majorBidi" w:cstheme="majorBidi"/>
           <w:sz w:val="36"/>
           <w:szCs w:val="36"/>
           <w:lang w:val="en-US"/>
         </w:rPr>
-        <w:t xml:space="preserve">Following the discussion regarding these shortcomings, we determined some important challenges that make the day-to-day operation at these places difficult. It is clear from these limitations that there is a need for adopting a more advanced approach in order to ensure the improvement in their operations. </w:t>
-      </w:r>
-    </w:p>
-    <w:p>
-      <w:pPr>
-        <w:spacing w:after="100"/>
+      </w:pPr>
+      <w:r>
         <w:rPr>
           <w:rFonts w:asciiTheme="majorBidi" w:hAnsiTheme="majorBidi" w:cstheme="majorBidi"/>
           <w:sz w:val="36"/>
           <w:szCs w:val="36"/>
-          <w:rtl/>
-          <w:lang w:val="en-US"/>
-        </w:rPr>
-      </w:pPr>
-      <w:r>
+          <w:lang w:val="en-US"/>
+        </w:rPr>
+        <w:t>Ultimately, we introduced a computerized solution in the form of desktop software that would be aimed at centralizing information and improving organizational performance. The proposed solution will form the foundation for our system as we continue to discuss analysis, design, and implementation.</w:t>
+      </w:r>
+    </w:p>
+    <w:p>
+      <w:pPr>
+        <w:spacing w:after="100"/>
         <w:rPr>
           <w:rFonts w:asciiTheme="majorBidi" w:hAnsiTheme="majorBidi" w:cstheme="majorBidi"/>
           <w:sz w:val="36"/>
           <w:szCs w:val="36"/>
           <w:lang w:val="en-US"/>
         </w:rPr>
-        <w:t>Ultimately, we introduced a computerized solution in the form of desktop software that would be aimed at centralizing information and improving organizational performance. The proposed solution will form the foundation for our system as we continue to discuss analysis, design, and implementation.</w:t>
+      </w:pPr>
+    </w:p>
+    <w:p>
+      <w:pPr>
+        <w:spacing w:after="100"/>
+        <w:rPr>
+          <w:rFonts w:asciiTheme="majorBidi" w:hAnsiTheme="majorBidi" w:cstheme="majorBidi"/>
+          <w:sz w:val="36"/>
+          <w:szCs w:val="36"/>
+          <w:lang w:val="en-US"/>
+        </w:rPr>
+      </w:pPr>
+    </w:p>
+    <w:p>
+      <w:pPr>
+        <w:spacing w:after="100"/>
+        <w:rPr>
+          <w:rFonts w:asciiTheme="majorBidi" w:hAnsiTheme="majorBidi" w:cstheme="majorBidi"/>
+          <w:sz w:val="36"/>
+          <w:szCs w:val="36"/>
+          <w:lang w:val="en-US"/>
+        </w:rPr>
+      </w:pPr>
+    </w:p>
+    <w:p>
+      <w:pPr>
+        <w:spacing w:after="100"/>
+        <w:rPr>
+          <w:rFonts w:asciiTheme="majorBidi" w:hAnsiTheme="majorBidi" w:cstheme="majorBidi"/>
+          <w:sz w:val="36"/>
+          <w:szCs w:val="36"/>
+          <w:lang w:val="en-US"/>
+        </w:rPr>
+      </w:pPr>
+    </w:p>
+    <w:p>
+      <w:pPr>
+        <w:spacing w:after="100"/>
+        <w:rPr>
+          <w:rFonts w:asciiTheme="majorBidi" w:hAnsiTheme="majorBidi" w:cstheme="majorBidi"/>
+          <w:sz w:val="36"/>
+          <w:szCs w:val="36"/>
+          <w:lang w:val="en-US"/>
+        </w:rPr>
+      </w:pPr>
+    </w:p>
+    <w:p>
+      <w:pPr>
+        <w:spacing w:after="100"/>
+        <w:rPr>
+          <w:rFonts w:asciiTheme="majorBidi" w:hAnsiTheme="majorBidi" w:cstheme="majorBidi"/>
+          <w:sz w:val="36"/>
+          <w:szCs w:val="36"/>
+          <w:lang w:val="en-US"/>
+        </w:rPr>
+      </w:pPr>
+    </w:p>
+    <w:p>
+      <w:pPr>
+        <w:spacing w:after="100"/>
+        <w:rPr>
+          <w:rFonts w:asciiTheme="majorBidi" w:hAnsiTheme="majorBidi" w:cstheme="majorBidi"/>
+          <w:sz w:val="36"/>
+          <w:szCs w:val="36"/>
+          <w:lang w:val="en-US"/>
+        </w:rPr>
+      </w:pPr>
+    </w:p>
+    <w:p>
+      <w:pPr>
+        <w:spacing w:after="100"/>
+        <w:rPr>
+          <w:rFonts w:asciiTheme="majorBidi" w:hAnsiTheme="majorBidi" w:cstheme="majorBidi"/>
+          <w:sz w:val="36"/>
+          <w:szCs w:val="36"/>
+          <w:lang w:val="en-US"/>
+        </w:rPr>
+      </w:pPr>
+    </w:p>
+    <w:p>
+      <w:pPr>
+        <w:spacing w:after="100"/>
+        <w:rPr>
+          <w:rFonts w:asciiTheme="majorBidi" w:hAnsiTheme="majorBidi" w:cstheme="majorBidi"/>
+          <w:sz w:val="36"/>
+          <w:szCs w:val="36"/>
+          <w:lang w:val="en-US"/>
+        </w:rPr>
+      </w:pPr>
+    </w:p>
+    <w:p>
+      <w:pPr>
+        <w:spacing w:after="100"/>
+        <w:rPr>
+          <w:b/>
+          <w:bCs/>
+          <w:sz w:val="96"/>
+          <w:szCs w:val="96"/>
+          <w:lang w:val="en-US"/>
+        </w:rPr>
+      </w:pPr>
+      <w:r>
+        <w:rPr>
+          <w:b/>
+          <w:bCs/>
+          <w:sz w:val="96"/>
+          <w:szCs w:val="96"/>
+          <w:lang w:val="en-US"/>
+        </w:rPr>
+        <w:lastRenderedPageBreak/>
+        <w:t>Chaptre 0</w:t>
+      </w:r>
+      <w:r>
+        <w:rPr>
+          <w:b/>
+          <w:bCs/>
+          <w:sz w:val="96"/>
+          <w:szCs w:val="96"/>
+          <w:lang w:val="en-US"/>
+        </w:rPr>
+        <w:t>2</w:t>
+      </w:r>
+    </w:p>
+    <w:p>
+      <w:pPr>
+        <w:spacing w:after="100"/>
+        <w:rPr>
+          <w:b/>
+          <w:bCs/>
+          <w:sz w:val="96"/>
+          <w:szCs w:val="96"/>
+          <w:lang w:val="en-US"/>
+        </w:rPr>
+      </w:pPr>
+      <w:r>
+        <w:rPr>
+          <w:b/>
+          <w:bCs/>
+          <w:sz w:val="96"/>
+          <w:szCs w:val="96"/>
+          <w:lang w:val="en-US"/>
+        </w:rPr>
+        <w:t>Existing System Study</w:t>
+      </w:r>
+    </w:p>
+    <w:p>
+      <w:pPr>
+        <w:spacing w:after="100"/>
+        <w:rPr>
+          <w:b/>
+          <w:bCs/>
+          <w:sz w:val="96"/>
+          <w:szCs w:val="96"/>
+          <w:lang w:val="en-US"/>
+        </w:rPr>
+      </w:pPr>
+    </w:p>
+    <w:p>
+      <w:pPr>
+        <w:spacing w:after="100"/>
+        <w:rPr>
+          <w:b/>
+          <w:bCs/>
+          <w:sz w:val="96"/>
+          <w:szCs w:val="96"/>
+          <w:lang w:val="en-US"/>
+        </w:rPr>
+      </w:pPr>
+    </w:p>
+    <w:p>
+      <w:pPr>
+        <w:spacing w:after="100"/>
+        <w:rPr>
+          <w:b/>
+          <w:bCs/>
+          <w:sz w:val="96"/>
+          <w:szCs w:val="96"/>
+          <w:lang w:val="en-US"/>
+        </w:rPr>
+      </w:pPr>
+    </w:p>
+    <w:p>
+      <w:pPr>
+        <w:spacing w:after="100"/>
+        <w:rPr>
+          <w:b/>
+          <w:bCs/>
+          <w:sz w:val="96"/>
+          <w:szCs w:val="96"/>
+          <w:lang w:val="en-US"/>
+        </w:rPr>
+      </w:pPr>
+    </w:p>
+    <w:p>
+      <w:pPr>
+        <w:spacing w:after="100"/>
+        <w:rPr>
+          <w:b/>
+          <w:bCs/>
+          <w:sz w:val="96"/>
+          <w:szCs w:val="96"/>
+          <w:lang w:val="en-US"/>
+        </w:rPr>
+      </w:pPr>
+    </w:p>
+    <w:p>
+      <w:pPr>
+        <w:spacing w:after="100"/>
+        <w:rPr>
+          <w:b/>
+          <w:bCs/>
+          <w:sz w:val="96"/>
+          <w:szCs w:val="96"/>
+          <w:lang w:val="en-US"/>
+        </w:rPr>
+      </w:pPr>
+    </w:p>
+    <w:p>
+      <w:pPr>
+        <w:spacing w:after="100"/>
+        <w:rPr>
+          <w:b/>
+          <w:bCs/>
+          <w:sz w:val="96"/>
+          <w:szCs w:val="96"/>
+          <w:lang w:val="en-US"/>
+        </w:rPr>
+      </w:pPr>
+    </w:p>
+    <w:p>
+      <w:pPr>
+        <w:spacing w:after="100"/>
+        <w:rPr>
+          <w:b/>
+          <w:bCs/>
+          <w:sz w:val="96"/>
+          <w:szCs w:val="96"/>
+          <w:lang w:val="en-US"/>
+        </w:rPr>
+      </w:pPr>
+    </w:p>
+    <w:p>
+      <w:pPr>
+        <w:spacing w:after="100"/>
+        <w:rPr>
+          <w:b/>
+          <w:bCs/>
+          <w:sz w:val="96"/>
+          <w:szCs w:val="96"/>
+          <w:lang w:val="en-US"/>
+        </w:rPr>
+      </w:pPr>
+    </w:p>
+    <w:p>
+      <w:pPr>
+        <w:spacing w:after="100"/>
+        <w:rPr>
+          <w:rFonts w:ascii="Goudy Old Style" w:hAnsi="Goudy Old Style"/>
+          <w:b/>
+          <w:bCs/>
+          <w:sz w:val="18"/>
+          <w:szCs w:val="18"/>
+          <w:lang w:val="en-US"/>
+        </w:rPr>
+      </w:pPr>
+      <w:r>
+        <w:rPr>
+          <w:rFonts w:ascii="Goudy Old Style" w:hAnsi="Goudy Old Style"/>
+          <w:b/>
+          <w:bCs/>
+          <w:sz w:val="72"/>
+          <w:szCs w:val="72"/>
+          <w:lang w:val="en-US"/>
+        </w:rPr>
+        <w:lastRenderedPageBreak/>
+        <w:t>Introduction</w:t>
+      </w:r>
+    </w:p>
+    <w:p>
+      <w:pPr>
+        <w:spacing w:after="100"/>
+        <w:rPr>
+          <w:rFonts w:ascii="Goudy Old Style" w:hAnsi="Goudy Old Style"/>
+          <w:b/>
+          <w:bCs/>
+          <w:sz w:val="16"/>
+          <w:szCs w:val="16"/>
+          <w:lang w:val="en-US"/>
+        </w:rPr>
+      </w:pPr>
+    </w:p>
+    <w:p>
+      <w:pPr>
+        <w:spacing w:after="100"/>
+        <w:rPr>
+          <w:rFonts w:asciiTheme="majorBidi" w:hAnsiTheme="majorBidi" w:cstheme="majorBidi"/>
+          <w:sz w:val="40"/>
+          <w:szCs w:val="40"/>
+          <w:lang w:val="en-US"/>
+        </w:rPr>
+      </w:pPr>
+      <w:r>
+        <w:rPr>
+          <w:rFonts w:asciiTheme="majorBidi" w:hAnsiTheme="majorBidi" w:cstheme="majorBidi"/>
+          <w:sz w:val="40"/>
+          <w:szCs w:val="40"/>
+          <w:lang w:val="en-US"/>
+        </w:rPr>
+        <w:t>Being an important component of developing any computer application, one should start with the analysis of the present situation, as it provides an opportunity to gain insight into how things work within the given field at the moment.</w:t>
+      </w:r>
+    </w:p>
+    <w:p>
+      <w:pPr>
+        <w:spacing w:after="100"/>
+        <w:rPr>
+          <w:rFonts w:asciiTheme="majorBidi" w:hAnsiTheme="majorBidi" w:cstheme="majorBidi"/>
+          <w:sz w:val="40"/>
+          <w:szCs w:val="40"/>
+          <w:lang w:val="en-US"/>
+        </w:rPr>
+      </w:pPr>
+    </w:p>
+    <w:p>
+      <w:pPr>
+        <w:spacing w:after="100"/>
+        <w:rPr>
+          <w:rFonts w:asciiTheme="majorBidi" w:hAnsiTheme="majorBidi" w:cstheme="majorBidi"/>
+          <w:sz w:val="40"/>
+          <w:szCs w:val="40"/>
+          <w:lang w:val="en-US"/>
+        </w:rPr>
+      </w:pPr>
+      <w:r>
+        <w:rPr>
+          <w:rFonts w:asciiTheme="majorBidi" w:hAnsiTheme="majorBidi" w:cstheme="majorBidi"/>
+          <w:sz w:val="40"/>
+          <w:szCs w:val="40"/>
+          <w:lang w:val="en-US"/>
+        </w:rPr>
+        <w:t>The current reality shows that the administrative management in day-care centers is usually implemented using conventional approaches, such as writing notes on paper or working manually. Such a practice may cause different organizational and technical issues.</w:t>
+      </w:r>
+    </w:p>
+    <w:p>
+      <w:pPr>
+        <w:spacing w:after="100"/>
+        <w:rPr>
+          <w:rFonts w:asciiTheme="majorBidi" w:hAnsiTheme="majorBidi" w:cstheme="majorBidi"/>
+          <w:sz w:val="40"/>
+          <w:szCs w:val="40"/>
+          <w:lang w:val="en-US"/>
+        </w:rPr>
+      </w:pPr>
+    </w:p>
+    <w:p>
+      <w:pPr>
+        <w:spacing w:after="100"/>
+        <w:rPr>
+          <w:rFonts w:asciiTheme="majorBidi" w:hAnsiTheme="majorBidi" w:cstheme="majorBidi"/>
+          <w:sz w:val="40"/>
+          <w:szCs w:val="40"/>
+          <w:lang w:val="en-US"/>
+        </w:rPr>
+      </w:pPr>
+      <w:r>
+        <w:rPr>
+          <w:rFonts w:asciiTheme="majorBidi" w:hAnsiTheme="majorBidi" w:cstheme="majorBidi"/>
+          <w:sz w:val="40"/>
+          <w:szCs w:val="40"/>
+          <w:lang w:val="en-US"/>
+        </w:rPr>
+        <w:t>Thus, this chapter will focus on the analysis of the process of administrative management in day-care centers, discussing the shortcomings of the current system as well as formulating a problem statement and objectives for implementing the project.</w:t>
+      </w:r>
+    </w:p>
+    <w:p>
+      <w:pPr>
+        <w:spacing w:after="100"/>
+        <w:rPr>
+          <w:rFonts w:asciiTheme="majorBidi" w:hAnsiTheme="majorBidi" w:cstheme="majorBidi"/>
+          <w:sz w:val="40"/>
+          <w:szCs w:val="40"/>
+          <w:lang w:val="en-US"/>
+        </w:rPr>
+      </w:pPr>
+    </w:p>
+    <w:p>
+      <w:pPr>
+        <w:spacing w:after="100"/>
+        <w:rPr>
+          <w:rFonts w:asciiTheme="majorBidi" w:hAnsiTheme="majorBidi" w:cstheme="majorBidi"/>
+          <w:sz w:val="40"/>
+          <w:szCs w:val="40"/>
+          <w:lang w:val="en-US"/>
+        </w:rPr>
+      </w:pPr>
+    </w:p>
+    <w:p>
+      <w:pPr>
+        <w:spacing w:after="100"/>
+        <w:rPr>
+          <w:rFonts w:asciiTheme="majorBidi" w:hAnsiTheme="majorBidi" w:cstheme="majorBidi"/>
+          <w:sz w:val="40"/>
+          <w:szCs w:val="40"/>
+          <w:lang w:val="en-US"/>
+        </w:rPr>
+      </w:pPr>
+    </w:p>
+    <w:p>
+      <w:pPr>
+        <w:spacing w:after="100"/>
+        <w:rPr>
+          <w:rFonts w:asciiTheme="majorBidi" w:hAnsiTheme="majorBidi" w:cstheme="majorBidi"/>
+          <w:sz w:val="40"/>
+          <w:szCs w:val="40"/>
+          <w:lang w:val="en-US"/>
+        </w:rPr>
+      </w:pPr>
+    </w:p>
+    <w:p>
+      <w:pPr>
+        <w:spacing w:after="100"/>
+        <w:rPr>
+          <w:rFonts w:asciiTheme="majorBidi" w:hAnsiTheme="majorBidi" w:cstheme="majorBidi"/>
+          <w:sz w:val="40"/>
+          <w:szCs w:val="40"/>
+          <w:lang w:val="en-US"/>
+        </w:rPr>
+      </w:pPr>
+    </w:p>
+    <w:p>
+      <w:pPr>
+        <w:spacing w:after="100"/>
+        <w:jc w:val="left"/>
+        <w:rPr>
+          <w:rFonts w:ascii="Goudy Old Style" w:hAnsi="Goudy Old Style"/>
+          <w:b/>
+          <w:bCs/>
+          <w:sz w:val="72"/>
+          <w:szCs w:val="72"/>
+          <w:lang w:val="en-US"/>
+        </w:rPr>
+      </w:pPr>
+    </w:p>
+    <w:p>
+      <w:pPr>
+        <w:spacing w:after="100"/>
+        <w:jc w:val="left"/>
+        <w:rPr>
+          <w:rFonts w:ascii="Goudy Old Style" w:hAnsi="Goudy Old Style"/>
+          <w:b/>
+          <w:bCs/>
+          <w:sz w:val="72"/>
+          <w:szCs w:val="72"/>
+        </w:rPr>
+      </w:pPr>
+      <w:r>
+        <w:rPr>
+          <w:rFonts w:ascii="Goudy Old Style" w:hAnsi="Goudy Old Style"/>
+          <w:b/>
+          <w:bCs/>
+          <w:sz w:val="72"/>
+          <w:szCs w:val="72"/>
+        </w:rPr>
+        <w:lastRenderedPageBreak/>
+        <w:t>Analysis of Current Processes</w:t>
+      </w:r>
+    </w:p>
+    <w:p>
+      <w:pPr>
+        <w:spacing w:after="100"/>
+        <w:rPr>
+          <w:rFonts w:ascii="Goudy Old Style" w:hAnsi="Goudy Old Style"/>
+          <w:b/>
+          <w:bCs/>
+          <w:sz w:val="16"/>
+          <w:szCs w:val="16"/>
+        </w:rPr>
+      </w:pPr>
+    </w:p>
+    <w:p>
+      <w:pPr>
+        <w:spacing w:after="100"/>
+        <w:rPr>
+          <w:rFonts w:asciiTheme="majorBidi" w:hAnsiTheme="majorBidi" w:cstheme="majorBidi"/>
+          <w:sz w:val="16"/>
+          <w:szCs w:val="16"/>
+          <w:lang w:val="en-US"/>
+        </w:rPr>
+      </w:pPr>
+      <w:r>
+        <w:rPr>
+          <w:rFonts w:asciiTheme="majorBidi" w:hAnsiTheme="majorBidi" w:cstheme="majorBidi"/>
+          <w:b/>
+          <w:bCs/>
+          <w:sz w:val="40"/>
+          <w:szCs w:val="40"/>
+          <w:lang w:val="en-US"/>
+        </w:rPr>
+        <w:t xml:space="preserve">General Overview: </w:t>
+      </w:r>
+      <w:r>
+        <w:rPr>
+          <w:rFonts w:asciiTheme="majorBidi" w:hAnsiTheme="majorBidi" w:cstheme="majorBidi"/>
+          <w:sz w:val="36"/>
+          <w:szCs w:val="36"/>
+          <w:lang w:val="en-US"/>
+        </w:rPr>
+        <w:t>The process involved in the running of childcare centers is normally done by traditional means whereby there is involvement of manual processes using simple tools like paper and excel files. This is done in order to manage the various operations in the day care center such as enrollment of children and payments.</w:t>
+      </w:r>
+      <w:r>
+        <w:rPr>
+          <w:rFonts w:asciiTheme="majorBidi" w:hAnsiTheme="majorBidi" w:cstheme="majorBidi"/>
+          <w:sz w:val="36"/>
+          <w:szCs w:val="36"/>
+          <w:lang w:val="en-US"/>
+        </w:rPr>
+        <w:t xml:space="preserve"> </w:t>
+      </w:r>
+    </w:p>
+    <w:p>
+      <w:pPr>
+        <w:spacing w:after="100"/>
+        <w:rPr>
+          <w:rFonts w:asciiTheme="majorBidi" w:hAnsiTheme="majorBidi" w:cstheme="majorBidi"/>
+          <w:sz w:val="16"/>
+          <w:szCs w:val="16"/>
+          <w:lang w:val="en-US"/>
+        </w:rPr>
+      </w:pPr>
+    </w:p>
+    <w:p>
+      <w:pPr>
+        <w:spacing w:after="100"/>
+        <w:rPr>
+          <w:rFonts w:asciiTheme="majorBidi" w:hAnsiTheme="majorBidi" w:cstheme="majorBidi"/>
+          <w:sz w:val="16"/>
+          <w:szCs w:val="16"/>
+          <w:lang w:val="en-US"/>
+        </w:rPr>
+      </w:pPr>
+      <w:r>
+        <w:rPr>
+          <w:rFonts w:asciiTheme="majorBidi" w:hAnsiTheme="majorBidi" w:cstheme="majorBidi"/>
+          <w:b/>
+          <w:bCs/>
+          <w:sz w:val="40"/>
+          <w:szCs w:val="40"/>
+          <w:lang w:val="en-US"/>
+        </w:rPr>
+        <w:t>Information Handling:</w:t>
+      </w:r>
+      <w:r>
+        <w:rPr>
+          <w:rFonts w:asciiTheme="majorBidi" w:hAnsiTheme="majorBidi" w:cstheme="majorBidi"/>
+          <w:b/>
+          <w:bCs/>
+          <w:sz w:val="40"/>
+          <w:szCs w:val="40"/>
+          <w:lang w:val="en-US"/>
+        </w:rPr>
+        <w:t xml:space="preserve"> </w:t>
+      </w:r>
+      <w:r>
+        <w:rPr>
+          <w:rFonts w:asciiTheme="majorBidi" w:hAnsiTheme="majorBidi" w:cstheme="majorBidi"/>
+          <w:sz w:val="40"/>
+          <w:szCs w:val="40"/>
+          <w:lang w:val="en-US"/>
+        </w:rPr>
+        <w:t>In most cases, information is recorded manually and stored in different documents, which makes it difficult to organize and update data efficiently. Each process is handled separately, and there is no centralized system to manage all the information in one place.</w:t>
+      </w:r>
+      <w:r>
+        <w:rPr>
+          <w:rFonts w:asciiTheme="majorBidi" w:hAnsiTheme="majorBidi" w:cstheme="majorBidi"/>
+          <w:sz w:val="40"/>
+          <w:szCs w:val="40"/>
+          <w:lang w:val="en-US"/>
+        </w:rPr>
+        <w:t xml:space="preserve">  </w:t>
+      </w:r>
+    </w:p>
+    <w:p>
+      <w:pPr>
+        <w:spacing w:after="100"/>
+        <w:rPr>
+          <w:rFonts w:asciiTheme="majorBidi" w:hAnsiTheme="majorBidi" w:cstheme="majorBidi"/>
+          <w:sz w:val="16"/>
+          <w:szCs w:val="16"/>
+          <w:lang w:val="en-US"/>
+        </w:rPr>
+      </w:pPr>
+    </w:p>
+    <w:p>
+      <w:pPr>
+        <w:spacing w:after="100"/>
+        <w:rPr>
+          <w:rFonts w:asciiTheme="majorBidi" w:hAnsiTheme="majorBidi" w:cstheme="majorBidi"/>
+          <w:sz w:val="16"/>
+          <w:szCs w:val="16"/>
+          <w:lang w:val="en-US"/>
+        </w:rPr>
+      </w:pPr>
+      <w:r>
+        <w:rPr>
+          <w:rFonts w:asciiTheme="majorBidi" w:hAnsiTheme="majorBidi" w:cstheme="majorBidi"/>
+          <w:b/>
+          <w:bCs/>
+          <w:sz w:val="40"/>
+          <w:szCs w:val="40"/>
+          <w:lang w:val="en-US"/>
+        </w:rPr>
+        <w:t>Operational Difficulties</w:t>
+      </w:r>
+      <w:r>
+        <w:rPr>
+          <w:rFonts w:asciiTheme="majorBidi" w:hAnsiTheme="majorBidi" w:cstheme="majorBidi"/>
+          <w:b/>
+          <w:bCs/>
+          <w:sz w:val="40"/>
+          <w:szCs w:val="40"/>
+          <w:lang w:val="en-US"/>
+        </w:rPr>
+        <w:t>:</w:t>
+      </w:r>
+      <w:r>
+        <w:rPr>
+          <w:rFonts w:asciiTheme="majorBidi" w:hAnsiTheme="majorBidi" w:cstheme="majorBidi"/>
+          <w:sz w:val="40"/>
+          <w:szCs w:val="40"/>
+          <w:lang w:val="en-US"/>
+        </w:rPr>
+        <w:t xml:space="preserve"> As such, the employees will have to allocate significant time in finding, updating, and confirming the information in the system. This adds up to their tasks and can result in delays and mistakes in operations.</w:t>
+      </w:r>
+      <w:r>
+        <w:rPr>
+          <w:rFonts w:asciiTheme="majorBidi" w:hAnsiTheme="majorBidi" w:cstheme="majorBidi"/>
+          <w:sz w:val="40"/>
+          <w:szCs w:val="40"/>
+          <w:lang w:val="en-US"/>
+        </w:rPr>
+        <w:t xml:space="preserve"> </w:t>
+      </w:r>
+    </w:p>
+    <w:p>
+      <w:pPr>
+        <w:spacing w:after="100"/>
+        <w:rPr>
+          <w:rFonts w:asciiTheme="majorBidi" w:hAnsiTheme="majorBidi" w:cstheme="majorBidi"/>
+          <w:sz w:val="16"/>
+          <w:szCs w:val="16"/>
+          <w:lang w:val="en-US"/>
+        </w:rPr>
+      </w:pPr>
+    </w:p>
+    <w:p>
+      <w:pPr>
+        <w:spacing w:after="100"/>
+        <w:rPr>
+          <w:rFonts w:asciiTheme="majorBidi" w:hAnsiTheme="majorBidi" w:cstheme="majorBidi"/>
+          <w:sz w:val="16"/>
+          <w:szCs w:val="16"/>
+          <w:lang w:val="en-US"/>
+        </w:rPr>
+      </w:pPr>
+      <w:r>
+        <w:rPr>
+          <w:rFonts w:asciiTheme="majorBidi" w:hAnsiTheme="majorBidi" w:cstheme="majorBidi"/>
+          <w:b/>
+          <w:bCs/>
+          <w:sz w:val="40"/>
+          <w:szCs w:val="40"/>
+          <w:lang w:val="en-US"/>
+        </w:rPr>
+        <w:t>Conclusion of the Analysis</w:t>
+      </w:r>
+      <w:r>
+        <w:rPr>
+          <w:rFonts w:asciiTheme="majorBidi" w:hAnsiTheme="majorBidi" w:cstheme="majorBidi"/>
+          <w:b/>
+          <w:bCs/>
+          <w:sz w:val="40"/>
+          <w:szCs w:val="40"/>
+          <w:lang w:val="en-US"/>
+        </w:rPr>
+        <w:t>:</w:t>
+      </w:r>
+      <w:r>
+        <w:rPr>
+          <w:rFonts w:asciiTheme="majorBidi" w:hAnsiTheme="majorBidi" w:cstheme="majorBidi"/>
+          <w:sz w:val="40"/>
+          <w:szCs w:val="40"/>
+          <w:lang w:val="en-US"/>
+        </w:rPr>
+        <w:t xml:space="preserve"> Therefore, analyzing these cu</w:t>
+      </w:r>
+      <w:r>
+        <w:rPr>
+          <w:rFonts w:asciiTheme="majorBidi" w:hAnsiTheme="majorBidi" w:cstheme="majorBidi"/>
+          <w:sz w:val="40"/>
+          <w:szCs w:val="40"/>
+          <w:lang w:val="en-US"/>
+        </w:rPr>
+        <w:t xml:space="preserve">rrent processes helps to better </w:t>
+      </w:r>
+      <w:r>
+        <w:rPr>
+          <w:rFonts w:asciiTheme="majorBidi" w:hAnsiTheme="majorBidi" w:cstheme="majorBidi"/>
+          <w:sz w:val="40"/>
+          <w:szCs w:val="40"/>
+          <w:lang w:val="en-US"/>
+        </w:rPr>
+        <w:t>understand the weaknesses of the existing system and highlights the need for an improved and automated solution.</w:t>
+      </w:r>
+    </w:p>
+    <w:p>
+      <w:pPr>
+        <w:spacing w:after="100"/>
+        <w:rPr>
+          <w:rFonts w:asciiTheme="majorBidi" w:hAnsiTheme="majorBidi" w:cstheme="majorBidi"/>
+          <w:sz w:val="16"/>
+          <w:szCs w:val="16"/>
+          <w:lang w:val="en-US"/>
+        </w:rPr>
+      </w:pPr>
+    </w:p>
+    <w:p>
+      <w:pPr>
+        <w:spacing w:after="100"/>
+        <w:rPr>
+          <w:rFonts w:asciiTheme="majorBidi" w:hAnsiTheme="majorBidi" w:cstheme="majorBidi"/>
+          <w:sz w:val="16"/>
+          <w:szCs w:val="16"/>
+          <w:lang w:val="en-US"/>
+        </w:rPr>
+      </w:pPr>
+    </w:p>
+    <w:p>
+      <w:pPr>
+        <w:spacing w:after="100"/>
+        <w:rPr>
+          <w:rFonts w:asciiTheme="majorBidi" w:hAnsiTheme="majorBidi" w:cstheme="majorBidi"/>
+          <w:sz w:val="16"/>
+          <w:szCs w:val="16"/>
+          <w:lang w:val="en-US"/>
+        </w:rPr>
+      </w:pPr>
+    </w:p>
+    <w:p>
+      <w:pPr>
+        <w:spacing w:after="100"/>
+        <w:rPr>
+          <w:rFonts w:asciiTheme="majorBidi" w:hAnsiTheme="majorBidi" w:cstheme="majorBidi"/>
+          <w:b/>
+          <w:bCs/>
+          <w:sz w:val="72"/>
+          <w:szCs w:val="72"/>
+          <w:lang w:val="en-US"/>
+        </w:rPr>
+      </w:pPr>
+    </w:p>
+    <w:p>
+      <w:pPr>
+        <w:spacing w:after="100"/>
+        <w:rPr>
+          <w:rFonts w:ascii="Goudy Old Style" w:hAnsi="Goudy Old Style"/>
+          <w:b/>
+          <w:bCs/>
+          <w:sz w:val="16"/>
+          <w:szCs w:val="16"/>
+          <w:lang w:val="en-US"/>
+        </w:rPr>
+      </w:pPr>
+      <w:r>
+        <w:rPr>
+          <w:rFonts w:ascii="Goudy Old Style" w:hAnsi="Goudy Old Style"/>
+          <w:b/>
+          <w:bCs/>
+          <w:sz w:val="72"/>
+          <w:szCs w:val="72"/>
+          <w:lang w:val="en-US"/>
+        </w:rPr>
+        <w:lastRenderedPageBreak/>
+        <w:t>Children Management</w:t>
+      </w:r>
+      <w:r>
+        <w:rPr>
+          <w:rFonts w:ascii="Goudy Old Style" w:hAnsi="Goudy Old Style"/>
+          <w:b/>
+          <w:bCs/>
+          <w:sz w:val="16"/>
+          <w:szCs w:val="16"/>
+          <w:lang w:val="en-US"/>
+        </w:rPr>
+        <w:t xml:space="preserve"> </w:t>
+      </w:r>
+    </w:p>
+    <w:p>
+      <w:pPr>
+        <w:spacing w:after="100"/>
+        <w:rPr>
+          <w:rFonts w:ascii="Goudy Old Style" w:hAnsi="Goudy Old Style"/>
+          <w:b/>
+          <w:bCs/>
+          <w:sz w:val="16"/>
+          <w:szCs w:val="16"/>
+          <w:lang w:val="en-US"/>
+        </w:rPr>
+      </w:pPr>
+    </w:p>
+    <w:p>
+      <w:pPr>
+        <w:spacing w:after="100"/>
+        <w:rPr>
+          <w:rFonts w:asciiTheme="majorBidi" w:hAnsiTheme="majorBidi" w:cstheme="majorBidi"/>
+          <w:sz w:val="40"/>
+          <w:szCs w:val="40"/>
+          <w:lang w:val="en-US"/>
+        </w:rPr>
+      </w:pPr>
+      <w:r>
+        <w:rPr>
+          <w:rFonts w:asciiTheme="majorBidi" w:hAnsiTheme="majorBidi" w:cstheme="majorBidi"/>
+          <w:sz w:val="40"/>
+          <w:szCs w:val="40"/>
+          <w:lang w:val="en-US"/>
+        </w:rPr>
+        <w:t>Generally, the management and storage of information on children in these institutions takes place manually by means of paper records (registers, etc.) or simply computerized documents. Each child has their record where basic information like name, age, place of residence, and data of contacts (parents) are stored. They are mostly kept in paper folders or other media, which complicates their organization and maintenance.</w:t>
+      </w:r>
+    </w:p>
+    <w:p>
+      <w:pPr>
+        <w:spacing w:after="100"/>
+        <w:rPr>
+          <w:rFonts w:asciiTheme="majorBidi" w:hAnsiTheme="majorBidi" w:cstheme="majorBidi"/>
+          <w:sz w:val="40"/>
+          <w:szCs w:val="40"/>
+          <w:lang w:val="en-US"/>
+        </w:rPr>
+      </w:pPr>
+    </w:p>
+    <w:p>
+      <w:pPr>
+        <w:spacing w:after="100"/>
+        <w:rPr>
+          <w:rFonts w:asciiTheme="majorBidi" w:hAnsiTheme="majorBidi" w:cstheme="majorBidi"/>
+          <w:sz w:val="40"/>
+          <w:szCs w:val="40"/>
+          <w:lang w:val="en-US"/>
+        </w:rPr>
+      </w:pPr>
+      <w:r>
+        <w:rPr>
+          <w:rFonts w:asciiTheme="majorBidi" w:hAnsiTheme="majorBidi" w:cstheme="majorBidi"/>
+          <w:sz w:val="40"/>
+          <w:szCs w:val="40"/>
+          <w:lang w:val="en-US"/>
+        </w:rPr>
+        <w:t>In case any changes need to be introduced into this document (for example, updating data about the person), then they have to be found manually by staff, which takes much time and effort and may result in making mistakes.</w:t>
+      </w:r>
+    </w:p>
+    <w:p>
+      <w:pPr>
+        <w:spacing w:after="100"/>
+        <w:rPr>
+          <w:rFonts w:asciiTheme="majorBidi" w:hAnsiTheme="majorBidi" w:cstheme="majorBidi"/>
+          <w:sz w:val="40"/>
+          <w:szCs w:val="40"/>
+          <w:lang w:val="en-US"/>
+        </w:rPr>
+      </w:pPr>
+    </w:p>
+    <w:p>
+      <w:pPr>
+        <w:spacing w:after="100"/>
+        <w:rPr>
+          <w:rFonts w:ascii="Goudy Old Style" w:hAnsi="Goudy Old Style"/>
+          <w:b/>
+          <w:bCs/>
+          <w:sz w:val="36"/>
+          <w:szCs w:val="36"/>
+          <w:lang w:val="en-US"/>
+        </w:rPr>
+      </w:pPr>
+      <w:r>
+        <w:rPr>
+          <w:rFonts w:asciiTheme="majorBidi" w:hAnsiTheme="majorBidi" w:cstheme="majorBidi"/>
+          <w:sz w:val="40"/>
+          <w:szCs w:val="40"/>
+          <w:lang w:val="en-US"/>
+        </w:rPr>
+        <w:t>Moreover, monitoring and recording any history regarding each kid, like attendance or payments, is poorly organized.</w:t>
+      </w:r>
+    </w:p>
+    <w:p>
+      <w:pPr>
+        <w:spacing w:after="100"/>
+        <w:rPr>
+          <w:rFonts w:asciiTheme="majorBidi" w:hAnsiTheme="majorBidi" w:cstheme="majorBidi"/>
+          <w:sz w:val="40"/>
+          <w:szCs w:val="40"/>
+          <w:lang w:val="en-US"/>
+        </w:rPr>
+      </w:pPr>
+    </w:p>
+    <w:p>
+      <w:pPr>
+        <w:spacing w:after="100"/>
+        <w:rPr>
+          <w:rFonts w:asciiTheme="majorBidi" w:hAnsiTheme="majorBidi" w:cstheme="majorBidi"/>
+          <w:sz w:val="40"/>
+          <w:szCs w:val="40"/>
+          <w:lang w:val="en-US"/>
+        </w:rPr>
+      </w:pPr>
+    </w:p>
+    <w:p>
+      <w:pPr>
+        <w:spacing w:after="100"/>
+        <w:rPr>
+          <w:rFonts w:asciiTheme="majorBidi" w:hAnsiTheme="majorBidi" w:cstheme="majorBidi"/>
+          <w:sz w:val="40"/>
+          <w:szCs w:val="40"/>
+          <w:lang w:val="en-US"/>
+        </w:rPr>
+      </w:pPr>
+    </w:p>
+    <w:p>
+      <w:pPr>
+        <w:spacing w:after="100"/>
+        <w:rPr>
+          <w:rFonts w:asciiTheme="majorBidi" w:hAnsiTheme="majorBidi" w:cstheme="majorBidi"/>
+          <w:sz w:val="40"/>
+          <w:szCs w:val="40"/>
+          <w:lang w:val="en-US"/>
+        </w:rPr>
+      </w:pPr>
+    </w:p>
+    <w:p>
+      <w:pPr>
+        <w:spacing w:after="100"/>
+        <w:rPr>
+          <w:rFonts w:asciiTheme="majorBidi" w:hAnsiTheme="majorBidi" w:cstheme="majorBidi"/>
+          <w:sz w:val="40"/>
+          <w:szCs w:val="40"/>
+          <w:lang w:val="en-US"/>
+        </w:rPr>
+      </w:pPr>
+    </w:p>
+    <w:p>
+      <w:pPr>
+        <w:spacing w:after="100"/>
+        <w:rPr>
+          <w:rFonts w:asciiTheme="majorBidi" w:hAnsiTheme="majorBidi" w:cstheme="majorBidi"/>
+          <w:sz w:val="40"/>
+          <w:szCs w:val="40"/>
+          <w:lang w:val="en-US"/>
+        </w:rPr>
+      </w:pPr>
+    </w:p>
+    <w:p>
+      <w:pPr>
+        <w:spacing w:after="100"/>
+        <w:rPr>
+          <w:rFonts w:asciiTheme="majorBidi" w:hAnsiTheme="majorBidi" w:cstheme="majorBidi"/>
+          <w:sz w:val="40"/>
+          <w:szCs w:val="40"/>
+          <w:lang w:val="en-US"/>
+        </w:rPr>
+      </w:pPr>
+    </w:p>
+    <w:p>
+      <w:pPr>
+        <w:spacing w:after="100"/>
+        <w:rPr>
+          <w:rFonts w:asciiTheme="majorBidi" w:hAnsiTheme="majorBidi" w:cstheme="majorBidi"/>
+          <w:sz w:val="40"/>
+          <w:szCs w:val="40"/>
+          <w:lang w:val="en-US"/>
+        </w:rPr>
+      </w:pPr>
+    </w:p>
+    <w:p>
+      <w:pPr>
+        <w:spacing w:after="100"/>
+        <w:rPr>
+          <w:rFonts w:asciiTheme="majorBidi" w:hAnsiTheme="majorBidi" w:cstheme="majorBidi"/>
+          <w:sz w:val="40"/>
+          <w:szCs w:val="40"/>
+          <w:lang w:val="en-US"/>
+        </w:rPr>
+      </w:pPr>
+    </w:p>
+    <w:p>
+      <w:pPr>
+        <w:spacing w:after="100"/>
+        <w:rPr>
+          <w:sz w:val="34"/>
+          <w:szCs w:val="34"/>
+          <w:lang w:val="en-US"/>
+        </w:rPr>
+      </w:pPr>
+      <w:r>
+        <w:rPr>
+          <w:rFonts w:asciiTheme="majorBidi" w:hAnsiTheme="majorBidi" w:cstheme="majorBidi"/>
+          <w:noProof/>
+          <w:sz w:val="40"/>
+          <w:szCs w:val="40"/>
+          <w:lang w:eastAsia="fr-FR"/>
+        </w:rPr>
+        <w:drawing>
+          <wp:inline distT="0" distB="0" distL="0" distR="0" wp14:anchorId="68D15D83" wp14:editId="09EE241E">
+            <wp:extent cx="5755640" cy="3209925"/>
+            <wp:effectExtent l="0" t="0" r="0" b="9525"/>
+            <wp:docPr id="1" name="Image 1"/>
+            <wp:cNvGraphicFramePr>
+              <a:graphicFrameLocks xmlns:a="http://schemas.openxmlformats.org/drawingml/2006/main" noChangeAspect="1"/>
+            </wp:cNvGraphicFramePr>
+            <a:graphic xmlns:a="http://schemas.openxmlformats.org/drawingml/2006/main">
+              <a:graphicData uri="http://schemas.openxmlformats.org/drawingml/2006/picture">
+                <pic:pic xmlns:pic="http://schemas.openxmlformats.org/drawingml/2006/picture">
+                  <pic:nvPicPr>
+                    <pic:cNvPr id="1" name=""/>
+                    <pic:cNvPicPr/>
+                  </pic:nvPicPr>
+                  <pic:blipFill>
+                    <a:blip r:embed="rId6"/>
+                    <a:stretch>
+                      <a:fillRect/>
+                    </a:stretch>
+                  </pic:blipFill>
+                  <pic:spPr>
+                    <a:xfrm>
+                      <a:off x="0" y="0"/>
+                      <a:ext cx="5755640" cy="3209925"/>
+                    </a:xfrm>
+                    <a:prstGeom prst="rect">
+                      <a:avLst/>
+                    </a:prstGeom>
+                  </pic:spPr>
+                </pic:pic>
+              </a:graphicData>
+            </a:graphic>
+          </wp:inline>
+        </w:drawing>
+      </w:r>
+    </w:p>
+    <w:p>
+      <w:pPr>
+        <w:spacing w:after="100"/>
+        <w:rPr>
+          <w:rFonts w:asciiTheme="majorBidi" w:hAnsiTheme="majorBidi" w:cstheme="majorBidi"/>
+          <w:b/>
+          <w:bCs/>
+          <w:sz w:val="32"/>
+          <w:szCs w:val="32"/>
+          <w:lang w:val="en-US"/>
+        </w:rPr>
+      </w:pPr>
+      <w:r>
+        <w:rPr>
+          <w:rFonts w:asciiTheme="majorBidi" w:hAnsiTheme="majorBidi" w:cstheme="majorBidi"/>
+          <w:b/>
+          <w:bCs/>
+          <w:sz w:val="32"/>
+          <w:szCs w:val="32"/>
+          <w:lang w:val="en-US"/>
+        </w:rPr>
+        <w:t>Figure 2.1: Example of children register used in daycare centers</w:t>
+      </w:r>
+    </w:p>
+    <w:p>
+      <w:pPr>
+        <w:spacing w:after="100"/>
+        <w:rPr>
+          <w:rFonts w:asciiTheme="majorBidi" w:hAnsiTheme="majorBidi" w:cstheme="majorBidi"/>
+          <w:b/>
+          <w:bCs/>
+          <w:sz w:val="32"/>
+          <w:szCs w:val="32"/>
+          <w:lang w:val="en-US"/>
+        </w:rPr>
+      </w:pPr>
+    </w:p>
+    <w:p>
+      <w:pPr>
+        <w:spacing w:after="100"/>
+        <w:rPr>
+          <w:rFonts w:asciiTheme="majorBidi" w:hAnsiTheme="majorBidi" w:cstheme="majorBidi"/>
+          <w:b/>
+          <w:bCs/>
+          <w:sz w:val="32"/>
+          <w:szCs w:val="32"/>
+          <w:lang w:val="en-US"/>
+        </w:rPr>
+      </w:pPr>
+    </w:p>
+    <w:p>
+      <w:pPr>
+        <w:spacing w:after="100"/>
+        <w:rPr>
+          <w:rFonts w:asciiTheme="majorBidi" w:hAnsiTheme="majorBidi" w:cstheme="majorBidi"/>
+          <w:b/>
+          <w:bCs/>
+          <w:sz w:val="32"/>
+          <w:szCs w:val="32"/>
+          <w:lang w:val="en-US"/>
+        </w:rPr>
+      </w:pPr>
+    </w:p>
+    <w:p>
+      <w:pPr>
+        <w:spacing w:after="100"/>
+        <w:rPr>
+          <w:rFonts w:asciiTheme="majorBidi" w:hAnsiTheme="majorBidi" w:cstheme="majorBidi"/>
+          <w:b/>
+          <w:bCs/>
+          <w:sz w:val="32"/>
+          <w:szCs w:val="32"/>
+          <w:lang w:val="en-US"/>
+        </w:rPr>
+      </w:pPr>
+    </w:p>
+    <w:p>
+      <w:pPr>
+        <w:spacing w:after="100"/>
+        <w:rPr>
+          <w:rFonts w:asciiTheme="majorBidi" w:hAnsiTheme="majorBidi" w:cstheme="majorBidi"/>
+          <w:b/>
+          <w:bCs/>
+          <w:sz w:val="32"/>
+          <w:szCs w:val="32"/>
+          <w:lang w:val="en-US"/>
+        </w:rPr>
+      </w:pPr>
+    </w:p>
+    <w:p>
+      <w:pPr>
+        <w:spacing w:after="100"/>
+        <w:rPr>
+          <w:rFonts w:asciiTheme="majorBidi" w:hAnsiTheme="majorBidi" w:cstheme="majorBidi"/>
+          <w:b/>
+          <w:bCs/>
+          <w:sz w:val="32"/>
+          <w:szCs w:val="32"/>
+          <w:lang w:val="en-US"/>
+        </w:rPr>
+      </w:pPr>
+    </w:p>
+    <w:p>
+      <w:pPr>
+        <w:spacing w:after="100"/>
+        <w:rPr>
+          <w:rFonts w:asciiTheme="majorBidi" w:hAnsiTheme="majorBidi" w:cstheme="majorBidi"/>
+          <w:b/>
+          <w:bCs/>
+          <w:sz w:val="32"/>
+          <w:szCs w:val="32"/>
+          <w:lang w:val="en-US"/>
+        </w:rPr>
+      </w:pPr>
+    </w:p>
+    <w:p>
+      <w:pPr>
+        <w:spacing w:after="100"/>
+        <w:rPr>
+          <w:rFonts w:asciiTheme="majorBidi" w:hAnsiTheme="majorBidi" w:cstheme="majorBidi"/>
+          <w:b/>
+          <w:bCs/>
+          <w:sz w:val="32"/>
+          <w:szCs w:val="32"/>
+          <w:lang w:val="en-US"/>
+        </w:rPr>
+      </w:pPr>
+    </w:p>
+    <w:p>
+      <w:pPr>
+        <w:spacing w:after="100"/>
+        <w:rPr>
+          <w:rFonts w:asciiTheme="majorBidi" w:hAnsiTheme="majorBidi" w:cstheme="majorBidi"/>
+          <w:b/>
+          <w:bCs/>
+          <w:sz w:val="32"/>
+          <w:szCs w:val="32"/>
+          <w:lang w:val="en-US"/>
+        </w:rPr>
+      </w:pPr>
+    </w:p>
+    <w:p>
+      <w:pPr>
+        <w:spacing w:after="100"/>
+        <w:rPr>
+          <w:rFonts w:asciiTheme="majorBidi" w:hAnsiTheme="majorBidi" w:cstheme="majorBidi"/>
+          <w:b/>
+          <w:bCs/>
+          <w:sz w:val="32"/>
+          <w:szCs w:val="32"/>
+          <w:lang w:val="en-US"/>
+        </w:rPr>
+      </w:pPr>
+    </w:p>
+    <w:p>
+      <w:pPr>
+        <w:spacing w:after="100"/>
+        <w:rPr>
+          <w:rFonts w:asciiTheme="majorBidi" w:hAnsiTheme="majorBidi" w:cstheme="majorBidi"/>
+          <w:b/>
+          <w:bCs/>
+          <w:sz w:val="32"/>
+          <w:szCs w:val="32"/>
+          <w:lang w:val="en-US"/>
+        </w:rPr>
+      </w:pPr>
+    </w:p>
+    <w:p>
+      <w:pPr>
+        <w:spacing w:after="100"/>
+        <w:rPr>
+          <w:rFonts w:asciiTheme="majorBidi" w:hAnsiTheme="majorBidi" w:cstheme="majorBidi"/>
+          <w:b/>
+          <w:bCs/>
+          <w:sz w:val="32"/>
+          <w:szCs w:val="32"/>
+          <w:lang w:val="en-US"/>
+        </w:rPr>
+      </w:pPr>
+    </w:p>
+    <w:p>
+      <w:pPr>
+        <w:spacing w:after="100"/>
+        <w:rPr>
+          <w:rFonts w:asciiTheme="majorBidi" w:hAnsiTheme="majorBidi" w:cstheme="majorBidi"/>
+          <w:b/>
+          <w:bCs/>
+          <w:sz w:val="32"/>
+          <w:szCs w:val="32"/>
+          <w:lang w:val="en-US"/>
+        </w:rPr>
+      </w:pPr>
+    </w:p>
+    <w:p>
+      <w:pPr>
+        <w:spacing w:after="100"/>
+        <w:rPr>
+          <w:rFonts w:asciiTheme="majorBidi" w:hAnsiTheme="majorBidi" w:cstheme="majorBidi"/>
+          <w:b/>
+          <w:bCs/>
+          <w:sz w:val="32"/>
+          <w:szCs w:val="32"/>
+          <w:lang w:val="en-US"/>
+        </w:rPr>
+      </w:pPr>
+    </w:p>
+    <w:p>
+      <w:pPr>
+        <w:spacing w:after="100"/>
+        <w:rPr>
+          <w:rFonts w:asciiTheme="majorBidi" w:hAnsiTheme="majorBidi" w:cstheme="majorBidi"/>
+          <w:b/>
+          <w:bCs/>
+          <w:sz w:val="32"/>
+          <w:szCs w:val="32"/>
+          <w:lang w:val="en-US"/>
+        </w:rPr>
+      </w:pPr>
+    </w:p>
+    <w:p>
+      <w:pPr>
+        <w:spacing w:after="100"/>
+        <w:rPr>
+          <w:rFonts w:asciiTheme="majorBidi" w:hAnsiTheme="majorBidi" w:cstheme="majorBidi"/>
+          <w:b/>
+          <w:bCs/>
+          <w:sz w:val="32"/>
+          <w:szCs w:val="32"/>
+          <w:lang w:val="en-US"/>
+        </w:rPr>
+      </w:pPr>
+    </w:p>
+    <w:p>
+      <w:pPr>
+        <w:spacing w:after="100"/>
+        <w:rPr>
+          <w:rFonts w:ascii="Goudy Old Style" w:hAnsi="Goudy Old Style"/>
+          <w:b/>
+          <w:bCs/>
+          <w:sz w:val="16"/>
+          <w:szCs w:val="16"/>
+          <w:lang w:val="en-US"/>
+        </w:rPr>
+      </w:pPr>
+      <w:r>
+        <w:rPr>
+          <w:rFonts w:ascii="Goudy Old Style" w:hAnsi="Goudy Old Style"/>
+          <w:b/>
+          <w:bCs/>
+          <w:sz w:val="72"/>
+          <w:szCs w:val="72"/>
+          <w:lang w:val="en-US"/>
+        </w:rPr>
+        <w:lastRenderedPageBreak/>
+        <w:t xml:space="preserve">Attendance Management </w:t>
+      </w:r>
+    </w:p>
+    <w:p>
+      <w:pPr>
+        <w:spacing w:after="100"/>
+        <w:rPr>
+          <w:rFonts w:ascii="Goudy Old Style" w:hAnsi="Goudy Old Style"/>
+          <w:b/>
+          <w:bCs/>
+          <w:sz w:val="8"/>
+          <w:szCs w:val="8"/>
+          <w:lang w:val="en-US"/>
+        </w:rPr>
+      </w:pPr>
+    </w:p>
+    <w:p>
+      <w:pPr>
+        <w:spacing w:after="100"/>
+        <w:rPr>
+          <w:rFonts w:asciiTheme="majorBidi" w:hAnsiTheme="majorBidi" w:cstheme="majorBidi"/>
+          <w:sz w:val="36"/>
+          <w:szCs w:val="36"/>
+          <w:lang w:val="en-US"/>
+        </w:rPr>
+      </w:pPr>
+      <w:r>
+        <w:rPr>
+          <w:rFonts w:asciiTheme="majorBidi" w:hAnsiTheme="majorBidi" w:cstheme="majorBidi"/>
+          <w:sz w:val="36"/>
+          <w:szCs w:val="36"/>
+          <w:lang w:val="en-US"/>
+        </w:rPr>
+        <w:t>Management of attendance at daycare centers is typically performed manually through the use of paper registers and tables. Educators fill out specific forms for each day depending on whether the child attended or not.</w:t>
+      </w:r>
+    </w:p>
+    <w:p>
+      <w:pPr>
+        <w:spacing w:after="100"/>
+        <w:rPr>
+          <w:rFonts w:asciiTheme="majorBidi" w:hAnsiTheme="majorBidi" w:cstheme="majorBidi"/>
+          <w:sz w:val="4"/>
+          <w:szCs w:val="4"/>
+          <w:lang w:val="en-US"/>
+        </w:rPr>
+      </w:pPr>
+    </w:p>
+    <w:p>
+      <w:pPr>
+        <w:spacing w:after="100"/>
+        <w:rPr>
+          <w:rFonts w:asciiTheme="majorBidi" w:hAnsiTheme="majorBidi" w:cstheme="majorBidi"/>
+          <w:sz w:val="36"/>
+          <w:szCs w:val="36"/>
+          <w:lang w:val="en-US"/>
+        </w:rPr>
+      </w:pPr>
+      <w:r>
+        <w:rPr>
+          <w:rFonts w:asciiTheme="majorBidi" w:hAnsiTheme="majorBidi" w:cstheme="majorBidi"/>
+          <w:sz w:val="36"/>
+          <w:szCs w:val="36"/>
+          <w:lang w:val="en-US"/>
+        </w:rPr>
+        <w:t>This system usually involves the use of physical forms with data input done daily, making access and updating of the data quite challenging. When mistakes happen, it is difficult to modify the records correctly.</w:t>
+      </w:r>
+    </w:p>
+    <w:p>
+      <w:pPr>
+        <w:spacing w:after="100"/>
+        <w:rPr>
+          <w:rFonts w:asciiTheme="majorBidi" w:hAnsiTheme="majorBidi" w:cstheme="majorBidi"/>
+          <w:sz w:val="4"/>
+          <w:szCs w:val="4"/>
+          <w:lang w:val="en-US"/>
+        </w:rPr>
+      </w:pPr>
+    </w:p>
+    <w:p>
+      <w:pPr>
+        <w:spacing w:after="100"/>
+        <w:rPr>
+          <w:rFonts w:asciiTheme="majorBidi" w:hAnsiTheme="majorBidi" w:cstheme="majorBidi"/>
+          <w:sz w:val="36"/>
+          <w:szCs w:val="36"/>
+          <w:lang w:val="en-US"/>
+        </w:rPr>
+      </w:pPr>
+      <w:r>
+        <w:rPr>
+          <w:rFonts w:asciiTheme="majorBidi" w:hAnsiTheme="majorBidi" w:cstheme="majorBidi"/>
+          <w:sz w:val="36"/>
+          <w:szCs w:val="36"/>
+          <w:lang w:val="en-US"/>
+        </w:rPr>
+        <w:t>Moreover, monitoring attendance within a certain period of time would require the analysis of several different registers, making the whole process very lengthy and possibly confusing.</w:t>
+      </w:r>
+    </w:p>
+    <w:p>
+      <w:pPr>
+        <w:spacing w:after="100"/>
+        <w:rPr>
+          <w:rFonts w:asciiTheme="majorBidi" w:hAnsiTheme="majorBidi" w:cstheme="majorBidi"/>
+          <w:b/>
+          <w:bCs/>
+          <w:sz w:val="28"/>
+          <w:szCs w:val="28"/>
+          <w:lang w:val="en-US"/>
+        </w:rPr>
+      </w:pPr>
+    </w:p>
+    <w:p>
+      <w:pPr>
+        <w:spacing w:after="100"/>
+        <w:rPr>
+          <w:rFonts w:asciiTheme="majorBidi" w:hAnsiTheme="majorBidi" w:cstheme="majorBidi"/>
+          <w:b/>
+          <w:bCs/>
+          <w:sz w:val="32"/>
+          <w:szCs w:val="32"/>
+          <w:lang w:val="en-US"/>
+        </w:rPr>
+      </w:pPr>
+      <w:r>
+        <w:rPr>
+          <w:rFonts w:asciiTheme="majorBidi" w:hAnsiTheme="majorBidi" w:cstheme="majorBidi"/>
+          <w:b/>
+          <w:bCs/>
+          <w:noProof/>
+          <w:sz w:val="32"/>
+          <w:szCs w:val="32"/>
+          <w:lang w:eastAsia="fr-FR"/>
+        </w:rPr>
+        <w:drawing>
+          <wp:inline distT="0" distB="0" distL="0" distR="0" wp14:anchorId="44625CB8" wp14:editId="69FF1A86">
+            <wp:extent cx="5715000" cy="4610099"/>
+            <wp:effectExtent l="0" t="0" r="0" b="635"/>
+            <wp:docPr id="2" name="Image 2"/>
+            <wp:cNvGraphicFramePr>
+              <a:graphicFrameLocks xmlns:a="http://schemas.openxmlformats.org/drawingml/2006/main" noChangeAspect="1"/>
+            </wp:cNvGraphicFramePr>
+            <a:graphic xmlns:a="http://schemas.openxmlformats.org/drawingml/2006/main">
+              <a:graphicData uri="http://schemas.openxmlformats.org/drawingml/2006/picture">
+                <pic:pic xmlns:pic="http://schemas.openxmlformats.org/drawingml/2006/picture">
+                  <pic:nvPicPr>
+                    <pic:cNvPr id="1" name=""/>
+                    <pic:cNvPicPr/>
+                  </pic:nvPicPr>
+                  <pic:blipFill>
+                    <a:blip r:embed="rId7"/>
+                    <a:stretch>
+                      <a:fillRect/>
+                    </a:stretch>
+                  </pic:blipFill>
+                  <pic:spPr>
+                    <a:xfrm>
+                      <a:off x="0" y="0"/>
+                      <a:ext cx="5772679" cy="4656626"/>
+                    </a:xfrm>
+                    <a:prstGeom prst="rect">
+                      <a:avLst/>
+                    </a:prstGeom>
+                  </pic:spPr>
+                </pic:pic>
+              </a:graphicData>
+            </a:graphic>
+          </wp:inline>
+        </w:drawing>
+      </w:r>
+    </w:p>
+    <w:p>
+      <w:pPr>
+        <w:spacing w:after="100"/>
+        <w:rPr>
+          <w:rFonts w:asciiTheme="majorBidi" w:hAnsiTheme="majorBidi" w:cstheme="majorBidi"/>
+          <w:b/>
+          <w:bCs/>
+          <w:sz w:val="32"/>
+          <w:szCs w:val="32"/>
+          <w:lang w:val="en-US"/>
+        </w:rPr>
+      </w:pPr>
+      <w:r>
+        <w:rPr>
+          <w:rFonts w:asciiTheme="majorBidi" w:hAnsiTheme="majorBidi" w:cstheme="majorBidi"/>
+          <w:b/>
+          <w:bCs/>
+          <w:sz w:val="32"/>
+          <w:szCs w:val="32"/>
+          <w:lang w:val="en-US"/>
+        </w:rPr>
+        <w:t xml:space="preserve">             </w:t>
+      </w:r>
+      <w:r>
+        <w:rPr>
+          <w:rFonts w:asciiTheme="majorBidi" w:hAnsiTheme="majorBidi" w:cstheme="majorBidi"/>
+          <w:b/>
+          <w:bCs/>
+          <w:sz w:val="32"/>
+          <w:szCs w:val="32"/>
+          <w:lang w:val="en-US"/>
+        </w:rPr>
+        <w:t>Figure 2.2: Example of attendance table in Excel</w:t>
+      </w:r>
+    </w:p>
+    <w:p>
+      <w:pPr>
+        <w:spacing w:after="100"/>
+        <w:rPr>
+          <w:rFonts w:ascii="Goudy Old Style" w:hAnsi="Goudy Old Style"/>
+          <w:b/>
+          <w:bCs/>
+          <w:sz w:val="16"/>
+          <w:szCs w:val="16"/>
+          <w:lang w:val="en-US"/>
+        </w:rPr>
+      </w:pPr>
+      <w:r>
+        <w:rPr>
+          <w:rFonts w:ascii="Goudy Old Style" w:hAnsi="Goudy Old Style"/>
+          <w:b/>
+          <w:bCs/>
+          <w:sz w:val="72"/>
+          <w:szCs w:val="72"/>
+          <w:lang w:val="en-US"/>
+        </w:rPr>
+        <w:lastRenderedPageBreak/>
+        <w:t>Employee Management</w:t>
+      </w:r>
+    </w:p>
+    <w:p>
+      <w:pPr>
+        <w:spacing w:after="100"/>
+        <w:rPr>
+          <w:rFonts w:ascii="Goudy Old Style" w:hAnsi="Goudy Old Style"/>
+          <w:b/>
+          <w:bCs/>
+          <w:sz w:val="16"/>
+          <w:szCs w:val="16"/>
+          <w:lang w:val="en-US"/>
+        </w:rPr>
+      </w:pPr>
+    </w:p>
+    <w:p>
+      <w:pPr>
+        <w:spacing w:after="100"/>
+        <w:rPr>
+          <w:rFonts w:asciiTheme="majorBidi" w:hAnsiTheme="majorBidi" w:cstheme="majorBidi"/>
+          <w:sz w:val="16"/>
+          <w:szCs w:val="16"/>
+          <w:lang w:val="en-US"/>
+        </w:rPr>
+      </w:pPr>
+      <w:r>
+        <w:rPr>
+          <w:rFonts w:asciiTheme="majorBidi" w:hAnsiTheme="majorBidi" w:cstheme="majorBidi"/>
+          <w:sz w:val="40"/>
+          <w:szCs w:val="40"/>
+          <w:lang w:val="en-US"/>
+        </w:rPr>
+        <w:t>Employee management in daycare centers is generally carried out in a traditional way using paper files. Each employee has a file containing personal information such as name, surname, contact details, job position,</w:t>
+      </w:r>
+      <w:r>
+        <w:rPr>
+          <w:rFonts w:asciiTheme="majorBidi" w:hAnsiTheme="majorBidi" w:cstheme="majorBidi"/>
+          <w:sz w:val="40"/>
+          <w:szCs w:val="40"/>
+          <w:lang w:val="en-US"/>
+        </w:rPr>
+        <w:t xml:space="preserve"> salary,</w:t>
+      </w:r>
+      <w:r>
+        <w:rPr>
+          <w:rFonts w:asciiTheme="majorBidi" w:hAnsiTheme="majorBidi" w:cstheme="majorBidi"/>
+          <w:sz w:val="40"/>
+          <w:szCs w:val="40"/>
+          <w:lang w:val="en-US"/>
+        </w:rPr>
+        <w:t xml:space="preserve"> and working schedule.</w:t>
+      </w:r>
+    </w:p>
+    <w:p>
+      <w:pPr>
+        <w:spacing w:after="100"/>
+        <w:rPr>
+          <w:rFonts w:asciiTheme="majorBidi" w:hAnsiTheme="majorBidi" w:cstheme="majorBidi"/>
+          <w:sz w:val="16"/>
+          <w:szCs w:val="16"/>
+          <w:lang w:val="en-US"/>
+        </w:rPr>
+      </w:pPr>
+    </w:p>
+    <w:p>
+      <w:pPr>
+        <w:spacing w:after="100"/>
+        <w:rPr>
+          <w:rFonts w:asciiTheme="majorBidi" w:hAnsiTheme="majorBidi" w:cstheme="majorBidi"/>
+          <w:sz w:val="16"/>
+          <w:szCs w:val="16"/>
+          <w:lang w:val="en-US"/>
+        </w:rPr>
+      </w:pPr>
+      <w:r>
+        <w:rPr>
+          <w:rFonts w:asciiTheme="majorBidi" w:hAnsiTheme="majorBidi" w:cstheme="majorBidi"/>
+          <w:sz w:val="40"/>
+          <w:szCs w:val="40"/>
+          <w:lang w:val="en-US"/>
+        </w:rPr>
+        <w:t>This information is often stored in a non-centralized manner, which makes it difficult to access and update. Any modification of data requires manual intervention, which increases the risk of errors or inconsistencies in the records.</w:t>
+      </w:r>
+    </w:p>
+    <w:p>
+      <w:pPr>
+        <w:spacing w:after="100"/>
+        <w:rPr>
+          <w:rFonts w:asciiTheme="majorBidi" w:hAnsiTheme="majorBidi" w:cstheme="majorBidi"/>
+          <w:sz w:val="16"/>
+          <w:szCs w:val="16"/>
+          <w:lang w:val="en-US"/>
+        </w:rPr>
+      </w:pPr>
+    </w:p>
+    <w:p>
+      <w:pPr>
+        <w:spacing w:after="100"/>
+        <w:rPr>
+          <w:rFonts w:asciiTheme="majorBidi" w:hAnsiTheme="majorBidi" w:cstheme="majorBidi"/>
+          <w:sz w:val="40"/>
+          <w:szCs w:val="40"/>
+          <w:lang w:val="en-US"/>
+        </w:rPr>
+      </w:pPr>
+      <w:r>
+        <w:rPr>
+          <w:rFonts w:asciiTheme="majorBidi" w:hAnsiTheme="majorBidi" w:cstheme="majorBidi"/>
+          <w:sz w:val="40"/>
+          <w:szCs w:val="40"/>
+          <w:lang w:val="en-US"/>
+        </w:rPr>
+        <w:t>In addition, tracking employees, such as managing attendance, absences, or schedules, is often done separately and without an automated tool. This can lead to a lack of organization and a loss of time in the daily management of staff.</w:t>
+      </w:r>
+    </w:p>
+    <w:p>
+      <w:pPr>
+        <w:spacing w:after="100"/>
+        <w:rPr>
+          <w:rFonts w:asciiTheme="majorBidi" w:hAnsiTheme="majorBidi" w:cstheme="majorBidi"/>
+          <w:b/>
+          <w:bCs/>
+          <w:sz w:val="32"/>
+          <w:szCs w:val="32"/>
+          <w:lang w:val="en-US"/>
+        </w:rPr>
+      </w:pPr>
+    </w:p>
+    <w:p>
+      <w:pPr>
+        <w:spacing w:after="100"/>
+        <w:rPr>
+          <w:rFonts w:asciiTheme="majorBidi" w:hAnsiTheme="majorBidi" w:cstheme="majorBidi"/>
+          <w:b/>
+          <w:bCs/>
+          <w:sz w:val="32"/>
+          <w:szCs w:val="32"/>
+          <w:lang w:val="en-US"/>
+        </w:rPr>
+      </w:pPr>
+    </w:p>
+    <w:p>
+      <w:pPr>
+        <w:spacing w:after="100"/>
+        <w:rPr>
+          <w:rFonts w:asciiTheme="majorBidi" w:hAnsiTheme="majorBidi" w:cstheme="majorBidi"/>
+          <w:b/>
+          <w:bCs/>
+          <w:sz w:val="32"/>
+          <w:szCs w:val="32"/>
+          <w:lang w:val="en-US"/>
+        </w:rPr>
+      </w:pPr>
+    </w:p>
+    <w:p>
+      <w:pPr>
+        <w:spacing w:after="100"/>
+        <w:rPr>
+          <w:rFonts w:asciiTheme="majorBidi" w:hAnsiTheme="majorBidi" w:cstheme="majorBidi"/>
+          <w:b/>
+          <w:bCs/>
+          <w:sz w:val="32"/>
+          <w:szCs w:val="32"/>
+          <w:lang w:val="en-US"/>
+        </w:rPr>
+      </w:pPr>
+    </w:p>
+    <w:p>
+      <w:pPr>
+        <w:spacing w:after="100"/>
+        <w:rPr>
+          <w:rFonts w:asciiTheme="majorBidi" w:hAnsiTheme="majorBidi" w:cstheme="majorBidi"/>
+          <w:b/>
+          <w:bCs/>
+          <w:sz w:val="32"/>
+          <w:szCs w:val="32"/>
+          <w:lang w:val="en-US"/>
+        </w:rPr>
+      </w:pPr>
+    </w:p>
+    <w:p>
+      <w:pPr>
+        <w:spacing w:after="100"/>
+        <w:rPr>
+          <w:rFonts w:asciiTheme="majorBidi" w:hAnsiTheme="majorBidi" w:cstheme="majorBidi"/>
+          <w:b/>
+          <w:bCs/>
+          <w:sz w:val="32"/>
+          <w:szCs w:val="32"/>
+          <w:lang w:val="en-US"/>
+        </w:rPr>
+      </w:pPr>
+    </w:p>
+    <w:p>
+      <w:pPr>
+        <w:spacing w:after="100"/>
+        <w:rPr>
+          <w:rFonts w:asciiTheme="majorBidi" w:hAnsiTheme="majorBidi" w:cstheme="majorBidi"/>
+          <w:b/>
+          <w:bCs/>
+          <w:sz w:val="32"/>
+          <w:szCs w:val="32"/>
+          <w:lang w:val="en-US"/>
+        </w:rPr>
+      </w:pPr>
+    </w:p>
+    <w:p>
+      <w:pPr>
+        <w:spacing w:after="100"/>
+        <w:rPr>
+          <w:rFonts w:asciiTheme="majorBidi" w:hAnsiTheme="majorBidi" w:cstheme="majorBidi"/>
+          <w:b/>
+          <w:bCs/>
+          <w:sz w:val="32"/>
+          <w:szCs w:val="32"/>
+          <w:lang w:val="en-US"/>
+        </w:rPr>
+      </w:pPr>
+    </w:p>
+    <w:p>
+      <w:pPr>
+        <w:spacing w:after="100"/>
+        <w:rPr>
+          <w:rFonts w:asciiTheme="majorBidi" w:hAnsiTheme="majorBidi" w:cstheme="majorBidi"/>
+          <w:b/>
+          <w:bCs/>
+          <w:sz w:val="32"/>
+          <w:szCs w:val="32"/>
+          <w:lang w:val="en-US"/>
+        </w:rPr>
+      </w:pPr>
+    </w:p>
+    <w:p>
+      <w:pPr>
+        <w:spacing w:after="100"/>
+        <w:rPr>
+          <w:rFonts w:asciiTheme="majorBidi" w:hAnsiTheme="majorBidi" w:cstheme="majorBidi"/>
+          <w:b/>
+          <w:bCs/>
+          <w:sz w:val="32"/>
+          <w:szCs w:val="32"/>
+          <w:lang w:val="en-US"/>
+        </w:rPr>
+      </w:pPr>
+    </w:p>
+    <w:p>
+      <w:pPr>
+        <w:spacing w:after="100"/>
+        <w:rPr>
+          <w:rFonts w:ascii="Goudy Old Style" w:hAnsi="Goudy Old Style"/>
+          <w:b/>
+          <w:bCs/>
+          <w:sz w:val="16"/>
+          <w:szCs w:val="16"/>
+        </w:rPr>
+      </w:pPr>
+      <w:r>
+        <w:rPr>
+          <w:rFonts w:ascii="Goudy Old Style" w:hAnsi="Goudy Old Style"/>
+          <w:b/>
+          <w:bCs/>
+          <w:sz w:val="72"/>
+          <w:szCs w:val="72"/>
+        </w:rPr>
+        <w:lastRenderedPageBreak/>
+        <w:t>Payment Management</w:t>
+      </w:r>
+      <w:r>
+        <w:rPr>
+          <w:rFonts w:ascii="Goudy Old Style" w:hAnsi="Goudy Old Style"/>
+          <w:b/>
+          <w:bCs/>
+          <w:sz w:val="72"/>
+          <w:szCs w:val="72"/>
+        </w:rPr>
+        <w:t xml:space="preserve"> </w:t>
+      </w:r>
+    </w:p>
+    <w:p>
+      <w:pPr>
+        <w:spacing w:after="100"/>
+        <w:rPr>
+          <w:rFonts w:ascii="Goudy Old Style" w:hAnsi="Goudy Old Style"/>
+          <w:b/>
+          <w:bCs/>
+          <w:sz w:val="16"/>
+          <w:szCs w:val="16"/>
+          <w:lang w:val="en-US"/>
+        </w:rPr>
+      </w:pPr>
+    </w:p>
+    <w:p>
+      <w:pPr>
+        <w:spacing w:after="100"/>
+        <w:rPr>
+          <w:rFonts w:asciiTheme="majorBidi" w:hAnsiTheme="majorBidi" w:cstheme="majorBidi"/>
+          <w:sz w:val="40"/>
+          <w:szCs w:val="40"/>
+          <w:lang w:val="en-US"/>
+        </w:rPr>
+      </w:pPr>
+      <w:r>
+        <w:rPr>
+          <w:rFonts w:asciiTheme="majorBidi" w:hAnsiTheme="majorBidi" w:cstheme="majorBidi"/>
+          <w:sz w:val="40"/>
+          <w:szCs w:val="40"/>
+          <w:lang w:val="en-US"/>
+        </w:rPr>
+        <w:t>Payments in childcare institutions are usually made using the conventional method by maintaining manual records and documents. The payments made manually are usually noted along with details such as the amount of money received, the month in which the payment is made, and the date of payment for each child.</w:t>
+      </w:r>
+    </w:p>
+    <w:p>
+      <w:pPr>
+        <w:spacing w:after="100"/>
+        <w:rPr>
+          <w:rFonts w:asciiTheme="majorBidi" w:hAnsiTheme="majorBidi" w:cstheme="majorBidi"/>
+          <w:sz w:val="16"/>
+          <w:szCs w:val="16"/>
+          <w:lang w:val="en-US"/>
+        </w:rPr>
+      </w:pPr>
+    </w:p>
+    <w:p>
+      <w:pPr>
+        <w:spacing w:after="100"/>
+        <w:rPr>
+          <w:rFonts w:asciiTheme="majorBidi" w:hAnsiTheme="majorBidi" w:cstheme="majorBidi"/>
+          <w:sz w:val="40"/>
+          <w:szCs w:val="40"/>
+          <w:lang w:val="en-US"/>
+        </w:rPr>
+      </w:pPr>
+      <w:r>
+        <w:rPr>
+          <w:rFonts w:asciiTheme="majorBidi" w:hAnsiTheme="majorBidi" w:cstheme="majorBidi"/>
+          <w:sz w:val="40"/>
+          <w:szCs w:val="40"/>
+          <w:lang w:val="en-US"/>
+        </w:rPr>
+        <w:t>Usually, payments are made by issuing a receipt for payment that is manually filled. Such a receipt serves as a proof of the payment that is made by parents.</w:t>
+      </w:r>
+    </w:p>
+    <w:p>
+      <w:pPr>
+        <w:spacing w:after="100"/>
+        <w:rPr>
+          <w:rFonts w:asciiTheme="majorBidi" w:hAnsiTheme="majorBidi" w:cstheme="majorBidi"/>
+          <w:sz w:val="16"/>
+          <w:szCs w:val="16"/>
+          <w:lang w:val="en-US"/>
+        </w:rPr>
+      </w:pPr>
+    </w:p>
+    <w:p>
+      <w:pPr>
+        <w:spacing w:after="100"/>
+        <w:rPr>
+          <w:rFonts w:asciiTheme="majorBidi" w:hAnsiTheme="majorBidi" w:cstheme="majorBidi"/>
+          <w:b/>
+          <w:bCs/>
+          <w:sz w:val="32"/>
+          <w:szCs w:val="32"/>
+          <w:lang w:val="en-US"/>
+        </w:rPr>
+      </w:pPr>
+      <w:r>
+        <w:rPr>
+          <w:rFonts w:asciiTheme="majorBidi" w:hAnsiTheme="majorBidi" w:cstheme="majorBidi"/>
+          <w:sz w:val="40"/>
+          <w:szCs w:val="40"/>
+          <w:lang w:val="en-US"/>
+        </w:rPr>
+        <w:t>This process of keeping track of payments is inefficient as the documents are maintained individually and can be difficult to track and monitor. Checking the history of previous payments or even the payment status of a particular child becomes very tedious.</w:t>
+      </w:r>
+    </w:p>
+    <w:p>
+      <w:pPr>
+        <w:spacing w:after="100"/>
+        <w:rPr>
+          <w:rFonts w:asciiTheme="majorBidi" w:hAnsiTheme="majorBidi" w:cstheme="majorBidi"/>
+          <w:b/>
+          <w:bCs/>
+          <w:sz w:val="32"/>
+          <w:szCs w:val="32"/>
+          <w:lang w:val="en-US"/>
+        </w:rPr>
+      </w:pPr>
+    </w:p>
+    <w:p>
+      <w:pPr>
+        <w:spacing w:after="100"/>
+        <w:rPr>
+          <w:rFonts w:asciiTheme="majorBidi" w:hAnsiTheme="majorBidi" w:cstheme="majorBidi"/>
+          <w:b/>
+          <w:bCs/>
+          <w:sz w:val="32"/>
+          <w:szCs w:val="32"/>
+          <w:lang w:val="en-US"/>
+        </w:rPr>
+      </w:pPr>
+    </w:p>
+    <w:p>
+      <w:pPr>
+        <w:spacing w:after="100"/>
+        <w:rPr>
+          <w:rFonts w:asciiTheme="majorBidi" w:hAnsiTheme="majorBidi" w:cstheme="majorBidi"/>
+          <w:b/>
+          <w:bCs/>
+          <w:sz w:val="32"/>
+          <w:szCs w:val="32"/>
+          <w:lang w:val="en-US"/>
+        </w:rPr>
+      </w:pPr>
+    </w:p>
+    <w:p>
+      <w:pPr>
+        <w:spacing w:after="100"/>
+        <w:rPr>
+          <w:rFonts w:asciiTheme="majorBidi" w:hAnsiTheme="majorBidi" w:cstheme="majorBidi"/>
+          <w:b/>
+          <w:bCs/>
+          <w:sz w:val="32"/>
+          <w:szCs w:val="32"/>
+          <w:lang w:val="en-US"/>
+        </w:rPr>
+      </w:pPr>
+    </w:p>
+    <w:p>
+      <w:pPr>
+        <w:spacing w:after="100"/>
+        <w:rPr>
+          <w:rFonts w:asciiTheme="majorBidi" w:hAnsiTheme="majorBidi" w:cstheme="majorBidi"/>
+          <w:b/>
+          <w:bCs/>
+          <w:sz w:val="32"/>
+          <w:szCs w:val="32"/>
+          <w:lang w:val="en-US"/>
+        </w:rPr>
+      </w:pPr>
+    </w:p>
+    <w:p>
+      <w:pPr>
+        <w:spacing w:after="100"/>
+        <w:rPr>
+          <w:rFonts w:asciiTheme="majorBidi" w:hAnsiTheme="majorBidi" w:cstheme="majorBidi"/>
+          <w:b/>
+          <w:bCs/>
+          <w:sz w:val="32"/>
+          <w:szCs w:val="32"/>
+          <w:lang w:val="en-US"/>
+        </w:rPr>
+      </w:pPr>
+    </w:p>
+    <w:p>
+      <w:pPr>
+        <w:spacing w:after="100"/>
+        <w:rPr>
+          <w:rFonts w:asciiTheme="majorBidi" w:hAnsiTheme="majorBidi" w:cstheme="majorBidi"/>
+          <w:b/>
+          <w:bCs/>
+          <w:sz w:val="32"/>
+          <w:szCs w:val="32"/>
+          <w:lang w:val="en-US"/>
+        </w:rPr>
+      </w:pPr>
+    </w:p>
+    <w:p>
+      <w:pPr>
+        <w:spacing w:after="100"/>
+        <w:rPr>
+          <w:rFonts w:asciiTheme="majorBidi" w:hAnsiTheme="majorBidi" w:cstheme="majorBidi"/>
+          <w:b/>
+          <w:bCs/>
+          <w:sz w:val="32"/>
+          <w:szCs w:val="32"/>
+          <w:lang w:val="en-US"/>
+        </w:rPr>
+      </w:pPr>
+    </w:p>
+    <w:p>
+      <w:pPr>
+        <w:spacing w:after="100"/>
+        <w:rPr>
+          <w:rFonts w:asciiTheme="majorBidi" w:hAnsiTheme="majorBidi" w:cstheme="majorBidi"/>
+          <w:b/>
+          <w:bCs/>
+          <w:sz w:val="32"/>
+          <w:szCs w:val="32"/>
+          <w:lang w:val="en-US"/>
+        </w:rPr>
+      </w:pPr>
+    </w:p>
+    <w:p>
+      <w:pPr>
+        <w:spacing w:after="100"/>
+        <w:rPr>
+          <w:rFonts w:asciiTheme="majorBidi" w:hAnsiTheme="majorBidi" w:cstheme="majorBidi"/>
+          <w:b/>
+          <w:bCs/>
+          <w:sz w:val="32"/>
+          <w:szCs w:val="32"/>
+          <w:lang w:val="en-US"/>
+        </w:rPr>
+      </w:pPr>
+    </w:p>
+    <w:p>
+      <w:pPr>
+        <w:spacing w:after="100"/>
+        <w:rPr>
+          <w:rFonts w:asciiTheme="majorBidi" w:hAnsiTheme="majorBidi" w:cstheme="majorBidi"/>
+          <w:b/>
+          <w:bCs/>
+          <w:sz w:val="32"/>
+          <w:szCs w:val="32"/>
+          <w:lang w:val="en-US"/>
+        </w:rPr>
+      </w:pPr>
+    </w:p>
+    <w:p>
+      <w:pPr>
+        <w:spacing w:after="100"/>
+        <w:rPr>
+          <w:rFonts w:ascii="Goudy Old Style" w:hAnsi="Goudy Old Style"/>
+          <w:b/>
+          <w:bCs/>
+          <w:sz w:val="16"/>
+          <w:szCs w:val="16"/>
+          <w:lang w:val="en-US"/>
+        </w:rPr>
+      </w:pPr>
+      <w:r>
+        <w:rPr>
+          <w:rFonts w:ascii="Goudy Old Style" w:hAnsi="Goudy Old Style"/>
+          <w:b/>
+          <w:bCs/>
+          <w:sz w:val="72"/>
+          <w:szCs w:val="72"/>
+          <w:lang w:val="en-US"/>
+        </w:rPr>
+        <w:lastRenderedPageBreak/>
+        <w:t xml:space="preserve">Criticism </w:t>
+      </w:r>
+      <w:r>
+        <w:rPr>
+          <w:rFonts w:ascii="Goudy Old Style" w:hAnsi="Goudy Old Style"/>
+          <w:b/>
+          <w:bCs/>
+          <w:sz w:val="72"/>
+          <w:szCs w:val="72"/>
+          <w:lang w:val="en-US"/>
+        </w:rPr>
+        <w:t>of the Existing System</w:t>
+      </w:r>
+    </w:p>
+    <w:p>
+      <w:pPr>
+        <w:spacing w:after="100"/>
+        <w:rPr>
+          <w:rFonts w:ascii="Goudy Old Style" w:hAnsi="Goudy Old Style"/>
+          <w:b/>
+          <w:bCs/>
+          <w:sz w:val="16"/>
+          <w:szCs w:val="16"/>
+          <w:lang w:val="en-US"/>
+        </w:rPr>
+      </w:pPr>
+    </w:p>
+    <w:p>
+      <w:pPr>
+        <w:spacing w:after="100"/>
+        <w:rPr>
+          <w:rFonts w:asciiTheme="majorBidi" w:hAnsiTheme="majorBidi" w:cstheme="majorBidi"/>
+          <w:sz w:val="16"/>
+          <w:szCs w:val="16"/>
+          <w:lang w:val="en-US"/>
+        </w:rPr>
+      </w:pPr>
+      <w:r>
+        <w:rPr>
+          <w:rFonts w:asciiTheme="majorBidi" w:hAnsiTheme="majorBidi" w:cstheme="majorBidi"/>
+          <w:sz w:val="40"/>
+          <w:szCs w:val="40"/>
+          <w:lang w:val="en-US"/>
+        </w:rPr>
+        <w:t>The current process for management in daycare centers relies mostly on manual processes and tools. Even though the process might still be functional, there are certain problems that make the process less effective.</w:t>
+      </w:r>
+    </w:p>
+    <w:p>
+      <w:pPr>
+        <w:spacing w:after="100"/>
+        <w:rPr>
+          <w:rFonts w:asciiTheme="majorBidi" w:hAnsiTheme="majorBidi" w:cstheme="majorBidi"/>
+          <w:sz w:val="16"/>
+          <w:szCs w:val="16"/>
+          <w:lang w:val="en-US"/>
+        </w:rPr>
+      </w:pPr>
+    </w:p>
+    <w:p>
+      <w:pPr>
+        <w:spacing w:after="100"/>
+        <w:rPr>
+          <w:rFonts w:asciiTheme="majorBidi" w:hAnsiTheme="majorBidi" w:cstheme="majorBidi"/>
+          <w:sz w:val="16"/>
+          <w:szCs w:val="16"/>
+          <w:lang w:val="en-US"/>
+        </w:rPr>
+      </w:pPr>
+      <w:r>
+        <w:rPr>
+          <w:rFonts w:asciiTheme="majorBidi" w:hAnsiTheme="majorBidi" w:cstheme="majorBidi"/>
+          <w:sz w:val="40"/>
+          <w:szCs w:val="40"/>
+          <w:lang w:val="en-US"/>
+        </w:rPr>
+        <w:t>For example, one of the most evident weaknesses of the current process is its unreliability. The fact that all data is manually collected and stored makes it vulnerable to inaccuracies and mistakes. For instance, the information about children, employees, attendance, and payments could be incorrect.</w:t>
+      </w:r>
+    </w:p>
+    <w:p>
+      <w:pPr>
+        <w:spacing w:after="100"/>
+        <w:rPr>
+          <w:rFonts w:asciiTheme="majorBidi" w:hAnsiTheme="majorBidi" w:cstheme="majorBidi"/>
+          <w:sz w:val="16"/>
+          <w:szCs w:val="16"/>
+          <w:lang w:val="en-US"/>
+        </w:rPr>
+      </w:pPr>
+    </w:p>
+    <w:p>
+      <w:pPr>
+        <w:spacing w:after="100"/>
+        <w:rPr>
+          <w:rFonts w:asciiTheme="majorBidi" w:hAnsiTheme="majorBidi" w:cstheme="majorBidi"/>
+          <w:sz w:val="16"/>
+          <w:szCs w:val="16"/>
+          <w:lang w:val="en-US"/>
+        </w:rPr>
+      </w:pPr>
+      <w:r>
+        <w:rPr>
+          <w:rFonts w:asciiTheme="majorBidi" w:hAnsiTheme="majorBidi" w:cstheme="majorBidi"/>
+          <w:sz w:val="40"/>
+          <w:szCs w:val="40"/>
+          <w:lang w:val="en-US"/>
+        </w:rPr>
+        <w:t>Secondly, there is a problem related to the way information is organized in the current process. The information is dispersed between different registers and files, which means that it is harder to locate and use.</w:t>
+      </w:r>
+    </w:p>
+    <w:p>
+      <w:pPr>
+        <w:spacing w:after="100"/>
+        <w:rPr>
+          <w:rFonts w:asciiTheme="majorBidi" w:hAnsiTheme="majorBidi" w:cstheme="majorBidi"/>
+          <w:sz w:val="16"/>
+          <w:szCs w:val="16"/>
+          <w:lang w:val="en-US"/>
+        </w:rPr>
+      </w:pPr>
+    </w:p>
+    <w:p>
+      <w:pPr>
+        <w:spacing w:after="100"/>
+        <w:rPr>
+          <w:rFonts w:asciiTheme="majorBidi" w:hAnsiTheme="majorBidi" w:cstheme="majorBidi"/>
+          <w:sz w:val="16"/>
+          <w:szCs w:val="16"/>
+          <w:lang w:val="en-US"/>
+        </w:rPr>
+      </w:pPr>
+      <w:r>
+        <w:rPr>
+          <w:rFonts w:asciiTheme="majorBidi" w:hAnsiTheme="majorBidi" w:cstheme="majorBidi"/>
+          <w:sz w:val="40"/>
+          <w:szCs w:val="40"/>
+          <w:lang w:val="en-US"/>
+        </w:rPr>
+        <w:t>Thirdly, the current process is non-automated and requires employees to do everything manually. It becomes a problem in terms of increasing efficiency because the employees have to work on multiple tasks without any assistance from computers.</w:t>
+      </w:r>
+    </w:p>
+    <w:p>
+      <w:pPr>
+        <w:spacing w:after="100"/>
+        <w:rPr>
+          <w:rFonts w:asciiTheme="majorBidi" w:hAnsiTheme="majorBidi" w:cstheme="majorBidi"/>
+          <w:sz w:val="16"/>
+          <w:szCs w:val="16"/>
+          <w:lang w:val="en-US"/>
+        </w:rPr>
+      </w:pPr>
+    </w:p>
+    <w:p>
+      <w:pPr>
+        <w:spacing w:after="100"/>
+        <w:rPr>
+          <w:rFonts w:asciiTheme="majorBidi" w:hAnsiTheme="majorBidi" w:cstheme="majorBidi"/>
+          <w:sz w:val="40"/>
+          <w:szCs w:val="40"/>
+          <w:lang w:val="en-US"/>
+        </w:rPr>
+      </w:pPr>
+      <w:r>
+        <w:rPr>
+          <w:rFonts w:asciiTheme="majorBidi" w:hAnsiTheme="majorBidi" w:cstheme="majorBidi"/>
+          <w:sz w:val="40"/>
+          <w:szCs w:val="40"/>
+          <w:lang w:val="en-US"/>
+        </w:rPr>
+        <w:t>Finally, the current process lacks digitalization and a central repository for storing information</w:t>
+      </w:r>
+      <w:r>
+        <w:rPr>
+          <w:rFonts w:asciiTheme="majorBidi" w:hAnsiTheme="majorBidi" w:cstheme="majorBidi"/>
+          <w:sz w:val="40"/>
+          <w:szCs w:val="40"/>
+          <w:lang w:val="en-US"/>
+        </w:rPr>
+        <w:t>.</w:t>
+      </w:r>
+    </w:p>
+    <w:p>
+      <w:pPr>
+        <w:spacing w:after="100"/>
+        <w:rPr>
+          <w:rFonts w:asciiTheme="majorBidi" w:hAnsiTheme="majorBidi" w:cstheme="majorBidi"/>
+          <w:sz w:val="40"/>
+          <w:szCs w:val="40"/>
+          <w:lang w:val="en-US"/>
+        </w:rPr>
+      </w:pPr>
+    </w:p>
+    <w:p>
+      <w:pPr>
+        <w:spacing w:after="100"/>
+        <w:rPr>
+          <w:rFonts w:ascii="Goudy Old Style" w:hAnsi="Goudy Old Style"/>
+          <w:b/>
+          <w:bCs/>
+          <w:sz w:val="16"/>
+          <w:szCs w:val="16"/>
+          <w:lang w:val="en-US"/>
+        </w:rPr>
+      </w:pPr>
+      <w:r>
+        <w:rPr>
+          <w:rFonts w:ascii="Goudy Old Style" w:hAnsi="Goudy Old Style"/>
+          <w:b/>
+          <w:bCs/>
+          <w:sz w:val="72"/>
+          <w:szCs w:val="72"/>
+          <w:lang w:val="en-US"/>
+        </w:rPr>
+        <w:lastRenderedPageBreak/>
+        <w:t>Objectives of the Solution</w:t>
+      </w:r>
+    </w:p>
+    <w:p>
+      <w:pPr>
+        <w:spacing w:after="100"/>
+        <w:rPr>
+          <w:rFonts w:ascii="Goudy Old Style" w:hAnsi="Goudy Old Style"/>
+          <w:b/>
+          <w:bCs/>
+          <w:sz w:val="16"/>
+          <w:szCs w:val="16"/>
+          <w:lang w:val="en-US"/>
+        </w:rPr>
+      </w:pPr>
+    </w:p>
+    <w:p>
+      <w:pPr>
+        <w:spacing w:after="100"/>
+        <w:rPr>
+          <w:rFonts w:asciiTheme="majorBidi" w:hAnsiTheme="majorBidi" w:cstheme="majorBidi"/>
+          <w:sz w:val="16"/>
+          <w:szCs w:val="16"/>
+          <w:lang w:val="en-US"/>
+        </w:rPr>
+      </w:pPr>
+      <w:r>
+        <w:rPr>
+          <w:rFonts w:asciiTheme="majorBidi" w:hAnsiTheme="majorBidi" w:cstheme="majorBidi"/>
+          <w:sz w:val="40"/>
+          <w:szCs w:val="40"/>
+          <w:lang w:val="en-US"/>
+        </w:rPr>
+        <w:t>The main objective of the proposed solution is to improve the management of daycare centers by developing a centralized and automated system that replaces traditional manual methods. This system aims to simplify daily operations and make information handling more efficient and reliable.</w:t>
+      </w:r>
+    </w:p>
+    <w:p>
+      <w:pPr>
+        <w:spacing w:after="100"/>
+        <w:rPr>
+          <w:rFonts w:asciiTheme="majorBidi" w:hAnsiTheme="majorBidi" w:cstheme="majorBidi"/>
+          <w:sz w:val="16"/>
+          <w:szCs w:val="16"/>
+          <w:lang w:val="en-US"/>
+        </w:rPr>
+      </w:pPr>
+    </w:p>
+    <w:p>
+      <w:pPr>
+        <w:spacing w:after="100"/>
+        <w:rPr>
+          <w:rFonts w:asciiTheme="majorBidi" w:hAnsiTheme="majorBidi" w:cstheme="majorBidi"/>
+          <w:sz w:val="16"/>
+          <w:szCs w:val="16"/>
+          <w:lang w:val="en-US"/>
+        </w:rPr>
+      </w:pPr>
+      <w:r>
+        <w:rPr>
+          <w:rFonts w:asciiTheme="majorBidi" w:hAnsiTheme="majorBidi" w:cstheme="majorBidi"/>
+          <w:sz w:val="40"/>
+          <w:szCs w:val="40"/>
+          <w:lang w:val="en-US"/>
+        </w:rPr>
+        <w:t>One of the key objectives is to centralize all data related to children, employees, attendance, and payments in a single system, allowing easy access and better organization of information.</w:t>
+      </w:r>
+    </w:p>
+    <w:p>
+      <w:pPr>
+        <w:spacing w:after="100"/>
+        <w:rPr>
+          <w:rFonts w:asciiTheme="majorBidi" w:hAnsiTheme="majorBidi" w:cstheme="majorBidi"/>
+          <w:sz w:val="16"/>
+          <w:szCs w:val="16"/>
+          <w:lang w:val="en-US"/>
+        </w:rPr>
+      </w:pPr>
+    </w:p>
+    <w:p>
+      <w:pPr>
+        <w:spacing w:after="100"/>
+        <w:rPr>
+          <w:rFonts w:asciiTheme="majorBidi" w:hAnsiTheme="majorBidi" w:cstheme="majorBidi"/>
+          <w:sz w:val="16"/>
+          <w:szCs w:val="16"/>
+          <w:lang w:val="en-US"/>
+        </w:rPr>
+      </w:pPr>
+      <w:r>
+        <w:rPr>
+          <w:rFonts w:asciiTheme="majorBidi" w:hAnsiTheme="majorBidi" w:cstheme="majorBidi"/>
+          <w:sz w:val="40"/>
+          <w:szCs w:val="40"/>
+          <w:lang w:val="en-US"/>
+        </w:rPr>
+        <w:t>Another important objective is to reduce human errors by automating repetitive tasks such as recording attendance, managing payments, and updating records. This will improve the accuracy and reliability of the data.</w:t>
+      </w:r>
+    </w:p>
+    <w:p>
+      <w:pPr>
+        <w:spacing w:after="100"/>
+        <w:rPr>
+          <w:rFonts w:asciiTheme="majorBidi" w:hAnsiTheme="majorBidi" w:cstheme="majorBidi"/>
+          <w:sz w:val="16"/>
+          <w:szCs w:val="16"/>
+          <w:lang w:val="en-US"/>
+        </w:rPr>
+      </w:pPr>
+    </w:p>
+    <w:p>
+      <w:pPr>
+        <w:spacing w:after="100"/>
+        <w:rPr>
+          <w:rFonts w:asciiTheme="majorBidi" w:hAnsiTheme="majorBidi" w:cstheme="majorBidi"/>
+          <w:sz w:val="16"/>
+          <w:szCs w:val="16"/>
+          <w:lang w:val="en-US"/>
+        </w:rPr>
+      </w:pPr>
+      <w:r>
+        <w:rPr>
+          <w:rFonts w:asciiTheme="majorBidi" w:hAnsiTheme="majorBidi" w:cstheme="majorBidi"/>
+          <w:sz w:val="40"/>
+          <w:szCs w:val="40"/>
+          <w:lang w:val="en-US"/>
+        </w:rPr>
+        <w:t>The system also aims to save time and increase productivity by making administrative tasks faster and more efficient. Staff members will be able to focus more on essential tasks instead of manual data entry.</w:t>
+      </w:r>
+    </w:p>
+    <w:p>
+      <w:pPr>
+        <w:spacing w:after="100"/>
+        <w:rPr>
+          <w:rFonts w:asciiTheme="majorBidi" w:hAnsiTheme="majorBidi" w:cstheme="majorBidi"/>
+          <w:sz w:val="16"/>
+          <w:szCs w:val="16"/>
+          <w:lang w:val="en-US"/>
+        </w:rPr>
+      </w:pPr>
+    </w:p>
+    <w:p>
+      <w:pPr>
+        <w:spacing w:after="100"/>
+        <w:rPr>
+          <w:rFonts w:asciiTheme="majorBidi" w:hAnsiTheme="majorBidi" w:cstheme="majorBidi"/>
+          <w:b/>
+          <w:bCs/>
+          <w:sz w:val="32"/>
+          <w:szCs w:val="32"/>
+          <w:lang w:val="en-US"/>
+        </w:rPr>
+      </w:pPr>
+      <w:r>
+        <w:rPr>
+          <w:rFonts w:asciiTheme="majorBidi" w:hAnsiTheme="majorBidi" w:cstheme="majorBidi"/>
+          <w:sz w:val="40"/>
+          <w:szCs w:val="40"/>
+          <w:lang w:val="en-US"/>
+        </w:rPr>
+        <w:t>Finally, the solution aims to provide better monitoring and reporting tools, such as statistics and summaries, to help administrators make informed decisions and improve the overall management of the daycare center.</w:t>
+      </w:r>
+    </w:p>
+    <w:p>
+      <w:pPr>
+        <w:spacing w:after="100"/>
+        <w:rPr>
+          <w:rFonts w:asciiTheme="majorBidi" w:hAnsiTheme="majorBidi" w:cstheme="majorBidi"/>
+          <w:b/>
+          <w:bCs/>
+          <w:sz w:val="32"/>
+          <w:szCs w:val="32"/>
+          <w:lang w:val="en-US"/>
+        </w:rPr>
+      </w:pPr>
+    </w:p>
+    <w:p>
+      <w:pPr>
+        <w:spacing w:after="100"/>
+        <w:rPr>
+          <w:rFonts w:ascii="Goudy Old Style" w:hAnsi="Goudy Old Style"/>
+          <w:b/>
+          <w:bCs/>
+          <w:sz w:val="16"/>
+          <w:szCs w:val="16"/>
+          <w:lang w:val="en-US"/>
+        </w:rPr>
+      </w:pPr>
+      <w:r>
+        <w:rPr>
+          <w:rFonts w:ascii="Goudy Old Style" w:hAnsi="Goudy Old Style"/>
+          <w:b/>
+          <w:bCs/>
+          <w:sz w:val="72"/>
+          <w:szCs w:val="72"/>
+          <w:lang w:val="en-US"/>
+        </w:rPr>
+        <w:lastRenderedPageBreak/>
+        <w:t xml:space="preserve">Daily Usage Flow Diagram   </w:t>
+      </w:r>
+    </w:p>
+    <w:p>
+      <w:pPr>
+        <w:spacing w:after="100"/>
+        <w:rPr>
+          <w:rFonts w:ascii="Goudy Old Style" w:hAnsi="Goudy Old Style"/>
+          <w:b/>
+          <w:bCs/>
+          <w:sz w:val="16"/>
+          <w:szCs w:val="16"/>
+          <w:lang w:val="en-US"/>
+        </w:rPr>
+      </w:pPr>
+    </w:p>
+    <w:p>
+      <w:pPr>
+        <w:spacing w:after="100"/>
+        <w:rPr>
+          <w:rFonts w:asciiTheme="majorBidi" w:hAnsiTheme="majorBidi" w:cstheme="majorBidi"/>
+          <w:b/>
+          <w:bCs/>
+          <w:sz w:val="32"/>
+          <w:szCs w:val="32"/>
+          <w:lang w:val="en-US"/>
+        </w:rPr>
+      </w:pPr>
+      <w:r>
+        <w:rPr>
+          <w:rFonts w:asciiTheme="majorBidi" w:hAnsiTheme="majorBidi" w:cstheme="majorBidi"/>
+          <w:b/>
+          <w:bCs/>
+          <w:noProof/>
+          <w:sz w:val="32"/>
+          <w:szCs w:val="32"/>
+          <w:lang w:eastAsia="fr-FR"/>
+        </w:rPr>
+        <mc:AlternateContent>
+          <mc:Choice Requires="wps">
+            <w:drawing>
+              <wp:anchor distT="0" distB="0" distL="114300" distR="114300" simplePos="0" relativeHeight="251660288" behindDoc="0" locked="0" layoutInCell="1" allowOverlap="1">
+                <wp:simplePos x="0" y="0"/>
+                <wp:positionH relativeFrom="column">
+                  <wp:posOffset>3389935</wp:posOffset>
+                </wp:positionH>
+                <wp:positionV relativeFrom="paragraph">
+                  <wp:posOffset>3175457</wp:posOffset>
+                </wp:positionV>
+                <wp:extent cx="384048" cy="0"/>
+                <wp:effectExtent l="0" t="0" r="35560" b="19050"/>
+                <wp:wrapNone/>
+                <wp:docPr id="8" name="Connecteur droit 8"/>
+                <wp:cNvGraphicFramePr/>
+                <a:graphic xmlns:a="http://schemas.openxmlformats.org/drawingml/2006/main">
+                  <a:graphicData uri="http://schemas.microsoft.com/office/word/2010/wordprocessingShape">
+                    <wps:wsp>
+                      <wps:cNvCnPr/>
+                      <wps:spPr>
+                        <a:xfrm>
+                          <a:off x="0" y="0"/>
+                          <a:ext cx="384048" cy="0"/>
+                        </a:xfrm>
+                        <a:prstGeom prst="line">
+                          <a:avLst/>
+                        </a:prstGeom>
+                        <a:ln w="19050">
+                          <a:solidFill>
+                            <a:schemeClr val="tx1">
+                              <a:lumMod val="50000"/>
+                              <a:lumOff val="50000"/>
+                            </a:schemeClr>
+                          </a:solidFill>
+                        </a:ln>
+                      </wps:spPr>
+                      <wps:style>
+                        <a:lnRef idx="1">
+                          <a:schemeClr val="dk1"/>
+                        </a:lnRef>
+                        <a:fillRef idx="0">
+                          <a:schemeClr val="dk1"/>
+                        </a:fillRef>
+                        <a:effectRef idx="0">
+                          <a:schemeClr val="dk1"/>
+                        </a:effectRef>
+                        <a:fontRef idx="minor">
+                          <a:schemeClr val="tx1"/>
+                        </a:fontRef>
+                      </wps:style>
+                      <wps:bodyPr/>
+                    </wps:wsp>
+                  </a:graphicData>
+                </a:graphic>
+                <wp14:sizeRelV relativeFrom="margin">
+                  <wp14:pctHeight>0</wp14:pctHeight>
+                </wp14:sizeRelV>
+              </wp:anchor>
+            </w:drawing>
+          </mc:Choice>
+          <mc:Fallback>
+            <w:pict>
+              <v:line w14:anchorId="4209784F" id="Connecteur droit 8" o:spid="_x0000_s1026" style="position:absolute;z-index:251660288;visibility:visible;mso-wrap-style:square;mso-height-percent:0;mso-wrap-distance-left:9pt;mso-wrap-distance-top:0;mso-wrap-distance-right:9pt;mso-wrap-distance-bottom:0;mso-position-horizontal:absolute;mso-position-horizontal-relative:text;mso-position-vertical:absolute;mso-position-vertical-relative:text;mso-height-percent:0;mso-height-relative:margin" from="266.9pt,250.05pt" to="297.15pt,250.05pt" o:gfxdata="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" strokecolor="gray [1629]" strokeweight="1.5pt">
+                <v:stroke joinstyle="miter"/>
+              </v:line>
+            </w:pict>
+          </mc:Fallback>
+        </mc:AlternateContent>
+      </w:r>
+      <w:r>
+        <w:rPr>
+          <w:rFonts w:asciiTheme="majorBidi" w:hAnsiTheme="majorBidi" w:cstheme="majorBidi"/>
+          <w:b/>
+          <w:bCs/>
+          <w:noProof/>
+          <w:sz w:val="32"/>
+          <w:szCs w:val="32"/>
+          <w:lang w:eastAsia="fr-FR"/>
+        </w:rPr>
+        <mc:AlternateContent>
+          <mc:Choice Requires="wps">
+            <w:drawing>
+              <wp:anchor distT="0" distB="0" distL="114300" distR="114300" simplePos="0" relativeHeight="251659264" behindDoc="0" locked="0" layoutInCell="1" allowOverlap="1">
+                <wp:simplePos x="0" y="0"/>
+                <wp:positionH relativeFrom="margin">
+                  <wp:align>center</wp:align>
+                </wp:positionH>
+                <wp:positionV relativeFrom="paragraph">
+                  <wp:posOffset>2833862</wp:posOffset>
+                </wp:positionV>
+                <wp:extent cx="1044054" cy="696036"/>
+                <wp:effectExtent l="19050" t="19050" r="22860" b="46990"/>
+                <wp:wrapNone/>
+                <wp:docPr id="7" name="Organigramme : Décision 7"/>
+                <wp:cNvGraphicFramePr/>
+                <a:graphic xmlns:a="http://schemas.openxmlformats.org/drawingml/2006/main">
+                  <a:graphicData uri="http://schemas.microsoft.com/office/word/2010/wordprocessingShape">
+                    <wps:wsp>
+                      <wps:cNvSpPr/>
+                      <wps:spPr>
+                        <a:xfrm>
+                          <a:off x="0" y="0"/>
+                          <a:ext cx="1044054" cy="696036"/>
+                        </a:xfrm>
+                        <a:prstGeom prst="flowChartDecision">
+                          <a:avLst/>
+                        </a:prstGeom>
+                        <a:noFill/>
+                        <a:ln>
+                          <a:solidFill>
+                            <a:schemeClr val="tx1">
+                              <a:lumMod val="50000"/>
+                              <a:lumOff val="50000"/>
+                            </a:schemeClr>
+                          </a:solidFill>
+                        </a:ln>
+                      </wps:spPr>
+                      <wps:style>
+                        <a:lnRef idx="2">
+                          <a:schemeClr val="accent1">
+                            <a:shade val="50000"/>
+                          </a:schemeClr>
+                        </a:lnRef>
+                        <a:fillRef idx="1">
+                          <a:schemeClr val="accent1"/>
+                        </a:fillRef>
+                        <a:effectRef idx="0">
+                          <a:schemeClr val="accent1"/>
+                        </a:effectRef>
+                        <a:fontRef idx="minor">
+                          <a:schemeClr val="lt1"/>
+                        </a:fontRef>
+                      </wps:style>
+                      <wps:bodyPr rot="0" spcFirstLastPara="0" vertOverflow="overflow" horzOverflow="overflow" vert="horz" wrap="square" lIns="91440" tIns="45720" rIns="91440" bIns="45720" numCol="1" spcCol="0" rtlCol="0" fromWordArt="0" anchor="ctr" anchorCtr="0" forceAA="0" compatLnSpc="1">
+                        <a:prstTxWarp prst="textNoShape">
+                          <a:avLst/>
+                        </a:prstTxWarp>
+                        <a:noAutofit/>
+                      </wps:bodyPr>
+                    </wps:wsp>
+                  </a:graphicData>
+                </a:graphic>
+              </wp:anchor>
+            </w:drawing>
+          </mc:Choice>
+          <mc:Fallback>
+            <w:pict>
+              <v:shapetype w14:anchorId="5E084A36" id="_x0000_t110" coordsize="21600,21600" o:spt="110" path="m10800,l,10800,10800,21600,21600,10800xe">
+                <v:stroke joinstyle="miter"/>
+                <v:path gradientshapeok="t" o:connecttype="rect" textboxrect="5400,5400,16200,16200"/>
+              </v:shapetype>
+              <v:shape id="Organigramme : Décision 7" o:spid="_x0000_s1026" type="#_x0000_t110" style="position:absolute;margin-left:0;margin-top:223.15pt;width:82.2pt;height:54.8pt;z-index:251659264;visibility:visible;mso-wrap-style:square;mso-wrap-distance-left:9pt;mso-wrap-distance-top:0;mso-wrap-distance-right:9pt;mso-wrap-distance-bottom:0;mso-position-horizontal:center;mso-position-horizontal-relative:margin;mso-position-vertical:absolute;mso-position-vertical-relative:text;v-text-anchor:middle" o:gfxdata="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" filled="f" strokecolor="gray [1629]" strokeweight="1pt">
+                <w10:wrap anchorx="margin"/>
+              </v:shape>
+            </w:pict>
+          </mc:Fallback>
+        </mc:AlternateContent>
+      </w:r>
+      <w:r>
+        <w:rPr>
+          <w:rFonts w:asciiTheme="majorBidi" w:hAnsiTheme="majorBidi" w:cstheme="majorBidi"/>
+          <w:b/>
+          <w:bCs/>
+          <w:noProof/>
+          <w:sz w:val="32"/>
+          <w:szCs w:val="32"/>
+          <w:lang w:eastAsia="fr-FR"/>
+        </w:rPr>
+        <w:drawing>
+          <wp:inline distT="0" distB="0" distL="0" distR="0">
+            <wp:extent cx="5755640" cy="7148945"/>
+            <wp:effectExtent l="0" t="0" r="0" b="0"/>
+            <wp:docPr id="6" name="Image 6"/>
+            <wp:cNvGraphicFramePr>
+              <a:graphicFrameLocks xmlns:a="http://schemas.openxmlformats.org/drawingml/2006/main" noChangeAspect="1"/>
+            </wp:cNvGraphicFramePr>
+            <a:graphic xmlns:a="http://schemas.openxmlformats.org/drawingml/2006/main">
+              <a:graphicData uri="http://schemas.openxmlformats.org/drawingml/2006/picture">
+                <pic:pic xmlns:pic="http://schemas.openxmlformats.org/drawingml/2006/picture">
+                  <pic:nvPicPr>
+                    <pic:cNvPr id="6" name="creche_daily_flow_english.png"/>
+                    <pic:cNvPicPr/>
+                  </pic:nvPicPr>
+                  <pic:blipFill rotWithShape="1">
+                    <a:blip r:embed="rId8">
+                      <a:extLst>
+                        <a:ext uri="{28A0092B-C50C-407E-A947-70E740481C1C}">
+                          <a14:useLocalDpi xmlns:a14="http://schemas.microsoft.com/office/drawing/2010/main" val="0"/>
+                        </a:ext>
+                      </a:extLst>
+                    </a:blip>
+                    <a:srcRect b="8194"/>
+                    <a:stretch/>
+                  </pic:blipFill>
+                  <pic:spPr bwMode="auto">
+                    <a:xfrm>
+                      <a:off x="0" y="0"/>
+                      <a:ext cx="5755640" cy="7148945"/>
+                    </a:xfrm>
+                    <a:prstGeom prst="rect">
+                      <a:avLst/>
+                    </a:prstGeom>
+                    <a:ln>
+                      <a:noFill/>
+                    </a:ln>
+                    <a:extLst>
+                      <a:ext uri="{53640926-AAD7-44D8-BBD7-CCE9431645EC}">
+                        <a14:shadowObscured xmlns:a14="http://schemas.microsoft.com/office/drawing/2010/main"/>
+                      </a:ext>
+                    </a:extLst>
+                  </pic:spPr>
+                </pic:pic>
+              </a:graphicData>
+            </a:graphic>
+          </wp:inline>
+        </w:drawing>
+      </w:r>
+      <w:bookmarkStart w:id="0" w:name="_GoBack"/>
+      <w:bookmarkEnd w:id="0"/>
+    </w:p>
+    <w:p>
+      <w:pPr>
+        <w:spacing w:after="100"/>
+        <w:rPr>
+          <w:rFonts w:asciiTheme="majorBidi" w:hAnsiTheme="majorBidi" w:cstheme="majorBidi"/>
+          <w:b/>
+          <w:bCs/>
+          <w:sz w:val="32"/>
+          <w:szCs w:val="32"/>
+          <w:rtl/>
+          <w:lang w:val="en-US"/>
+        </w:rPr>
+      </w:pPr>
+      <w:r>
+        <w:rPr>
+          <w:rFonts w:ascii="Times New Roman" w:eastAsia="Times New Roman" w:hAnsi="Times New Roman" w:cs="Times New Roman"/>
+          <w:b/>
+          <w:bCs/>
+          <w:sz w:val="32"/>
+          <w:szCs w:val="32"/>
+          <w:lang w:val="en-US" w:eastAsia="fr-FR"/>
+        </w:rPr>
+        <w:t xml:space="preserve">   </w:t>
+      </w:r>
+      <w:r>
+        <w:rPr>
+          <w:rFonts w:ascii="Times New Roman" w:eastAsia="Times New Roman" w:hAnsi="Times New Roman" w:cs="Times New Roman"/>
+          <w:b/>
+          <w:bCs/>
+          <w:sz w:val="32"/>
+          <w:szCs w:val="32"/>
+          <w:lang w:val="en-US" w:eastAsia="fr-FR"/>
+        </w:rPr>
+        <w:t>Figure</w:t>
+      </w:r>
+      <w:r>
+        <w:rPr>
+          <w:rFonts w:ascii="Times New Roman" w:eastAsia="Times New Roman" w:hAnsi="Times New Roman" w:cs="Times New Roman"/>
+          <w:b/>
+          <w:bCs/>
+          <w:sz w:val="32"/>
+          <w:szCs w:val="32"/>
+          <w:lang w:val="en-US" w:eastAsia="fr-FR"/>
+        </w:rPr>
+        <w:t xml:space="preserve"> 2.3</w:t>
+      </w:r>
+      <w:r>
+        <w:rPr>
+          <w:rFonts w:ascii="Times New Roman" w:eastAsia="Times New Roman" w:hAnsi="Times New Roman" w:cs="Times New Roman"/>
+          <w:b/>
+          <w:bCs/>
+          <w:sz w:val="32"/>
+          <w:szCs w:val="32"/>
+          <w:lang w:val="en-US" w:eastAsia="fr-FR"/>
+        </w:rPr>
+        <w:t>: Application usage flow diagram in daily operations</w:t>
       </w:r>
     </w:p>
     <w:sectPr>
@@ -3560,7 +6382,7 @@
   <w:style w:type="paragraph" w:default="1" w:styleId="Normal">
     <w:name w:val="Normal"/>
     <w:qFormat/>
-    <w:rsid w:val="006F2A1A"/>
+    <w:rsid w:val="004422CF"/>
   </w:style>
   <w:style w:type="paragraph" w:styleId="Titre1">
     <w:name w:val="heading 1"/>

</xml_diff>

<commit_message>
chapter 2 conclusion added
</commit_message>
<xml_diff>
--- a/PFE.docx
+++ b/PFE.docx
@@ -2034,7 +2034,10 @@
           <w:lang w:val="en-US"/>
         </w:rPr>
       </w:pPr>
-      <w:r>
+    </w:p>
+    <w:p>
+      <w:pPr>
+        <w:spacing w:after="100"/>
         <w:rPr>
           <w:b/>
           <w:bCs/>
@@ -2042,7 +2045,15 @@
           <w:szCs w:val="96"/>
           <w:lang w:val="en-US"/>
         </w:rPr>
-        <w:lastRenderedPageBreak/>
+      </w:pPr>
+      <w:r>
+        <w:rPr>
+          <w:b/>
+          <w:bCs/>
+          <w:sz w:val="96"/>
+          <w:szCs w:val="96"/>
+          <w:lang w:val="en-US"/>
+        </w:rPr>
         <w:t>Chaptre 01</w:t>
       </w:r>
     </w:p>
@@ -2095,36 +2106,6 @@
         </w:rPr>
         <w:t>Project</w:t>
       </w:r>
-    </w:p>
-    <w:p>
-      <w:pPr>
-        <w:spacing w:after="100"/>
-        <w:rPr>
-          <w:sz w:val="22"/>
-          <w:szCs w:val="22"/>
-          <w:lang w:val="en-US"/>
-        </w:rPr>
-      </w:pPr>
-    </w:p>
-    <w:p>
-      <w:pPr>
-        <w:spacing w:after="100"/>
-        <w:rPr>
-          <w:sz w:val="22"/>
-          <w:szCs w:val="22"/>
-          <w:lang w:val="en-US"/>
-        </w:rPr>
-      </w:pPr>
-    </w:p>
-    <w:p>
-      <w:pPr>
-        <w:spacing w:after="100"/>
-        <w:rPr>
-          <w:sz w:val="22"/>
-          <w:szCs w:val="22"/>
-          <w:lang w:val="en-US"/>
-        </w:rPr>
-      </w:pPr>
     </w:p>
     <w:p>
       <w:pPr>
@@ -2521,26 +2502,6 @@
       <w:pPr>
         <w:spacing w:after="100"/>
         <w:rPr>
-          <w:sz w:val="36"/>
-          <w:szCs w:val="36"/>
-          <w:lang w:val="en-US"/>
-        </w:rPr>
-      </w:pPr>
-    </w:p>
-    <w:p>
-      <w:pPr>
-        <w:spacing w:after="100"/>
-        <w:rPr>
-          <w:sz w:val="36"/>
-          <w:szCs w:val="36"/>
-          <w:lang w:val="en-US"/>
-        </w:rPr>
-      </w:pPr>
-    </w:p>
-    <w:p>
-      <w:pPr>
-        <w:spacing w:after="100"/>
-        <w:rPr>
           <w:lang w:val="en-US"/>
         </w:rPr>
       </w:pPr>
@@ -2566,6 +2527,7 @@
           <w:szCs w:val="72"/>
           <w:lang w:val="en-US"/>
         </w:rPr>
+        <w:lastRenderedPageBreak/>
         <w:t>Problem Statement</w:t>
       </w:r>
     </w:p>
@@ -2785,16 +2747,6 @@
       <w:pPr>
         <w:spacing w:after="100"/>
         <w:rPr>
-          <w:sz w:val="22"/>
-          <w:szCs w:val="22"/>
-          <w:lang w:val="en-US" w:bidi="ar-DZ"/>
-        </w:rPr>
-      </w:pPr>
-    </w:p>
-    <w:p>
-      <w:pPr>
-        <w:spacing w:after="100"/>
-        <w:rPr>
           <w:rFonts w:ascii="Goudy Old Style" w:hAnsi="Goudy Old Style"/>
           <w:b/>
           <w:bCs/>
@@ -3236,7 +3188,10 @@
           <w:lang w:val="en-US"/>
         </w:rPr>
       </w:pPr>
-      <w:r>
+    </w:p>
+    <w:p>
+      <w:pPr>
+        <w:spacing w:after="100"/>
         <w:rPr>
           <w:b/>
           <w:bCs/>
@@ -3244,10 +3199,11 @@
           <w:szCs w:val="96"/>
           <w:lang w:val="en-US"/>
         </w:rPr>
-        <w:lastRenderedPageBreak/>
-        <w:t>Chaptre 0</w:t>
-      </w:r>
-      <w:r>
+      </w:pPr>
+    </w:p>
+    <w:p>
+      <w:pPr>
+        <w:spacing w:after="100"/>
         <w:rPr>
           <w:b/>
           <w:bCs/>
@@ -3255,12 +3211,8 @@
           <w:szCs w:val="96"/>
           <w:lang w:val="en-US"/>
         </w:rPr>
-        <w:t>2</w:t>
-      </w:r>
-    </w:p>
-    <w:p>
-      <w:pPr>
-        <w:spacing w:after="100"/>
+      </w:pPr>
+      <w:r>
         <w:rPr>
           <w:b/>
           <w:bCs/>
@@ -3268,7 +3220,8 @@
           <w:szCs w:val="96"/>
           <w:lang w:val="en-US"/>
         </w:rPr>
-      </w:pPr>
+        <w:t>Chaptre 0</w:t>
+      </w:r>
       <w:r>
         <w:rPr>
           <w:b/>
@@ -3277,7 +3230,7 @@
           <w:szCs w:val="96"/>
           <w:lang w:val="en-US"/>
         </w:rPr>
-        <w:t>Existing System Study</w:t>
+        <w:t>2</w:t>
       </w:r>
     </w:p>
     <w:p>
@@ -3291,10 +3244,7 @@
           <w:lang w:val="en-US"/>
         </w:rPr>
       </w:pPr>
-    </w:p>
-    <w:p>
-      <w:pPr>
-        <w:spacing w:after="100"/>
+      <w:r>
         <w:rPr>
           <w:b/>
           <w:bCs/>
@@ -3302,7 +3252,8 @@
           <w:szCs w:val="96"/>
           <w:lang w:val="en-US"/>
         </w:rPr>
-      </w:pPr>
+        <w:t>Existing System Study</w:t>
+      </w:r>
     </w:p>
     <w:p>
       <w:pPr>
@@ -5713,7 +5664,7 @@
           </mc:Choice>
           <mc:Fallback>
             <w:pict>
-              <v:line w14:anchorId="4209784F" id="Connecteur droit 8" o:spid="_x0000_s1026" style="position:absolute;z-index:251660288;visibility:visible;mso-wrap-style:square;mso-height-percent:0;mso-wrap-distance-left:9pt;mso-wrap-distance-top:0;mso-wrap-distance-right:9pt;mso-wrap-distance-bottom:0;mso-position-horizontal:absolute;mso-position-horizontal-relative:text;mso-position-vertical:absolute;mso-position-vertical-relative:text;mso-height-percent:0;mso-height-relative:margin" from="266.9pt,250.05pt" to="297.15pt,250.05pt" o:gfxdata="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" strokecolor="gray [1629]" strokeweight="1.5pt">
+              <v:line w14:anchorId="6F690F30" id="Connecteur droit 8" o:spid="_x0000_s1026" style="position:absolute;z-index:251660288;visibility:visible;mso-wrap-style:square;mso-height-percent:0;mso-wrap-distance-left:9pt;mso-wrap-distance-top:0;mso-wrap-distance-right:9pt;mso-wrap-distance-bottom:0;mso-position-horizontal:absolute;mso-position-horizontal-relative:text;mso-position-vertical:absolute;mso-position-vertical-relative:text;mso-height-percent:0;mso-height-relative:margin" from="266.9pt,250.05pt" to="297.15pt,250.05pt" o:gfxdata="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" strokecolor="gray [1629]" strokeweight="1.5pt">
                 <v:stroke joinstyle="miter"/>
               </v:line>
             </w:pict>
@@ -5798,7 +5749,7 @@
           </mc:Choice>
           <mc:Fallback>
             <w:pict>
-              <v:shapetype w14:anchorId="5E084A36" id="_x0000_t110" coordsize="21600,21600" o:spt="110" path="m10800,l,10800,10800,21600,21600,10800xe">
+              <v:shapetype w14:anchorId="1326FB44" id="_x0000_t110" coordsize="21600,21600" o:spt="110" path="m10800,l,10800,10800,21600,21600,10800xe">
                 <v:stroke joinstyle="miter"/>
                 <v:path gradientshapeok="t" o:connecttype="rect" textboxrect="5400,5400,16200,16200"/>
               </v:shapetype>
@@ -5868,9 +5819,267 @@
           </wp:inline>
         </w:drawing>
       </w:r>
+    </w:p>
+    <w:p>
+      <w:pPr>
+        <w:spacing w:after="100"/>
+        <w:rPr>
+          <w:rFonts w:ascii="Times New Roman" w:eastAsia="Times New Roman" w:hAnsi="Times New Roman" w:cs="Times New Roman"/>
+          <w:b/>
+          <w:bCs/>
+          <w:sz w:val="32"/>
+          <w:szCs w:val="32"/>
+          <w:lang w:val="en-US" w:eastAsia="fr-FR"/>
+        </w:rPr>
+      </w:pPr>
+      <w:r>
+        <w:rPr>
+          <w:rFonts w:ascii="Times New Roman" w:eastAsia="Times New Roman" w:hAnsi="Times New Roman" w:cs="Times New Roman"/>
+          <w:b/>
+          <w:bCs/>
+          <w:sz w:val="32"/>
+          <w:szCs w:val="32"/>
+          <w:lang w:val="en-US" w:eastAsia="fr-FR"/>
+        </w:rPr>
+        <w:t xml:space="preserve">   </w:t>
+      </w:r>
+      <w:r>
+        <w:rPr>
+          <w:rFonts w:ascii="Times New Roman" w:eastAsia="Times New Roman" w:hAnsi="Times New Roman" w:cs="Times New Roman"/>
+          <w:b/>
+          <w:bCs/>
+          <w:sz w:val="32"/>
+          <w:szCs w:val="32"/>
+          <w:lang w:val="en-US" w:eastAsia="fr-FR"/>
+        </w:rPr>
+        <w:t>Figure</w:t>
+      </w:r>
+      <w:r>
+        <w:rPr>
+          <w:rFonts w:ascii="Times New Roman" w:eastAsia="Times New Roman" w:hAnsi="Times New Roman" w:cs="Times New Roman"/>
+          <w:b/>
+          <w:bCs/>
+          <w:sz w:val="32"/>
+          <w:szCs w:val="32"/>
+          <w:lang w:val="en-US" w:eastAsia="fr-FR"/>
+        </w:rPr>
+        <w:t xml:space="preserve"> 2.3</w:t>
+      </w:r>
+      <w:r>
+        <w:rPr>
+          <w:rFonts w:ascii="Times New Roman" w:eastAsia="Times New Roman" w:hAnsi="Times New Roman" w:cs="Times New Roman"/>
+          <w:b/>
+          <w:bCs/>
+          <w:sz w:val="32"/>
+          <w:szCs w:val="32"/>
+          <w:lang w:val="en-US" w:eastAsia="fr-FR"/>
+        </w:rPr>
+        <w:t>: Application usage flow diagram in daily operations</w:t>
+      </w:r>
+    </w:p>
+    <w:p>
+      <w:pPr>
+        <w:spacing w:after="100"/>
+        <w:rPr>
+          <w:rFonts w:ascii="Times New Roman" w:eastAsia="Times New Roman" w:hAnsi="Times New Roman" w:cs="Times New Roman"/>
+          <w:b/>
+          <w:bCs/>
+          <w:sz w:val="32"/>
+          <w:szCs w:val="32"/>
+          <w:lang w:val="en-US" w:eastAsia="fr-FR"/>
+        </w:rPr>
+      </w:pPr>
+    </w:p>
+    <w:p>
+      <w:pPr>
+        <w:spacing w:after="100"/>
+        <w:rPr>
+          <w:rFonts w:ascii="Times New Roman" w:eastAsia="Times New Roman" w:hAnsi="Times New Roman" w:cs="Times New Roman"/>
+          <w:b/>
+          <w:bCs/>
+          <w:sz w:val="32"/>
+          <w:szCs w:val="32"/>
+          <w:lang w:val="en-US" w:eastAsia="fr-FR"/>
+        </w:rPr>
+      </w:pPr>
+    </w:p>
+    <w:p>
+      <w:pPr>
+        <w:spacing w:after="100"/>
+        <w:rPr>
+          <w:rFonts w:ascii="Times New Roman" w:eastAsia="Times New Roman" w:hAnsi="Times New Roman" w:cs="Times New Roman"/>
+          <w:b/>
+          <w:bCs/>
+          <w:sz w:val="32"/>
+          <w:szCs w:val="32"/>
+          <w:lang w:val="en-US" w:eastAsia="fr-FR"/>
+        </w:rPr>
+      </w:pPr>
+    </w:p>
+    <w:p>
+      <w:pPr>
+        <w:spacing w:after="100"/>
+        <w:rPr>
+          <w:rFonts w:ascii="Goudy Old Style" w:hAnsi="Goudy Old Style" w:cstheme="majorBidi"/>
+          <w:b/>
+          <w:bCs/>
+          <w:sz w:val="40"/>
+          <w:szCs w:val="40"/>
+          <w:lang w:val="en-US"/>
+        </w:rPr>
+      </w:pPr>
+      <w:r>
+        <w:rPr>
+          <w:rFonts w:ascii="Goudy Old Style" w:hAnsi="Goudy Old Style" w:cstheme="majorBidi"/>
+          <w:b/>
+          <w:bCs/>
+          <w:sz w:val="72"/>
+          <w:szCs w:val="72"/>
+          <w:lang w:val="en-US"/>
+        </w:rPr>
+        <w:lastRenderedPageBreak/>
+        <w:t>Conclusion</w:t>
+      </w:r>
+    </w:p>
+    <w:p>
+      <w:pPr>
+        <w:spacing w:after="100"/>
+        <w:rPr>
+          <w:rFonts w:asciiTheme="majorBidi" w:hAnsiTheme="majorBidi" w:cstheme="majorBidi"/>
+          <w:sz w:val="40"/>
+          <w:szCs w:val="40"/>
+          <w:lang w:val="en-US"/>
+        </w:rPr>
+      </w:pPr>
       <w:bookmarkStart w:id="0" w:name="_GoBack"/>
-      <w:bookmarkEnd w:id="0"/>
-    </w:p>
+      <w:r>
+        <w:rPr>
+          <w:rFonts w:asciiTheme="majorBidi" w:hAnsiTheme="majorBidi" w:cstheme="majorBidi"/>
+          <w:sz w:val="40"/>
+          <w:szCs w:val="40"/>
+          <w:lang w:val="en-US"/>
+        </w:rPr>
+        <w:t>In this chapter, we have done an analysis of the existing system used in daycare centers for carrying out day-to-day activities. We have considered processes such as processes relating to children, process relating to attendance, processes relating to employees, and processes relating to payments and realized that all these processes are executed in a manually-driven way using simple techniques.</w:t>
+      </w:r>
+    </w:p>
+    <w:p>
+      <w:pPr>
+        <w:spacing w:after="100"/>
+        <w:rPr>
+          <w:rFonts w:asciiTheme="majorBidi" w:hAnsiTheme="majorBidi" w:cstheme="majorBidi"/>
+          <w:sz w:val="40"/>
+          <w:szCs w:val="40"/>
+          <w:lang w:val="en-US"/>
+        </w:rPr>
+      </w:pPr>
+    </w:p>
+    <w:p>
+      <w:pPr>
+        <w:spacing w:after="100"/>
+        <w:rPr>
+          <w:rFonts w:asciiTheme="majorBidi" w:hAnsiTheme="majorBidi" w:cstheme="majorBidi"/>
+          <w:sz w:val="40"/>
+          <w:szCs w:val="40"/>
+          <w:lang w:val="en-US"/>
+        </w:rPr>
+      </w:pPr>
+      <w:r>
+        <w:rPr>
+          <w:rFonts w:asciiTheme="majorBidi" w:hAnsiTheme="majorBidi" w:cstheme="majorBidi"/>
+          <w:sz w:val="40"/>
+          <w:szCs w:val="40"/>
+          <w:lang w:val="en-US"/>
+        </w:rPr>
+        <w:t>The identified problems included non-centralized nature, chance of errors, time consumption, and difficulties in managing and updating information. These problems indicated clearly that the existing system does not cater to all the necessary requirements in order to execute its operation successfully.</w:t>
+      </w:r>
+    </w:p>
+    <w:p>
+      <w:pPr>
+        <w:spacing w:after="100"/>
+        <w:rPr>
+          <w:rFonts w:asciiTheme="majorBidi" w:hAnsiTheme="majorBidi" w:cstheme="majorBidi"/>
+          <w:sz w:val="40"/>
+          <w:szCs w:val="40"/>
+          <w:lang w:val="en-US"/>
+        </w:rPr>
+      </w:pPr>
+    </w:p>
+    <w:p>
+      <w:pPr>
+        <w:spacing w:after="100"/>
+        <w:rPr>
+          <w:rFonts w:asciiTheme="majorBidi" w:hAnsiTheme="majorBidi" w:cstheme="majorBidi"/>
+          <w:sz w:val="40"/>
+          <w:szCs w:val="40"/>
+          <w:lang w:val="en-US"/>
+        </w:rPr>
+      </w:pPr>
+      <w:r>
+        <w:rPr>
+          <w:rFonts w:asciiTheme="majorBidi" w:hAnsiTheme="majorBidi" w:cstheme="majorBidi"/>
+          <w:sz w:val="40"/>
+          <w:szCs w:val="40"/>
+          <w:lang w:val="en-US"/>
+        </w:rPr>
+        <w:t>Based on the above study, we have come up with major problems facing the system and its objectives. We have provided flowchart representation of the existing system and its usage.</w:t>
+      </w:r>
+    </w:p>
+    <w:p>
+      <w:pPr>
+        <w:spacing w:after="100"/>
+        <w:rPr>
+          <w:rFonts w:asciiTheme="majorBidi" w:hAnsiTheme="majorBidi" w:cstheme="majorBidi"/>
+          <w:sz w:val="40"/>
+          <w:szCs w:val="40"/>
+          <w:lang w:val="en-US"/>
+        </w:rPr>
+      </w:pPr>
+    </w:p>
+    <w:p>
+      <w:pPr>
+        <w:spacing w:after="100"/>
+        <w:rPr>
+          <w:rFonts w:asciiTheme="majorBidi" w:hAnsiTheme="majorBidi" w:cstheme="majorBidi"/>
+          <w:b/>
+          <w:bCs/>
+          <w:sz w:val="32"/>
+          <w:szCs w:val="32"/>
+          <w:lang w:val="en-US"/>
+        </w:rPr>
+      </w:pPr>
+      <w:r>
+        <w:rPr>
+          <w:rFonts w:asciiTheme="majorBidi" w:hAnsiTheme="majorBidi" w:cstheme="majorBidi"/>
+          <w:sz w:val="40"/>
+          <w:szCs w:val="40"/>
+          <w:lang w:val="en-US"/>
+        </w:rPr>
+        <w:t>Thus, from the above chapter, it has become evident that there exists a need for a more modern and centralized system and we shall describe it in subsequent chapters.</w:t>
+      </w:r>
+      <w:r>
+        <w:rPr>
+          <w:rFonts w:asciiTheme="majorBidi" w:hAnsiTheme="majorBidi" w:cstheme="majorBidi"/>
+          <w:sz w:val="40"/>
+          <w:szCs w:val="40"/>
+          <w:lang w:val="en-US"/>
+        </w:rPr>
+        <w:t>.</w:t>
+      </w:r>
+    </w:p>
+    <w:p>
+      <w:pPr>
+        <w:spacing w:after="100"/>
+        <w:rPr>
+          <w:rFonts w:ascii="Times New Roman" w:eastAsia="Times New Roman" w:hAnsi="Times New Roman" w:cs="Times New Roman"/>
+          <w:b/>
+          <w:bCs/>
+          <w:sz w:val="32"/>
+          <w:szCs w:val="32"/>
+          <w:lang w:val="en-US" w:eastAsia="fr-FR"/>
+        </w:rPr>
+      </w:pPr>
+    </w:p>
+    <w:bookmarkEnd w:id="0"/>
     <w:p>
       <w:pPr>
         <w:spacing w:after="100"/>
@@ -5884,50 +6093,6 @@
           <w:lang w:val="en-US"/>
         </w:rPr>
       </w:pPr>
-      <w:r>
-        <w:rPr>
-          <w:rFonts w:ascii="Times New Roman" w:eastAsia="Times New Roman" w:hAnsi="Times New Roman" w:cs="Times New Roman"/>
-          <w:b/>
-          <w:bCs/>
-          <w:sz w:val="32"/>
-          <w:szCs w:val="32"/>
-          <w:lang w:val="en-US" w:eastAsia="fr-FR"/>
-        </w:rPr>
-        <w:t xml:space="preserve">   </w:t>
-      </w:r>
-      <w:r>
-        <w:rPr>
-          <w:rFonts w:ascii="Times New Roman" w:eastAsia="Times New Roman" w:hAnsi="Times New Roman" w:cs="Times New Roman"/>
-          <w:b/>
-          <w:bCs/>
-          <w:sz w:val="32"/>
-          <w:szCs w:val="32"/>
-          <w:lang w:val="en-US" w:eastAsia="fr-FR"/>
-        </w:rPr>
-        <w:t>Figure</w:t>
-      </w:r>
-      <w:r>
-        <w:rPr>
-          <w:rFonts w:ascii="Times New Roman" w:eastAsia="Times New Roman" w:hAnsi="Times New Roman" w:cs="Times New Roman"/>
-          <w:b/>
-          <w:bCs/>
-          <w:sz w:val="32"/>
-          <w:szCs w:val="32"/>
-          <w:lang w:val="en-US" w:eastAsia="fr-FR"/>
-        </w:rPr>
-        <w:t xml:space="preserve"> 2.3</w:t>
-      </w:r>
-      <w:r>
-        <w:rPr>
-          <w:rFonts w:ascii="Times New Roman" w:eastAsia="Times New Roman" w:hAnsi="Times New Roman" w:cs="Times New Roman"/>
-          <w:b/>
-          <w:bCs/>
-          <w:sz w:val="32"/>
-          <w:szCs w:val="32"/>
-          <w:lang w:val="en-US" w:eastAsia="fr-FR"/>
-        </w:rPr>
-        <w:t>: Application usage flow diagram in daily operations</w:t>
-      </w:r>
     </w:p>
     <w:sectPr>
       <w:type w:val="continuous"/>
@@ -6382,7 +6547,7 @@
   <w:style w:type="paragraph" w:default="1" w:styleId="Normal">
     <w:name w:val="Normal"/>
     <w:qFormat/>
-    <w:rsid w:val="004422CF"/>
+    <w:rsid w:val="007162DB"/>
   </w:style>
   <w:style w:type="paragraph" w:styleId="Titre1">
     <w:name w:val="heading 1"/>

</xml_diff>

<commit_message>
added sequence diagrams v1
</commit_message>
<xml_diff>
--- a/PFE.docx
+++ b/PFE.docx
@@ -764,32 +764,36 @@
         <w:rPr>
           <w:sz w:val="24"/>
           <w:szCs w:val="24"/>
-          <w:lang w:val="en-US"/>
-        </w:rPr>
-      </w:pPr>
-      <w:r>
-        <w:rPr>
-          <w:sz w:val="24"/>
-          <w:szCs w:val="24"/>
-          <w:lang w:val="en-US"/>
-        </w:rPr>
-        <w:t>3.6.1 Class Diagram ........................................ 27</w:t>
-      </w:r>
-    </w:p>
-    <w:p>
-      <w:pPr>
-        <w:spacing w:after="100"/>
-        <w:rPr>
-          <w:sz w:val="24"/>
-          <w:szCs w:val="24"/>
-          <w:lang w:val="en-US"/>
-        </w:rPr>
-      </w:pPr>
-      <w:r>
-        <w:rPr>
-          <w:sz w:val="24"/>
-          <w:szCs w:val="24"/>
-          <w:lang w:val="en-US"/>
+        </w:rPr>
+      </w:pPr>
+      <w:r>
+        <w:rPr>
+          <w:sz w:val="24"/>
+          <w:szCs w:val="24"/>
+          <w:lang w:val="en-US"/>
+        </w:rPr>
+        <w:t xml:space="preserve">3.6.1 Class Diagram ........................................ </w:t>
+      </w:r>
+      <w:r>
+        <w:rPr>
+          <w:sz w:val="24"/>
+          <w:szCs w:val="24"/>
+        </w:rPr>
+        <w:t>27</w:t>
+      </w:r>
+    </w:p>
+    <w:p>
+      <w:pPr>
+        <w:spacing w:after="100"/>
+        <w:rPr>
+          <w:sz w:val="24"/>
+          <w:szCs w:val="24"/>
+        </w:rPr>
+      </w:pPr>
+      <w:r>
+        <w:rPr>
+          <w:sz w:val="24"/>
+          <w:szCs w:val="24"/>
         </w:rPr>
         <w:t>3.6.2 Database Schema ................................. 28</w:t>
       </w:r>
@@ -800,34 +804,14 @@
         <w:rPr>
           <w:sz w:val="24"/>
           <w:szCs w:val="24"/>
-          <w:lang w:val="en-US"/>
-        </w:rPr>
-      </w:pPr>
-      <w:r>
-        <w:rPr>
-          <w:sz w:val="24"/>
-          <w:szCs w:val="24"/>
-          <w:lang w:val="en-US"/>
+        </w:rPr>
+      </w:pPr>
+      <w:r>
+        <w:rPr>
+          <w:sz w:val="24"/>
+          <w:szCs w:val="24"/>
         </w:rPr>
         <w:lastRenderedPageBreak/>
-        <w:t>3.6.3 Business Rules ...................................... 29</w:t>
-      </w:r>
-    </w:p>
-    <w:p>
-      <w:pPr>
-        <w:spacing w:after="100"/>
-        <w:rPr>
-          <w:sz w:val="24"/>
-          <w:szCs w:val="24"/>
-          <w:lang w:val="en-US"/>
-        </w:rPr>
-      </w:pPr>
-      <w:r>
-        <w:rPr>
-          <w:sz w:val="24"/>
-          <w:szCs w:val="24"/>
-          <w:lang w:val="en-US"/>
-        </w:rPr>
         <w:t>3.7 Sequence Diagrams .................................. 30</w:t>
       </w:r>
     </w:p>
@@ -843,7 +827,6 @@
         <w:rPr>
           <w:sz w:val="24"/>
           <w:szCs w:val="24"/>
-          <w:lang w:val="en-US"/>
         </w:rPr>
         <w:t>3.8 Conclusion ............................................... 34</w:t>
       </w:r>
@@ -1347,6 +1330,7 @@
           <w:bCs/>
           <w:sz w:val="44"/>
           <w:szCs w:val="44"/>
+          <w:lang w:val="en-US"/>
         </w:rPr>
       </w:pPr>
     </w:p>
@@ -1356,6 +1340,7 @@
         <w:rPr>
           <w:sz w:val="36"/>
           <w:szCs w:val="36"/>
+          <w:lang w:val="en-US"/>
         </w:rPr>
       </w:pPr>
       <w:r>
@@ -1364,14 +1349,15 @@
           <w:bCs/>
           <w:sz w:val="44"/>
           <w:szCs w:val="44"/>
-        </w:rPr>
-        <w:lastRenderedPageBreak/>
+          <w:lang w:val="en-US"/>
+        </w:rPr>
         <w:t>— Chapitre 01</w:t>
       </w:r>
       <w:r>
         <w:rPr>
           <w:sz w:val="44"/>
           <w:szCs w:val="44"/>
+          <w:lang w:val="en-US"/>
         </w:rPr>
         <w:t xml:space="preserve"> : </w:t>
       </w:r>
@@ -1381,6 +1367,7 @@
           <w:bCs/>
           <w:sz w:val="44"/>
           <w:szCs w:val="44"/>
+          <w:lang w:val="en-US"/>
         </w:rPr>
         <w:t>L’organisme d’accueil</w:t>
       </w:r>
@@ -1400,6 +1387,7 @@
           <w:szCs w:val="28"/>
           <w:lang w:val="en-US"/>
         </w:rPr>
+        <w:lastRenderedPageBreak/>
         <w:t>In this chapter, we present the host organization, its main activities, and the services it provides.</w:t>
       </w:r>
     </w:p>
@@ -1768,6 +1756,7 @@
           <w:szCs w:val="96"/>
           <w:lang w:val="en-US"/>
         </w:rPr>
+        <w:lastRenderedPageBreak/>
         <w:t>Chaptre 01</w:t>
       </w:r>
     </w:p>
@@ -2096,6 +2085,7 @@
           <w:szCs w:val="72"/>
           <w:lang w:val="en-US"/>
         </w:rPr>
+        <w:lastRenderedPageBreak/>
         <w:t>Introduction</w:t>
       </w:r>
     </w:p>
@@ -2224,27 +2214,17 @@
           <w:szCs w:val="36"/>
           <w:lang w:val="en-US"/>
         </w:rPr>
-        <w:t xml:space="preserve"> Our project is trying to help daycare centers. We want to make a computer program, for daycare centers. This program will help them manage things in an simple way. We want to help </w:t>
-      </w:r>
-      <w:r>
-        <w:rPr>
-          <w:rFonts w:asciiTheme="majorBidi" w:hAnsiTheme="majorBidi" w:cstheme="majorBidi"/>
+        <w:t xml:space="preserve"> Our project is trying to help daycare centers. We want to make a computer program, for daycare centers. This program will help them manage things in an simple way. We want to help daycare centers use computers and technology to make things better.</w:t>
+      </w:r>
+    </w:p>
+    <w:p>
+      <w:pPr>
+        <w:spacing w:after="100"/>
+        <w:rPr>
           <w:sz w:val="36"/>
           <w:szCs w:val="36"/>
           <w:lang w:val="en-US"/>
         </w:rPr>
-        <w:lastRenderedPageBreak/>
-        <w:t>daycare centers use computers and technology to make things better.</w:t>
-      </w:r>
-    </w:p>
-    <w:p>
-      <w:pPr>
-        <w:spacing w:after="100"/>
-        <w:rPr>
-          <w:sz w:val="36"/>
-          <w:szCs w:val="36"/>
-          <w:lang w:val="en-US"/>
-        </w:rPr>
       </w:pPr>
     </w:p>
     <w:p>
@@ -2276,6 +2256,7 @@
           <w:szCs w:val="72"/>
           <w:lang w:val="en-US"/>
         </w:rPr>
+        <w:lastRenderedPageBreak/>
         <w:t>Problem Statement</w:t>
       </w:r>
     </w:p>
@@ -2512,6 +2493,7 @@
           <w:szCs w:val="72"/>
           <w:lang w:val="en-US"/>
         </w:rPr>
+        <w:lastRenderedPageBreak/>
         <w:t>Proposed Solution</w:t>
       </w:r>
     </w:p>
@@ -2748,6 +2730,7 @@
           <w:szCs w:val="72"/>
           <w:lang w:val="en-US"/>
         </w:rPr>
+        <w:lastRenderedPageBreak/>
         <w:t>Conclusion</w:t>
       </w:r>
     </w:p>
@@ -3106,6 +3089,7 @@
           <w:szCs w:val="72"/>
           <w:lang w:val="en-US"/>
         </w:rPr>
+        <w:lastRenderedPageBreak/>
         <w:t>Introduction</w:t>
       </w:r>
     </w:p>
@@ -3295,6 +3279,7 @@
           <w:szCs w:val="72"/>
           <w:lang w:val="en-US"/>
         </w:rPr>
+        <w:lastRenderedPageBreak/>
         <w:t>Analysis of Current Processes</w:t>
       </w:r>
     </w:p>
@@ -3613,6 +3598,7 @@
           <w:szCs w:val="72"/>
           <w:lang w:val="en-US"/>
         </w:rPr>
+        <w:lastRenderedPageBreak/>
         <w:t>Children Management</w:t>
       </w:r>
       <w:r>
@@ -4130,6 +4116,7 @@
           <w:szCs w:val="72"/>
           <w:lang w:val="en-US"/>
         </w:rPr>
+        <w:lastRenderedPageBreak/>
         <w:t xml:space="preserve">Attendance Management </w:t>
       </w:r>
     </w:p>
@@ -4321,7 +4308,6 @@
           <w:szCs w:val="32"/>
           <w:lang w:val="en-US"/>
         </w:rPr>
-        <w:lastRenderedPageBreak/>
         <w:t xml:space="preserve">             </w:t>
       </w:r>
       <w:r>
@@ -4357,6 +4343,7 @@
           <w:szCs w:val="72"/>
           <w:lang w:val="en-US"/>
         </w:rPr>
+        <w:lastRenderedPageBreak/>
         <w:t>Employee Management</w:t>
       </w:r>
     </w:p>
@@ -4612,6 +4599,7 @@
           <w:bCs/>
           <w:sz w:val="16"/>
           <w:szCs w:val="16"/>
+          <w:lang w:val="en-US"/>
         </w:rPr>
       </w:pPr>
       <w:r>
@@ -4621,9 +4609,264 @@
           <w:bCs/>
           <w:sz w:val="72"/>
           <w:szCs w:val="72"/>
-        </w:rPr>
-        <w:t>Payment Management</w:t>
-      </w:r>
+          <w:lang w:val="en-US"/>
+        </w:rPr>
+        <w:lastRenderedPageBreak/>
+        <w:t xml:space="preserve">Payment Management </w:t>
+      </w:r>
+    </w:p>
+    <w:p>
+      <w:pPr>
+        <w:spacing w:after="100"/>
+        <w:rPr>
+          <w:rFonts w:ascii="Goudy Old Style" w:hAnsi="Goudy Old Style"/>
+          <w:b/>
+          <w:bCs/>
+          <w:sz w:val="16"/>
+          <w:szCs w:val="16"/>
+          <w:lang w:val="en-US"/>
+        </w:rPr>
+      </w:pPr>
+    </w:p>
+    <w:p>
+      <w:pPr>
+        <w:spacing w:after="100"/>
+        <w:rPr>
+          <w:rFonts w:asciiTheme="majorBidi" w:hAnsiTheme="majorBidi" w:cstheme="majorBidi"/>
+          <w:sz w:val="40"/>
+          <w:szCs w:val="40"/>
+          <w:lang w:val="en-US"/>
+        </w:rPr>
+      </w:pPr>
+      <w:r>
+        <w:rPr>
+          <w:rFonts w:asciiTheme="majorBidi" w:hAnsiTheme="majorBidi" w:cstheme="majorBidi"/>
+          <w:sz w:val="40"/>
+          <w:szCs w:val="40"/>
+          <w:lang w:val="en-US"/>
+        </w:rPr>
+        <w:t>Payments in childcare institutions are usually made using the conventional method by maintaining manual records and documents. The payments made manually are usually noted along with details such as the amount of money received, the month in which the payment is made, and the date of payment for each child.</w:t>
+      </w:r>
+    </w:p>
+    <w:p>
+      <w:pPr>
+        <w:spacing w:after="100"/>
+        <w:rPr>
+          <w:rFonts w:asciiTheme="majorBidi" w:hAnsiTheme="majorBidi" w:cstheme="majorBidi"/>
+          <w:sz w:val="16"/>
+          <w:szCs w:val="16"/>
+          <w:lang w:val="en-US"/>
+        </w:rPr>
+      </w:pPr>
+    </w:p>
+    <w:p>
+      <w:pPr>
+        <w:spacing w:after="100"/>
+        <w:rPr>
+          <w:rFonts w:asciiTheme="majorBidi" w:hAnsiTheme="majorBidi" w:cstheme="majorBidi"/>
+          <w:sz w:val="40"/>
+          <w:szCs w:val="40"/>
+          <w:lang w:val="en-US"/>
+        </w:rPr>
+      </w:pPr>
+      <w:r>
+        <w:rPr>
+          <w:rFonts w:asciiTheme="majorBidi" w:hAnsiTheme="majorBidi" w:cstheme="majorBidi"/>
+          <w:sz w:val="40"/>
+          <w:szCs w:val="40"/>
+          <w:lang w:val="en-US"/>
+        </w:rPr>
+        <w:t>Usually, payments are made by issuing a receipt for payment that is manually filled. Such a receipt serves as a proof of the payment that is made by parents.</w:t>
+      </w:r>
+    </w:p>
+    <w:p>
+      <w:pPr>
+        <w:spacing w:after="100"/>
+        <w:rPr>
+          <w:rFonts w:asciiTheme="majorBidi" w:hAnsiTheme="majorBidi" w:cstheme="majorBidi"/>
+          <w:sz w:val="16"/>
+          <w:szCs w:val="16"/>
+          <w:lang w:val="en-US"/>
+        </w:rPr>
+      </w:pPr>
+    </w:p>
+    <w:p>
+      <w:pPr>
+        <w:spacing w:after="100"/>
+        <w:rPr>
+          <w:rFonts w:asciiTheme="majorBidi" w:hAnsiTheme="majorBidi" w:cstheme="majorBidi"/>
+          <w:b/>
+          <w:bCs/>
+          <w:sz w:val="32"/>
+          <w:szCs w:val="32"/>
+          <w:lang w:val="en-US"/>
+        </w:rPr>
+      </w:pPr>
+      <w:r>
+        <w:rPr>
+          <w:rFonts w:asciiTheme="majorBidi" w:hAnsiTheme="majorBidi" w:cstheme="majorBidi"/>
+          <w:sz w:val="40"/>
+          <w:szCs w:val="40"/>
+          <w:lang w:val="en-US"/>
+        </w:rPr>
+        <w:t>This process of keeping track of payments is inefficient as the documents are maintained individually and can be difficult to track and monitor. Checking the history of previous payments or even the payment status of a particular child becomes very tedious.</w:t>
+      </w:r>
+    </w:p>
+    <w:p>
+      <w:pPr>
+        <w:spacing w:after="100"/>
+        <w:rPr>
+          <w:rFonts w:asciiTheme="majorBidi" w:hAnsiTheme="majorBidi" w:cstheme="majorBidi"/>
+          <w:b/>
+          <w:bCs/>
+          <w:sz w:val="32"/>
+          <w:szCs w:val="32"/>
+          <w:lang w:val="en-US"/>
+        </w:rPr>
+      </w:pPr>
+    </w:p>
+    <w:p>
+      <w:pPr>
+        <w:spacing w:after="100"/>
+        <w:rPr>
+          <w:rFonts w:asciiTheme="majorBidi" w:hAnsiTheme="majorBidi" w:cstheme="majorBidi"/>
+          <w:b/>
+          <w:bCs/>
+          <w:sz w:val="32"/>
+          <w:szCs w:val="32"/>
+          <w:lang w:val="en-US"/>
+        </w:rPr>
+      </w:pPr>
+    </w:p>
+    <w:p>
+      <w:pPr>
+        <w:spacing w:after="100"/>
+        <w:rPr>
+          <w:rFonts w:asciiTheme="majorBidi" w:hAnsiTheme="majorBidi" w:cstheme="majorBidi"/>
+          <w:b/>
+          <w:bCs/>
+          <w:sz w:val="32"/>
+          <w:szCs w:val="32"/>
+          <w:lang w:val="en-US"/>
+        </w:rPr>
+      </w:pPr>
+    </w:p>
+    <w:p>
+      <w:pPr>
+        <w:spacing w:after="100"/>
+        <w:rPr>
+          <w:rFonts w:asciiTheme="majorBidi" w:hAnsiTheme="majorBidi" w:cstheme="majorBidi"/>
+          <w:b/>
+          <w:bCs/>
+          <w:sz w:val="32"/>
+          <w:szCs w:val="32"/>
+          <w:lang w:val="en-US"/>
+        </w:rPr>
+      </w:pPr>
+    </w:p>
+    <w:p>
+      <w:pPr>
+        <w:spacing w:after="100"/>
+        <w:rPr>
+          <w:rFonts w:asciiTheme="majorBidi" w:hAnsiTheme="majorBidi" w:cstheme="majorBidi"/>
+          <w:b/>
+          <w:bCs/>
+          <w:sz w:val="32"/>
+          <w:szCs w:val="32"/>
+          <w:lang w:val="en-US"/>
+        </w:rPr>
+      </w:pPr>
+    </w:p>
+    <w:p>
+      <w:pPr>
+        <w:spacing w:after="100"/>
+        <w:rPr>
+          <w:rFonts w:asciiTheme="majorBidi" w:hAnsiTheme="majorBidi" w:cstheme="majorBidi"/>
+          <w:b/>
+          <w:bCs/>
+          <w:sz w:val="32"/>
+          <w:szCs w:val="32"/>
+          <w:lang w:val="en-US"/>
+        </w:rPr>
+      </w:pPr>
+    </w:p>
+    <w:p>
+      <w:pPr>
+        <w:spacing w:after="100"/>
+        <w:rPr>
+          <w:rFonts w:asciiTheme="majorBidi" w:hAnsiTheme="majorBidi" w:cstheme="majorBidi"/>
+          <w:b/>
+          <w:bCs/>
+          <w:sz w:val="32"/>
+          <w:szCs w:val="32"/>
+          <w:lang w:val="en-US"/>
+        </w:rPr>
+      </w:pPr>
+    </w:p>
+    <w:p>
+      <w:pPr>
+        <w:spacing w:after="100"/>
+        <w:rPr>
+          <w:rFonts w:asciiTheme="majorBidi" w:hAnsiTheme="majorBidi" w:cstheme="majorBidi"/>
+          <w:b/>
+          <w:bCs/>
+          <w:sz w:val="32"/>
+          <w:szCs w:val="32"/>
+          <w:lang w:val="en-US"/>
+        </w:rPr>
+      </w:pPr>
+    </w:p>
+    <w:p>
+      <w:pPr>
+        <w:spacing w:after="100"/>
+        <w:rPr>
+          <w:rFonts w:asciiTheme="majorBidi" w:hAnsiTheme="majorBidi" w:cstheme="majorBidi"/>
+          <w:b/>
+          <w:bCs/>
+          <w:sz w:val="32"/>
+          <w:szCs w:val="32"/>
+          <w:lang w:val="en-US"/>
+        </w:rPr>
+      </w:pPr>
+    </w:p>
+    <w:p>
+      <w:pPr>
+        <w:spacing w:after="100"/>
+        <w:rPr>
+          <w:rFonts w:asciiTheme="majorBidi" w:hAnsiTheme="majorBidi" w:cstheme="majorBidi"/>
+          <w:b/>
+          <w:bCs/>
+          <w:sz w:val="32"/>
+          <w:szCs w:val="32"/>
+          <w:lang w:val="en-US"/>
+        </w:rPr>
+      </w:pPr>
+    </w:p>
+    <w:p>
+      <w:pPr>
+        <w:spacing w:after="100"/>
+        <w:rPr>
+          <w:rFonts w:asciiTheme="majorBidi" w:hAnsiTheme="majorBidi" w:cstheme="majorBidi"/>
+          <w:b/>
+          <w:bCs/>
+          <w:sz w:val="32"/>
+          <w:szCs w:val="32"/>
+          <w:lang w:val="en-US"/>
+        </w:rPr>
+      </w:pPr>
+    </w:p>
+    <w:p>
+      <w:pPr>
+        <w:spacing w:after="100"/>
+        <w:rPr>
+          <w:rFonts w:ascii="Goudy Old Style" w:hAnsi="Goudy Old Style"/>
+          <w:b/>
+          <w:bCs/>
+          <w:sz w:val="16"/>
+          <w:szCs w:val="16"/>
+          <w:lang w:val="en-US"/>
+        </w:rPr>
+      </w:pPr>
       <w:r>
         <w:rPr>
           <w:rFonts w:ascii="Goudy Old Style" w:hAnsi="Goudy Old Style"/>
@@ -4631,8 +4874,21 @@
           <w:bCs/>
           <w:sz w:val="72"/>
           <w:szCs w:val="72"/>
-        </w:rPr>
-        <w:t xml:space="preserve"> </w:t>
+          <w:lang w:val="en-US"/>
+        </w:rPr>
+        <w:lastRenderedPageBreak/>
+        <w:t xml:space="preserve">Criticism </w:t>
+      </w:r>
+      <w:r>
+        <w:rPr>
+          <w:rFonts w:ascii="Goudy Old Style" w:hAnsi="Goudy Old Style"/>
+          <w:b/>
+          <w:bCs/>
+          <w:sz w:val="72"/>
+          <w:szCs w:val="72"/>
+          <w:lang w:val="en-US"/>
+        </w:rPr>
+        <w:t>of the Existing System</w:t>
       </w:r>
     </w:p>
     <w:p>
@@ -4653,50 +4909,19 @@
         <w:spacing w:after="100"/>
         <w:rPr>
           <w:rFonts w:asciiTheme="majorBidi" w:hAnsiTheme="majorBidi" w:cstheme="majorBidi"/>
-          <w:sz w:val="40"/>
-          <w:szCs w:val="40"/>
-          <w:lang w:val="en-US"/>
-        </w:rPr>
-      </w:pPr>
-      <w:r>
-        <w:rPr>
-          <w:rFonts w:asciiTheme="majorBidi" w:hAnsiTheme="majorBidi" w:cstheme="majorBidi"/>
-          <w:sz w:val="40"/>
-          <w:szCs w:val="40"/>
-          <w:lang w:val="en-US"/>
-        </w:rPr>
-        <w:t>Payments in childcare institutions are usually made using the conventional method by maintaining manual records and documents. The payments made manually are usually noted along with details such as the amount of money received, the month in which the payment is made, and the date of payment for each child.</w:t>
-      </w:r>
-    </w:p>
-    <w:p>
-      <w:pPr>
-        <w:spacing w:after="100"/>
-        <w:rPr>
-          <w:rFonts w:asciiTheme="majorBidi" w:hAnsiTheme="majorBidi" w:cstheme="majorBidi"/>
           <w:sz w:val="16"/>
           <w:szCs w:val="16"/>
           <w:lang w:val="en-US"/>
         </w:rPr>
       </w:pPr>
-    </w:p>
-    <w:p>
-      <w:pPr>
-        <w:spacing w:after="100"/>
-        <w:rPr>
-          <w:rFonts w:asciiTheme="majorBidi" w:hAnsiTheme="majorBidi" w:cstheme="majorBidi"/>
-          <w:sz w:val="40"/>
-          <w:szCs w:val="40"/>
-          <w:lang w:val="en-US"/>
-        </w:rPr>
-      </w:pPr>
-      <w:r>
-        <w:rPr>
-          <w:rFonts w:asciiTheme="majorBidi" w:hAnsiTheme="majorBidi" w:cstheme="majorBidi"/>
-          <w:sz w:val="40"/>
-          <w:szCs w:val="40"/>
-          <w:lang w:val="en-US"/>
-        </w:rPr>
-        <w:t>Usually, payments are made by issuing a receipt for payment that is manually filled. Such a receipt serves as a proof of the payment that is made by parents.</w:t>
+      <w:r>
+        <w:rPr>
+          <w:rFonts w:asciiTheme="majorBidi" w:hAnsiTheme="majorBidi" w:cstheme="majorBidi"/>
+          <w:sz w:val="40"/>
+          <w:szCs w:val="40"/>
+          <w:lang w:val="en-US"/>
+        </w:rPr>
+        <w:t>The current process for management in daycare centers relies mostly on manual processes and tools. Even though the process might still be functional, there are certain problems that make the process less effective.</w:t>
       </w:r>
     </w:p>
     <w:p>
@@ -4715,173 +4940,6 @@
         <w:spacing w:after="100"/>
         <w:rPr>
           <w:rFonts w:asciiTheme="majorBidi" w:hAnsiTheme="majorBidi" w:cstheme="majorBidi"/>
-          <w:b/>
-          <w:bCs/>
-          <w:sz w:val="32"/>
-          <w:szCs w:val="32"/>
-          <w:lang w:val="en-US"/>
-        </w:rPr>
-      </w:pPr>
-      <w:r>
-        <w:rPr>
-          <w:rFonts w:asciiTheme="majorBidi" w:hAnsiTheme="majorBidi" w:cstheme="majorBidi"/>
-          <w:sz w:val="40"/>
-          <w:szCs w:val="40"/>
-          <w:lang w:val="en-US"/>
-        </w:rPr>
-        <w:t>This process of keeping track of payments is inefficient as the documents are maintained individually and can be difficult to track and monitor. Checking the history of previous payments or even the payment status of a particular child becomes very tedious.</w:t>
-      </w:r>
-    </w:p>
-    <w:p>
-      <w:pPr>
-        <w:spacing w:after="100"/>
-        <w:rPr>
-          <w:rFonts w:asciiTheme="majorBidi" w:hAnsiTheme="majorBidi" w:cstheme="majorBidi"/>
-          <w:b/>
-          <w:bCs/>
-          <w:sz w:val="32"/>
-          <w:szCs w:val="32"/>
-          <w:lang w:val="en-US"/>
-        </w:rPr>
-      </w:pPr>
-    </w:p>
-    <w:p>
-      <w:pPr>
-        <w:spacing w:after="100"/>
-        <w:rPr>
-          <w:rFonts w:asciiTheme="majorBidi" w:hAnsiTheme="majorBidi" w:cstheme="majorBidi"/>
-          <w:b/>
-          <w:bCs/>
-          <w:sz w:val="32"/>
-          <w:szCs w:val="32"/>
-          <w:lang w:val="en-US"/>
-        </w:rPr>
-      </w:pPr>
-    </w:p>
-    <w:p>
-      <w:pPr>
-        <w:spacing w:after="100"/>
-        <w:rPr>
-          <w:rFonts w:asciiTheme="majorBidi" w:hAnsiTheme="majorBidi" w:cstheme="majorBidi"/>
-          <w:b/>
-          <w:bCs/>
-          <w:sz w:val="32"/>
-          <w:szCs w:val="32"/>
-          <w:lang w:val="en-US"/>
-        </w:rPr>
-      </w:pPr>
-    </w:p>
-    <w:p>
-      <w:pPr>
-        <w:spacing w:after="100"/>
-        <w:rPr>
-          <w:rFonts w:asciiTheme="majorBidi" w:hAnsiTheme="majorBidi" w:cstheme="majorBidi"/>
-          <w:b/>
-          <w:bCs/>
-          <w:sz w:val="32"/>
-          <w:szCs w:val="32"/>
-          <w:lang w:val="en-US"/>
-        </w:rPr>
-      </w:pPr>
-    </w:p>
-    <w:p>
-      <w:pPr>
-        <w:spacing w:after="100"/>
-        <w:rPr>
-          <w:rFonts w:asciiTheme="majorBidi" w:hAnsiTheme="majorBidi" w:cstheme="majorBidi"/>
-          <w:b/>
-          <w:bCs/>
-          <w:sz w:val="32"/>
-          <w:szCs w:val="32"/>
-          <w:lang w:val="en-US"/>
-        </w:rPr>
-      </w:pPr>
-    </w:p>
-    <w:p>
-      <w:pPr>
-        <w:spacing w:after="100"/>
-        <w:rPr>
-          <w:rFonts w:asciiTheme="majorBidi" w:hAnsiTheme="majorBidi" w:cstheme="majorBidi"/>
-          <w:b/>
-          <w:bCs/>
-          <w:sz w:val="32"/>
-          <w:szCs w:val="32"/>
-          <w:lang w:val="en-US"/>
-        </w:rPr>
-      </w:pPr>
-    </w:p>
-    <w:p>
-      <w:pPr>
-        <w:spacing w:after="100"/>
-        <w:rPr>
-          <w:rFonts w:asciiTheme="majorBidi" w:hAnsiTheme="majorBidi" w:cstheme="majorBidi"/>
-          <w:b/>
-          <w:bCs/>
-          <w:sz w:val="32"/>
-          <w:szCs w:val="32"/>
-          <w:lang w:val="en-US"/>
-        </w:rPr>
-      </w:pPr>
-    </w:p>
-    <w:p>
-      <w:pPr>
-        <w:spacing w:after="100"/>
-        <w:rPr>
-          <w:rFonts w:asciiTheme="majorBidi" w:hAnsiTheme="majorBidi" w:cstheme="majorBidi"/>
-          <w:b/>
-          <w:bCs/>
-          <w:sz w:val="32"/>
-          <w:szCs w:val="32"/>
-          <w:lang w:val="en-US"/>
-        </w:rPr>
-      </w:pPr>
-    </w:p>
-    <w:p>
-      <w:pPr>
-        <w:spacing w:after="100"/>
-        <w:rPr>
-          <w:rFonts w:asciiTheme="majorBidi" w:hAnsiTheme="majorBidi" w:cstheme="majorBidi"/>
-          <w:b/>
-          <w:bCs/>
-          <w:sz w:val="32"/>
-          <w:szCs w:val="32"/>
-          <w:lang w:val="en-US"/>
-        </w:rPr>
-      </w:pPr>
-    </w:p>
-    <w:p>
-      <w:pPr>
-        <w:spacing w:after="100"/>
-        <w:rPr>
-          <w:rFonts w:asciiTheme="majorBidi" w:hAnsiTheme="majorBidi" w:cstheme="majorBidi"/>
-          <w:b/>
-          <w:bCs/>
-          <w:sz w:val="32"/>
-          <w:szCs w:val="32"/>
-          <w:lang w:val="en-US"/>
-        </w:rPr>
-      </w:pPr>
-    </w:p>
-    <w:p>
-      <w:pPr>
-        <w:spacing w:after="100"/>
-        <w:rPr>
-          <w:rFonts w:asciiTheme="majorBidi" w:hAnsiTheme="majorBidi" w:cstheme="majorBidi"/>
-          <w:b/>
-          <w:bCs/>
-          <w:sz w:val="32"/>
-          <w:szCs w:val="32"/>
-          <w:lang w:val="en-US"/>
-        </w:rPr>
-      </w:pPr>
-    </w:p>
-    <w:p>
-      <w:pPr>
-        <w:spacing w:after="100"/>
-        <w:rPr>
-          <w:rFonts w:ascii="Goudy Old Style" w:hAnsi="Goudy Old Style"/>
-          <w:b/>
-          <w:bCs/>
           <w:sz w:val="16"/>
           <w:szCs w:val="16"/>
           <w:lang w:val="en-US"/>
@@ -4889,6 +4947,141 @@
       </w:pPr>
       <w:r>
         <w:rPr>
+          <w:rFonts w:asciiTheme="majorBidi" w:hAnsiTheme="majorBidi" w:cstheme="majorBidi"/>
+          <w:sz w:val="40"/>
+          <w:szCs w:val="40"/>
+          <w:lang w:val="en-US"/>
+        </w:rPr>
+        <w:t>For example, one of the most evident weaknesses of the current process is its unreliability. The fact that all data is manually collected and stored makes it vulnerable to inaccuracies and mistakes. For instance, the information about children, employees, attendance, and payments could be incorrect.</w:t>
+      </w:r>
+    </w:p>
+    <w:p>
+      <w:pPr>
+        <w:spacing w:after="100"/>
+        <w:rPr>
+          <w:rFonts w:asciiTheme="majorBidi" w:hAnsiTheme="majorBidi" w:cstheme="majorBidi"/>
+          <w:sz w:val="16"/>
+          <w:szCs w:val="16"/>
+          <w:lang w:val="en-US"/>
+        </w:rPr>
+      </w:pPr>
+    </w:p>
+    <w:p>
+      <w:pPr>
+        <w:spacing w:after="100"/>
+        <w:rPr>
+          <w:rFonts w:asciiTheme="majorBidi" w:hAnsiTheme="majorBidi" w:cstheme="majorBidi"/>
+          <w:sz w:val="16"/>
+          <w:szCs w:val="16"/>
+          <w:lang w:val="en-US"/>
+        </w:rPr>
+      </w:pPr>
+      <w:r>
+        <w:rPr>
+          <w:rFonts w:asciiTheme="majorBidi" w:hAnsiTheme="majorBidi" w:cstheme="majorBidi"/>
+          <w:sz w:val="40"/>
+          <w:szCs w:val="40"/>
+          <w:lang w:val="en-US"/>
+        </w:rPr>
+        <w:t>Secondly, there is a problem related to the way information is organized in the current process. The information is dispersed between different registers and files, which means that it is harder to locate and use.</w:t>
+      </w:r>
+    </w:p>
+    <w:p>
+      <w:pPr>
+        <w:spacing w:after="100"/>
+        <w:rPr>
+          <w:rFonts w:asciiTheme="majorBidi" w:hAnsiTheme="majorBidi" w:cstheme="majorBidi"/>
+          <w:sz w:val="16"/>
+          <w:szCs w:val="16"/>
+          <w:lang w:val="en-US"/>
+        </w:rPr>
+      </w:pPr>
+    </w:p>
+    <w:p>
+      <w:pPr>
+        <w:spacing w:after="100"/>
+        <w:rPr>
+          <w:rFonts w:asciiTheme="majorBidi" w:hAnsiTheme="majorBidi" w:cstheme="majorBidi"/>
+          <w:sz w:val="16"/>
+          <w:szCs w:val="16"/>
+          <w:lang w:val="en-US"/>
+        </w:rPr>
+      </w:pPr>
+      <w:r>
+        <w:rPr>
+          <w:rFonts w:asciiTheme="majorBidi" w:hAnsiTheme="majorBidi" w:cstheme="majorBidi"/>
+          <w:sz w:val="40"/>
+          <w:szCs w:val="40"/>
+          <w:lang w:val="en-US"/>
+        </w:rPr>
+        <w:t>Thirdly, the current process is non-automated and requires employees to do everything manually. It becomes a problem in terms of increasing efficiency because the employees have to work on multiple tasks without any assistance from computers.</w:t>
+      </w:r>
+    </w:p>
+    <w:p>
+      <w:pPr>
+        <w:spacing w:after="100"/>
+        <w:rPr>
+          <w:rFonts w:asciiTheme="majorBidi" w:hAnsiTheme="majorBidi" w:cstheme="majorBidi"/>
+          <w:sz w:val="16"/>
+          <w:szCs w:val="16"/>
+          <w:lang w:val="en-US"/>
+        </w:rPr>
+      </w:pPr>
+    </w:p>
+    <w:p>
+      <w:pPr>
+        <w:spacing w:after="100"/>
+        <w:rPr>
+          <w:rFonts w:asciiTheme="majorBidi" w:hAnsiTheme="majorBidi" w:cstheme="majorBidi"/>
+          <w:sz w:val="40"/>
+          <w:szCs w:val="40"/>
+          <w:lang w:val="en-US"/>
+        </w:rPr>
+      </w:pPr>
+      <w:r>
+        <w:rPr>
+          <w:rFonts w:asciiTheme="majorBidi" w:hAnsiTheme="majorBidi" w:cstheme="majorBidi"/>
+          <w:sz w:val="40"/>
+          <w:szCs w:val="40"/>
+          <w:lang w:val="en-US"/>
+        </w:rPr>
+        <w:t>Finally, the current process lacks digitalization and a central repository for storing information</w:t>
+      </w:r>
+      <w:r>
+        <w:rPr>
+          <w:rFonts w:asciiTheme="majorBidi" w:hAnsiTheme="majorBidi" w:cstheme="majorBidi"/>
+          <w:sz w:val="40"/>
+          <w:szCs w:val="40"/>
+          <w:lang w:val="en-US"/>
+        </w:rPr>
+        <w:t>.</w:t>
+      </w:r>
+    </w:p>
+    <w:p>
+      <w:pPr>
+        <w:spacing w:after="100"/>
+        <w:rPr>
+          <w:rFonts w:asciiTheme="majorBidi" w:hAnsiTheme="majorBidi" w:cstheme="majorBidi"/>
+          <w:sz w:val="40"/>
+          <w:szCs w:val="40"/>
+          <w:lang w:val="en-US"/>
+        </w:rPr>
+      </w:pPr>
+    </w:p>
+    <w:p>
+      <w:pPr>
+        <w:spacing w:after="100"/>
+        <w:rPr>
+          <w:rFonts w:ascii="Goudy Old Style" w:hAnsi="Goudy Old Style"/>
+          <w:b/>
+          <w:bCs/>
+          <w:sz w:val="16"/>
+          <w:szCs w:val="16"/>
+          <w:lang w:val="en-US"/>
+        </w:rPr>
+      </w:pPr>
+      <w:r>
+        <w:rPr>
           <w:rFonts w:ascii="Goudy Old Style" w:hAnsi="Goudy Old Style"/>
           <w:b/>
           <w:bCs/>
@@ -4896,218 +5089,7 @@
           <w:szCs w:val="72"/>
           <w:lang w:val="en-US"/>
         </w:rPr>
-        <w:t xml:space="preserve">Criticism </w:t>
-      </w:r>
-      <w:r>
-        <w:rPr>
-          <w:rFonts w:ascii="Goudy Old Style" w:hAnsi="Goudy Old Style"/>
-          <w:b/>
-          <w:bCs/>
-          <w:sz w:val="72"/>
-          <w:szCs w:val="72"/>
-          <w:lang w:val="en-US"/>
-        </w:rPr>
-        <w:t>of the Existing System</w:t>
-      </w:r>
-    </w:p>
-    <w:p>
-      <w:pPr>
-        <w:spacing w:after="100"/>
-        <w:rPr>
-          <w:rFonts w:ascii="Goudy Old Style" w:hAnsi="Goudy Old Style"/>
-          <w:b/>
-          <w:bCs/>
-          <w:sz w:val="16"/>
-          <w:szCs w:val="16"/>
-          <w:lang w:val="en-US"/>
-        </w:rPr>
-      </w:pPr>
-    </w:p>
-    <w:p>
-      <w:pPr>
-        <w:spacing w:after="100"/>
-        <w:rPr>
-          <w:rFonts w:asciiTheme="majorBidi" w:hAnsiTheme="majorBidi" w:cstheme="majorBidi"/>
-          <w:sz w:val="16"/>
-          <w:szCs w:val="16"/>
-          <w:lang w:val="en-US"/>
-        </w:rPr>
-      </w:pPr>
-      <w:r>
-        <w:rPr>
-          <w:rFonts w:asciiTheme="majorBidi" w:hAnsiTheme="majorBidi" w:cstheme="majorBidi"/>
-          <w:sz w:val="40"/>
-          <w:szCs w:val="40"/>
-          <w:lang w:val="en-US"/>
-        </w:rPr>
-        <w:t>The current process for management in daycare centers relies mostly on manual processes and tools. Even though the process might still be functional, there are certain problems that make the process less effective.</w:t>
-      </w:r>
-    </w:p>
-    <w:p>
-      <w:pPr>
-        <w:spacing w:after="100"/>
-        <w:rPr>
-          <w:rFonts w:asciiTheme="majorBidi" w:hAnsiTheme="majorBidi" w:cstheme="majorBidi"/>
-          <w:sz w:val="16"/>
-          <w:szCs w:val="16"/>
-          <w:lang w:val="en-US"/>
-        </w:rPr>
-      </w:pPr>
-    </w:p>
-    <w:p>
-      <w:pPr>
-        <w:spacing w:after="100"/>
-        <w:rPr>
-          <w:rFonts w:asciiTheme="majorBidi" w:hAnsiTheme="majorBidi" w:cstheme="majorBidi"/>
-          <w:sz w:val="16"/>
-          <w:szCs w:val="16"/>
-          <w:lang w:val="en-US"/>
-        </w:rPr>
-      </w:pPr>
-      <w:r>
-        <w:rPr>
-          <w:rFonts w:asciiTheme="majorBidi" w:hAnsiTheme="majorBidi" w:cstheme="majorBidi"/>
-          <w:sz w:val="40"/>
-          <w:szCs w:val="40"/>
-          <w:lang w:val="en-US"/>
-        </w:rPr>
-        <w:t>For example, one of the most evident weaknesses of the current process is its unreliability. The fact that all data is manually collected and stored makes it vulnerable to inaccuracies and mistakes. For instance, the information about children, employees, attendance, and payments could be incorrect.</w:t>
-      </w:r>
-    </w:p>
-    <w:p>
-      <w:pPr>
-        <w:spacing w:after="100"/>
-        <w:rPr>
-          <w:rFonts w:asciiTheme="majorBidi" w:hAnsiTheme="majorBidi" w:cstheme="majorBidi"/>
-          <w:sz w:val="16"/>
-          <w:szCs w:val="16"/>
-          <w:lang w:val="en-US"/>
-        </w:rPr>
-      </w:pPr>
-    </w:p>
-    <w:p>
-      <w:pPr>
-        <w:spacing w:after="100"/>
-        <w:rPr>
-          <w:rFonts w:asciiTheme="majorBidi" w:hAnsiTheme="majorBidi" w:cstheme="majorBidi"/>
-          <w:sz w:val="16"/>
-          <w:szCs w:val="16"/>
-          <w:lang w:val="en-US"/>
-        </w:rPr>
-      </w:pPr>
-      <w:r>
-        <w:rPr>
-          <w:rFonts w:asciiTheme="majorBidi" w:hAnsiTheme="majorBidi" w:cstheme="majorBidi"/>
-          <w:sz w:val="40"/>
-          <w:szCs w:val="40"/>
-          <w:lang w:val="en-US"/>
-        </w:rPr>
-        <w:t>Secondly, there is a problem related to the way information is organized in the current process. The information is dispersed between different registers and files, which means that it is harder to locate and use.</w:t>
-      </w:r>
-    </w:p>
-    <w:p>
-      <w:pPr>
-        <w:spacing w:after="100"/>
-        <w:rPr>
-          <w:rFonts w:asciiTheme="majorBidi" w:hAnsiTheme="majorBidi" w:cstheme="majorBidi"/>
-          <w:sz w:val="16"/>
-          <w:szCs w:val="16"/>
-          <w:lang w:val="en-US"/>
-        </w:rPr>
-      </w:pPr>
-    </w:p>
-    <w:p>
-      <w:pPr>
-        <w:spacing w:after="100"/>
-        <w:rPr>
-          <w:rFonts w:asciiTheme="majorBidi" w:hAnsiTheme="majorBidi" w:cstheme="majorBidi"/>
-          <w:sz w:val="16"/>
-          <w:szCs w:val="16"/>
-          <w:lang w:val="en-US"/>
-        </w:rPr>
-      </w:pPr>
-      <w:r>
-        <w:rPr>
-          <w:rFonts w:asciiTheme="majorBidi" w:hAnsiTheme="majorBidi" w:cstheme="majorBidi"/>
-          <w:sz w:val="40"/>
-          <w:szCs w:val="40"/>
-          <w:lang w:val="en-US"/>
-        </w:rPr>
-        <w:t>Thirdly, the current process is non-automated and requires employees to do everything manually. It becomes a problem in terms of increasing efficiency because the employees have to work on multiple tasks without any assistance from computers.</w:t>
-      </w:r>
-    </w:p>
-    <w:p>
-      <w:pPr>
-        <w:spacing w:after="100"/>
-        <w:rPr>
-          <w:rFonts w:asciiTheme="majorBidi" w:hAnsiTheme="majorBidi" w:cstheme="majorBidi"/>
-          <w:sz w:val="16"/>
-          <w:szCs w:val="16"/>
-          <w:lang w:val="en-US"/>
-        </w:rPr>
-      </w:pPr>
-    </w:p>
-    <w:p>
-      <w:pPr>
-        <w:spacing w:after="100"/>
-        <w:rPr>
-          <w:rFonts w:asciiTheme="majorBidi" w:hAnsiTheme="majorBidi" w:cstheme="majorBidi"/>
-          <w:sz w:val="40"/>
-          <w:szCs w:val="40"/>
-          <w:lang w:val="en-US"/>
-        </w:rPr>
-      </w:pPr>
-      <w:r>
-        <w:rPr>
-          <w:rFonts w:asciiTheme="majorBidi" w:hAnsiTheme="majorBidi" w:cstheme="majorBidi"/>
-          <w:sz w:val="40"/>
-          <w:szCs w:val="40"/>
-          <w:lang w:val="en-US"/>
-        </w:rPr>
-        <w:t>Finally, the current process lacks digitalization and a central repository for storing information</w:t>
-      </w:r>
-      <w:r>
-        <w:rPr>
-          <w:rFonts w:asciiTheme="majorBidi" w:hAnsiTheme="majorBidi" w:cstheme="majorBidi"/>
-          <w:sz w:val="40"/>
-          <w:szCs w:val="40"/>
-          <w:lang w:val="en-US"/>
-        </w:rPr>
-        <w:t>.</w:t>
-      </w:r>
-    </w:p>
-    <w:p>
-      <w:pPr>
-        <w:spacing w:after="100"/>
-        <w:rPr>
-          <w:rFonts w:asciiTheme="majorBidi" w:hAnsiTheme="majorBidi" w:cstheme="majorBidi"/>
-          <w:sz w:val="40"/>
-          <w:szCs w:val="40"/>
-          <w:lang w:val="en-US"/>
-        </w:rPr>
-      </w:pPr>
-    </w:p>
-    <w:p>
-      <w:pPr>
-        <w:spacing w:after="100"/>
-        <w:rPr>
-          <w:rFonts w:ascii="Goudy Old Style" w:hAnsi="Goudy Old Style"/>
-          <w:b/>
-          <w:bCs/>
-          <w:sz w:val="16"/>
-          <w:szCs w:val="16"/>
-          <w:lang w:val="en-US"/>
-        </w:rPr>
-      </w:pPr>
-      <w:r>
-        <w:rPr>
-          <w:rFonts w:ascii="Goudy Old Style" w:hAnsi="Goudy Old Style"/>
-          <w:b/>
-          <w:bCs/>
-          <w:sz w:val="72"/>
-          <w:szCs w:val="72"/>
-          <w:lang w:val="en-US"/>
-        </w:rPr>
+        <w:lastRenderedPageBreak/>
         <w:t>Objectives of the Solution</w:t>
       </w:r>
     </w:p>
@@ -7946,29 +7928,7 @@
           <w:szCs w:val="32"/>
           <w:lang w:val="en-US"/>
         </w:rPr>
-        <w:t xml:space="preserve">           </w:t>
-      </w:r>
-      <w:r>
-        <w:rPr>
-          <w:rFonts w:asciiTheme="majorBidi" w:hAnsiTheme="majorBidi" w:cstheme="majorBidi"/>
-          <w:b/>
-          <w:bCs/>
-          <w:sz w:val="32"/>
-          <w:szCs w:val="32"/>
-          <w:lang w:val="en-US"/>
-        </w:rPr>
-        <w:t xml:space="preserve">   </w:t>
-      </w:r>
-      <w:r>
-        <w:rPr>
-          <w:rFonts w:asciiTheme="majorBidi" w:hAnsiTheme="majorBidi" w:cstheme="majorBidi"/>
-          <w:b/>
-          <w:bCs/>
-          <w:sz w:val="32"/>
-          <w:szCs w:val="32"/>
-          <w:lang w:val="en-US"/>
-        </w:rPr>
-        <w:t xml:space="preserve">  </w:t>
+        <w:t xml:space="preserve">                </w:t>
       </w:r>
       <w:r>
         <w:rPr>
@@ -8160,40 +8120,7 @@
           <w:szCs w:val="32"/>
           <w:lang w:val="en-US"/>
         </w:rPr>
-        <w:t xml:space="preserve">              </w:t>
-      </w:r>
-      <w:r>
-        <w:rPr>
-          <w:rFonts w:asciiTheme="majorBidi" w:hAnsiTheme="majorBidi" w:cstheme="majorBidi"/>
-          <w:b/>
-          <w:bCs/>
-          <w:sz w:val="32"/>
-          <w:szCs w:val="32"/>
-          <w:lang w:val="en-US"/>
-        </w:rPr>
-        <w:t xml:space="preserve">       </w:t>
-      </w:r>
-      <w:r>
-        <w:rPr>
-          <w:rFonts w:asciiTheme="majorBidi" w:hAnsiTheme="majorBidi" w:cstheme="majorBidi"/>
-          <w:b/>
-          <w:bCs/>
-          <w:sz w:val="32"/>
-          <w:szCs w:val="32"/>
-          <w:lang w:val="en-US"/>
-        </w:rPr>
-        <w:t xml:space="preserve">  </w:t>
-      </w:r>
-      <w:r>
-        <w:rPr>
-          <w:rFonts w:asciiTheme="majorBidi" w:hAnsiTheme="majorBidi" w:cstheme="majorBidi"/>
-          <w:b/>
-          <w:bCs/>
-          <w:sz w:val="32"/>
-          <w:szCs w:val="32"/>
-          <w:lang w:val="en-US"/>
-        </w:rPr>
-        <w:t xml:space="preserve">     </w:t>
+        <w:t xml:space="preserve">                            </w:t>
       </w:r>
       <w:r>
         <w:rPr>
@@ -8313,9 +8240,10 @@
           <w:rFonts w:asciiTheme="majorBidi" w:hAnsiTheme="majorBidi" w:cstheme="majorBidi"/>
           <w:b/>
           <w:bCs/>
-          <w:sz w:val="32"/>
-          <w:szCs w:val="32"/>
-          <w:lang w:val="en-US"/>
+          <w:noProof/>
+          <w:sz w:val="32"/>
+          <w:szCs w:val="32"/>
+          <w:lang w:eastAsia="fr-FR"/>
         </w:rPr>
         <w:drawing>
           <wp:inline distT="0" distB="0" distL="0" distR="0" wp14:anchorId="029F630F" wp14:editId="3DEFA96F">
@@ -8401,6 +8329,353 @@
         </w:rPr>
         <w:t xml:space="preserve">                          </w:t>
       </w:r>
+      <w:r>
+        <w:rPr>
+          <w:rFonts w:asciiTheme="majorBidi" w:hAnsiTheme="majorBidi" w:cstheme="majorBidi"/>
+          <w:b/>
+          <w:bCs/>
+          <w:sz w:val="32"/>
+          <w:szCs w:val="32"/>
+          <w:lang w:val="en-US"/>
+        </w:rPr>
+        <w:t xml:space="preserve"> </w:t>
+      </w:r>
+      <w:r>
+        <w:rPr>
+          <w:rFonts w:asciiTheme="majorBidi" w:hAnsiTheme="majorBidi" w:cstheme="majorBidi"/>
+          <w:b/>
+          <w:bCs/>
+          <w:sz w:val="32"/>
+          <w:szCs w:val="32"/>
+          <w:lang w:val="en-US"/>
+        </w:rPr>
+        <w:t xml:space="preserve">Figure 2.2: </w:t>
+      </w:r>
+      <w:r>
+        <w:rPr>
+          <w:rFonts w:asciiTheme="majorBidi" w:hAnsiTheme="majorBidi" w:cstheme="majorBidi"/>
+          <w:b/>
+          <w:bCs/>
+          <w:sz w:val="32"/>
+          <w:szCs w:val="32"/>
+          <w:lang w:val="en-US"/>
+        </w:rPr>
+        <w:t>Database Schema</w:t>
+      </w:r>
+    </w:p>
+    <w:p>
+      <w:pPr>
+        <w:spacing w:after="100"/>
+        <w:rPr>
+          <w:rFonts w:ascii="Goudy Old Style" w:hAnsi="Goudy Old Style"/>
+          <w:b/>
+          <w:bCs/>
+          <w:sz w:val="72"/>
+          <w:szCs w:val="72"/>
+          <w:lang w:val="en-US"/>
+        </w:rPr>
+      </w:pPr>
+    </w:p>
+    <w:p>
+      <w:pPr>
+        <w:spacing w:after="100"/>
+        <w:rPr>
+          <w:rFonts w:ascii="Goudy Old Style" w:hAnsi="Goudy Old Style"/>
+          <w:b/>
+          <w:bCs/>
+          <w:sz w:val="72"/>
+          <w:szCs w:val="72"/>
+          <w:lang w:val="en-US"/>
+        </w:rPr>
+      </w:pPr>
+    </w:p>
+    <w:p>
+      <w:pPr>
+        <w:spacing w:after="100"/>
+        <w:rPr>
+          <w:rFonts w:ascii="Goudy Old Style" w:hAnsi="Goudy Old Style"/>
+          <w:b/>
+          <w:bCs/>
+          <w:sz w:val="72"/>
+          <w:szCs w:val="72"/>
+          <w:lang w:val="en-US"/>
+        </w:rPr>
+      </w:pPr>
+    </w:p>
+    <w:p>
+      <w:pPr>
+        <w:spacing w:after="100"/>
+        <w:rPr>
+          <w:rFonts w:ascii="Goudy Old Style" w:hAnsi="Goudy Old Style"/>
+          <w:b/>
+          <w:bCs/>
+          <w:sz w:val="72"/>
+          <w:szCs w:val="72"/>
+          <w:lang w:val="en-US"/>
+        </w:rPr>
+      </w:pPr>
+    </w:p>
+    <w:p>
+      <w:pPr>
+        <w:spacing w:after="100"/>
+        <w:rPr>
+          <w:rFonts w:ascii="Goudy Old Style" w:hAnsi="Goudy Old Style"/>
+          <w:b/>
+          <w:bCs/>
+          <w:sz w:val="72"/>
+          <w:szCs w:val="72"/>
+          <w:lang w:val="en-US"/>
+        </w:rPr>
+      </w:pPr>
+    </w:p>
+    <w:p>
+      <w:pPr>
+        <w:spacing w:before="100" w:beforeAutospacing="1" w:after="100" w:afterAutospacing="1"/>
+        <w:ind w:left="-454"/>
+        <w:rPr>
+          <w:rFonts w:ascii="Goudy Old Style" w:hAnsi="Goudy Old Style"/>
+          <w:b/>
+          <w:bCs/>
+          <w:sz w:val="72"/>
+          <w:szCs w:val="72"/>
+          <w:lang w:val="en-US"/>
+        </w:rPr>
+      </w:pPr>
+      <w:r>
+        <w:rPr>
+          <w:rFonts w:ascii="Goudy Old Style" w:hAnsi="Goudy Old Style"/>
+          <w:b/>
+          <w:bCs/>
+          <w:sz w:val="72"/>
+          <w:szCs w:val="72"/>
+          <w:lang w:val="en-US"/>
+        </w:rPr>
+        <w:lastRenderedPageBreak/>
+        <w:t>Sequence Diagram</w:t>
+      </w:r>
+    </w:p>
+    <w:p>
+      <w:pPr>
+        <w:spacing w:after="100"/>
+        <w:rPr>
+          <w:rFonts w:ascii="Goudy Old Style" w:hAnsi="Goudy Old Style"/>
+          <w:b/>
+          <w:bCs/>
+          <w:i/>
+          <w:iCs/>
+          <w:sz w:val="72"/>
+          <w:szCs w:val="72"/>
+          <w:lang w:val="en-US"/>
+        </w:rPr>
+      </w:pPr>
+      <w:r>
+        <w:rPr>
+          <w:rFonts w:ascii="Goudy Old Style" w:hAnsi="Goudy Old Style"/>
+          <w:b/>
+          <w:bCs/>
+          <w:sz w:val="72"/>
+          <w:szCs w:val="72"/>
+          <w:lang w:val="en-US"/>
+        </w:rPr>
+        <w:t xml:space="preserve"> </w:t>
+      </w:r>
+      <w:r>
+        <w:rPr>
+          <w:rFonts w:asciiTheme="majorBidi" w:hAnsiTheme="majorBidi" w:cstheme="majorBidi"/>
+          <w:b/>
+          <w:bCs/>
+          <w:i/>
+          <w:iCs/>
+          <w:sz w:val="36"/>
+          <w:szCs w:val="36"/>
+          <w:u w:val="thick"/>
+          <w:lang w:val="en-US"/>
+        </w:rPr>
+        <w:t>Authenticcation</w:t>
+      </w:r>
+      <w:r>
+        <w:rPr>
+          <w:rFonts w:asciiTheme="majorBidi" w:hAnsiTheme="majorBidi" w:cstheme="majorBidi"/>
+          <w:b/>
+          <w:bCs/>
+          <w:i/>
+          <w:iCs/>
+          <w:sz w:val="32"/>
+          <w:szCs w:val="32"/>
+          <w:lang w:val="en-US"/>
+        </w:rPr>
+        <w:t>:</w:t>
+      </w:r>
+    </w:p>
+    <w:p>
+      <w:pPr>
+        <w:spacing w:before="100" w:beforeAutospacing="1" w:after="100" w:afterAutospacing="1" w:line="240" w:lineRule="auto"/>
+        <w:jc w:val="left"/>
+        <w:rPr>
+          <w:rFonts w:ascii="Times New Roman" w:eastAsia="Times New Roman" w:hAnsi="Times New Roman" w:cs="Times New Roman"/>
+          <w:sz w:val="24"/>
+          <w:szCs w:val="24"/>
+          <w:lang w:eastAsia="fr-FR"/>
+        </w:rPr>
+      </w:pPr>
+      <w:r>
+        <w:rPr>
+          <w:rFonts w:ascii="Times New Roman" w:eastAsia="Times New Roman" w:hAnsi="Times New Roman" w:cs="Times New Roman"/>
+          <w:noProof/>
+          <w:sz w:val="24"/>
+          <w:szCs w:val="24"/>
+          <w:lang w:eastAsia="fr-FR"/>
+        </w:rPr>
+        <w:drawing>
+          <wp:inline distT="0" distB="0" distL="0" distR="0">
+            <wp:extent cx="6153150" cy="6934200"/>
+            <wp:effectExtent l="0" t="0" r="0" b="0"/>
+            <wp:docPr id="3" name="Image 3" descr="C:\Users\dif\Downloads\bLHDRzD04BtlhnYPGri-96W41oIWTkA8IB503H6NIcYwdiIhshjcTqtuKFzxPpUEquH8Y8iFyzwyzsR6zfNpQ7tNrB2OV4ixNv7sIg9NHWjtftIB5XjmzBqZBGd-283KMhCPczfOU38QZK95UcCpOqkoVVtr-4qsVidGNArehZITHZ-pjvAgHUqpb7ThQpfTzgGydrvEfqUaaofJe_r2_IPu.png"/>
+            <wp:cNvGraphicFramePr>
+              <a:graphicFrameLocks xmlns:a="http://schemas.openxmlformats.org/drawingml/2006/main" noChangeAspect="1"/>
+            </wp:cNvGraphicFramePr>
+            <a:graphic xmlns:a="http://schemas.openxmlformats.org/drawingml/2006/main">
+              <a:graphicData uri="http://schemas.openxmlformats.org/drawingml/2006/picture">
+                <pic:pic xmlns:pic="http://schemas.openxmlformats.org/drawingml/2006/picture">
+                  <pic:nvPicPr>
+                    <pic:cNvPr id="0" name="Picture 1" descr="C:\Users\dif\Downloads\bLHDRzD04BtlhnYPGri-96W41oIWTkA8IB503H6NIcYwdiIhshjcTqtuKFzxPpUEquH8Y8iFyzwyzsR6zfNpQ7tNrB2OV4ixNv7sIg9NHWjtftIB5XjmzBqZBGd-283KMhCPczfOU38QZK95UcCpOqkoVVtr-4qsVidGNArehZITHZ-pjvAgHUqpb7ThQpfTzgGydrvEfqUaaofJe_r2_IPu.png"/>
+                    <pic:cNvPicPr>
+                      <a:picLocks noChangeAspect="1" noChangeArrowheads="1"/>
+                    </pic:cNvPicPr>
+                  </pic:nvPicPr>
+                  <pic:blipFill>
+                    <a:blip r:embed="rId12">
+                      <a:extLst>
+                        <a:ext uri="{28A0092B-C50C-407E-A947-70E740481C1C}">
+                          <a14:useLocalDpi xmlns:a14="http://schemas.microsoft.com/office/drawing/2010/main" val="0"/>
+                        </a:ext>
+                      </a:extLst>
+                    </a:blip>
+                    <a:srcRect/>
+                    <a:stretch>
+                      <a:fillRect/>
+                    </a:stretch>
+                  </pic:blipFill>
+                  <pic:spPr bwMode="auto">
+                    <a:xfrm>
+                      <a:off x="0" y="0"/>
+                      <a:ext cx="6153150" cy="6934200"/>
+                    </a:xfrm>
+                    <a:prstGeom prst="rect">
+                      <a:avLst/>
+                    </a:prstGeom>
+                    <a:noFill/>
+                    <a:ln>
+                      <a:noFill/>
+                    </a:ln>
+                  </pic:spPr>
+                </pic:pic>
+              </a:graphicData>
+            </a:graphic>
+          </wp:inline>
+        </w:drawing>
+      </w:r>
+    </w:p>
+    <w:p>
+      <w:pPr>
+        <w:spacing w:after="100"/>
+        <w:rPr>
+          <w:rFonts w:asciiTheme="majorBidi" w:hAnsiTheme="majorBidi" w:cstheme="majorBidi"/>
+          <w:b/>
+          <w:bCs/>
+          <w:sz w:val="32"/>
+          <w:szCs w:val="32"/>
+        </w:rPr>
+      </w:pPr>
+      <w:r>
+        <w:rPr>
+          <w:rFonts w:asciiTheme="majorBidi" w:hAnsiTheme="majorBidi" w:cstheme="majorBidi"/>
+          <w:b/>
+          <w:bCs/>
+          <w:sz w:val="32"/>
+          <w:szCs w:val="32"/>
+        </w:rPr>
+        <w:t xml:space="preserve">              </w:t>
+      </w:r>
+      <w:r>
+        <w:rPr>
+          <w:rFonts w:asciiTheme="majorBidi" w:hAnsiTheme="majorBidi" w:cstheme="majorBidi"/>
+          <w:b/>
+          <w:bCs/>
+          <w:sz w:val="32"/>
+          <w:szCs w:val="32"/>
+        </w:rPr>
+        <w:t xml:space="preserve">   Figure 2.2: </w:t>
+      </w:r>
+      <w:r>
+        <w:rPr>
+          <w:rFonts w:asciiTheme="majorBidi" w:hAnsiTheme="majorBidi" w:cstheme="majorBidi"/>
+          <w:b/>
+          <w:bCs/>
+          <w:sz w:val="32"/>
+          <w:szCs w:val="32"/>
+        </w:rPr>
+        <w:t>A</w:t>
+      </w:r>
+      <w:r>
+        <w:rPr>
+          <w:rFonts w:asciiTheme="majorBidi" w:hAnsiTheme="majorBidi" w:cstheme="majorBidi"/>
+          <w:b/>
+          <w:bCs/>
+          <w:sz w:val="32"/>
+          <w:szCs w:val="32"/>
+        </w:rPr>
+        <w:t>uthentication Se</w:t>
+      </w:r>
+      <w:r>
+        <w:rPr>
+          <w:rFonts w:asciiTheme="majorBidi" w:hAnsiTheme="majorBidi" w:cstheme="majorBidi"/>
+          <w:b/>
+          <w:bCs/>
+          <w:sz w:val="32"/>
+          <w:szCs w:val="32"/>
+        </w:rPr>
+        <w:t>quence</w:t>
+      </w:r>
+      <w:r>
+        <w:rPr>
+          <w:rFonts w:asciiTheme="majorBidi" w:hAnsiTheme="majorBidi" w:cstheme="majorBidi"/>
+          <w:b/>
+          <w:bCs/>
+          <w:sz w:val="32"/>
+          <w:szCs w:val="32"/>
+        </w:rPr>
+        <w:t xml:space="preserve"> Diagram</w:t>
+      </w:r>
+    </w:p>
+    <w:p>
+      <w:pPr>
+        <w:spacing w:after="100"/>
+        <w:rPr>
+          <w:rFonts w:ascii="Goudy Old Style" w:hAnsi="Goudy Old Style"/>
+          <w:b/>
+          <w:bCs/>
+          <w:sz w:val="72"/>
+          <w:szCs w:val="72"/>
+          <w:lang w:val="en-US"/>
+        </w:rPr>
+      </w:pPr>
+    </w:p>
+    <w:p>
+      <w:pPr>
+        <w:spacing w:after="100"/>
+        <w:rPr>
+          <w:rFonts w:ascii="Goudy Old Style" w:hAnsi="Goudy Old Style"/>
+          <w:b/>
+          <w:bCs/>
+          <w:i/>
+          <w:iCs/>
+          <w:sz w:val="96"/>
+          <w:szCs w:val="96"/>
+          <w:u w:val="single"/>
+          <w:lang w:val="en-US"/>
+        </w:rPr>
+      </w:pPr>
       <w:bookmarkStart w:id="0" w:name="_GoBack"/>
       <w:bookmarkEnd w:id="0"/>
       <w:r>
@@ -8408,33 +8683,29 @@
           <w:rFonts w:asciiTheme="majorBidi" w:hAnsiTheme="majorBidi" w:cstheme="majorBidi"/>
           <w:b/>
           <w:bCs/>
-          <w:sz w:val="32"/>
-          <w:szCs w:val="32"/>
-          <w:lang w:val="en-US"/>
-        </w:rPr>
-        <w:t xml:space="preserve"> </w:t>
-      </w:r>
-      <w:r>
-        <w:rPr>
-          <w:rFonts w:asciiTheme="majorBidi" w:hAnsiTheme="majorBidi" w:cstheme="majorBidi"/>
-          <w:b/>
-          <w:bCs/>
-          <w:sz w:val="32"/>
-          <w:szCs w:val="32"/>
-          <w:lang w:val="en-US"/>
-        </w:rPr>
-        <w:t xml:space="preserve">Figure 2.2: </w:t>
-      </w:r>
-      <w:r>
-        <w:rPr>
-          <w:rFonts w:asciiTheme="majorBidi" w:hAnsiTheme="majorBidi" w:cstheme="majorBidi"/>
-          <w:b/>
-          <w:bCs/>
-          <w:sz w:val="32"/>
-          <w:szCs w:val="32"/>
-          <w:lang w:val="en-US"/>
-        </w:rPr>
-        <w:t>Database Schema</w:t>
+          <w:i/>
+          <w:iCs/>
+          <w:sz w:val="36"/>
+          <w:szCs w:val="36"/>
+          <w:u w:val="single"/>
+          <w:lang w:val="en-US"/>
+        </w:rPr>
+        <w:lastRenderedPageBreak/>
+        <w:t>Child Managment</w:t>
+      </w:r>
+      <w:r>
+        <w:rPr>
+          <w:rFonts w:asciiTheme="majorBidi" w:hAnsiTheme="majorBidi" w:cstheme="majorBidi"/>
+          <w:b/>
+          <w:bCs/>
+          <w:i/>
+          <w:iCs/>
+          <w:sz w:val="36"/>
+          <w:szCs w:val="36"/>
+          <w:u w:val="single"/>
+          <w:lang w:val="en-US"/>
+        </w:rPr>
+        <w:t>:</w:t>
       </w:r>
     </w:p>
     <w:p>
@@ -8444,12 +8715,82 @@
           <w:rFonts w:ascii="Goudy Old Style" w:hAnsi="Goudy Old Style"/>
           <w:b/>
           <w:bCs/>
-          <w:sz w:val="72"/>
-          <w:szCs w:val="72"/>
+          <w:sz w:val="2"/>
+          <w:szCs w:val="2"/>
+          <w:lang w:val="en-US"/>
+        </w:rPr>
+      </w:pPr>
+    </w:p>
+    <w:p>
+      <w:pPr>
+        <w:spacing w:before="100" w:beforeAutospacing="1" w:after="100" w:afterAutospacing="1" w:line="240" w:lineRule="auto"/>
+        <w:ind w:left="-510" w:right="57"/>
+        <w:jc w:val="left"/>
+        <w:rPr>
+          <w:rFonts w:ascii="Times New Roman" w:eastAsia="Times New Roman" w:hAnsi="Times New Roman" w:cs="Times New Roman"/>
+          <w:sz w:val="24"/>
+          <w:szCs w:val="24"/>
           <w:rtl/>
-          <w:lang w:val="en-US"/>
-        </w:rPr>
-      </w:pPr>
+          <w:lang w:eastAsia="fr-FR"/>
+        </w:rPr>
+      </w:pPr>
+      <w:r>
+        <w:rPr>
+          <w:rFonts w:ascii="Times New Roman" w:eastAsia="Times New Roman" w:hAnsi="Times New Roman" w:cs="Times New Roman"/>
+          <w:noProof/>
+          <w:sz w:val="24"/>
+          <w:szCs w:val="24"/>
+          <w:lang w:eastAsia="fr-FR"/>
+        </w:rPr>
+        <w:drawing>
+          <wp:inline distT="0" distB="0" distL="0" distR="0">
+            <wp:extent cx="6562725" cy="8458200"/>
+            <wp:effectExtent l="0" t="0" r="9525" b="0"/>
+            <wp:docPr id="4" name="Image 4" descr="C:\Users\dif\Downloads\hLRRQXin47rVs7yOqXS74aEIXaB09V4D34dZsacV2a6HPcsHNScLP8UqzDyxqihshcCxJIb-i7TcD9TpHcTzQHqpRbxaCEu-TAOo5pTCiGaMg5oQEEboX626jHs6HdEq5iRuOuwA8tGbcnXMf4cQs2UfPemUm2wzlz84uCeO_TpHkJRmuRJdFy7AdJPjRGIQw3lhdv-qpxtlMcPuBHNkS0-f.png"/>
+            <wp:cNvGraphicFramePr>
+              <a:graphicFrameLocks xmlns:a="http://schemas.openxmlformats.org/drawingml/2006/main" noChangeAspect="1"/>
+            </wp:cNvGraphicFramePr>
+            <a:graphic xmlns:a="http://schemas.openxmlformats.org/drawingml/2006/main">
+              <a:graphicData uri="http://schemas.openxmlformats.org/drawingml/2006/picture">
+                <pic:pic xmlns:pic="http://schemas.openxmlformats.org/drawingml/2006/picture">
+                  <pic:nvPicPr>
+                    <pic:cNvPr id="0" name="Picture 3" descr="C:\Users\dif\Downloads\hLRRQXin47rVs7yOqXS74aEIXaB09V4D34dZsacV2a6HPcsHNScLP8UqzDyxqihshcCxJIb-i7TcD9TpHcTzQHqpRbxaCEu-TAOo5pTCiGaMg5oQEEboX626jHs6HdEq5iRuOuwA8tGbcnXMf4cQs2UfPemUm2wzlz84uCeO_TpHkJRmuRJdFy7AdJPjRGIQw3lhdv-qpxtlMcPuBHNkS0-f.png"/>
+                    <pic:cNvPicPr>
+                      <a:picLocks noChangeAspect="1" noChangeArrowheads="1"/>
+                    </pic:cNvPicPr>
+                  </pic:nvPicPr>
+                  <pic:blipFill>
+                    <a:blip r:embed="rId13">
+                      <a:extLst>
+                        <a:ext uri="{28A0092B-C50C-407E-A947-70E740481C1C}">
+                          <a14:useLocalDpi xmlns:a14="http://schemas.microsoft.com/office/drawing/2010/main" val="0"/>
+                        </a:ext>
+                      </a:extLst>
+                    </a:blip>
+                    <a:srcRect/>
+                    <a:stretch>
+                      <a:fillRect/>
+                    </a:stretch>
+                  </pic:blipFill>
+                  <pic:spPr bwMode="auto">
+                    <a:xfrm>
+                      <a:off x="0" y="0"/>
+                      <a:ext cx="6562725" cy="8458200"/>
+                    </a:xfrm>
+                    <a:prstGeom prst="rect">
+                      <a:avLst/>
+                    </a:prstGeom>
+                    <a:noFill/>
+                    <a:ln>
+                      <a:noFill/>
+                    </a:ln>
+                  </pic:spPr>
+                </pic:pic>
+              </a:graphicData>
+            </a:graphic>
+          </wp:inline>
+        </w:drawing>
+      </w:r>
     </w:p>
     <w:sectPr>
       <w:type w:val="continuous"/>
@@ -8904,7 +9245,7 @@
   <w:style w:type="paragraph" w:default="1" w:styleId="Normal">
     <w:name w:val="Normal"/>
     <w:qFormat/>
-    <w:rsid w:val="002D37F8"/>
+    <w:rsid w:val="006E4645"/>
   </w:style>
   <w:style w:type="paragraph" w:styleId="Titre1">
     <w:name w:val="heading 1"/>

</xml_diff>

<commit_message>
SEQUENCE DOAGRAM AND CHAPTER 4
</commit_message>
<xml_diff>
--- a/PFE.docx
+++ b/PFE.docx
@@ -966,6 +966,7 @@
           <w:szCs w:val="24"/>
         </w:rPr>
       </w:pPr>
+      <w:bookmarkStart w:id="0" w:name="_GoBack"/>
       <w:r>
         <w:rPr>
           <w:sz w:val="24"/>
@@ -987,9 +988,10 @@
           <w:sz w:val="24"/>
           <w:szCs w:val="24"/>
         </w:rPr>
-        <w:t>4.3.1 Architecture adoptée (MVC / MVVM) ....................... 37</w:t>
-      </w:r>
-    </w:p>
+        <w:t>4.3.2 Organisation du projet .............................................. 38</w:t>
+      </w:r>
+    </w:p>
+    <w:bookmarkEnd w:id="0"/>
     <w:p>
       <w:pPr>
         <w:spacing w:after="100"/>
@@ -1003,7 +1005,7 @@
           <w:sz w:val="24"/>
           <w:szCs w:val="24"/>
         </w:rPr>
-        <w:t>4.3.2 Organisation du projet .............................................. 38</w:t>
+        <w:t>4.4 Présentation des fonctionnalités ................................... 39</w:t>
       </w:r>
     </w:p>
     <w:p>
@@ -1019,7 +1021,7 @@
           <w:sz w:val="24"/>
           <w:szCs w:val="24"/>
         </w:rPr>
-        <w:t>4.4 Présentation des fonctionnalités ................................... 39</w:t>
+        <w:t>4.5 Interfaces de l’application ............................................... 39</w:t>
       </w:r>
     </w:p>
     <w:p>
@@ -1035,7 +1037,7 @@
           <w:sz w:val="24"/>
           <w:szCs w:val="24"/>
         </w:rPr>
-        <w:t>4.5 Interfaces de l’application ............................................... 39</w:t>
+        <w:t>4.5.1 Interface d’authentification ...................................... 39</w:t>
       </w:r>
     </w:p>
     <w:p>
@@ -1051,7 +1053,7 @@
           <w:sz w:val="24"/>
           <w:szCs w:val="24"/>
         </w:rPr>
-        <w:t>4.5.1 Interface d’authentification ...................................... 39</w:t>
+        <w:t>4.5.2 Tableau de bord (Dashboard) ................................... 40</w:t>
       </w:r>
     </w:p>
     <w:p>
@@ -1067,7 +1069,7 @@
           <w:sz w:val="24"/>
           <w:szCs w:val="24"/>
         </w:rPr>
-        <w:t>4.5.2 Tableau de bord (Dashboard) ................................... 40</w:t>
+        <w:t>4.5.3 Gestion des enfants .................................................. 41</w:t>
       </w:r>
     </w:p>
     <w:p>
@@ -1083,7 +1085,7 @@
           <w:sz w:val="24"/>
           <w:szCs w:val="24"/>
         </w:rPr>
-        <w:t>4.5.3 Gestion des enfants .................................................. 41</w:t>
+        <w:t>4.5.4 Profil enfant .............................................................. 42</w:t>
       </w:r>
     </w:p>
     <w:p>
@@ -1099,7 +1101,7 @@
           <w:sz w:val="24"/>
           <w:szCs w:val="24"/>
         </w:rPr>
-        <w:t>4.5.4 Profil enfant .............................................................. 42</w:t>
+        <w:t>4.5.5 Gestion des présences .............................................. 44</w:t>
       </w:r>
     </w:p>
     <w:p>
@@ -1115,7 +1117,7 @@
           <w:sz w:val="24"/>
           <w:szCs w:val="24"/>
         </w:rPr>
-        <w:t>4.5.5 Gestion des présences .............................................. 44</w:t>
+        <w:t>4.5.6 Gestion des employés ............................................... 45</w:t>
       </w:r>
     </w:p>
     <w:p>
@@ -1131,7 +1133,7 @@
           <w:sz w:val="24"/>
           <w:szCs w:val="24"/>
         </w:rPr>
-        <w:t>4.5.6 Gestion des employés ............................................... 45</w:t>
+        <w:t>4.5.7 Gestion des activités ................................................. 47</w:t>
       </w:r>
     </w:p>
     <w:p>
@@ -1147,7 +1149,7 @@
           <w:sz w:val="24"/>
           <w:szCs w:val="24"/>
         </w:rPr>
-        <w:t>4.5.7 Gestion des activités ................................................. 47</w:t>
+        <w:t>4.5.8 Gestion des paiements .............................................. 48</w:t>
       </w:r>
     </w:p>
     <w:p>
@@ -1163,7 +1165,7 @@
           <w:sz w:val="24"/>
           <w:szCs w:val="24"/>
         </w:rPr>
-        <w:t>4.5.8 Gestion des paiements .............................................. 48</w:t>
+        <w:t>4.5.9 Gestion des dépenses ............................................... 49</w:t>
       </w:r>
     </w:p>
     <w:p>
@@ -1179,7 +1181,7 @@
           <w:sz w:val="24"/>
           <w:szCs w:val="24"/>
         </w:rPr>
-        <w:t>4.5.9 Gestion des dépenses ............................................... 49</w:t>
+        <w:t>4.5.10 Statistiques et graphiques ....................................... 50</w:t>
       </w:r>
     </w:p>
     <w:p>
@@ -1195,7 +1197,7 @@
           <w:sz w:val="24"/>
           <w:szCs w:val="24"/>
         </w:rPr>
-        <w:t>4.5.10 Statistiques et graphiques ....................................... 50</w:t>
+        <w:t>4.5.11 Paramètres ............................................................... 51</w:t>
       </w:r>
     </w:p>
     <w:p>
@@ -1211,7 +1213,7 @@
           <w:sz w:val="24"/>
           <w:szCs w:val="24"/>
         </w:rPr>
-        <w:t>4.5.11 Paramètres ............................................................... 51</w:t>
+        <w:t>4.6 Tests et validation............................................................ 52</w:t>
       </w:r>
     </w:p>
     <w:p>
@@ -1227,22 +1229,6 @@
           <w:sz w:val="24"/>
           <w:szCs w:val="24"/>
         </w:rPr>
-        <w:t>4.6 Tests et validation............................................................ 52</w:t>
-      </w:r>
-    </w:p>
-    <w:p>
-      <w:pPr>
-        <w:spacing w:after="100"/>
-        <w:rPr>
-          <w:sz w:val="24"/>
-          <w:szCs w:val="24"/>
-        </w:rPr>
-      </w:pPr>
-      <w:r>
-        <w:rPr>
-          <w:sz w:val="24"/>
-          <w:szCs w:val="24"/>
-        </w:rPr>
         <w:t>4.7 Conclusion ........................................................................... 53</w:t>
       </w:r>
     </w:p>
@@ -1338,29 +1324,35 @@
       <w:pPr>
         <w:spacing w:after="100"/>
         <w:rPr>
-          <w:sz w:val="36"/>
-          <w:szCs w:val="36"/>
-          <w:lang w:val="en-US"/>
-        </w:rPr>
-      </w:pPr>
-      <w:r>
-        <w:rPr>
           <w:b/>
           <w:bCs/>
           <w:sz w:val="44"/>
           <w:szCs w:val="44"/>
           <w:lang w:val="en-US"/>
         </w:rPr>
-        <w:t>— Chapitre 01</w:t>
-      </w:r>
-      <w:r>
-        <w:rPr>
+      </w:pPr>
+    </w:p>
+    <w:p>
+      <w:pPr>
+        <w:spacing w:after="100"/>
+        <w:rPr>
+          <w:b/>
+          <w:bCs/>
           <w:sz w:val="44"/>
           <w:szCs w:val="44"/>
           <w:lang w:val="en-US"/>
         </w:rPr>
-        <w:t xml:space="preserve"> : </w:t>
-      </w:r>
+      </w:pPr>
+    </w:p>
+    <w:p>
+      <w:pPr>
+        <w:spacing w:after="100"/>
+        <w:rPr>
+          <w:sz w:val="36"/>
+          <w:szCs w:val="36"/>
+          <w:lang w:val="en-US"/>
+        </w:rPr>
+      </w:pPr>
       <w:r>
         <w:rPr>
           <w:b/>
@@ -1369,6 +1361,25 @@
           <w:szCs w:val="44"/>
           <w:lang w:val="en-US"/>
         </w:rPr>
+        <w:lastRenderedPageBreak/>
+        <w:t>— Chapitre 01</w:t>
+      </w:r>
+      <w:r>
+        <w:rPr>
+          <w:sz w:val="44"/>
+          <w:szCs w:val="44"/>
+          <w:lang w:val="en-US"/>
+        </w:rPr>
+        <w:t xml:space="preserve"> : </w:t>
+      </w:r>
+      <w:r>
+        <w:rPr>
+          <w:b/>
+          <w:bCs/>
+          <w:sz w:val="44"/>
+          <w:szCs w:val="44"/>
+          <w:lang w:val="en-US"/>
+        </w:rPr>
         <w:t>L’organisme d’accueil</w:t>
       </w:r>
     </w:p>
@@ -1387,7 +1398,6 @@
           <w:szCs w:val="28"/>
           <w:lang w:val="en-US"/>
         </w:rPr>
-        <w:lastRenderedPageBreak/>
         <w:t>In this chapter, we present the host organization, its main activities, and the services it provides.</w:t>
       </w:r>
     </w:p>
@@ -1756,7 +1766,6 @@
           <w:szCs w:val="96"/>
           <w:lang w:val="en-US"/>
         </w:rPr>
-        <w:lastRenderedPageBreak/>
         <w:t>Chaptre 01</w:t>
       </w:r>
     </w:p>
@@ -2036,32 +2045,6 @@
         <w:rPr>
           <w:sz w:val="22"/>
           <w:szCs w:val="22"/>
-          <w:lang w:val="en-US"/>
-        </w:rPr>
-      </w:pPr>
-    </w:p>
-    <w:p>
-      <w:pPr>
-        <w:spacing w:after="100"/>
-        <w:rPr>
-          <w:rFonts w:ascii="Goudy Old Style" w:hAnsi="Goudy Old Style"/>
-          <w:b/>
-          <w:bCs/>
-          <w:sz w:val="72"/>
-          <w:szCs w:val="72"/>
-          <w:lang w:val="en-US"/>
-        </w:rPr>
-      </w:pPr>
-    </w:p>
-    <w:p>
-      <w:pPr>
-        <w:spacing w:after="100"/>
-        <w:rPr>
-          <w:rFonts w:ascii="Goudy Old Style" w:hAnsi="Goudy Old Style"/>
-          <w:b/>
-          <w:bCs/>
-          <w:sz w:val="72"/>
-          <w:szCs w:val="72"/>
           <w:lang w:val="en-US"/>
         </w:rPr>
       </w:pPr>
@@ -5388,7 +5371,7 @@
           </mc:Choice>
           <mc:Fallback>
             <w:pict>
-              <v:line w14:anchorId="6F690F30" id="Connecteur droit 8" o:spid="_x0000_s1026" style="position:absolute;z-index:251660288;visibility:visible;mso-wrap-style:square;mso-height-percent:0;mso-wrap-distance-left:9pt;mso-wrap-distance-top:0;mso-wrap-distance-right:9pt;mso-wrap-distance-bottom:0;mso-position-horizontal:absolute;mso-position-horizontal-relative:text;mso-position-vertical:absolute;mso-position-vertical-relative:text;mso-height-percent:0;mso-height-relative:margin" from="266.9pt,250.05pt" to="297.15pt,250.05pt" o:gfxdata="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" strokecolor="gray [1629]" strokeweight="1.5pt">
+              <v:line w14:anchorId="0E4C6078" id="Connecteur droit 8" o:spid="_x0000_s1026" style="position:absolute;z-index:251660288;visibility:visible;mso-wrap-style:square;mso-height-percent:0;mso-wrap-distance-left:9pt;mso-wrap-distance-top:0;mso-wrap-distance-right:9pt;mso-wrap-distance-bottom:0;mso-position-horizontal:absolute;mso-position-horizontal-relative:text;mso-position-vertical:absolute;mso-position-vertical-relative:text;mso-height-percent:0;mso-height-relative:margin" from="266.9pt,250.05pt" to="297.15pt,250.05pt" o:gfxdata="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" strokecolor="gray [1629]" strokeweight="1.5pt">
                 <v:stroke joinstyle="miter"/>
               </v:line>
             </w:pict>
@@ -5473,7 +5456,7 @@
           </mc:Choice>
           <mc:Fallback>
             <w:pict>
-              <v:shapetype w14:anchorId="1326FB44" id="_x0000_t110" coordsize="21600,21600" o:spt="110" path="m10800,l,10800,10800,21600,21600,10800xe">
+              <v:shapetype w14:anchorId="349C9925" id="_x0000_t110" coordsize="21600,21600" o:spt="110" path="m10800,l,10800,10800,21600,21600,10800xe">
                 <v:stroke joinstyle="miter"/>
                 <v:path gradientshapeok="t" o:connecttype="rect" textboxrect="5400,5400,16200,16200"/>
               </v:shapetype>
@@ -8510,6 +8493,7 @@
     <w:p>
       <w:pPr>
         <w:spacing w:before="100" w:beforeAutospacing="1" w:after="100" w:afterAutospacing="1" w:line="240" w:lineRule="auto"/>
+        <w:ind w:left="-454"/>
         <w:jc w:val="left"/>
         <w:rPr>
           <w:rFonts w:ascii="Times New Roman" w:eastAsia="Times New Roman" w:hAnsi="Times New Roman" w:cs="Times New Roman"/>
@@ -8528,8 +8512,8 @@
         </w:rPr>
         <w:drawing>
           <wp:inline distT="0" distB="0" distL="0" distR="0">
-            <wp:extent cx="6153150" cy="6934200"/>
-            <wp:effectExtent l="0" t="0" r="0" b="0"/>
+            <wp:extent cx="6697683" cy="6934059"/>
+            <wp:effectExtent l="0" t="0" r="8255" b="635"/>
             <wp:docPr id="3" name="Image 3" descr="C:\Users\dif\Downloads\bLHDRzD04BtlhnYPGri-96W41oIWTkA8IB503H6NIcYwdiIhshjcTqtuKFzxPpUEquH8Y8iFyzwyzsR6zfNpQ7tNrB2OV4ixNv7sIg9NHWjtftIB5XjmzBqZBGd-283KMhCPczfOU38QZK95UcCpOqkoVVtr-4qsVidGNArehZITHZ-pjvAgHUqpb7ThQpfTzgGydrvEfqUaaofJe_r2_IPu.png"/>
             <wp:cNvGraphicFramePr>
               <a:graphicFrameLocks xmlns:a="http://schemas.openxmlformats.org/drawingml/2006/main" noChangeAspect="1"/>
@@ -8559,7 +8543,7 @@
                   <pic:spPr bwMode="auto">
                     <a:xfrm>
                       <a:off x="0" y="0"/>
-                      <a:ext cx="6153150" cy="6934200"/>
+                      <a:ext cx="6709942" cy="6946751"/>
                     </a:xfrm>
                     <a:prstGeom prst="rect">
                       <a:avLst/>
@@ -8585,6 +8569,7 @@
           <w:bCs/>
           <w:sz w:val="32"/>
           <w:szCs w:val="32"/>
+          <w:lang w:val="en-US"/>
         </w:rPr>
       </w:pPr>
       <w:r>
@@ -8605,25 +8590,27 @@
           <w:sz w:val="32"/>
           <w:szCs w:val="32"/>
         </w:rPr>
-        <w:t xml:space="preserve">   Figure 2.2: </w:t>
-      </w:r>
-      <w:r>
-        <w:rPr>
-          <w:rFonts w:asciiTheme="majorBidi" w:hAnsiTheme="majorBidi" w:cstheme="majorBidi"/>
-          <w:b/>
-          <w:bCs/>
-          <w:sz w:val="32"/>
-          <w:szCs w:val="32"/>
-        </w:rPr>
-        <w:t>A</w:t>
-      </w:r>
-      <w:r>
-        <w:rPr>
-          <w:rFonts w:asciiTheme="majorBidi" w:hAnsiTheme="majorBidi" w:cstheme="majorBidi"/>
-          <w:b/>
-          <w:bCs/>
-          <w:sz w:val="32"/>
-          <w:szCs w:val="32"/>
+        <w:t xml:space="preserve">   </w:t>
+      </w:r>
+      <w:r>
+        <w:rPr>
+          <w:rFonts w:asciiTheme="majorBidi" w:hAnsiTheme="majorBidi" w:cstheme="majorBidi"/>
+          <w:b/>
+          <w:bCs/>
+          <w:sz w:val="32"/>
+          <w:szCs w:val="32"/>
+          <w:lang w:val="en-US"/>
+        </w:rPr>
+        <w:t>Figure 2.2: A</w:t>
+      </w:r>
+      <w:r>
+        <w:rPr>
+          <w:rFonts w:asciiTheme="majorBidi" w:hAnsiTheme="majorBidi" w:cstheme="majorBidi"/>
+          <w:b/>
+          <w:bCs/>
+          <w:sz w:val="32"/>
+          <w:szCs w:val="32"/>
+          <w:lang w:val="en-US"/>
         </w:rPr>
         <w:t>uthentication Se</w:t>
       </w:r>
@@ -8634,18 +8621,9 @@
           <w:bCs/>
           <w:sz w:val="32"/>
           <w:szCs w:val="32"/>
-        </w:rPr>
-        <w:t>quence</w:t>
-      </w:r>
-      <w:r>
-        <w:rPr>
-          <w:rFonts w:asciiTheme="majorBidi" w:hAnsiTheme="majorBidi" w:cstheme="majorBidi"/>
-          <w:b/>
-          <w:bCs/>
-          <w:sz w:val="32"/>
-          <w:szCs w:val="32"/>
-        </w:rPr>
-        <w:t xml:space="preserve"> Diagram</w:t>
+          <w:lang w:val="en-US"/>
+        </w:rPr>
+        <w:t>quence Diagram</w:t>
       </w:r>
     </w:p>
     <w:p>
@@ -8676,8 +8654,6 @@
           <w:lang w:val="en-US"/>
         </w:rPr>
       </w:pPr>
-      <w:bookmarkStart w:id="0" w:name="_GoBack"/>
-      <w:bookmarkEnd w:id="0"/>
       <w:r>
         <w:rPr>
           <w:rFonts w:asciiTheme="majorBidi" w:hAnsiTheme="majorBidi" w:cstheme="majorBidi"/>
@@ -8691,21 +8667,7 @@
           <w:lang w:val="en-US"/>
         </w:rPr>
         <w:lastRenderedPageBreak/>
-        <w:t>Child Managment</w:t>
-      </w:r>
-      <w:r>
-        <w:rPr>
-          <w:rFonts w:asciiTheme="majorBidi" w:hAnsiTheme="majorBidi" w:cstheme="majorBidi"/>
-          <w:b/>
-          <w:bCs/>
-          <w:i/>
-          <w:iCs/>
-          <w:sz w:val="36"/>
-          <w:szCs w:val="36"/>
-          <w:u w:val="single"/>
-          <w:lang w:val="en-US"/>
-        </w:rPr>
-        <w:t>:</w:t>
+        <w:t>Child Managment:</w:t>
       </w:r>
     </w:p>
     <w:p>
@@ -8727,11 +8689,15 @@
         <w:ind w:left="-510" w:right="57"/>
         <w:jc w:val="left"/>
         <w:rPr>
-          <w:rFonts w:ascii="Times New Roman" w:eastAsia="Times New Roman" w:hAnsi="Times New Roman" w:cs="Times New Roman"/>
-          <w:sz w:val="24"/>
-          <w:szCs w:val="24"/>
-          <w:rtl/>
-          <w:lang w:eastAsia="fr-FR"/>
+          <w:rFonts w:asciiTheme="majorBidi" w:hAnsiTheme="majorBidi" w:cstheme="majorBidi"/>
+          <w:b/>
+          <w:bCs/>
+          <w:i/>
+          <w:iCs/>
+          <w:sz w:val="36"/>
+          <w:szCs w:val="36"/>
+          <w:u w:val="single"/>
+          <w:lang w:val="en-US"/>
         </w:rPr>
       </w:pPr>
       <w:r>
@@ -8790,6 +8756,1935 @@
             </a:graphic>
           </wp:inline>
         </w:drawing>
+      </w:r>
+    </w:p>
+    <w:p>
+      <w:pPr>
+        <w:spacing w:after="100"/>
+        <w:rPr>
+          <w:rFonts w:asciiTheme="majorBidi" w:hAnsiTheme="majorBidi" w:cstheme="majorBidi"/>
+          <w:b/>
+          <w:bCs/>
+          <w:sz w:val="32"/>
+          <w:szCs w:val="32"/>
+          <w:lang w:val="en-US"/>
+        </w:rPr>
+      </w:pPr>
+      <w:r>
+        <w:rPr>
+          <w:rFonts w:asciiTheme="majorBidi" w:hAnsiTheme="majorBidi" w:cstheme="majorBidi"/>
+          <w:b/>
+          <w:bCs/>
+          <w:sz w:val="32"/>
+          <w:szCs w:val="32"/>
+          <w:lang w:val="en-US"/>
+        </w:rPr>
+        <w:t xml:space="preserve">                 </w:t>
+      </w:r>
+      <w:r>
+        <w:rPr>
+          <w:rFonts w:asciiTheme="majorBidi" w:hAnsiTheme="majorBidi" w:cstheme="majorBidi"/>
+          <w:b/>
+          <w:bCs/>
+          <w:sz w:val="32"/>
+          <w:szCs w:val="32"/>
+          <w:lang w:val="en-US"/>
+        </w:rPr>
+        <w:t>Figure 2.2: Authentication Sequence Diagram</w:t>
+      </w:r>
+    </w:p>
+    <w:p>
+      <w:pPr>
+        <w:spacing w:before="100" w:beforeAutospacing="1" w:after="100" w:afterAutospacing="1" w:line="240" w:lineRule="auto"/>
+        <w:ind w:left="-737" w:right="2721"/>
+        <w:jc w:val="left"/>
+        <w:rPr>
+          <w:rFonts w:asciiTheme="majorBidi" w:hAnsiTheme="majorBidi" w:cstheme="majorBidi"/>
+          <w:b/>
+          <w:bCs/>
+          <w:i/>
+          <w:iCs/>
+          <w:sz w:val="36"/>
+          <w:szCs w:val="36"/>
+          <w:u w:val="single"/>
+          <w:lang w:val="en-US"/>
+        </w:rPr>
+      </w:pPr>
+    </w:p>
+    <w:p>
+      <w:pPr>
+        <w:spacing w:before="100" w:beforeAutospacing="1" w:after="100" w:afterAutospacing="1" w:line="240" w:lineRule="auto"/>
+        <w:ind w:left="-737" w:right="2721"/>
+        <w:jc w:val="left"/>
+        <w:rPr>
+          <w:rFonts w:asciiTheme="majorBidi" w:hAnsiTheme="majorBidi" w:cstheme="majorBidi"/>
+          <w:b/>
+          <w:bCs/>
+          <w:i/>
+          <w:iCs/>
+          <w:sz w:val="2"/>
+          <w:szCs w:val="2"/>
+          <w:u w:val="single"/>
+          <w:lang w:val="en-US"/>
+        </w:rPr>
+      </w:pPr>
+      <w:r>
+        <w:rPr>
+          <w:rFonts w:asciiTheme="majorBidi" w:hAnsiTheme="majorBidi" w:cstheme="majorBidi"/>
+          <w:b/>
+          <w:bCs/>
+          <w:i/>
+          <w:iCs/>
+          <w:sz w:val="36"/>
+          <w:szCs w:val="36"/>
+          <w:u w:val="single"/>
+          <w:lang w:val="en-US"/>
+        </w:rPr>
+        <w:t>Attendance</w:t>
+      </w:r>
+      <w:r>
+        <w:rPr>
+          <w:rFonts w:asciiTheme="majorBidi" w:hAnsiTheme="majorBidi" w:cstheme="majorBidi"/>
+          <w:b/>
+          <w:bCs/>
+          <w:i/>
+          <w:iCs/>
+          <w:sz w:val="36"/>
+          <w:szCs w:val="36"/>
+          <w:u w:val="single"/>
+          <w:lang w:val="en-US"/>
+        </w:rPr>
+        <w:t xml:space="preserve"> Managment:</w:t>
+      </w:r>
+      <w:r>
+        <w:rPr>
+          <w:rFonts w:asciiTheme="majorBidi" w:hAnsiTheme="majorBidi" w:cstheme="majorBidi"/>
+          <w:b/>
+          <w:bCs/>
+          <w:i/>
+          <w:iCs/>
+          <w:sz w:val="36"/>
+          <w:szCs w:val="36"/>
+          <w:u w:val="single"/>
+          <w:lang w:val="en-US"/>
+        </w:rPr>
+        <w:t xml:space="preserve"> </w:t>
+      </w:r>
+    </w:p>
+    <w:p>
+      <w:pPr>
+        <w:spacing w:before="100" w:beforeAutospacing="1" w:after="100"/>
+        <w:ind w:left="-850"/>
+        <w:rPr>
+          <w:rFonts w:asciiTheme="majorBidi" w:hAnsiTheme="majorBidi" w:cstheme="majorBidi"/>
+          <w:b/>
+          <w:bCs/>
+          <w:sz w:val="32"/>
+          <w:szCs w:val="32"/>
+          <w:lang w:val="en-US"/>
+        </w:rPr>
+      </w:pPr>
+      <w:r>
+        <w:rPr>
+          <w:noProof/>
+        </w:rPr>
+        <w:drawing>
+          <wp:inline distT="0" distB="0" distL="0" distR="0" wp14:anchorId="3A429F82" wp14:editId="13175DA7">
+            <wp:extent cx="6885940" cy="7766462"/>
+            <wp:effectExtent l="0" t="0" r="0" b="6350"/>
+            <wp:docPr id="5" name="Image 5" descr="C:\Users\dif\Downloads\bLBHQXin47pNLopfYqCJIciAQS4bZkD088RGqBwMZRI-4zP9LsalRbhwxvNEkfvLZfQ-v89cPZqpkvU1qNFN615sshReiO50Npkoak2705Xwx_OhPvo75_FvFBr8TlxAUKL-UB-uMCzN4RhJMxhJbgRHU_IifMxHyXNANULTPrKchIzktgxVbQJfAJVEyeF-Jl3wZVXvxBf6vVRQLh154qW8.png"/>
+            <wp:cNvGraphicFramePr>
+              <a:graphicFrameLocks xmlns:a="http://schemas.openxmlformats.org/drawingml/2006/main" noChangeAspect="1"/>
+            </wp:cNvGraphicFramePr>
+            <a:graphic xmlns:a="http://schemas.openxmlformats.org/drawingml/2006/main">
+              <a:graphicData uri="http://schemas.openxmlformats.org/drawingml/2006/picture">
+                <pic:pic xmlns:pic="http://schemas.openxmlformats.org/drawingml/2006/picture">
+                  <pic:nvPicPr>
+                    <pic:cNvPr id="0" name="Picture 5" descr="C:\Users\dif\Downloads\bLBHQXin47pNLopfYqCJIciAQS4bZkD088RGqBwMZRI-4zP9LsalRbhwxvNEkfvLZfQ-v89cPZqpkvU1qNFN615sshReiO50Npkoak2705Xwx_OhPvo75_FvFBr8TlxAUKL-UB-uMCzN4RhJMxhJbgRHU_IifMxHyXNANULTPrKchIzktgxVbQJfAJVEyeF-Jl3wZVXvxBf6vVRQLh154qW8.png"/>
+                    <pic:cNvPicPr>
+                      <a:picLocks noChangeAspect="1" noChangeArrowheads="1"/>
+                    </pic:cNvPicPr>
+                  </pic:nvPicPr>
+                  <pic:blipFill>
+                    <a:blip r:embed="rId14">
+                      <a:extLst>
+                        <a:ext uri="{28A0092B-C50C-407E-A947-70E740481C1C}">
+                          <a14:useLocalDpi xmlns:a14="http://schemas.microsoft.com/office/drawing/2010/main" val="0"/>
+                        </a:ext>
+                      </a:extLst>
+                    </a:blip>
+                    <a:srcRect/>
+                    <a:stretch>
+                      <a:fillRect/>
+                    </a:stretch>
+                  </pic:blipFill>
+                  <pic:spPr bwMode="auto">
+                    <a:xfrm>
+                      <a:off x="0" y="0"/>
+                      <a:ext cx="6981177" cy="7873877"/>
+                    </a:xfrm>
+                    <a:prstGeom prst="rect">
+                      <a:avLst/>
+                    </a:prstGeom>
+                    <a:noFill/>
+                    <a:ln>
+                      <a:noFill/>
+                    </a:ln>
+                  </pic:spPr>
+                </pic:pic>
+              </a:graphicData>
+            </a:graphic>
+          </wp:inline>
+        </w:drawing>
+      </w:r>
+      <w:r>
+        <w:rPr>
+          <w:rFonts w:asciiTheme="majorBidi" w:hAnsiTheme="majorBidi" w:cstheme="majorBidi"/>
+          <w:b/>
+          <w:bCs/>
+          <w:sz w:val="32"/>
+          <w:szCs w:val="32"/>
+          <w:lang w:val="en-US"/>
+        </w:rPr>
+        <w:t xml:space="preserve">                            </w:t>
+      </w:r>
+    </w:p>
+    <w:p>
+      <w:pPr>
+        <w:spacing w:before="100" w:beforeAutospacing="1" w:after="100"/>
+        <w:ind w:left="-850"/>
+        <w:rPr>
+          <w:rFonts w:asciiTheme="majorBidi" w:hAnsiTheme="majorBidi" w:cstheme="majorBidi"/>
+          <w:b/>
+          <w:bCs/>
+          <w:sz w:val="32"/>
+          <w:szCs w:val="32"/>
+          <w:lang w:val="en-US"/>
+        </w:rPr>
+      </w:pPr>
+      <w:r>
+        <w:rPr>
+          <w:rFonts w:asciiTheme="majorBidi" w:hAnsiTheme="majorBidi" w:cstheme="majorBidi"/>
+          <w:b/>
+          <w:bCs/>
+          <w:sz w:val="32"/>
+          <w:szCs w:val="32"/>
+          <w:lang w:val="en-US"/>
+        </w:rPr>
+        <w:t xml:space="preserve">                       </w:t>
+      </w:r>
+      <w:r>
+        <w:rPr>
+          <w:rFonts w:asciiTheme="majorBidi" w:hAnsiTheme="majorBidi" w:cstheme="majorBidi"/>
+          <w:b/>
+          <w:bCs/>
+          <w:sz w:val="32"/>
+          <w:szCs w:val="32"/>
+          <w:lang w:val="en-US"/>
+        </w:rPr>
+        <w:t>Figure 2.2: Authentication Sequence Diagram</w:t>
+      </w:r>
+    </w:p>
+    <w:p>
+      <w:pPr>
+        <w:spacing w:before="100" w:beforeAutospacing="1" w:after="100" w:afterAutospacing="1" w:line="240" w:lineRule="auto"/>
+        <w:ind w:left="-737" w:right="2721"/>
+        <w:jc w:val="left"/>
+        <w:rPr>
+          <w:rFonts w:ascii="Times New Roman" w:eastAsia="Times New Roman" w:hAnsi="Times New Roman" w:cs="Times New Roman"/>
+          <w:sz w:val="24"/>
+          <w:szCs w:val="24"/>
+          <w:lang w:eastAsia="fr-FR"/>
+        </w:rPr>
+      </w:pPr>
+    </w:p>
+    <w:p>
+      <w:pPr>
+        <w:spacing w:before="100" w:beforeAutospacing="1" w:after="100" w:afterAutospacing="1" w:line="240" w:lineRule="auto"/>
+        <w:ind w:left="-737" w:right="2721"/>
+        <w:jc w:val="left"/>
+        <w:rPr>
+          <w:rFonts w:asciiTheme="majorBidi" w:hAnsiTheme="majorBidi" w:cstheme="majorBidi"/>
+          <w:b/>
+          <w:bCs/>
+          <w:i/>
+          <w:iCs/>
+          <w:sz w:val="2"/>
+          <w:szCs w:val="2"/>
+          <w:u w:val="single"/>
+          <w:lang w:val="en-US"/>
+        </w:rPr>
+      </w:pPr>
+      <w:r>
+        <w:rPr>
+          <w:rFonts w:asciiTheme="majorBidi" w:hAnsiTheme="majorBidi" w:cstheme="majorBidi"/>
+          <w:b/>
+          <w:bCs/>
+          <w:i/>
+          <w:iCs/>
+          <w:sz w:val="36"/>
+          <w:szCs w:val="36"/>
+          <w:u w:val="single"/>
+          <w:lang w:val="en-US"/>
+        </w:rPr>
+        <w:lastRenderedPageBreak/>
+        <w:t>Employee</w:t>
+      </w:r>
+      <w:r>
+        <w:rPr>
+          <w:rFonts w:asciiTheme="majorBidi" w:hAnsiTheme="majorBidi" w:cstheme="majorBidi"/>
+          <w:b/>
+          <w:bCs/>
+          <w:i/>
+          <w:iCs/>
+          <w:sz w:val="36"/>
+          <w:szCs w:val="36"/>
+          <w:u w:val="single"/>
+          <w:lang w:val="en-US"/>
+        </w:rPr>
+        <w:t xml:space="preserve"> Managment:</w:t>
+      </w:r>
+      <w:r>
+        <w:rPr>
+          <w:rFonts w:asciiTheme="majorBidi" w:hAnsiTheme="majorBidi" w:cstheme="majorBidi"/>
+          <w:b/>
+          <w:bCs/>
+          <w:i/>
+          <w:iCs/>
+          <w:sz w:val="36"/>
+          <w:szCs w:val="36"/>
+          <w:u w:val="single"/>
+          <w:lang w:val="en-US"/>
+        </w:rPr>
+        <w:t xml:space="preserve"> </w:t>
+      </w:r>
+      <w:r>
+        <w:rPr>
+          <w:noProof/>
+          <w:lang w:eastAsia="fr-FR"/>
+        </w:rPr>
+        <w:drawing>
+          <wp:inline distT="0" distB="0" distL="0" distR="0" wp14:anchorId="48BE1398" wp14:editId="56B15B15">
+            <wp:extent cx="6875780" cy="8372104"/>
+            <wp:effectExtent l="0" t="0" r="1270" b="0"/>
+            <wp:docPr id="10" name="Image 10"/>
+            <wp:cNvGraphicFramePr>
+              <a:graphicFrameLocks xmlns:a="http://schemas.openxmlformats.org/drawingml/2006/main" noChangeAspect="1"/>
+            </wp:cNvGraphicFramePr>
+            <a:graphic xmlns:a="http://schemas.openxmlformats.org/drawingml/2006/main">
+              <a:graphicData uri="http://schemas.openxmlformats.org/drawingml/2006/picture">
+                <pic:pic xmlns:pic="http://schemas.openxmlformats.org/drawingml/2006/picture">
+                  <pic:nvPicPr>
+                    <pic:cNvPr id="1" name=""/>
+                    <pic:cNvPicPr/>
+                  </pic:nvPicPr>
+                  <pic:blipFill>
+                    <a:blip r:embed="rId15"/>
+                    <a:stretch>
+                      <a:fillRect/>
+                    </a:stretch>
+                  </pic:blipFill>
+                  <pic:spPr>
+                    <a:xfrm>
+                      <a:off x="0" y="0"/>
+                      <a:ext cx="6880489" cy="8377838"/>
+                    </a:xfrm>
+                    <a:prstGeom prst="rect">
+                      <a:avLst/>
+                    </a:prstGeom>
+                  </pic:spPr>
+                </pic:pic>
+              </a:graphicData>
+            </a:graphic>
+          </wp:inline>
+        </w:drawing>
+      </w:r>
+    </w:p>
+    <w:p>
+      <w:pPr>
+        <w:spacing w:before="100" w:beforeAutospacing="1" w:after="100"/>
+        <w:ind w:left="-850"/>
+        <w:rPr>
+          <w:rFonts w:asciiTheme="majorBidi" w:hAnsiTheme="majorBidi" w:cstheme="majorBidi"/>
+          <w:b/>
+          <w:bCs/>
+          <w:sz w:val="32"/>
+          <w:szCs w:val="32"/>
+          <w:lang w:val="en-US"/>
+        </w:rPr>
+      </w:pPr>
+      <w:r>
+        <w:rPr>
+          <w:rFonts w:asciiTheme="majorBidi" w:hAnsiTheme="majorBidi" w:cstheme="majorBidi"/>
+          <w:b/>
+          <w:bCs/>
+          <w:sz w:val="32"/>
+          <w:szCs w:val="32"/>
+          <w:lang w:val="en-US"/>
+        </w:rPr>
+        <w:t xml:space="preserve">                       </w:t>
+      </w:r>
+      <w:r>
+        <w:rPr>
+          <w:rFonts w:asciiTheme="majorBidi" w:hAnsiTheme="majorBidi" w:cstheme="majorBidi"/>
+          <w:b/>
+          <w:bCs/>
+          <w:sz w:val="32"/>
+          <w:szCs w:val="32"/>
+          <w:lang w:val="en-US"/>
+        </w:rPr>
+        <w:t>Figure 2.2: Authentication Sequence Diagram</w:t>
+      </w:r>
+    </w:p>
+    <w:p>
+      <w:pPr>
+        <w:spacing w:before="100" w:beforeAutospacing="1" w:after="100" w:afterAutospacing="1" w:line="240" w:lineRule="auto"/>
+        <w:ind w:left="-907"/>
+        <w:jc w:val="left"/>
+        <w:rPr>
+          <w:rFonts w:ascii="Times New Roman" w:eastAsia="Times New Roman" w:hAnsi="Times New Roman" w:cs="Times New Roman"/>
+          <w:sz w:val="24"/>
+          <w:szCs w:val="24"/>
+          <w:lang w:val="en-US" w:eastAsia="fr-FR"/>
+        </w:rPr>
+      </w:pPr>
+      <w:r>
+        <w:rPr>
+          <w:rFonts w:asciiTheme="majorBidi" w:hAnsiTheme="majorBidi" w:cstheme="majorBidi"/>
+          <w:b/>
+          <w:bCs/>
+          <w:i/>
+          <w:iCs/>
+          <w:sz w:val="36"/>
+          <w:szCs w:val="36"/>
+          <w:u w:val="single"/>
+          <w:lang w:val="en-US"/>
+        </w:rPr>
+        <w:lastRenderedPageBreak/>
+        <w:t>Payment</w:t>
+      </w:r>
+      <w:r>
+        <w:rPr>
+          <w:rFonts w:asciiTheme="majorBidi" w:hAnsiTheme="majorBidi" w:cstheme="majorBidi"/>
+          <w:b/>
+          <w:bCs/>
+          <w:i/>
+          <w:iCs/>
+          <w:sz w:val="36"/>
+          <w:szCs w:val="36"/>
+          <w:u w:val="single"/>
+          <w:lang w:val="en-US"/>
+        </w:rPr>
+        <w:t xml:space="preserve"> Managment:</w:t>
+      </w:r>
+    </w:p>
+    <w:p>
+      <w:pPr>
+        <w:pStyle w:val="NormalWeb"/>
+        <w:ind w:left="-1020"/>
+      </w:pPr>
+      <w:r>
+        <w:rPr>
+          <w:noProof/>
+        </w:rPr>
+        <w:drawing>
+          <wp:inline distT="0" distB="0" distL="0" distR="0">
+            <wp:extent cx="7162800" cy="7968343"/>
+            <wp:effectExtent l="0" t="0" r="0" b="0"/>
+            <wp:docPr id="11" name="Image 11" descr="C:\Users\dif\Downloads\bLDXInj14Fs-lsAmNnILebAmXHHZDIMW9TZQJuKoxawImRtPw-uU8ItzxztitQPtaYhz53BlpTjvRsukGaGVcyggyCXIeySA0lreI3J1BmKmzjwjFZZhFBmwEplRL7Hq_j9vGxwhJzwEpq_V9EY6vtJ3GhlH6Vh8cckKU8dwSU5T8wQG9fFpwvCXQRVAn4dyp3y9JaxLx_xKIpHknRA0ETf0.png"/>
+            <wp:cNvGraphicFramePr>
+              <a:graphicFrameLocks xmlns:a="http://schemas.openxmlformats.org/drawingml/2006/main" noChangeAspect="1"/>
+            </wp:cNvGraphicFramePr>
+            <a:graphic xmlns:a="http://schemas.openxmlformats.org/drawingml/2006/main">
+              <a:graphicData uri="http://schemas.openxmlformats.org/drawingml/2006/picture">
+                <pic:pic xmlns:pic="http://schemas.openxmlformats.org/drawingml/2006/picture">
+                  <pic:nvPicPr>
+                    <pic:cNvPr id="0" name="Picture 3" descr="C:\Users\dif\Downloads\bLDXInj14Fs-lsAmNnILebAmXHHZDIMW9TZQJuKoxawImRtPw-uU8ItzxztitQPtaYhz53BlpTjvRsukGaGVcyggyCXIeySA0lreI3J1BmKmzjwjFZZhFBmwEplRL7Hq_j9vGxwhJzwEpq_V9EY6vtJ3GhlH6Vh8cckKU8dwSU5T8wQG9fFpwvCXQRVAn4dyp3y9JaxLx_xKIpHknRA0ETf0.png"/>
+                    <pic:cNvPicPr>
+                      <a:picLocks noChangeAspect="1" noChangeArrowheads="1"/>
+                    </pic:cNvPicPr>
+                  </pic:nvPicPr>
+                  <pic:blipFill>
+                    <a:blip r:embed="rId16">
+                      <a:extLst>
+                        <a:ext uri="{28A0092B-C50C-407E-A947-70E740481C1C}">
+                          <a14:useLocalDpi xmlns:a14="http://schemas.microsoft.com/office/drawing/2010/main" val="0"/>
+                        </a:ext>
+                      </a:extLst>
+                    </a:blip>
+                    <a:srcRect/>
+                    <a:stretch>
+                      <a:fillRect/>
+                    </a:stretch>
+                  </pic:blipFill>
+                  <pic:spPr bwMode="auto">
+                    <a:xfrm>
+                      <a:off x="0" y="0"/>
+                      <a:ext cx="7163537" cy="7969163"/>
+                    </a:xfrm>
+                    <a:prstGeom prst="rect">
+                      <a:avLst/>
+                    </a:prstGeom>
+                    <a:noFill/>
+                    <a:ln>
+                      <a:noFill/>
+                    </a:ln>
+                  </pic:spPr>
+                </pic:pic>
+              </a:graphicData>
+            </a:graphic>
+          </wp:inline>
+        </w:drawing>
+      </w:r>
+    </w:p>
+    <w:p>
+      <w:pPr>
+        <w:spacing w:before="100" w:beforeAutospacing="1" w:after="100"/>
+        <w:ind w:left="-850"/>
+        <w:rPr>
+          <w:rFonts w:asciiTheme="majorBidi" w:hAnsiTheme="majorBidi" w:cstheme="majorBidi"/>
+          <w:b/>
+          <w:bCs/>
+          <w:sz w:val="32"/>
+          <w:szCs w:val="32"/>
+          <w:lang w:val="en-US"/>
+        </w:rPr>
+      </w:pPr>
+      <w:r>
+        <w:rPr>
+          <w:rFonts w:asciiTheme="majorBidi" w:hAnsiTheme="majorBidi" w:cstheme="majorBidi"/>
+          <w:b/>
+          <w:bCs/>
+          <w:sz w:val="32"/>
+          <w:szCs w:val="32"/>
+          <w:lang w:val="en-US"/>
+        </w:rPr>
+        <w:t xml:space="preserve">                       </w:t>
+      </w:r>
+      <w:r>
+        <w:rPr>
+          <w:rFonts w:asciiTheme="majorBidi" w:hAnsiTheme="majorBidi" w:cstheme="majorBidi"/>
+          <w:b/>
+          <w:bCs/>
+          <w:sz w:val="32"/>
+          <w:szCs w:val="32"/>
+          <w:lang w:val="en-US"/>
+        </w:rPr>
+        <w:t>Figure 2.2: Authentication Sequence Diagram</w:t>
+      </w:r>
+    </w:p>
+    <w:p>
+      <w:pPr>
+        <w:pStyle w:val="NormalWeb"/>
+        <w:rPr>
+          <w:rFonts w:asciiTheme="majorBidi" w:eastAsiaTheme="minorEastAsia" w:hAnsiTheme="majorBidi" w:cstheme="majorBidi"/>
+          <w:b/>
+          <w:bCs/>
+          <w:i/>
+          <w:iCs/>
+          <w:sz w:val="36"/>
+          <w:szCs w:val="36"/>
+          <w:u w:val="single"/>
+          <w:lang w:val="en-US" w:eastAsia="en-US"/>
+        </w:rPr>
+      </w:pPr>
+    </w:p>
+    <w:p>
+      <w:pPr>
+        <w:pStyle w:val="NormalWeb"/>
+      </w:pPr>
+      <w:r>
+        <w:rPr>
+          <w:rFonts w:asciiTheme="majorBidi" w:eastAsiaTheme="minorEastAsia" w:hAnsiTheme="majorBidi" w:cstheme="majorBidi"/>
+          <w:b/>
+          <w:bCs/>
+          <w:i/>
+          <w:iCs/>
+          <w:sz w:val="36"/>
+          <w:szCs w:val="36"/>
+          <w:u w:val="single"/>
+          <w:lang w:val="en-US" w:eastAsia="en-US"/>
+        </w:rPr>
+        <w:lastRenderedPageBreak/>
+        <w:t>Statistics &amp; Expenses</w:t>
+      </w:r>
+      <w:r>
+        <w:rPr>
+          <w:rFonts w:asciiTheme="majorBidi" w:eastAsiaTheme="minorEastAsia" w:hAnsiTheme="majorBidi" w:cstheme="majorBidi"/>
+          <w:b/>
+          <w:bCs/>
+          <w:i/>
+          <w:iCs/>
+          <w:sz w:val="36"/>
+          <w:szCs w:val="36"/>
+          <w:u w:val="single"/>
+          <w:lang w:val="en-US" w:eastAsia="en-US"/>
+        </w:rPr>
+        <w:t>:</w:t>
+      </w:r>
+    </w:p>
+    <w:p>
+      <w:pPr>
+        <w:pStyle w:val="NormalWeb"/>
+        <w:ind w:left="-907"/>
+      </w:pPr>
+      <w:r>
+        <w:rPr>
+          <w:noProof/>
+        </w:rPr>
+        <w:drawing>
+          <wp:inline distT="0" distB="0" distL="0" distR="0">
+            <wp:extent cx="7086600" cy="8505825"/>
+            <wp:effectExtent l="0" t="0" r="0" b="9525"/>
+            <wp:docPr id="12" name="Image 12" descr="C:\Users\dif\Downloads\ZLB1RXen4BtxAqRqGWvHcw3qK8ag4A2g5AIeg8UUec4zi1PUUpkULKgh_dkzU36KGjlJQltUFB_tnlT1aAMfh0eRusfah23GruPSGV130OoO_Sk3jvxXrM0mQ4yAyJpsh8cxyvkxjtSFRoBqQ5RqQ1oTHv-GnHIcHYTZB3PhzetJ7MawcDtE9YUaioepxsHXlXFStAgVnwvBrFx5k3Miq0PI.png"/>
+            <wp:cNvGraphicFramePr>
+              <a:graphicFrameLocks xmlns:a="http://schemas.openxmlformats.org/drawingml/2006/main" noChangeAspect="1"/>
+            </wp:cNvGraphicFramePr>
+            <a:graphic xmlns:a="http://schemas.openxmlformats.org/drawingml/2006/main">
+              <a:graphicData uri="http://schemas.openxmlformats.org/drawingml/2006/picture">
+                <pic:pic xmlns:pic="http://schemas.openxmlformats.org/drawingml/2006/picture">
+                  <pic:nvPicPr>
+                    <pic:cNvPr id="0" name="Picture 5" descr="C:\Users\dif\Downloads\ZLB1RXen4BtxAqRqGWvHcw3qK8ag4A2g5AIeg8UUec4zi1PUUpkULKgh_dkzU36KGjlJQltUFB_tnlT1aAMfh0eRusfah23GruPSGV130OoO_Sk3jvxXrM0mQ4yAyJpsh8cxyvkxjtSFRoBqQ5RqQ1oTHv-GnHIcHYTZB3PhzetJ7MawcDtE9YUaioepxsHXlXFStAgVnwvBrFx5k3Miq0PI.png"/>
+                    <pic:cNvPicPr>
+                      <a:picLocks noChangeAspect="1" noChangeArrowheads="1"/>
+                    </pic:cNvPicPr>
+                  </pic:nvPicPr>
+                  <pic:blipFill>
+                    <a:blip r:embed="rId17">
+                      <a:extLst>
+                        <a:ext uri="{28A0092B-C50C-407E-A947-70E740481C1C}">
+                          <a14:useLocalDpi xmlns:a14="http://schemas.microsoft.com/office/drawing/2010/main" val="0"/>
+                        </a:ext>
+                      </a:extLst>
+                    </a:blip>
+                    <a:srcRect/>
+                    <a:stretch>
+                      <a:fillRect/>
+                    </a:stretch>
+                  </pic:blipFill>
+                  <pic:spPr bwMode="auto">
+                    <a:xfrm>
+                      <a:off x="0" y="0"/>
+                      <a:ext cx="7086600" cy="8505825"/>
+                    </a:xfrm>
+                    <a:prstGeom prst="rect">
+                      <a:avLst/>
+                    </a:prstGeom>
+                    <a:noFill/>
+                    <a:ln>
+                      <a:noFill/>
+                    </a:ln>
+                  </pic:spPr>
+                </pic:pic>
+              </a:graphicData>
+            </a:graphic>
+          </wp:inline>
+        </w:drawing>
+      </w:r>
+    </w:p>
+    <w:p>
+      <w:pPr>
+        <w:spacing w:before="100" w:beforeAutospacing="1" w:after="100"/>
+        <w:ind w:left="-850"/>
+        <w:rPr>
+          <w:rFonts w:asciiTheme="majorBidi" w:hAnsiTheme="majorBidi" w:cstheme="majorBidi"/>
+          <w:b/>
+          <w:bCs/>
+          <w:sz w:val="32"/>
+          <w:szCs w:val="32"/>
+          <w:lang w:val="en-US"/>
+        </w:rPr>
+      </w:pPr>
+      <w:r>
+        <w:rPr>
+          <w:rFonts w:asciiTheme="majorBidi" w:hAnsiTheme="majorBidi" w:cstheme="majorBidi"/>
+          <w:b/>
+          <w:bCs/>
+          <w:sz w:val="32"/>
+          <w:szCs w:val="32"/>
+          <w:lang w:val="en-US"/>
+        </w:rPr>
+        <w:t xml:space="preserve">                       </w:t>
+      </w:r>
+      <w:r>
+        <w:rPr>
+          <w:rFonts w:asciiTheme="majorBidi" w:hAnsiTheme="majorBidi" w:cstheme="majorBidi"/>
+          <w:b/>
+          <w:bCs/>
+          <w:sz w:val="32"/>
+          <w:szCs w:val="32"/>
+          <w:lang w:val="en-US"/>
+        </w:rPr>
+        <w:t>Figure 2.2: Authentication Sequence Diagram</w:t>
+      </w:r>
+    </w:p>
+    <w:p>
+      <w:pPr>
+        <w:spacing w:after="100"/>
+        <w:rPr>
+          <w:rFonts w:ascii="Goudy Old Style" w:hAnsi="Goudy Old Style" w:cstheme="majorBidi"/>
+          <w:b/>
+          <w:bCs/>
+          <w:sz w:val="40"/>
+          <w:szCs w:val="40"/>
+          <w:lang w:val="en-US"/>
+        </w:rPr>
+      </w:pPr>
+      <w:r>
+        <w:rPr>
+          <w:rFonts w:ascii="Goudy Old Style" w:hAnsi="Goudy Old Style" w:cstheme="majorBidi"/>
+          <w:b/>
+          <w:bCs/>
+          <w:sz w:val="72"/>
+          <w:szCs w:val="72"/>
+          <w:lang w:val="en-US"/>
+        </w:rPr>
+        <w:lastRenderedPageBreak/>
+        <w:t>Conclusion</w:t>
+      </w:r>
+    </w:p>
+    <w:p>
+      <w:pPr>
+        <w:spacing w:after="100"/>
+        <w:rPr>
+          <w:rFonts w:asciiTheme="majorBidi" w:hAnsiTheme="majorBidi" w:cstheme="majorBidi"/>
+          <w:sz w:val="40"/>
+          <w:szCs w:val="40"/>
+          <w:lang w:val="en-US"/>
+        </w:rPr>
+      </w:pPr>
+      <w:r>
+        <w:rPr>
+          <w:rFonts w:asciiTheme="majorBidi" w:hAnsiTheme="majorBidi" w:cstheme="majorBidi"/>
+          <w:sz w:val="40"/>
+          <w:szCs w:val="40"/>
+          <w:lang w:val="en-US"/>
+        </w:rPr>
+        <w:t xml:space="preserve">Analysis and design is the topic of discussion in this chapter, where we introduced the reader to UML and the Waterfall approach that was used in developing the system. </w:t>
+      </w:r>
+    </w:p>
+    <w:p>
+      <w:pPr>
+        <w:spacing w:after="100"/>
+        <w:rPr>
+          <w:rFonts w:asciiTheme="majorBidi" w:hAnsiTheme="majorBidi" w:cstheme="majorBidi"/>
+          <w:sz w:val="40"/>
+          <w:szCs w:val="40"/>
+          <w:lang w:val="en-US"/>
+        </w:rPr>
+      </w:pPr>
+    </w:p>
+    <w:p>
+      <w:pPr>
+        <w:spacing w:after="100"/>
+        <w:rPr>
+          <w:rFonts w:asciiTheme="majorBidi" w:hAnsiTheme="majorBidi" w:cstheme="majorBidi"/>
+          <w:sz w:val="40"/>
+          <w:szCs w:val="40"/>
+          <w:lang w:val="en-US"/>
+        </w:rPr>
+      </w:pPr>
+      <w:r>
+        <w:rPr>
+          <w:rFonts w:asciiTheme="majorBidi" w:hAnsiTheme="majorBidi" w:cstheme="majorBidi"/>
+          <w:sz w:val="40"/>
+          <w:szCs w:val="40"/>
+          <w:lang w:val="en-US"/>
+        </w:rPr>
+        <w:t>Functional analysis of the system followed next, where we established the main actors of the system, their functions, and interactions with each other. In this way, it became easier for us to analyze the requirements and services required of the application.</w:t>
+      </w:r>
+    </w:p>
+    <w:p>
+      <w:pPr>
+        <w:spacing w:after="100"/>
+        <w:rPr>
+          <w:rFonts w:asciiTheme="majorBidi" w:hAnsiTheme="majorBidi" w:cstheme="majorBidi"/>
+          <w:sz w:val="40"/>
+          <w:szCs w:val="40"/>
+          <w:lang w:val="en-US"/>
+        </w:rPr>
+      </w:pPr>
+    </w:p>
+    <w:p>
+      <w:pPr>
+        <w:spacing w:after="100"/>
+        <w:rPr>
+          <w:rFonts w:asciiTheme="majorBidi" w:hAnsiTheme="majorBidi" w:cstheme="majorBidi"/>
+          <w:sz w:val="40"/>
+          <w:szCs w:val="40"/>
+          <w:lang w:val="en-US"/>
+        </w:rPr>
+      </w:pPr>
+      <w:r>
+        <w:rPr>
+          <w:rFonts w:asciiTheme="majorBidi" w:hAnsiTheme="majorBidi" w:cstheme="majorBidi"/>
+          <w:sz w:val="40"/>
+          <w:szCs w:val="40"/>
+          <w:lang w:val="en-US"/>
+        </w:rPr>
+        <w:t>The design phase followed next, where we modelled the system through UML diagrams. These include global use-case diagrams, class diagrams, database schema, and sequence diagrams. Each of these diagrams helped us represent the system in a structured manner.</w:t>
+      </w:r>
+    </w:p>
+    <w:p>
+      <w:pPr>
+        <w:spacing w:after="100"/>
+        <w:rPr>
+          <w:rFonts w:asciiTheme="majorBidi" w:hAnsiTheme="majorBidi" w:cstheme="majorBidi"/>
+          <w:sz w:val="40"/>
+          <w:szCs w:val="40"/>
+          <w:lang w:val="en-US"/>
+        </w:rPr>
+      </w:pPr>
+    </w:p>
+    <w:p>
+      <w:pPr>
+        <w:spacing w:after="100"/>
+        <w:rPr>
+          <w:rFonts w:asciiTheme="majorBidi" w:hAnsiTheme="majorBidi" w:cstheme="majorBidi"/>
+          <w:sz w:val="40"/>
+          <w:szCs w:val="40"/>
+          <w:lang w:val="en-US"/>
+        </w:rPr>
+      </w:pPr>
+      <w:r>
+        <w:rPr>
+          <w:rFonts w:asciiTheme="majorBidi" w:hAnsiTheme="majorBidi" w:cstheme="majorBidi"/>
+          <w:sz w:val="40"/>
+          <w:szCs w:val="40"/>
+          <w:lang w:val="en-US"/>
+        </w:rPr>
+        <w:t>Finally, this chapter has laid a solid foundation for the design of the application.</w:t>
+      </w:r>
+    </w:p>
+    <w:p>
+      <w:pPr>
+        <w:spacing w:after="100"/>
+        <w:rPr>
+          <w:rFonts w:asciiTheme="majorBidi" w:hAnsiTheme="majorBidi" w:cstheme="majorBidi"/>
+          <w:sz w:val="40"/>
+          <w:szCs w:val="40"/>
+          <w:lang w:val="en-US"/>
+        </w:rPr>
+      </w:pPr>
+    </w:p>
+    <w:p>
+      <w:pPr>
+        <w:spacing w:after="100"/>
+        <w:rPr>
+          <w:rFonts w:asciiTheme="majorBidi" w:hAnsiTheme="majorBidi" w:cstheme="majorBidi"/>
+          <w:sz w:val="40"/>
+          <w:szCs w:val="40"/>
+          <w:lang w:val="en-US"/>
+        </w:rPr>
+      </w:pPr>
+    </w:p>
+    <w:p>
+      <w:pPr>
+        <w:spacing w:after="100"/>
+        <w:rPr>
+          <w:rFonts w:asciiTheme="majorBidi" w:hAnsiTheme="majorBidi" w:cstheme="majorBidi"/>
+          <w:sz w:val="40"/>
+          <w:szCs w:val="40"/>
+          <w:lang w:val="en-US"/>
+        </w:rPr>
+      </w:pPr>
+    </w:p>
+    <w:p>
+      <w:pPr>
+        <w:spacing w:after="100"/>
+        <w:rPr>
+          <w:rFonts w:asciiTheme="majorBidi" w:hAnsiTheme="majorBidi" w:cstheme="majorBidi"/>
+          <w:sz w:val="40"/>
+          <w:szCs w:val="40"/>
+          <w:lang w:val="en-US"/>
+        </w:rPr>
+      </w:pPr>
+    </w:p>
+    <w:p>
+      <w:pPr>
+        <w:spacing w:after="100"/>
+        <w:rPr>
+          <w:rFonts w:asciiTheme="majorBidi" w:hAnsiTheme="majorBidi" w:cstheme="majorBidi"/>
+          <w:sz w:val="40"/>
+          <w:szCs w:val="40"/>
+          <w:lang w:val="en-US"/>
+        </w:rPr>
+      </w:pPr>
+    </w:p>
+    <w:p>
+      <w:pPr>
+        <w:spacing w:after="100"/>
+        <w:rPr>
+          <w:rFonts w:asciiTheme="majorBidi" w:hAnsiTheme="majorBidi" w:cstheme="majorBidi"/>
+          <w:sz w:val="40"/>
+          <w:szCs w:val="40"/>
+          <w:lang w:val="en-US"/>
+        </w:rPr>
+      </w:pPr>
+    </w:p>
+    <w:p>
+      <w:pPr>
+        <w:spacing w:after="100"/>
+        <w:rPr>
+          <w:b/>
+          <w:bCs/>
+          <w:sz w:val="96"/>
+          <w:szCs w:val="96"/>
+          <w:lang w:val="en-US"/>
+        </w:rPr>
+      </w:pPr>
+    </w:p>
+    <w:p>
+      <w:pPr>
+        <w:spacing w:after="100"/>
+        <w:rPr>
+          <w:b/>
+          <w:bCs/>
+          <w:sz w:val="96"/>
+          <w:szCs w:val="96"/>
+          <w:lang w:val="en-US"/>
+        </w:rPr>
+      </w:pPr>
+      <w:r>
+        <w:rPr>
+          <w:b/>
+          <w:bCs/>
+          <w:sz w:val="96"/>
+          <w:szCs w:val="96"/>
+          <w:lang w:val="en-US"/>
+        </w:rPr>
+        <w:t>Chaptre 0</w:t>
+      </w:r>
+      <w:r>
+        <w:rPr>
+          <w:b/>
+          <w:bCs/>
+          <w:sz w:val="96"/>
+          <w:szCs w:val="96"/>
+          <w:lang w:val="en-US"/>
+        </w:rPr>
+        <w:t>4</w:t>
+      </w:r>
+    </w:p>
+    <w:p>
+      <w:pPr>
+        <w:spacing w:after="100"/>
+        <w:rPr>
+          <w:b/>
+          <w:bCs/>
+          <w:sz w:val="96"/>
+          <w:szCs w:val="96"/>
+          <w:lang w:val="en-US"/>
+        </w:rPr>
+      </w:pPr>
+      <w:r>
+        <w:rPr>
+          <w:b/>
+          <w:bCs/>
+          <w:sz w:val="96"/>
+          <w:szCs w:val="96"/>
+          <w:lang w:val="en-US"/>
+        </w:rPr>
+        <w:t>Réalisation</w:t>
+      </w:r>
+    </w:p>
+    <w:p>
+      <w:pPr>
+        <w:spacing w:after="100"/>
+        <w:rPr>
+          <w:b/>
+          <w:bCs/>
+          <w:sz w:val="96"/>
+          <w:szCs w:val="96"/>
+          <w:lang w:val="en-US"/>
+        </w:rPr>
+      </w:pPr>
+    </w:p>
+    <w:p>
+      <w:pPr>
+        <w:spacing w:after="100"/>
+        <w:rPr>
+          <w:b/>
+          <w:bCs/>
+          <w:sz w:val="96"/>
+          <w:szCs w:val="96"/>
+          <w:lang w:val="en-US"/>
+        </w:rPr>
+      </w:pPr>
+    </w:p>
+    <w:p>
+      <w:pPr>
+        <w:spacing w:after="100"/>
+        <w:rPr>
+          <w:b/>
+          <w:bCs/>
+          <w:sz w:val="96"/>
+          <w:szCs w:val="96"/>
+          <w:lang w:val="en-US"/>
+        </w:rPr>
+      </w:pPr>
+    </w:p>
+    <w:p>
+      <w:pPr>
+        <w:spacing w:after="100"/>
+        <w:rPr>
+          <w:b/>
+          <w:bCs/>
+          <w:sz w:val="96"/>
+          <w:szCs w:val="96"/>
+          <w:lang w:val="en-US"/>
+        </w:rPr>
+      </w:pPr>
+    </w:p>
+    <w:p>
+      <w:pPr>
+        <w:spacing w:after="100"/>
+        <w:rPr>
+          <w:b/>
+          <w:bCs/>
+          <w:sz w:val="96"/>
+          <w:szCs w:val="96"/>
+          <w:lang w:val="en-US"/>
+        </w:rPr>
+      </w:pPr>
+    </w:p>
+    <w:p>
+      <w:pPr>
+        <w:spacing w:after="100"/>
+        <w:rPr>
+          <w:b/>
+          <w:bCs/>
+          <w:sz w:val="96"/>
+          <w:szCs w:val="96"/>
+          <w:lang w:val="en-US"/>
+        </w:rPr>
+      </w:pPr>
+    </w:p>
+    <w:p>
+      <w:pPr>
+        <w:spacing w:after="100"/>
+        <w:rPr>
+          <w:b/>
+          <w:bCs/>
+          <w:sz w:val="96"/>
+          <w:szCs w:val="96"/>
+          <w:lang w:val="en-US"/>
+        </w:rPr>
+      </w:pPr>
+    </w:p>
+    <w:p>
+      <w:pPr>
+        <w:spacing w:after="100"/>
+        <w:rPr>
+          <w:b/>
+          <w:bCs/>
+          <w:sz w:val="96"/>
+          <w:szCs w:val="96"/>
+          <w:lang w:val="en-US"/>
+        </w:rPr>
+      </w:pPr>
+    </w:p>
+    <w:p>
+      <w:pPr>
+        <w:spacing w:after="100"/>
+        <w:rPr>
+          <w:rFonts w:ascii="Goudy Old Style" w:hAnsi="Goudy Old Style"/>
+          <w:sz w:val="72"/>
+          <w:szCs w:val="72"/>
+          <w:lang w:val="en-US"/>
+        </w:rPr>
+      </w:pPr>
+      <w:r>
+        <w:rPr>
+          <w:rFonts w:ascii="Times New Roman" w:eastAsia="Times New Roman" w:hAnsi="Times New Roman" w:cs="Times New Roman"/>
+          <w:sz w:val="24"/>
+          <w:szCs w:val="24"/>
+          <w:lang w:val="en-US" w:eastAsia="fr-FR"/>
+        </w:rPr>
+        <w:lastRenderedPageBreak/>
+        <w:t xml:space="preserve">  </w:t>
+      </w:r>
+      <w:r>
+        <w:rPr>
+          <w:rFonts w:ascii="Goudy Old Style" w:hAnsi="Goudy Old Style"/>
+          <w:b/>
+          <w:bCs/>
+          <w:sz w:val="72"/>
+          <w:szCs w:val="72"/>
+          <w:lang w:val="en-US"/>
+        </w:rPr>
+        <w:t>Introduction</w:t>
+      </w:r>
+    </w:p>
+    <w:p>
+      <w:pPr>
+        <w:spacing w:after="100"/>
+        <w:rPr>
+          <w:sz w:val="28"/>
+          <w:szCs w:val="28"/>
+          <w:lang w:val="en-US"/>
+        </w:rPr>
+      </w:pPr>
+    </w:p>
+    <w:p>
+      <w:pPr>
+        <w:spacing w:after="100"/>
+        <w:rPr>
+          <w:rFonts w:asciiTheme="majorBidi" w:hAnsiTheme="majorBidi" w:cstheme="majorBidi"/>
+          <w:sz w:val="36"/>
+          <w:szCs w:val="36"/>
+          <w:lang w:val="en-US"/>
+        </w:rPr>
+      </w:pPr>
+      <w:r>
+        <w:rPr>
+          <w:rFonts w:asciiTheme="majorBidi" w:hAnsiTheme="majorBidi" w:cstheme="majorBidi"/>
+          <w:sz w:val="36"/>
+          <w:szCs w:val="36"/>
+          <w:lang w:val="en-US"/>
+        </w:rPr>
+        <w:t>This chapter describes the implementation process of the nursery management system. It discusses how the implementation of the software is done based on the analysis and design processes discussed in the previous chapter.</w:t>
+      </w:r>
+    </w:p>
+    <w:p>
+      <w:pPr>
+        <w:spacing w:after="100"/>
+        <w:rPr>
+          <w:rFonts w:asciiTheme="majorBidi" w:hAnsiTheme="majorBidi" w:cstheme="majorBidi"/>
+          <w:sz w:val="36"/>
+          <w:szCs w:val="36"/>
+          <w:lang w:val="en-US"/>
+        </w:rPr>
+      </w:pPr>
+    </w:p>
+    <w:p>
+      <w:pPr>
+        <w:spacing w:after="100"/>
+        <w:rPr>
+          <w:rFonts w:asciiTheme="majorBidi" w:hAnsiTheme="majorBidi" w:cstheme="majorBidi"/>
+          <w:sz w:val="36"/>
+          <w:szCs w:val="36"/>
+          <w:lang w:val="en-US"/>
+        </w:rPr>
+      </w:pPr>
+      <w:r>
+        <w:rPr>
+          <w:rFonts w:asciiTheme="majorBidi" w:hAnsiTheme="majorBidi" w:cstheme="majorBidi"/>
+          <w:sz w:val="36"/>
+          <w:szCs w:val="36"/>
+          <w:lang w:val="en-US"/>
+        </w:rPr>
+        <w:t>At this point, the description of the development environment will be presented, which will discuss the technology tools used in the development process. In addition to this, the architecture of the system will be discussed as well as the way in which the development process is organized.</w:t>
+      </w:r>
+    </w:p>
+    <w:p>
+      <w:pPr>
+        <w:spacing w:after="100"/>
+        <w:rPr>
+          <w:rFonts w:asciiTheme="majorBidi" w:hAnsiTheme="majorBidi" w:cstheme="majorBidi"/>
+          <w:sz w:val="36"/>
+          <w:szCs w:val="36"/>
+          <w:lang w:val="en-US"/>
+        </w:rPr>
+      </w:pPr>
+    </w:p>
+    <w:p>
+      <w:pPr>
+        <w:spacing w:after="100"/>
+        <w:rPr>
+          <w:rFonts w:asciiTheme="majorBidi" w:hAnsiTheme="majorBidi" w:cstheme="majorBidi"/>
+          <w:sz w:val="36"/>
+          <w:szCs w:val="36"/>
+          <w:lang w:val="en-US"/>
+        </w:rPr>
+      </w:pPr>
+      <w:r>
+        <w:rPr>
+          <w:rFonts w:asciiTheme="majorBidi" w:hAnsiTheme="majorBidi" w:cstheme="majorBidi"/>
+          <w:sz w:val="36"/>
+          <w:szCs w:val="36"/>
+          <w:lang w:val="en-US"/>
+        </w:rPr>
+        <w:t>Finally, in this chapter, the major features of the system will be highlighted using the interface description of the software.</w:t>
+      </w:r>
+    </w:p>
+    <w:p>
+      <w:pPr>
+        <w:spacing w:after="100"/>
+        <w:rPr>
+          <w:rFonts w:asciiTheme="majorBidi" w:hAnsiTheme="majorBidi" w:cstheme="majorBidi"/>
+          <w:sz w:val="36"/>
+          <w:szCs w:val="36"/>
+          <w:lang w:val="en-US"/>
+        </w:rPr>
+      </w:pPr>
+    </w:p>
+    <w:p>
+      <w:pPr>
+        <w:spacing w:after="100"/>
+        <w:rPr>
+          <w:rFonts w:asciiTheme="majorBidi" w:hAnsiTheme="majorBidi" w:cstheme="majorBidi"/>
+          <w:sz w:val="36"/>
+          <w:szCs w:val="36"/>
+          <w:lang w:val="en-US"/>
+        </w:rPr>
+      </w:pPr>
+    </w:p>
+    <w:p>
+      <w:pPr>
+        <w:spacing w:after="100"/>
+        <w:rPr>
+          <w:rFonts w:asciiTheme="majorBidi" w:hAnsiTheme="majorBidi" w:cstheme="majorBidi"/>
+          <w:sz w:val="36"/>
+          <w:szCs w:val="36"/>
+          <w:lang w:val="en-US"/>
+        </w:rPr>
+      </w:pPr>
+    </w:p>
+    <w:p>
+      <w:pPr>
+        <w:spacing w:after="100"/>
+        <w:rPr>
+          <w:rFonts w:asciiTheme="majorBidi" w:hAnsiTheme="majorBidi" w:cstheme="majorBidi"/>
+          <w:sz w:val="36"/>
+          <w:szCs w:val="36"/>
+          <w:lang w:val="en-US"/>
+        </w:rPr>
+      </w:pPr>
+    </w:p>
+    <w:p>
+      <w:pPr>
+        <w:spacing w:after="100"/>
+        <w:rPr>
+          <w:rFonts w:asciiTheme="majorBidi" w:hAnsiTheme="majorBidi" w:cstheme="majorBidi"/>
+          <w:sz w:val="36"/>
+          <w:szCs w:val="36"/>
+          <w:lang w:val="en-US"/>
+        </w:rPr>
+      </w:pPr>
+    </w:p>
+    <w:p>
+      <w:pPr>
+        <w:spacing w:after="100"/>
+        <w:rPr>
+          <w:rFonts w:asciiTheme="majorBidi" w:hAnsiTheme="majorBidi" w:cstheme="majorBidi"/>
+          <w:sz w:val="36"/>
+          <w:szCs w:val="36"/>
+          <w:lang w:val="en-US"/>
+        </w:rPr>
+      </w:pPr>
+    </w:p>
+    <w:p>
+      <w:pPr>
+        <w:spacing w:after="100"/>
+        <w:rPr>
+          <w:rFonts w:asciiTheme="majorBidi" w:hAnsiTheme="majorBidi" w:cstheme="majorBidi"/>
+          <w:sz w:val="36"/>
+          <w:szCs w:val="36"/>
+          <w:lang w:val="en-US"/>
+        </w:rPr>
+      </w:pPr>
+    </w:p>
+    <w:p>
+      <w:pPr>
+        <w:spacing w:after="100"/>
+        <w:rPr>
+          <w:rFonts w:asciiTheme="majorBidi" w:hAnsiTheme="majorBidi" w:cstheme="majorBidi"/>
+          <w:sz w:val="36"/>
+          <w:szCs w:val="36"/>
+          <w:lang w:val="en-US"/>
+        </w:rPr>
+      </w:pPr>
+    </w:p>
+    <w:p>
+      <w:pPr>
+        <w:spacing w:after="100"/>
+        <w:rPr>
+          <w:rFonts w:asciiTheme="majorBidi" w:hAnsiTheme="majorBidi" w:cstheme="majorBidi"/>
+          <w:sz w:val="36"/>
+          <w:szCs w:val="36"/>
+          <w:lang w:val="en-US"/>
+        </w:rPr>
+      </w:pPr>
+    </w:p>
+    <w:p>
+      <w:pPr>
+        <w:spacing w:after="100"/>
+        <w:rPr>
+          <w:rFonts w:asciiTheme="majorBidi" w:hAnsiTheme="majorBidi" w:cstheme="majorBidi"/>
+          <w:sz w:val="36"/>
+          <w:szCs w:val="36"/>
+          <w:lang w:val="en-US"/>
+        </w:rPr>
+      </w:pPr>
+    </w:p>
+    <w:p>
+      <w:pPr>
+        <w:spacing w:after="100"/>
+        <w:rPr>
+          <w:rFonts w:asciiTheme="majorBidi" w:hAnsiTheme="majorBidi" w:cstheme="majorBidi"/>
+          <w:sz w:val="36"/>
+          <w:szCs w:val="36"/>
+          <w:lang w:val="en-US"/>
+        </w:rPr>
+      </w:pPr>
+    </w:p>
+    <w:p>
+      <w:pPr>
+        <w:spacing w:after="100"/>
+        <w:rPr>
+          <w:rFonts w:asciiTheme="majorBidi" w:hAnsiTheme="majorBidi" w:cstheme="majorBidi"/>
+          <w:sz w:val="36"/>
+          <w:szCs w:val="36"/>
+          <w:lang w:val="en-US"/>
+        </w:rPr>
+      </w:pPr>
+    </w:p>
+    <w:p>
+      <w:pPr>
+        <w:spacing w:after="100"/>
+        <w:rPr>
+          <w:rFonts w:ascii="Goudy Old Style" w:hAnsi="Goudy Old Style"/>
+          <w:b/>
+          <w:bCs/>
+          <w:sz w:val="64"/>
+          <w:szCs w:val="64"/>
+          <w:lang w:val="en-US"/>
+        </w:rPr>
+      </w:pPr>
+      <w:r>
+        <w:rPr>
+          <w:rFonts w:ascii="Goudy Old Style" w:hAnsi="Goudy Old Style"/>
+          <w:b/>
+          <w:bCs/>
+          <w:sz w:val="64"/>
+          <w:szCs w:val="64"/>
+          <w:lang w:val="en-US"/>
+        </w:rPr>
+        <w:lastRenderedPageBreak/>
+        <w:t>Environnement</w:t>
+      </w:r>
+      <w:r>
+        <w:rPr>
+          <w:rFonts w:ascii="Goudy Old Style" w:hAnsi="Goudy Old Style"/>
+          <w:b/>
+          <w:bCs/>
+          <w:sz w:val="64"/>
+          <w:szCs w:val="64"/>
+          <w:lang w:val="en-US"/>
+        </w:rPr>
+        <w:t xml:space="preserve"> </w:t>
+      </w:r>
+      <w:r>
+        <w:rPr>
+          <w:rFonts w:ascii="Goudy Old Style" w:hAnsi="Goudy Old Style"/>
+          <w:b/>
+          <w:bCs/>
+          <w:sz w:val="64"/>
+          <w:szCs w:val="64"/>
+          <w:lang w:val="en-US"/>
+        </w:rPr>
+        <w:t>de développement</w:t>
+      </w:r>
+    </w:p>
+    <w:p>
+      <w:pPr>
+        <w:spacing w:after="100"/>
+        <w:rPr>
+          <w:rFonts w:ascii="Goudy Old Style" w:hAnsi="Goudy Old Style"/>
+          <w:b/>
+          <w:bCs/>
+          <w:sz w:val="22"/>
+          <w:szCs w:val="22"/>
+          <w:lang w:val="en-US"/>
+        </w:rPr>
+      </w:pPr>
+    </w:p>
+    <w:p>
+      <w:pPr>
+        <w:spacing w:after="100"/>
+        <w:rPr>
+          <w:rFonts w:asciiTheme="majorBidi" w:hAnsiTheme="majorBidi" w:cstheme="majorBidi"/>
+          <w:b/>
+          <w:bCs/>
+          <w:sz w:val="40"/>
+          <w:szCs w:val="40"/>
+          <w:u w:val="single"/>
+        </w:rPr>
+      </w:pPr>
+      <w:r>
+        <w:rPr>
+          <w:rFonts w:asciiTheme="majorBidi" w:hAnsiTheme="majorBidi" w:cstheme="majorBidi"/>
+          <w:b/>
+          <w:bCs/>
+          <w:sz w:val="40"/>
+          <w:szCs w:val="40"/>
+          <w:u w:val="single"/>
+        </w:rPr>
+        <w:t>Framework Flutter</w:t>
+      </w:r>
+      <w:r>
+        <w:rPr>
+          <w:rFonts w:asciiTheme="majorBidi" w:hAnsiTheme="majorBidi" w:cstheme="majorBidi"/>
+          <w:b/>
+          <w:bCs/>
+          <w:sz w:val="40"/>
+          <w:szCs w:val="40"/>
+          <w:u w:val="single"/>
+        </w:rPr>
+        <w:t> :</w:t>
+      </w:r>
+    </w:p>
+    <w:p>
+      <w:pPr>
+        <w:spacing w:after="100"/>
+        <w:rPr>
+          <w:rFonts w:asciiTheme="majorBidi" w:hAnsiTheme="majorBidi" w:cstheme="majorBidi"/>
+          <w:sz w:val="36"/>
+          <w:szCs w:val="36"/>
+          <w:lang w:val="en-US"/>
+        </w:rPr>
+      </w:pPr>
+      <w:r>
+        <w:rPr>
+          <w:rFonts w:asciiTheme="majorBidi" w:hAnsiTheme="majorBidi" w:cstheme="majorBidi"/>
+          <w:sz w:val="36"/>
+          <w:szCs w:val="36"/>
+          <w:lang w:val="en-US"/>
+        </w:rPr>
+        <w:t>Flutter is a software development kit (SDK) provided by Google as an open source tool to develop interactive user interfaces for today’s applications. Flutter facilitates the development of powerful apps using one code base.</w:t>
+      </w:r>
+    </w:p>
+    <w:p>
+      <w:pPr>
+        <w:spacing w:after="100"/>
+        <w:rPr>
+          <w:rFonts w:asciiTheme="majorBidi" w:hAnsiTheme="majorBidi" w:cstheme="majorBidi"/>
+          <w:sz w:val="36"/>
+          <w:szCs w:val="36"/>
+          <w:lang w:val="en-US"/>
+        </w:rPr>
+      </w:pPr>
+    </w:p>
+    <w:p>
+      <w:pPr>
+        <w:spacing w:after="100"/>
+        <w:rPr>
+          <w:rFonts w:asciiTheme="majorBidi" w:hAnsiTheme="majorBidi" w:cstheme="majorBidi"/>
+          <w:sz w:val="36"/>
+          <w:szCs w:val="36"/>
+          <w:lang w:val="en-US"/>
+        </w:rPr>
+      </w:pPr>
+      <w:r>
+        <w:rPr>
+          <w:rFonts w:asciiTheme="majorBidi" w:hAnsiTheme="majorBidi" w:cstheme="majorBidi"/>
+          <w:sz w:val="36"/>
+          <w:szCs w:val="36"/>
+          <w:lang w:val="en-US"/>
+        </w:rPr>
+        <w:t>The use of Flutter in the current project is attributed to the ability to develop appealing interfaces along with easy desktop app development. Furthermore, it provides various pre-made components, which make the development process easy and effective.</w:t>
+      </w:r>
+    </w:p>
+    <w:p>
+      <w:pPr>
+        <w:spacing w:after="100"/>
+        <w:rPr>
+          <w:rFonts w:ascii="Goudy Old Style" w:hAnsi="Goudy Old Style"/>
+          <w:b/>
+          <w:bCs/>
+          <w:sz w:val="14"/>
+          <w:szCs w:val="14"/>
+          <w:lang w:val="en-US"/>
+        </w:rPr>
+      </w:pPr>
+    </w:p>
+    <w:p>
+      <w:pPr>
+        <w:spacing w:after="100"/>
+        <w:rPr>
+          <w:rFonts w:ascii="Goudy Old Style" w:hAnsi="Goudy Old Style"/>
+          <w:b/>
+          <w:bCs/>
+          <w:sz w:val="22"/>
+          <w:szCs w:val="22"/>
+          <w:lang w:val="en-US"/>
+        </w:rPr>
+      </w:pPr>
+    </w:p>
+    <w:p>
+      <w:pPr>
+        <w:spacing w:after="100"/>
+        <w:rPr>
+          <w:rFonts w:asciiTheme="majorBidi" w:hAnsiTheme="majorBidi" w:cstheme="majorBidi"/>
+          <w:b/>
+          <w:bCs/>
+          <w:sz w:val="40"/>
+          <w:szCs w:val="40"/>
+          <w:u w:val="single"/>
+          <w:lang w:val="en-US"/>
+        </w:rPr>
+      </w:pPr>
+      <w:r>
+        <w:rPr>
+          <w:rFonts w:asciiTheme="majorBidi" w:hAnsiTheme="majorBidi" w:cstheme="majorBidi"/>
+          <w:b/>
+          <w:bCs/>
+          <w:sz w:val="40"/>
+          <w:szCs w:val="40"/>
+          <w:u w:val="single"/>
+          <w:lang w:val="en-US"/>
+        </w:rPr>
+        <w:t>Dart Language</w:t>
+      </w:r>
+      <w:r>
+        <w:rPr>
+          <w:rFonts w:asciiTheme="majorBidi" w:hAnsiTheme="majorBidi" w:cstheme="majorBidi"/>
+          <w:b/>
+          <w:bCs/>
+          <w:sz w:val="40"/>
+          <w:szCs w:val="40"/>
+          <w:u w:val="single"/>
+          <w:lang w:val="en-US"/>
+        </w:rPr>
+        <w:t>:</w:t>
+      </w:r>
+    </w:p>
+    <w:p>
+      <w:pPr>
+        <w:spacing w:after="100"/>
+        <w:rPr>
+          <w:rFonts w:asciiTheme="majorBidi" w:hAnsiTheme="majorBidi" w:cstheme="majorBidi"/>
+          <w:sz w:val="36"/>
+          <w:szCs w:val="36"/>
+          <w:lang w:val="en-US"/>
+        </w:rPr>
+      </w:pPr>
+      <w:r>
+        <w:rPr>
+          <w:rFonts w:asciiTheme="majorBidi" w:hAnsiTheme="majorBidi" w:cstheme="majorBidi"/>
+          <w:sz w:val="36"/>
+          <w:szCs w:val="36"/>
+          <w:lang w:val="en-US"/>
+        </w:rPr>
+        <w:t>The Dart programming language is employed by Flutter for application development purposes. It is a modern programming language that supports object-oriented features and is easy to learn and use.</w:t>
+      </w:r>
+    </w:p>
+    <w:p>
+      <w:pPr>
+        <w:spacing w:after="100"/>
+        <w:rPr>
+          <w:rFonts w:asciiTheme="majorBidi" w:hAnsiTheme="majorBidi" w:cstheme="majorBidi"/>
+          <w:sz w:val="36"/>
+          <w:szCs w:val="36"/>
+          <w:lang w:val="en-US"/>
+        </w:rPr>
+      </w:pPr>
+    </w:p>
+    <w:p>
+      <w:pPr>
+        <w:spacing w:after="100"/>
+        <w:rPr>
+          <w:rFonts w:asciiTheme="majorBidi" w:hAnsiTheme="majorBidi" w:cstheme="majorBidi"/>
+          <w:sz w:val="36"/>
+          <w:szCs w:val="36"/>
+          <w:lang w:val="en-US"/>
+        </w:rPr>
+      </w:pPr>
+      <w:r>
+        <w:rPr>
+          <w:rFonts w:asciiTheme="majorBidi" w:hAnsiTheme="majorBidi" w:cstheme="majorBidi"/>
+          <w:sz w:val="36"/>
+          <w:szCs w:val="36"/>
+          <w:lang w:val="en-US"/>
+        </w:rPr>
+        <w:t>In the current project, the programming language Dart is applied to write code for implementation of application logic, handling of data and interaction between UI and database.</w:t>
+      </w:r>
+    </w:p>
+    <w:p>
+      <w:pPr>
+        <w:spacing w:after="100"/>
+        <w:rPr>
+          <w:rFonts w:asciiTheme="majorBidi" w:hAnsiTheme="majorBidi" w:cstheme="majorBidi"/>
+          <w:sz w:val="40"/>
+          <w:szCs w:val="40"/>
+          <w:lang w:val="en-US"/>
+        </w:rPr>
+      </w:pPr>
+    </w:p>
+    <w:p>
+      <w:pPr>
+        <w:spacing w:after="100"/>
+        <w:rPr>
+          <w:rFonts w:asciiTheme="majorBidi" w:hAnsiTheme="majorBidi" w:cstheme="majorBidi"/>
+          <w:sz w:val="40"/>
+          <w:szCs w:val="40"/>
+          <w:lang w:val="en-US"/>
+        </w:rPr>
+      </w:pPr>
+    </w:p>
+    <w:p>
+      <w:pPr>
+        <w:spacing w:after="100"/>
+        <w:rPr>
+          <w:rFonts w:asciiTheme="majorBidi" w:hAnsiTheme="majorBidi" w:cstheme="majorBidi"/>
+          <w:sz w:val="40"/>
+          <w:szCs w:val="40"/>
+          <w:lang w:val="en-US"/>
+        </w:rPr>
+      </w:pPr>
+    </w:p>
+    <w:p>
+      <w:pPr>
+        <w:spacing w:after="100"/>
+        <w:rPr>
+          <w:rFonts w:ascii="Goudy Old Style" w:hAnsi="Goudy Old Style"/>
+          <w:b/>
+          <w:bCs/>
+          <w:sz w:val="22"/>
+          <w:szCs w:val="22"/>
+          <w:lang w:val="en-US"/>
+        </w:rPr>
+      </w:pPr>
+    </w:p>
+    <w:p>
+      <w:pPr>
+        <w:spacing w:after="100"/>
+        <w:rPr>
+          <w:rFonts w:ascii="Goudy Old Style" w:hAnsi="Goudy Old Style"/>
+          <w:b/>
+          <w:bCs/>
+          <w:sz w:val="22"/>
+          <w:szCs w:val="22"/>
+          <w:lang w:val="en-US"/>
+        </w:rPr>
+      </w:pPr>
+    </w:p>
+    <w:p>
+      <w:pPr>
+        <w:spacing w:after="100"/>
+        <w:rPr>
+          <w:rFonts w:asciiTheme="majorBidi" w:hAnsiTheme="majorBidi" w:cstheme="majorBidi"/>
+          <w:b/>
+          <w:bCs/>
+          <w:sz w:val="40"/>
+          <w:szCs w:val="40"/>
+          <w:u w:val="single"/>
+          <w:lang w:val="en-US"/>
+        </w:rPr>
+      </w:pPr>
+    </w:p>
+    <w:p>
+      <w:pPr>
+        <w:spacing w:after="100"/>
+        <w:rPr>
+          <w:rFonts w:asciiTheme="majorBidi" w:hAnsiTheme="majorBidi" w:cstheme="majorBidi"/>
+          <w:b/>
+          <w:bCs/>
+          <w:sz w:val="40"/>
+          <w:szCs w:val="40"/>
+          <w:u w:val="single"/>
+          <w:lang w:val="en-US"/>
+        </w:rPr>
+      </w:pPr>
+      <w:r>
+        <w:rPr>
+          <w:rFonts w:asciiTheme="majorBidi" w:hAnsiTheme="majorBidi" w:cstheme="majorBidi"/>
+          <w:b/>
+          <w:bCs/>
+          <w:sz w:val="40"/>
+          <w:szCs w:val="40"/>
+          <w:u w:val="single"/>
+          <w:lang w:val="en-US"/>
+        </w:rPr>
+        <w:lastRenderedPageBreak/>
+        <w:t>Database (SQFLite)</w:t>
+      </w:r>
+      <w:r>
+        <w:rPr>
+          <w:rFonts w:asciiTheme="majorBidi" w:hAnsiTheme="majorBidi" w:cstheme="majorBidi"/>
+          <w:b/>
+          <w:bCs/>
+          <w:sz w:val="40"/>
+          <w:szCs w:val="40"/>
+          <w:u w:val="single"/>
+          <w:lang w:val="en-US"/>
+        </w:rPr>
+        <w:t>:</w:t>
+      </w:r>
+    </w:p>
+    <w:p>
+      <w:pPr>
+        <w:spacing w:after="100"/>
+        <w:rPr>
+          <w:rFonts w:asciiTheme="majorBidi" w:hAnsiTheme="majorBidi" w:cstheme="majorBidi"/>
+          <w:sz w:val="36"/>
+          <w:szCs w:val="36"/>
+          <w:lang w:val="en-US"/>
+        </w:rPr>
+      </w:pPr>
+      <w:r>
+        <w:rPr>
+          <w:rFonts w:asciiTheme="majorBidi" w:hAnsiTheme="majorBidi" w:cstheme="majorBidi"/>
+          <w:sz w:val="36"/>
+          <w:szCs w:val="36"/>
+          <w:lang w:val="en-US"/>
+        </w:rPr>
+        <w:t>SQFLite refers to a database that enables data storage within the application. This database works on the principle of SQLite and it is widely applied in Flutter apps when it comes to the management of data.</w:t>
+      </w:r>
+    </w:p>
+    <w:p>
+      <w:pPr>
+        <w:spacing w:after="100"/>
+        <w:rPr>
+          <w:rFonts w:asciiTheme="majorBidi" w:hAnsiTheme="majorBidi" w:cstheme="majorBidi"/>
+          <w:sz w:val="36"/>
+          <w:szCs w:val="36"/>
+          <w:lang w:val="en-US"/>
+        </w:rPr>
+      </w:pPr>
+    </w:p>
+    <w:p>
+      <w:pPr>
+        <w:spacing w:after="100"/>
+        <w:rPr>
+          <w:rFonts w:asciiTheme="majorBidi" w:hAnsiTheme="majorBidi" w:cstheme="majorBidi"/>
+          <w:sz w:val="36"/>
+          <w:szCs w:val="36"/>
+          <w:lang w:val="en-US"/>
+        </w:rPr>
+      </w:pPr>
+      <w:r>
+        <w:rPr>
+          <w:rFonts w:asciiTheme="majorBidi" w:hAnsiTheme="majorBidi" w:cstheme="majorBidi"/>
+          <w:sz w:val="36"/>
+          <w:szCs w:val="36"/>
+          <w:lang w:val="en-US"/>
+        </w:rPr>
+        <w:t>In this project, SQFLite is employed for data storage of everything required for the app, including children’s information, attendance records, employees’ information, and financial information.</w:t>
+      </w:r>
+    </w:p>
+    <w:p>
+      <w:pPr>
+        <w:spacing w:after="100"/>
+        <w:rPr>
+          <w:rFonts w:asciiTheme="majorBidi" w:hAnsiTheme="majorBidi" w:cstheme="majorBidi"/>
+          <w:sz w:val="40"/>
+          <w:szCs w:val="40"/>
+          <w:lang w:val="en-US"/>
+        </w:rPr>
+      </w:pPr>
+    </w:p>
+    <w:p>
+      <w:pPr>
+        <w:spacing w:after="100"/>
+        <w:rPr>
+          <w:rFonts w:asciiTheme="majorBidi" w:hAnsiTheme="majorBidi" w:cstheme="majorBidi"/>
+          <w:b/>
+          <w:bCs/>
+          <w:sz w:val="40"/>
+          <w:szCs w:val="40"/>
+          <w:u w:val="single"/>
+          <w:lang w:val="en-US"/>
+        </w:rPr>
+      </w:pPr>
+      <w:r>
+        <w:rPr>
+          <w:rFonts w:asciiTheme="majorBidi" w:hAnsiTheme="majorBidi" w:cstheme="majorBidi"/>
+          <w:b/>
+          <w:bCs/>
+          <w:sz w:val="40"/>
+          <w:szCs w:val="40"/>
+          <w:u w:val="single"/>
+          <w:lang w:val="en-US"/>
+        </w:rPr>
+        <w:t>Development Tools (VS Code)</w:t>
+      </w:r>
+      <w:r>
+        <w:rPr>
+          <w:rFonts w:asciiTheme="majorBidi" w:hAnsiTheme="majorBidi" w:cstheme="majorBidi"/>
+          <w:b/>
+          <w:bCs/>
+          <w:sz w:val="40"/>
+          <w:szCs w:val="40"/>
+          <w:u w:val="single"/>
+          <w:lang w:val="en-US"/>
+        </w:rPr>
+        <w:t>:</w:t>
+      </w:r>
+    </w:p>
+    <w:p>
+      <w:pPr>
+        <w:spacing w:after="100"/>
+        <w:rPr>
+          <w:rFonts w:asciiTheme="majorBidi" w:hAnsiTheme="majorBidi" w:cstheme="majorBidi"/>
+          <w:sz w:val="36"/>
+          <w:szCs w:val="36"/>
+          <w:lang w:val="en-US"/>
+        </w:rPr>
+      </w:pPr>
+      <w:r>
+        <w:rPr>
+          <w:rFonts w:asciiTheme="majorBidi" w:hAnsiTheme="majorBidi" w:cstheme="majorBidi"/>
+          <w:sz w:val="36"/>
+          <w:szCs w:val="36"/>
+          <w:lang w:val="en-US"/>
+        </w:rPr>
+        <w:t>Development Environment</w:t>
+      </w:r>
+    </w:p>
+    <w:p>
+      <w:pPr>
+        <w:spacing w:after="100"/>
+        <w:rPr>
+          <w:rFonts w:asciiTheme="majorBidi" w:hAnsiTheme="majorBidi" w:cstheme="majorBidi"/>
+          <w:sz w:val="36"/>
+          <w:szCs w:val="36"/>
+          <w:lang w:val="en-US"/>
+        </w:rPr>
+      </w:pPr>
+      <w:r>
+        <w:rPr>
+          <w:rFonts w:asciiTheme="majorBidi" w:hAnsiTheme="majorBidi" w:cstheme="majorBidi"/>
+          <w:sz w:val="36"/>
+          <w:szCs w:val="36"/>
+          <w:lang w:val="en-US"/>
+        </w:rPr>
+        <w:t xml:space="preserve">This project has been developed using Visual Studio Code (VS Code). This </w:t>
+      </w:r>
+      <w:r>
+        <w:rPr>
+          <w:rFonts w:asciiTheme="majorBidi" w:hAnsiTheme="majorBidi" w:cstheme="majorBidi"/>
+          <w:sz w:val="36"/>
+          <w:szCs w:val="36"/>
+          <w:lang w:val="en-US"/>
+        </w:rPr>
+        <w:t>excellent lightweight code editor</w:t>
+      </w:r>
+      <w:r>
+        <w:rPr>
+          <w:rFonts w:asciiTheme="majorBidi" w:hAnsiTheme="majorBidi" w:cstheme="majorBidi"/>
+          <w:sz w:val="36"/>
+          <w:szCs w:val="36"/>
+          <w:lang w:val="en-US"/>
+        </w:rPr>
+        <w:t xml:space="preserve"> supports numerous programming languages and frameworks.</w:t>
+      </w:r>
+    </w:p>
+    <w:p>
+      <w:pPr>
+        <w:spacing w:after="100"/>
+        <w:rPr>
+          <w:rFonts w:asciiTheme="majorBidi" w:hAnsiTheme="majorBidi" w:cstheme="majorBidi"/>
+          <w:sz w:val="36"/>
+          <w:szCs w:val="36"/>
+          <w:lang w:val="en-US"/>
+        </w:rPr>
+      </w:pPr>
+      <w:r>
+        <w:rPr>
+          <w:rFonts w:asciiTheme="majorBidi" w:hAnsiTheme="majorBidi" w:cstheme="majorBidi"/>
+          <w:sz w:val="36"/>
+          <w:szCs w:val="36"/>
+          <w:lang w:val="en-US"/>
+        </w:rPr>
+        <w:t>VS Code has been utilized for coding, debugging, and modifying the source code in this project. In addition, it contains some useful plugins for the development of Flutter and Dart applications.</w:t>
+      </w:r>
+    </w:p>
+    <w:p>
+      <w:pPr>
+        <w:pStyle w:val="NormalWeb"/>
+        <w:ind w:left="-510"/>
+      </w:pPr>
+      <w:r>
+        <w:rPr>
+          <w:noProof/>
+        </w:rPr>
+        <w:drawing>
+          <wp:inline distT="0" distB="0" distL="0" distR="0">
+            <wp:extent cx="6038850" cy="2486025"/>
+            <wp:effectExtent l="0" t="0" r="0" b="9525"/>
+            <wp:docPr id="13" name="Image 13" descr="C:\Users\dif\Downloads\Gemini_Generated_Image_dm9cbxdm9cbxdm9c.png"/>
+            <wp:cNvGraphicFramePr>
+              <a:graphicFrameLocks xmlns:a="http://schemas.openxmlformats.org/drawingml/2006/main" noChangeAspect="1"/>
+            </wp:cNvGraphicFramePr>
+            <a:graphic xmlns:a="http://schemas.openxmlformats.org/drawingml/2006/main">
+              <a:graphicData uri="http://schemas.openxmlformats.org/drawingml/2006/picture">
+                <pic:pic xmlns:pic="http://schemas.openxmlformats.org/drawingml/2006/picture">
+                  <pic:nvPicPr>
+                    <pic:cNvPr id="0" name="Picture 6" descr="C:\Users\dif\Downloads\Gemini_Generated_Image_dm9cbxdm9cbxdm9c.png"/>
+                    <pic:cNvPicPr>
+                      <a:picLocks noChangeAspect="1" noChangeArrowheads="1"/>
+                    </pic:cNvPicPr>
+                  </pic:nvPicPr>
+                  <pic:blipFill>
+                    <a:blip r:embed="rId18">
+                      <a:extLst>
+                        <a:ext uri="{28A0092B-C50C-407E-A947-70E740481C1C}">
+                          <a14:useLocalDpi xmlns:a14="http://schemas.microsoft.com/office/drawing/2010/main" val="0"/>
+                        </a:ext>
+                      </a:extLst>
+                    </a:blip>
+                    <a:srcRect/>
+                    <a:stretch>
+                      <a:fillRect/>
+                    </a:stretch>
+                  </pic:blipFill>
+                  <pic:spPr bwMode="auto">
+                    <a:xfrm>
+                      <a:off x="0" y="0"/>
+                      <a:ext cx="6038850" cy="2486025"/>
+                    </a:xfrm>
+                    <a:prstGeom prst="rect">
+                      <a:avLst/>
+                    </a:prstGeom>
+                    <a:noFill/>
+                    <a:ln>
+                      <a:noFill/>
+                    </a:ln>
+                  </pic:spPr>
+                </pic:pic>
+              </a:graphicData>
+            </a:graphic>
+          </wp:inline>
+        </w:drawing>
+      </w:r>
+    </w:p>
+    <w:p>
+      <w:pPr>
+        <w:spacing w:before="100" w:beforeAutospacing="1" w:after="100"/>
+        <w:ind w:left="-850"/>
+        <w:rPr>
+          <w:rFonts w:asciiTheme="majorBidi" w:hAnsiTheme="majorBidi" w:cstheme="majorBidi"/>
+          <w:b/>
+          <w:bCs/>
+          <w:sz w:val="32"/>
+          <w:szCs w:val="32"/>
+          <w:rtl/>
+          <w:lang w:val="en-US"/>
+        </w:rPr>
+      </w:pPr>
+      <w:r>
+        <w:rPr>
+          <w:rFonts w:asciiTheme="majorBidi" w:hAnsiTheme="majorBidi" w:cstheme="majorBidi"/>
+          <w:b/>
+          <w:bCs/>
+          <w:sz w:val="32"/>
+          <w:szCs w:val="32"/>
+          <w:lang w:val="en-US"/>
+        </w:rPr>
+        <w:t xml:space="preserve">                       </w:t>
+      </w:r>
+      <w:r>
+        <w:rPr>
+          <w:rFonts w:asciiTheme="majorBidi" w:hAnsiTheme="majorBidi" w:cstheme="majorBidi"/>
+          <w:b/>
+          <w:bCs/>
+          <w:sz w:val="32"/>
+          <w:szCs w:val="32"/>
+          <w:lang w:val="en-US"/>
+        </w:rPr>
+        <w:t>Figure 2.2: Authentication Sequence Diagram</w:t>
       </w:r>
     </w:p>
     <w:sectPr>
@@ -9245,7 +11140,7 @@
   <w:style w:type="paragraph" w:default="1" w:styleId="Normal">
     <w:name w:val="Normal"/>
     <w:qFormat/>
-    <w:rsid w:val="006E4645"/>
+    <w:rsid w:val="00D57E69"/>
   </w:style>
   <w:style w:type="paragraph" w:styleId="Titre1">
     <w:name w:val="heading 1"/>

</xml_diff>

<commit_message>
added build + added organization figure in pfe
</commit_message>
<xml_diff>
--- a/PFE.docx
+++ b/PFE.docx
@@ -1263,8 +1263,6 @@
           <w:lang w:val="en-US"/>
         </w:rPr>
       </w:pPr>
-      <w:bookmarkStart w:id="0" w:name="_GoBack"/>
-      <w:bookmarkEnd w:id="0"/>
     </w:p>
     <w:p>
       <w:pPr>
@@ -12671,8 +12669,19 @@
     </w:p>
     <w:p>
       <w:pPr>
-        <w:spacing w:after="100"/>
-        <w:ind w:left="720"/>
+        <w:spacing w:before="100" w:beforeAutospacing="1" w:after="100"/>
+        <w:ind w:left="680"/>
+        <w:rPr>
+          <w:rFonts w:asciiTheme="majorBidi" w:hAnsiTheme="majorBidi" w:cstheme="majorBidi"/>
+          <w:sz w:val="14"/>
+          <w:szCs w:val="14"/>
+          <w:lang w:val="en-US"/>
+        </w:rPr>
+      </w:pPr>
+    </w:p>
+    <w:p>
+      <w:pPr>
+        <w:spacing w:after="100"/>
         <w:rPr>
           <w:rFonts w:asciiTheme="majorBidi" w:hAnsiTheme="majorBidi" w:cstheme="majorBidi"/>
           <w:sz w:val="36"/>
@@ -12680,25 +12689,80 @@
           <w:lang w:val="en-US"/>
         </w:rPr>
       </w:pPr>
-    </w:p>
-    <w:p>
-      <w:pPr>
-        <w:spacing w:after="100"/>
+      <w:r>
         <w:rPr>
           <w:rFonts w:asciiTheme="majorBidi" w:hAnsiTheme="majorBidi" w:cstheme="majorBidi"/>
           <w:sz w:val="36"/>
           <w:szCs w:val="36"/>
           <w:lang w:val="en-US"/>
         </w:rPr>
-      </w:pPr>
-      <w:r>
+        <w:t>This organization helps keep the project well-structured, making it easier to navigate, understand, and maintain.</w:t>
+      </w:r>
+    </w:p>
+    <w:p>
+      <w:pPr>
+        <w:spacing w:after="100"/>
+        <w:rPr>
+          <w:rFonts w:asciiTheme="majorBidi" w:hAnsiTheme="majorBidi" w:cstheme="majorBidi"/>
+          <w:sz w:val="10"/>
+          <w:szCs w:val="10"/>
+          <w:lang w:val="en-US"/>
+        </w:rPr>
+      </w:pPr>
+    </w:p>
+    <w:p>
+      <w:pPr>
+        <w:spacing w:after="100"/>
+        <w:ind w:left="1531"/>
         <w:rPr>
           <w:rFonts w:asciiTheme="majorBidi" w:hAnsiTheme="majorBidi" w:cstheme="majorBidi"/>
           <w:sz w:val="36"/>
           <w:szCs w:val="36"/>
           <w:lang w:val="en-US"/>
         </w:rPr>
-        <w:t>This organization helps keep the project well-structured, making it easier to navigate, understand, and maintain.</w:t>
+      </w:pPr>
+      <w:r>
+        <w:rPr>
+          <w:rFonts w:asciiTheme="majorBidi" w:hAnsiTheme="majorBidi" w:cstheme="majorBidi"/>
+          <w:sz w:val="36"/>
+          <w:szCs w:val="36"/>
+          <w:lang w:val="en-US"/>
+        </w:rPr>
+        <w:drawing>
+          <wp:inline distT="0" distB="0" distL="0" distR="0" wp14:anchorId="264B178D" wp14:editId="28DC150B">
+            <wp:extent cx="3869317" cy="5571461"/>
+            <wp:effectExtent l="0" t="0" r="0" b="0"/>
+            <wp:docPr id="17" name="Image 17"/>
+            <wp:cNvGraphicFramePr>
+              <a:graphicFrameLocks xmlns:a="http://schemas.openxmlformats.org/drawingml/2006/main" noChangeAspect="1"/>
+            </wp:cNvGraphicFramePr>
+            <a:graphic xmlns:a="http://schemas.openxmlformats.org/drawingml/2006/main">
+              <a:graphicData uri="http://schemas.openxmlformats.org/drawingml/2006/picture">
+                <pic:pic xmlns:pic="http://schemas.openxmlformats.org/drawingml/2006/picture">
+                  <pic:nvPicPr>
+                    <pic:cNvPr id="1" name=""/>
+                    <pic:cNvPicPr/>
+                  </pic:nvPicPr>
+                  <pic:blipFill>
+                    <a:blip r:embed="rId20"/>
+                    <a:stretch>
+                      <a:fillRect/>
+                    </a:stretch>
+                  </pic:blipFill>
+                  <pic:spPr>
+                    <a:xfrm>
+                      <a:off x="0" y="0"/>
+                      <a:ext cx="3916060" cy="5638766"/>
+                    </a:xfrm>
+                    <a:prstGeom prst="rect">
+                      <a:avLst/>
+                    </a:prstGeom>
+                  </pic:spPr>
+                </pic:pic>
+              </a:graphicData>
+            </a:graphic>
+          </wp:inline>
+        </w:drawing>
       </w:r>
     </w:p>
     <w:p>
@@ -12714,6 +12778,41 @@
           <w:lang w:val="en-US"/>
         </w:rPr>
       </w:pPr>
+      <w:r>
+        <w:rPr>
+          <w:rFonts w:asciiTheme="majorBidi" w:hAnsiTheme="majorBidi" w:cstheme="majorBidi"/>
+          <w:b/>
+          <w:bCs/>
+          <w:sz w:val="32"/>
+          <w:szCs w:val="32"/>
+          <w:lang w:val="en-US"/>
+        </w:rPr>
+        <w:t xml:space="preserve">               </w:t>
+      </w:r>
+      <w:r>
+        <w:rPr>
+          <w:rFonts w:asciiTheme="majorBidi" w:hAnsiTheme="majorBidi" w:cstheme="majorBidi"/>
+          <w:b/>
+          <w:bCs/>
+          <w:sz w:val="32"/>
+          <w:szCs w:val="32"/>
+          <w:lang w:val="en-US"/>
+        </w:rPr>
+        <w:t xml:space="preserve"> </w:t>
+      </w:r>
+      <w:r>
+        <w:rPr>
+          <w:rFonts w:asciiTheme="majorBidi" w:hAnsiTheme="majorBidi" w:cstheme="majorBidi"/>
+          <w:b/>
+          <w:bCs/>
+          <w:sz w:val="32"/>
+          <w:szCs w:val="32"/>
+          <w:lang w:val="en-US"/>
+        </w:rPr>
+        <w:t>Figure 2.2: Authentication Sequence Diagram</w:t>
+      </w:r>
+      <w:bookmarkStart w:id="0" w:name="_GoBack"/>
+      <w:bookmarkEnd w:id="0"/>
     </w:p>
     <w:sectPr>
       <w:type w:val="continuous"/>
@@ -14085,7 +14184,7 @@
   <w:style w:type="paragraph" w:default="1" w:styleId="Normal">
     <w:name w:val="Normal"/>
     <w:qFormat/>
-    <w:rsid w:val="00703BAD"/>
+    <w:rsid w:val="001474C7"/>
   </w:style>
   <w:style w:type="paragraph" w:styleId="Titre1">
     <w:name w:val="heading 1"/>

</xml_diff>

<commit_message>
changed ui for settings and updated the PFE
</commit_message>
<xml_diff>
--- a/PFE.docx
+++ b/PFE.docx
@@ -865,6 +865,7 @@
         <w:rPr>
           <w:sz w:val="24"/>
           <w:szCs w:val="24"/>
+          <w:lang w:val="en-US"/>
         </w:rPr>
       </w:pPr>
       <w:r>
@@ -872,382 +873,406 @@
           <w:sz w:val="24"/>
           <w:szCs w:val="24"/>
         </w:rPr>
-        <w:t>4.1 Introduction ........................................... 35</w:t>
-      </w:r>
-    </w:p>
-    <w:p>
-      <w:pPr>
-        <w:spacing w:after="100"/>
+        <w:t xml:space="preserve">4.1 Introduction ........................................... </w:t>
+      </w:r>
+      <w:r>
         <w:rPr>
           <w:sz w:val="24"/>
           <w:szCs w:val="24"/>
-        </w:rPr>
-      </w:pPr>
-      <w:r>
+          <w:lang w:val="en-US"/>
+        </w:rPr>
+        <w:t>35</w:t>
+      </w:r>
+    </w:p>
+    <w:p>
+      <w:pPr>
+        <w:spacing w:after="100"/>
         <w:rPr>
           <w:sz w:val="24"/>
           <w:szCs w:val="24"/>
-        </w:rPr>
-        <w:t>4.2 Development Environment .......................... 35</w:t>
-      </w:r>
-    </w:p>
-    <w:p>
-      <w:pPr>
-        <w:spacing w:after="100"/>
+          <w:lang w:val="en-US"/>
+        </w:rPr>
+      </w:pPr>
+      <w:r>
         <w:rPr>
           <w:sz w:val="24"/>
           <w:szCs w:val="24"/>
-        </w:rPr>
-      </w:pPr>
-      <w:r>
+          <w:lang w:val="en-US"/>
+        </w:rPr>
+        <w:t>4.2 Development Environment .......................... 35</w:t>
+      </w:r>
+    </w:p>
+    <w:p>
+      <w:pPr>
+        <w:spacing w:after="100"/>
         <w:rPr>
           <w:sz w:val="24"/>
           <w:szCs w:val="24"/>
-        </w:rPr>
-        <w:t>4.2.1 Flutter Framework ................................. 35</w:t>
-      </w:r>
-    </w:p>
-    <w:p>
-      <w:pPr>
-        <w:spacing w:after="100"/>
+          <w:lang w:val="en-US"/>
+        </w:rPr>
+      </w:pPr>
+      <w:r>
         <w:rPr>
           <w:sz w:val="24"/>
           <w:szCs w:val="24"/>
-        </w:rPr>
-      </w:pPr>
-      <w:r>
+          <w:lang w:val="en-US"/>
+        </w:rPr>
+        <w:t>4.2.1 Flutter Framework ................................. 35</w:t>
+      </w:r>
+    </w:p>
+    <w:p>
+      <w:pPr>
+        <w:spacing w:after="100"/>
         <w:rPr>
           <w:sz w:val="24"/>
           <w:szCs w:val="24"/>
-        </w:rPr>
-        <w:t>4.2.2 Dart Language ...................................... 36</w:t>
-      </w:r>
-    </w:p>
-    <w:p>
-      <w:pPr>
-        <w:spacing w:after="100"/>
+          <w:lang w:val="en-US"/>
+        </w:rPr>
+      </w:pPr>
+      <w:r>
         <w:rPr>
           <w:sz w:val="24"/>
           <w:szCs w:val="24"/>
-        </w:rPr>
-      </w:pPr>
-      <w:r>
+          <w:lang w:val="en-US"/>
+        </w:rPr>
+        <w:t>4.2.2 Dart Language ...................................... 36</w:t>
+      </w:r>
+    </w:p>
+    <w:p>
+      <w:pPr>
+        <w:spacing w:after="100"/>
         <w:rPr>
           <w:sz w:val="24"/>
           <w:szCs w:val="24"/>
-        </w:rPr>
-        <w:t>4.2.3 Database (SQFLite) .............................. 36</w:t>
-      </w:r>
-    </w:p>
-    <w:p>
-      <w:pPr>
-        <w:spacing w:after="100"/>
+          <w:lang w:val="en-US"/>
+        </w:rPr>
+      </w:pPr>
+      <w:r>
         <w:rPr>
           <w:sz w:val="24"/>
           <w:szCs w:val="24"/>
-        </w:rPr>
-      </w:pPr>
-      <w:r>
+          <w:lang w:val="en-US"/>
+        </w:rPr>
+        <w:t>4.2.3 Database (SQFLite) .............................. 36</w:t>
+      </w:r>
+    </w:p>
+    <w:p>
+      <w:pPr>
+        <w:spacing w:after="100"/>
         <w:rPr>
           <w:sz w:val="24"/>
           <w:szCs w:val="24"/>
-        </w:rPr>
-        <w:t>4.2.4 Development Tools (VS Code) ............ 37</w:t>
-      </w:r>
-    </w:p>
-    <w:p>
-      <w:pPr>
-        <w:spacing w:after="100"/>
+          <w:lang w:val="en-US"/>
+        </w:rPr>
+      </w:pPr>
+      <w:r>
         <w:rPr>
           <w:sz w:val="24"/>
           <w:szCs w:val="24"/>
-        </w:rPr>
-      </w:pPr>
-      <w:r>
+          <w:lang w:val="en-US"/>
+        </w:rPr>
+        <w:t>4.2.4 Development Tools (VS Code) ............ 37</w:t>
+      </w:r>
+    </w:p>
+    <w:p>
+      <w:pPr>
+        <w:spacing w:after="100"/>
         <w:rPr>
           <w:sz w:val="24"/>
           <w:szCs w:val="24"/>
-        </w:rPr>
-        <w:t>4.3 Application Architecture ........................... 37</w:t>
-      </w:r>
-    </w:p>
-    <w:p>
-      <w:pPr>
-        <w:spacing w:after="100"/>
+          <w:lang w:val="en-US"/>
+        </w:rPr>
+      </w:pPr>
+      <w:r>
         <w:rPr>
           <w:sz w:val="24"/>
           <w:szCs w:val="24"/>
-        </w:rPr>
-      </w:pPr>
-      <w:r>
+          <w:lang w:val="en-US"/>
+        </w:rPr>
+        <w:t>4.3 Application Architecture ........................... 37</w:t>
+      </w:r>
+    </w:p>
+    <w:p>
+      <w:pPr>
+        <w:spacing w:after="100"/>
         <w:rPr>
           <w:sz w:val="24"/>
           <w:szCs w:val="24"/>
-        </w:rPr>
-        <w:t>4.3.2 Project Organization ............................ 38</w:t>
-      </w:r>
-    </w:p>
-    <w:p>
-      <w:pPr>
-        <w:spacing w:after="100"/>
+          <w:lang w:val="en-US"/>
+        </w:rPr>
+      </w:pPr>
+      <w:r>
         <w:rPr>
           <w:sz w:val="24"/>
           <w:szCs w:val="24"/>
-        </w:rPr>
-      </w:pPr>
-      <w:r>
+          <w:lang w:val="en-US"/>
+        </w:rPr>
+        <w:t>4.3.2 Project Organization ............................ 38</w:t>
+      </w:r>
+    </w:p>
+    <w:p>
+      <w:pPr>
+        <w:spacing w:after="100"/>
         <w:rPr>
           <w:sz w:val="24"/>
           <w:szCs w:val="24"/>
-        </w:rPr>
-        <w:t>4.4 Features Presentation .............................. 39</w:t>
-      </w:r>
-    </w:p>
-    <w:p>
-      <w:pPr>
-        <w:spacing w:after="100"/>
+          <w:lang w:val="en-US"/>
+        </w:rPr>
+      </w:pPr>
+      <w:r>
         <w:rPr>
           <w:sz w:val="24"/>
           <w:szCs w:val="24"/>
-        </w:rPr>
-      </w:pPr>
-      <w:r>
+          <w:lang w:val="en-US"/>
+        </w:rPr>
+        <w:t>4.4 Features Presentation .............................. 39</w:t>
+      </w:r>
+    </w:p>
+    <w:p>
+      <w:pPr>
+        <w:spacing w:after="100"/>
         <w:rPr>
           <w:sz w:val="24"/>
           <w:szCs w:val="24"/>
         </w:rPr>
-        <w:t>4.5 Application Interfaces .............................. 39</w:t>
-      </w:r>
-    </w:p>
-    <w:p>
-      <w:pPr>
-        <w:spacing w:after="100"/>
+      </w:pPr>
+      <w:r>
         <w:rPr>
           <w:sz w:val="24"/>
           <w:szCs w:val="24"/>
-          <w:lang w:val="en-US"/>
-        </w:rPr>
-      </w:pPr>
-      <w:r>
+        </w:rPr>
+        <w:t>4.5 Application Interfaces .............................. 39</w:t>
+      </w:r>
+    </w:p>
+    <w:p>
+      <w:pPr>
+        <w:spacing w:after="100"/>
         <w:rPr>
           <w:sz w:val="24"/>
           <w:szCs w:val="24"/>
           <w:lang w:val="en-US"/>
         </w:rPr>
-        <w:t>4.5.1 Authentication Interface .................... 39</w:t>
-      </w:r>
-    </w:p>
-    <w:p>
-      <w:pPr>
-        <w:spacing w:after="100"/>
+      </w:pPr>
+      <w:r>
         <w:rPr>
           <w:sz w:val="24"/>
           <w:szCs w:val="24"/>
           <w:lang w:val="en-US"/>
         </w:rPr>
-      </w:pPr>
-      <w:r>
+        <w:t>4.5.1 Authentication Interface .................... 39</w:t>
+      </w:r>
+    </w:p>
+    <w:p>
+      <w:pPr>
+        <w:spacing w:after="100"/>
         <w:rPr>
           <w:sz w:val="24"/>
           <w:szCs w:val="24"/>
           <w:lang w:val="en-US"/>
         </w:rPr>
-        <w:t>4.5.2 Dashboard ............................................ 40</w:t>
-      </w:r>
-    </w:p>
-    <w:p>
-      <w:pPr>
-        <w:spacing w:after="100"/>
+      </w:pPr>
+      <w:r>
         <w:rPr>
           <w:sz w:val="24"/>
           <w:szCs w:val="24"/>
           <w:lang w:val="en-US"/>
         </w:rPr>
-      </w:pPr>
-      <w:r>
+        <w:t>4.5.2 Dashboard ............................................ 40</w:t>
+      </w:r>
+    </w:p>
+    <w:p>
+      <w:pPr>
+        <w:spacing w:after="100"/>
         <w:rPr>
           <w:sz w:val="24"/>
           <w:szCs w:val="24"/>
           <w:lang w:val="en-US"/>
         </w:rPr>
-        <w:t>4.5.3 Children Management .......................... 41</w:t>
-      </w:r>
-    </w:p>
-    <w:p>
-      <w:pPr>
-        <w:spacing w:after="100"/>
+      </w:pPr>
+      <w:r>
         <w:rPr>
           <w:sz w:val="24"/>
           <w:szCs w:val="24"/>
           <w:lang w:val="en-US"/>
         </w:rPr>
-      </w:pPr>
-      <w:r>
+        <w:t>4.5.3 Children Management .......................... 41</w:t>
+      </w:r>
+    </w:p>
+    <w:p>
+      <w:pPr>
+        <w:spacing w:after="100"/>
         <w:rPr>
           <w:sz w:val="24"/>
           <w:szCs w:val="24"/>
           <w:lang w:val="en-US"/>
         </w:rPr>
-        <w:t>4.5.4 Child Profile ......................................... 42</w:t>
-      </w:r>
-    </w:p>
-    <w:p>
-      <w:pPr>
-        <w:spacing w:after="100"/>
+      </w:pPr>
+      <w:r>
         <w:rPr>
           <w:sz w:val="24"/>
           <w:szCs w:val="24"/>
           <w:lang w:val="en-US"/>
         </w:rPr>
-      </w:pPr>
-      <w:r>
+        <w:t>4.5.4 Child Profile ......................................... 42</w:t>
+      </w:r>
+    </w:p>
+    <w:p>
+      <w:pPr>
+        <w:spacing w:after="100"/>
         <w:rPr>
           <w:sz w:val="24"/>
           <w:szCs w:val="24"/>
           <w:lang w:val="en-US"/>
         </w:rPr>
-        <w:t>4.5.5 Attendance Management .................... 44</w:t>
-      </w:r>
-    </w:p>
-    <w:p>
-      <w:pPr>
-        <w:spacing w:after="100"/>
+      </w:pPr>
+      <w:r>
         <w:rPr>
           <w:sz w:val="24"/>
           <w:szCs w:val="24"/>
           <w:lang w:val="en-US"/>
         </w:rPr>
-      </w:pPr>
-      <w:r>
+        <w:t>4.5.5 Attendance Management .................... 44</w:t>
+      </w:r>
+    </w:p>
+    <w:p>
+      <w:pPr>
+        <w:spacing w:after="100"/>
         <w:rPr>
           <w:sz w:val="24"/>
           <w:szCs w:val="24"/>
           <w:lang w:val="en-US"/>
         </w:rPr>
-        <w:t>4.5.6 Employee Management ...................... 45</w:t>
-      </w:r>
-    </w:p>
-    <w:p>
-      <w:pPr>
-        <w:spacing w:after="100"/>
+      </w:pPr>
+      <w:r>
         <w:rPr>
           <w:sz w:val="24"/>
           <w:szCs w:val="24"/>
           <w:lang w:val="en-US"/>
         </w:rPr>
-      </w:pPr>
-      <w:r>
+        <w:t>4.5.6 Employee Management ...................... 45</w:t>
+      </w:r>
+    </w:p>
+    <w:p>
+      <w:pPr>
+        <w:spacing w:after="100"/>
         <w:rPr>
           <w:sz w:val="24"/>
           <w:szCs w:val="24"/>
           <w:lang w:val="en-US"/>
         </w:rPr>
-        <w:t>4.5.7 Activities Management ....................... 47</w:t>
-      </w:r>
-    </w:p>
-    <w:p>
-      <w:pPr>
-        <w:spacing w:after="100"/>
+      </w:pPr>
+      <w:r>
         <w:rPr>
           <w:sz w:val="24"/>
           <w:szCs w:val="24"/>
           <w:lang w:val="en-US"/>
         </w:rPr>
-      </w:pPr>
-      <w:r>
+        <w:t>4.5.7 Activities Management ....................... 47</w:t>
+      </w:r>
+    </w:p>
+    <w:p>
+      <w:pPr>
+        <w:spacing w:after="100"/>
         <w:rPr>
           <w:sz w:val="24"/>
           <w:szCs w:val="24"/>
           <w:lang w:val="en-US"/>
         </w:rPr>
-        <w:t>4.5.8 Payment Management ........................ 48</w:t>
-      </w:r>
-    </w:p>
-    <w:p>
-      <w:pPr>
-        <w:spacing w:after="100"/>
+      </w:pPr>
+      <w:r>
         <w:rPr>
           <w:sz w:val="24"/>
           <w:szCs w:val="24"/>
           <w:lang w:val="en-US"/>
         </w:rPr>
-      </w:pPr>
-      <w:r>
+        <w:t>4.5.8 Payment Management ........................ 48</w:t>
+      </w:r>
+    </w:p>
+    <w:p>
+      <w:pPr>
+        <w:spacing w:after="100"/>
         <w:rPr>
           <w:sz w:val="24"/>
           <w:szCs w:val="24"/>
           <w:lang w:val="en-US"/>
         </w:rPr>
-        <w:t>4.5.9 Expense Management ........................ 49</w:t>
-      </w:r>
-    </w:p>
-    <w:p>
-      <w:pPr>
-        <w:spacing w:after="100"/>
+      </w:pPr>
+      <w:r>
         <w:rPr>
           <w:sz w:val="24"/>
           <w:szCs w:val="24"/>
           <w:lang w:val="en-US"/>
         </w:rPr>
-      </w:pPr>
-      <w:r>
+        <w:t>4.5.9 Expense Management ........................ 49</w:t>
+      </w:r>
+    </w:p>
+    <w:p>
+      <w:pPr>
+        <w:spacing w:after="100"/>
         <w:rPr>
           <w:sz w:val="24"/>
           <w:szCs w:val="24"/>
           <w:lang w:val="en-US"/>
         </w:rPr>
-        <w:t>4.5.10 Statistics and Charts ....................... 50</w:t>
-      </w:r>
-    </w:p>
-    <w:p>
-      <w:pPr>
-        <w:spacing w:after="100"/>
+      </w:pPr>
+      <w:r>
         <w:rPr>
           <w:sz w:val="24"/>
           <w:szCs w:val="24"/>
           <w:lang w:val="en-US"/>
         </w:rPr>
-      </w:pPr>
-      <w:r>
+        <w:t>4.5.10 Statistics and Charts ....................... 50</w:t>
+      </w:r>
+    </w:p>
+    <w:p>
+      <w:pPr>
+        <w:spacing w:after="100"/>
         <w:rPr>
           <w:sz w:val="24"/>
           <w:szCs w:val="24"/>
           <w:lang w:val="en-US"/>
         </w:rPr>
-        <w:t>4.5.11 Settings ............................................. 51</w:t>
-      </w:r>
-    </w:p>
-    <w:p>
-      <w:pPr>
-        <w:spacing w:after="100"/>
+      </w:pPr>
+      <w:r>
         <w:rPr>
           <w:sz w:val="24"/>
           <w:szCs w:val="24"/>
           <w:lang w:val="en-US"/>
         </w:rPr>
-      </w:pPr>
-      <w:r>
+        <w:t>4.5.11 Settings ............................................. 51</w:t>
+      </w:r>
+    </w:p>
+    <w:p>
+      <w:pPr>
+        <w:spacing w:after="100"/>
         <w:rPr>
           <w:sz w:val="24"/>
           <w:szCs w:val="24"/>
           <w:lang w:val="en-US"/>
         </w:rPr>
-        <w:t>4.6 Testing and Validation .............................. 52</w:t>
-      </w:r>
-    </w:p>
-    <w:p>
-      <w:pPr>
-        <w:spacing w:after="100"/>
+      </w:pPr>
+      <w:r>
         <w:rPr>
           <w:sz w:val="24"/>
           <w:szCs w:val="24"/>
-        </w:rPr>
-      </w:pPr>
-      <w:r>
+          <w:lang w:val="en-US"/>
+        </w:rPr>
+        <w:t>4.6 Testing and Validation .............................. 52</w:t>
+      </w:r>
+    </w:p>
+    <w:p>
+      <w:pPr>
+        <w:spacing w:after="100"/>
         <w:rPr>
           <w:sz w:val="24"/>
           <w:szCs w:val="24"/>
         </w:rPr>
+      </w:pPr>
+      <w:r>
+        <w:rPr>
+          <w:sz w:val="24"/>
+          <w:szCs w:val="24"/>
+        </w:rPr>
         <w:t>4.7 Conclusion ............................................... 53</w:t>
       </w:r>
     </w:p>
@@ -1260,7 +1285,6 @@
           <w:bCs/>
           <w:sz w:val="52"/>
           <w:szCs w:val="52"/>
-          <w:lang w:val="en-US"/>
         </w:rPr>
       </w:pPr>
     </w:p>
@@ -8601,6 +8625,7 @@
           <w:bCs/>
           <w:sz w:val="32"/>
           <w:szCs w:val="32"/>
+          <w:lang w:val="en-US"/>
         </w:rPr>
         <w:t xml:space="preserve">              </w:t>
       </w:r>
@@ -8611,6 +8636,7 @@
           <w:bCs/>
           <w:sz w:val="32"/>
           <w:szCs w:val="32"/>
+          <w:lang w:val="en-US"/>
         </w:rPr>
         <w:t xml:space="preserve">   </w:t>
       </w:r>
@@ -10128,6 +10154,7 @@
           <w:sz w:val="40"/>
           <w:szCs w:val="40"/>
           <w:u w:val="single"/>
+          <w:lang w:val="en-US"/>
         </w:rPr>
       </w:pPr>
       <w:r>
@@ -10138,6 +10165,7 @@
           <w:sz w:val="40"/>
           <w:szCs w:val="40"/>
           <w:u w:val="single"/>
+          <w:lang w:val="en-US"/>
         </w:rPr>
         <w:t>Framework Flutter :</w:t>
       </w:r>
@@ -10668,6 +10696,7 @@
           <w:bCs/>
           <w:sz w:val="66"/>
           <w:szCs w:val="66"/>
+          <w:lang w:val="en-US"/>
         </w:rPr>
         <w:t>Architecture of the Application</w:t>
       </w:r>
@@ -10888,6 +10917,7 @@
           <w:bCs/>
           <w:sz w:val="72"/>
           <w:szCs w:val="72"/>
+          <w:lang w:val="en-US"/>
         </w:rPr>
       </w:pPr>
       <w:r>
@@ -10897,19 +10927,10 @@
           <w:bCs/>
           <w:sz w:val="72"/>
           <w:szCs w:val="72"/>
+          <w:lang w:val="en-US"/>
         </w:rPr>
         <w:lastRenderedPageBreak/>
-        <w:t>Project Organization</w:t>
-      </w:r>
-      <w:r>
-        <w:rPr>
-          <w:rFonts w:ascii="Goudy Old Style" w:hAnsi="Goudy Old Style"/>
-          <w:b/>
-          <w:bCs/>
-          <w:sz w:val="72"/>
-          <w:szCs w:val="72"/>
-        </w:rPr>
-        <w:t xml:space="preserve"> </w:t>
+        <w:t xml:space="preserve">Project Organization </w:t>
       </w:r>
     </w:p>
     <w:p>
@@ -10921,6 +10942,7 @@
           <w:bCs/>
           <w:sz w:val="16"/>
           <w:szCs w:val="16"/>
+          <w:lang w:val="en-US"/>
         </w:rPr>
       </w:pPr>
     </w:p>
@@ -10978,19 +11000,7 @@
           <w:u w:val="single"/>
           <w:lang w:val="en-US"/>
         </w:rPr>
-        <w:t>Screens</w:t>
-      </w:r>
-      <w:r>
-        <w:rPr>
-          <w:rFonts w:asciiTheme="majorBidi" w:hAnsiTheme="majorBidi" w:cstheme="majorBidi"/>
-          <w:b/>
-          <w:bCs/>
-          <w:sz w:val="40"/>
-          <w:szCs w:val="40"/>
-          <w:u w:val="single"/>
-          <w:lang w:val="en-US"/>
-        </w:rPr>
-        <w:t>:</w:t>
+        <w:t>Screens:</w:t>
       </w:r>
     </w:p>
     <w:p>
@@ -11532,19 +11542,7 @@
           <w:u w:val="single"/>
           <w:lang w:val="en-US"/>
         </w:rPr>
-        <w:t>Layout</w:t>
-      </w:r>
-      <w:r>
-        <w:rPr>
-          <w:rFonts w:asciiTheme="majorBidi" w:hAnsiTheme="majorBidi" w:cstheme="majorBidi"/>
-          <w:b/>
-          <w:bCs/>
-          <w:sz w:val="40"/>
-          <w:szCs w:val="40"/>
-          <w:u w:val="single"/>
-          <w:lang w:val="en-US"/>
-        </w:rPr>
-        <w:t>:</w:t>
+        <w:t>Layout:</w:t>
       </w:r>
     </w:p>
     <w:p>
@@ -11734,19 +11732,7 @@
           <w:u w:val="single"/>
           <w:lang w:val="en-US"/>
         </w:rPr>
-        <w:t>Models</w:t>
-      </w:r>
-      <w:r>
-        <w:rPr>
-          <w:rFonts w:asciiTheme="majorBidi" w:hAnsiTheme="majorBidi" w:cstheme="majorBidi"/>
-          <w:b/>
-          <w:bCs/>
-          <w:sz w:val="40"/>
-          <w:szCs w:val="40"/>
-          <w:u w:val="single"/>
-          <w:lang w:val="en-US"/>
-        </w:rPr>
-        <w:t>:</w:t>
+        <w:t>Models:</w:t>
       </w:r>
     </w:p>
     <w:p>
@@ -12328,19 +12314,7 @@
           <w:u w:val="single"/>
           <w:lang w:val="en-US"/>
         </w:rPr>
-        <w:t>Services</w:t>
-      </w:r>
-      <w:r>
-        <w:rPr>
-          <w:rFonts w:asciiTheme="majorBidi" w:hAnsiTheme="majorBidi" w:cstheme="majorBidi"/>
-          <w:b/>
-          <w:bCs/>
-          <w:sz w:val="40"/>
-          <w:szCs w:val="40"/>
-          <w:u w:val="single"/>
-          <w:lang w:val="en-US"/>
-        </w:rPr>
-        <w:t>:</w:t>
+        <w:t>Services:</w:t>
       </w:r>
     </w:p>
     <w:p>
@@ -12479,6 +12453,7 @@
           <w:sz w:val="40"/>
           <w:szCs w:val="40"/>
           <w:u w:val="single"/>
+          <w:lang w:val="en-US"/>
         </w:rPr>
       </w:pPr>
     </w:p>
@@ -12492,6 +12467,7 @@
           <w:sz w:val="40"/>
           <w:szCs w:val="40"/>
           <w:u w:val="single"/>
+          <w:lang w:val="en-US"/>
         </w:rPr>
       </w:pPr>
     </w:p>
@@ -12505,6 +12481,7 @@
           <w:sz w:val="40"/>
           <w:szCs w:val="40"/>
           <w:u w:val="single"/>
+          <w:lang w:val="en-US"/>
         </w:rPr>
       </w:pPr>
     </w:p>
@@ -12724,9 +12701,10 @@
       <w:r>
         <w:rPr>
           <w:rFonts w:asciiTheme="majorBidi" w:hAnsiTheme="majorBidi" w:cstheme="majorBidi"/>
+          <w:noProof/>
           <w:sz w:val="36"/>
           <w:szCs w:val="36"/>
-          <w:lang w:val="en-US"/>
+          <w:lang w:eastAsia="fr-FR"/>
         </w:rPr>
         <w:drawing>
           <wp:inline distT="0" distB="0" distL="0" distR="0" wp14:anchorId="264B178D" wp14:editId="28DC150B">
@@ -12774,6 +12752,3579 @@
           <w:bCs/>
           <w:sz w:val="32"/>
           <w:szCs w:val="32"/>
+          <w:lang w:val="en-US"/>
+        </w:rPr>
+      </w:pPr>
+      <w:r>
+        <w:rPr>
+          <w:rFonts w:asciiTheme="majorBidi" w:hAnsiTheme="majorBidi" w:cstheme="majorBidi"/>
+          <w:b/>
+          <w:bCs/>
+          <w:sz w:val="32"/>
+          <w:szCs w:val="32"/>
+          <w:lang w:val="en-US"/>
+        </w:rPr>
+        <w:t xml:space="preserve">                </w:t>
+      </w:r>
+      <w:r>
+        <w:rPr>
+          <w:rFonts w:asciiTheme="majorBidi" w:hAnsiTheme="majorBidi" w:cstheme="majorBidi"/>
+          <w:b/>
+          <w:bCs/>
+          <w:sz w:val="32"/>
+          <w:szCs w:val="32"/>
+          <w:lang w:val="en-US"/>
+        </w:rPr>
+        <w:t>Figure 2.2: Authentication Sequence Diagram</w:t>
+      </w:r>
+    </w:p>
+    <w:p>
+      <w:pPr>
+        <w:spacing w:after="100"/>
+        <w:rPr>
+          <w:rFonts w:ascii="Goudy Old Style" w:hAnsi="Goudy Old Style"/>
+          <w:b/>
+          <w:bCs/>
+          <w:sz w:val="72"/>
+          <w:szCs w:val="72"/>
+          <w:lang w:val="en-US"/>
+        </w:rPr>
+      </w:pPr>
+      <w:r>
+        <w:rPr>
+          <w:rFonts w:ascii="Goudy Old Style" w:hAnsi="Goudy Old Style"/>
+          <w:b/>
+          <w:bCs/>
+          <w:sz w:val="72"/>
+          <w:szCs w:val="72"/>
+          <w:lang w:val="en-US"/>
+        </w:rPr>
+        <w:lastRenderedPageBreak/>
+        <w:t>Authentication</w:t>
+      </w:r>
+      <w:r>
+        <w:rPr>
+          <w:rFonts w:ascii="Goudy Old Style" w:hAnsi="Goudy Old Style"/>
+          <w:b/>
+          <w:bCs/>
+          <w:sz w:val="72"/>
+          <w:szCs w:val="72"/>
+          <w:lang w:val="en-US"/>
+        </w:rPr>
+        <w:t xml:space="preserve"> </w:t>
+      </w:r>
+      <w:r>
+        <w:rPr>
+          <w:rFonts w:ascii="Goudy Old Style" w:hAnsi="Goudy Old Style"/>
+          <w:b/>
+          <w:bCs/>
+          <w:sz w:val="72"/>
+          <w:szCs w:val="72"/>
+          <w:lang w:val="en-US"/>
+        </w:rPr>
+        <w:t>Interface</w:t>
+      </w:r>
+    </w:p>
+    <w:p>
+      <w:pPr>
+        <w:spacing w:after="100"/>
+        <w:rPr>
+          <w:rFonts w:asciiTheme="majorBidi" w:hAnsiTheme="majorBidi" w:cstheme="majorBidi"/>
+          <w:b/>
+          <w:bCs/>
+          <w:sz w:val="32"/>
+          <w:szCs w:val="32"/>
+          <w:lang w:val="en-US"/>
+        </w:rPr>
+      </w:pPr>
+    </w:p>
+    <w:p>
+      <w:pPr>
+        <w:spacing w:after="100"/>
+        <w:rPr>
+          <w:rFonts w:asciiTheme="majorBidi" w:hAnsiTheme="majorBidi" w:cstheme="majorBidi"/>
+          <w:b/>
+          <w:bCs/>
+          <w:sz w:val="32"/>
+          <w:szCs w:val="32"/>
+          <w:lang w:val="en-US"/>
+        </w:rPr>
+      </w:pPr>
+      <w:r>
+        <w:rPr>
+          <w:rFonts w:asciiTheme="majorBidi" w:hAnsiTheme="majorBidi" w:cstheme="majorBidi"/>
+          <w:b/>
+          <w:bCs/>
+          <w:sz w:val="32"/>
+          <w:szCs w:val="32"/>
+          <w:lang w:val="en-US"/>
+        </w:rPr>
+        <w:drawing>
+          <wp:inline distT="0" distB="0" distL="0" distR="0" wp14:anchorId="279195DE" wp14:editId="2FC573BE">
+            <wp:extent cx="5952227" cy="4123055"/>
+            <wp:effectExtent l="0" t="0" r="0" b="0"/>
+            <wp:docPr id="19" name="Image 19"/>
+            <wp:cNvGraphicFramePr>
+              <a:graphicFrameLocks xmlns:a="http://schemas.openxmlformats.org/drawingml/2006/main" noChangeAspect="1"/>
+            </wp:cNvGraphicFramePr>
+            <a:graphic xmlns:a="http://schemas.openxmlformats.org/drawingml/2006/main">
+              <a:graphicData uri="http://schemas.openxmlformats.org/drawingml/2006/picture">
+                <pic:pic xmlns:pic="http://schemas.openxmlformats.org/drawingml/2006/picture">
+                  <pic:nvPicPr>
+                    <pic:cNvPr id="1" name=""/>
+                    <pic:cNvPicPr/>
+                  </pic:nvPicPr>
+                  <pic:blipFill>
+                    <a:blip r:embed="rId21"/>
+                    <a:stretch>
+                      <a:fillRect/>
+                    </a:stretch>
+                  </pic:blipFill>
+                  <pic:spPr>
+                    <a:xfrm>
+                      <a:off x="0" y="0"/>
+                      <a:ext cx="5995220" cy="4152836"/>
+                    </a:xfrm>
+                    <a:prstGeom prst="rect">
+                      <a:avLst/>
+                    </a:prstGeom>
+                  </pic:spPr>
+                </pic:pic>
+              </a:graphicData>
+            </a:graphic>
+          </wp:inline>
+        </w:drawing>
+      </w:r>
+    </w:p>
+    <w:p>
+      <w:pPr>
+        <w:spacing w:after="100"/>
+        <w:rPr>
+          <w:rFonts w:asciiTheme="majorBidi" w:hAnsiTheme="majorBidi" w:cstheme="majorBidi"/>
+          <w:b/>
+          <w:bCs/>
+          <w:sz w:val="32"/>
+          <w:szCs w:val="32"/>
+          <w:lang w:val="en-US"/>
+        </w:rPr>
+      </w:pPr>
+      <w:r>
+        <w:rPr>
+          <w:rFonts w:asciiTheme="majorBidi" w:hAnsiTheme="majorBidi" w:cstheme="majorBidi"/>
+          <w:b/>
+          <w:bCs/>
+          <w:sz w:val="32"/>
+          <w:szCs w:val="32"/>
+          <w:lang w:val="en-US"/>
+        </w:rPr>
+        <w:t xml:space="preserve">                </w:t>
+      </w:r>
+      <w:r>
+        <w:rPr>
+          <w:rFonts w:asciiTheme="majorBidi" w:hAnsiTheme="majorBidi" w:cstheme="majorBidi"/>
+          <w:b/>
+          <w:bCs/>
+          <w:sz w:val="32"/>
+          <w:szCs w:val="32"/>
+          <w:lang w:val="en-US"/>
+        </w:rPr>
+        <w:t>Figure 2.2: Authentication Sequence Diagram</w:t>
+      </w:r>
+    </w:p>
+    <w:p>
+      <w:pPr>
+        <w:spacing w:before="100" w:beforeAutospacing="1" w:after="100" w:afterAutospacing="1" w:line="240" w:lineRule="auto"/>
+        <w:jc w:val="left"/>
+        <w:rPr>
+          <w:rFonts w:ascii="Times New Roman" w:eastAsia="Times New Roman" w:hAnsi="Times New Roman" w:cs="Times New Roman"/>
+          <w:sz w:val="28"/>
+          <w:szCs w:val="28"/>
+          <w:lang w:val="en-US" w:eastAsia="fr-FR"/>
+        </w:rPr>
+      </w:pPr>
+    </w:p>
+    <w:p>
+      <w:pPr>
+        <w:spacing w:before="100" w:beforeAutospacing="1" w:after="100" w:afterAutospacing="1" w:line="240" w:lineRule="auto"/>
+        <w:jc w:val="left"/>
+        <w:rPr>
+          <w:rFonts w:ascii="Times New Roman" w:eastAsia="Times New Roman" w:hAnsi="Times New Roman" w:cs="Times New Roman"/>
+          <w:sz w:val="32"/>
+          <w:szCs w:val="32"/>
+          <w:lang w:val="en-US" w:eastAsia="fr-FR"/>
+        </w:rPr>
+      </w:pPr>
+      <w:r>
+        <w:rPr>
+          <w:rFonts w:ascii="Times New Roman" w:eastAsia="Times New Roman" w:hAnsi="Times New Roman" w:cs="Times New Roman"/>
+          <w:sz w:val="32"/>
+          <w:szCs w:val="32"/>
+          <w:lang w:val="en-US" w:eastAsia="fr-FR"/>
+        </w:rPr>
+        <w:t>-</w:t>
+      </w:r>
+      <w:r>
+        <w:rPr>
+          <w:rFonts w:ascii="Times New Roman" w:eastAsia="Times New Roman" w:hAnsi="Times New Roman" w:cs="Times New Roman"/>
+          <w:sz w:val="32"/>
+          <w:szCs w:val="32"/>
+          <w:lang w:val="en-US" w:eastAsia="fr-FR"/>
+        </w:rPr>
+        <w:t>The dashboard provides the administrator with an overview of the daycare’s activity. It displays key information such as the total number of children, monthly registrations, attendance summary, and payment status. It allows the administrator to quickly monitor the overall situation and access different sections of the application.</w:t>
+      </w:r>
+    </w:p>
+    <w:p>
+      <w:pPr>
+        <w:spacing w:before="100" w:beforeAutospacing="1" w:after="100" w:afterAutospacing="1" w:line="240" w:lineRule="auto"/>
+        <w:jc w:val="left"/>
+        <w:rPr>
+          <w:rFonts w:ascii="Times New Roman" w:eastAsia="Times New Roman" w:hAnsi="Times New Roman" w:cs="Times New Roman"/>
+          <w:sz w:val="32"/>
+          <w:szCs w:val="32"/>
+          <w:lang w:val="en-US" w:eastAsia="fr-FR"/>
+        </w:rPr>
+      </w:pPr>
+      <w:r>
+        <w:rPr>
+          <w:rFonts w:ascii="Times New Roman" w:eastAsia="Times New Roman" w:hAnsi="Times New Roman" w:cs="Times New Roman"/>
+          <w:sz w:val="32"/>
+          <w:szCs w:val="32"/>
+          <w:lang w:val="en-US" w:eastAsia="fr-FR"/>
+        </w:rPr>
+        <w:t>.</w:t>
+      </w:r>
+    </w:p>
+    <w:p>
+      <w:pPr>
+        <w:spacing w:after="100"/>
+        <w:rPr>
+          <w:rFonts w:asciiTheme="majorBidi" w:hAnsiTheme="majorBidi" w:cstheme="majorBidi"/>
+          <w:b/>
+          <w:bCs/>
+          <w:sz w:val="32"/>
+          <w:szCs w:val="32"/>
+          <w:lang w:val="en-US"/>
+        </w:rPr>
+      </w:pPr>
+    </w:p>
+    <w:p>
+      <w:pPr>
+        <w:spacing w:after="100"/>
+        <w:rPr>
+          <w:rFonts w:asciiTheme="majorBidi" w:hAnsiTheme="majorBidi" w:cstheme="majorBidi"/>
+          <w:b/>
+          <w:bCs/>
+          <w:sz w:val="32"/>
+          <w:szCs w:val="32"/>
+          <w:lang w:val="en-US"/>
+        </w:rPr>
+      </w:pPr>
+    </w:p>
+    <w:p>
+      <w:pPr>
+        <w:spacing w:after="100"/>
+        <w:rPr>
+          <w:rFonts w:asciiTheme="majorBidi" w:hAnsiTheme="majorBidi" w:cstheme="majorBidi"/>
+          <w:b/>
+          <w:bCs/>
+          <w:sz w:val="32"/>
+          <w:szCs w:val="32"/>
+          <w:lang w:val="en-US"/>
+        </w:rPr>
+      </w:pPr>
+    </w:p>
+    <w:p>
+      <w:pPr>
+        <w:spacing w:after="100"/>
+        <w:rPr>
+          <w:rFonts w:asciiTheme="majorBidi" w:hAnsiTheme="majorBidi" w:cstheme="majorBidi"/>
+          <w:b/>
+          <w:bCs/>
+          <w:sz w:val="32"/>
+          <w:szCs w:val="32"/>
+          <w:lang w:val="en-US"/>
+        </w:rPr>
+      </w:pPr>
+    </w:p>
+    <w:p>
+      <w:pPr>
+        <w:spacing w:after="100"/>
+        <w:rPr>
+          <w:rFonts w:ascii="Goudy Old Style" w:hAnsi="Goudy Old Style"/>
+          <w:b/>
+          <w:bCs/>
+          <w:sz w:val="72"/>
+          <w:szCs w:val="72"/>
+          <w:lang w:val="en-US"/>
+        </w:rPr>
+      </w:pPr>
+      <w:r>
+        <w:rPr>
+          <w:rFonts w:ascii="Goudy Old Style" w:hAnsi="Goudy Old Style"/>
+          <w:b/>
+          <w:bCs/>
+          <w:sz w:val="72"/>
+          <w:szCs w:val="72"/>
+          <w:lang w:val="en-US"/>
+        </w:rPr>
+        <w:lastRenderedPageBreak/>
+        <w:t>Dashboard</w:t>
+      </w:r>
+    </w:p>
+    <w:p>
+      <w:pPr>
+        <w:spacing w:after="100"/>
+        <w:rPr>
+          <w:rFonts w:asciiTheme="majorBidi" w:hAnsiTheme="majorBidi" w:cstheme="majorBidi"/>
+          <w:b/>
+          <w:bCs/>
+          <w:sz w:val="14"/>
+          <w:szCs w:val="14"/>
+          <w:lang w:val="en-US"/>
+        </w:rPr>
+      </w:pPr>
+    </w:p>
+    <w:p>
+      <w:pPr>
+        <w:spacing w:after="100"/>
+        <w:rPr>
+          <w:rFonts w:asciiTheme="majorBidi" w:hAnsiTheme="majorBidi" w:cstheme="majorBidi"/>
+          <w:b/>
+          <w:bCs/>
+          <w:sz w:val="32"/>
+          <w:szCs w:val="32"/>
+          <w:lang w:val="en-US"/>
+        </w:rPr>
+      </w:pPr>
+      <w:r>
+        <w:rPr>
+          <w:rFonts w:asciiTheme="majorBidi" w:hAnsiTheme="majorBidi" w:cstheme="majorBidi"/>
+          <w:b/>
+          <w:bCs/>
+          <w:sz w:val="32"/>
+          <w:szCs w:val="32"/>
+          <w:lang w:val="en-US"/>
+        </w:rPr>
+        <w:drawing>
+          <wp:inline distT="0" distB="0" distL="0" distR="0" wp14:anchorId="67AC21F2" wp14:editId="3733EF74">
+            <wp:extent cx="5755640" cy="3710940"/>
+            <wp:effectExtent l="0" t="0" r="0" b="3810"/>
+            <wp:docPr id="20" name="Image 20"/>
+            <wp:cNvGraphicFramePr>
+              <a:graphicFrameLocks xmlns:a="http://schemas.openxmlformats.org/drawingml/2006/main" noChangeAspect="1"/>
+            </wp:cNvGraphicFramePr>
+            <a:graphic xmlns:a="http://schemas.openxmlformats.org/drawingml/2006/main">
+              <a:graphicData uri="http://schemas.openxmlformats.org/drawingml/2006/picture">
+                <pic:pic xmlns:pic="http://schemas.openxmlformats.org/drawingml/2006/picture">
+                  <pic:nvPicPr>
+                    <pic:cNvPr id="1" name=""/>
+                    <pic:cNvPicPr/>
+                  </pic:nvPicPr>
+                  <pic:blipFill>
+                    <a:blip r:embed="rId22"/>
+                    <a:stretch>
+                      <a:fillRect/>
+                    </a:stretch>
+                  </pic:blipFill>
+                  <pic:spPr>
+                    <a:xfrm>
+                      <a:off x="0" y="0"/>
+                      <a:ext cx="5755640" cy="3710940"/>
+                    </a:xfrm>
+                    <a:prstGeom prst="rect">
+                      <a:avLst/>
+                    </a:prstGeom>
+                  </pic:spPr>
+                </pic:pic>
+              </a:graphicData>
+            </a:graphic>
+          </wp:inline>
+        </w:drawing>
+      </w:r>
+    </w:p>
+    <w:p>
+      <w:pPr>
+        <w:spacing w:after="100"/>
+        <w:rPr>
+          <w:rFonts w:asciiTheme="majorBidi" w:hAnsiTheme="majorBidi" w:cstheme="majorBidi"/>
+          <w:b/>
+          <w:bCs/>
+          <w:sz w:val="32"/>
+          <w:szCs w:val="32"/>
+          <w:lang w:val="en-US"/>
+        </w:rPr>
+      </w:pPr>
+      <w:r>
+        <w:rPr>
+          <w:rFonts w:asciiTheme="majorBidi" w:hAnsiTheme="majorBidi" w:cstheme="majorBidi"/>
+          <w:b/>
+          <w:bCs/>
+          <w:sz w:val="32"/>
+          <w:szCs w:val="32"/>
+          <w:lang w:val="en-US"/>
+        </w:rPr>
+        <w:t xml:space="preserve">                </w:t>
+      </w:r>
+      <w:r>
+        <w:rPr>
+          <w:rFonts w:asciiTheme="majorBidi" w:hAnsiTheme="majorBidi" w:cstheme="majorBidi"/>
+          <w:b/>
+          <w:bCs/>
+          <w:sz w:val="32"/>
+          <w:szCs w:val="32"/>
+          <w:lang w:val="en-US"/>
+        </w:rPr>
+        <w:t>Figure 2.2: Authentication Sequence Diagram</w:t>
+      </w:r>
+    </w:p>
+    <w:p>
+      <w:pPr>
+        <w:spacing w:after="100"/>
+        <w:rPr>
+          <w:rFonts w:asciiTheme="majorBidi" w:hAnsiTheme="majorBidi" w:cstheme="majorBidi"/>
+          <w:b/>
+          <w:bCs/>
+          <w:sz w:val="32"/>
+          <w:szCs w:val="32"/>
+          <w:lang w:val="en-US"/>
+        </w:rPr>
+      </w:pPr>
+    </w:p>
+    <w:p>
+      <w:pPr>
+        <w:spacing w:after="100"/>
+        <w:rPr>
+          <w:rFonts w:asciiTheme="majorBidi" w:hAnsiTheme="majorBidi" w:cstheme="majorBidi"/>
+          <w:b/>
+          <w:bCs/>
+          <w:sz w:val="32"/>
+          <w:szCs w:val="32"/>
+          <w:lang w:val="en-US"/>
+        </w:rPr>
+      </w:pPr>
+    </w:p>
+    <w:p>
+      <w:pPr>
+        <w:spacing w:after="100"/>
+        <w:rPr>
+          <w:rFonts w:ascii="Times New Roman" w:eastAsia="Times New Roman" w:hAnsi="Times New Roman" w:cs="Times New Roman"/>
+          <w:sz w:val="32"/>
+          <w:szCs w:val="32"/>
+          <w:lang w:val="en-US" w:eastAsia="fr-FR"/>
+        </w:rPr>
+      </w:pPr>
+      <w:r>
+        <w:rPr>
+          <w:rFonts w:ascii="Times New Roman" w:eastAsia="Times New Roman" w:hAnsi="Times New Roman" w:cs="Times New Roman"/>
+          <w:sz w:val="32"/>
+          <w:szCs w:val="32"/>
+          <w:lang w:val="en-US" w:eastAsia="fr-FR"/>
+        </w:rPr>
+        <w:t>-</w:t>
+      </w:r>
+      <w:r>
+        <w:rPr>
+          <w:rFonts w:ascii="Times New Roman" w:eastAsia="Times New Roman" w:hAnsi="Times New Roman" w:cs="Times New Roman"/>
+          <w:sz w:val="32"/>
+          <w:szCs w:val="32"/>
+          <w:lang w:val="en-US" w:eastAsia="fr-FR"/>
+        </w:rPr>
+        <w:t xml:space="preserve">The authentication interface allows users to access the application by entering their login credentials. The system supports two types of users: </w:t>
+      </w:r>
+      <w:r>
+        <w:rPr>
+          <w:rFonts w:ascii="Times New Roman" w:eastAsia="Times New Roman" w:hAnsi="Times New Roman" w:cs="Times New Roman"/>
+          <w:b/>
+          <w:bCs/>
+          <w:sz w:val="32"/>
+          <w:szCs w:val="32"/>
+          <w:lang w:val="en-US" w:eastAsia="fr-FR"/>
+        </w:rPr>
+        <w:t>Administrator</w:t>
+      </w:r>
+      <w:r>
+        <w:rPr>
+          <w:rFonts w:ascii="Times New Roman" w:eastAsia="Times New Roman" w:hAnsi="Times New Roman" w:cs="Times New Roman"/>
+          <w:sz w:val="32"/>
+          <w:szCs w:val="32"/>
+          <w:lang w:val="en-US" w:eastAsia="fr-FR"/>
+        </w:rPr>
+        <w:t xml:space="preserve"> and </w:t>
+      </w:r>
+      <w:r>
+        <w:rPr>
+          <w:rFonts w:ascii="Times New Roman" w:eastAsia="Times New Roman" w:hAnsi="Times New Roman" w:cs="Times New Roman"/>
+          <w:b/>
+          <w:bCs/>
+          <w:sz w:val="32"/>
+          <w:szCs w:val="32"/>
+          <w:lang w:val="en-US" w:eastAsia="fr-FR"/>
+        </w:rPr>
+        <w:t>Standard user</w:t>
+      </w:r>
+      <w:r>
+        <w:rPr>
+          <w:rFonts w:ascii="Times New Roman" w:eastAsia="Times New Roman" w:hAnsi="Times New Roman" w:cs="Times New Roman"/>
+          <w:sz w:val="32"/>
+          <w:szCs w:val="32"/>
+          <w:lang w:val="en-US" w:eastAsia="fr-FR"/>
+        </w:rPr>
+        <w:t>, each with different access levels.</w:t>
+      </w:r>
+    </w:p>
+    <w:p>
+      <w:pPr>
+        <w:spacing w:after="100"/>
+        <w:rPr>
+          <w:rFonts w:ascii="Times New Roman" w:eastAsia="Times New Roman" w:hAnsi="Times New Roman" w:cs="Times New Roman"/>
+          <w:sz w:val="32"/>
+          <w:szCs w:val="32"/>
+          <w:lang w:val="en-US" w:eastAsia="fr-FR"/>
+        </w:rPr>
+      </w:pPr>
+      <w:r>
+        <w:rPr>
+          <w:rFonts w:ascii="Times New Roman" w:eastAsia="Times New Roman" w:hAnsi="Times New Roman" w:cs="Times New Roman"/>
+          <w:sz w:val="32"/>
+          <w:szCs w:val="32"/>
+          <w:lang w:val="en-US" w:eastAsia="fr-FR"/>
+        </w:rPr>
+        <w:t>It ensures that only authorized users can enter the system and access its functionalities securely.</w:t>
+      </w:r>
+    </w:p>
+    <w:p>
+      <w:pPr>
+        <w:spacing w:after="100"/>
+        <w:rPr>
+          <w:rFonts w:asciiTheme="majorBidi" w:hAnsiTheme="majorBidi" w:cstheme="majorBidi"/>
+          <w:b/>
+          <w:bCs/>
+          <w:sz w:val="32"/>
+          <w:szCs w:val="32"/>
+          <w:lang w:val="en-US"/>
+        </w:rPr>
+      </w:pPr>
+    </w:p>
+    <w:p>
+      <w:pPr>
+        <w:spacing w:after="100"/>
+        <w:rPr>
+          <w:rFonts w:asciiTheme="majorBidi" w:hAnsiTheme="majorBidi" w:cstheme="majorBidi"/>
+          <w:b/>
+          <w:bCs/>
+          <w:sz w:val="32"/>
+          <w:szCs w:val="32"/>
+          <w:lang w:val="en-US"/>
+        </w:rPr>
+      </w:pPr>
+    </w:p>
+    <w:p>
+      <w:pPr>
+        <w:spacing w:after="100"/>
+        <w:rPr>
+          <w:rFonts w:asciiTheme="majorBidi" w:hAnsiTheme="majorBidi" w:cstheme="majorBidi"/>
+          <w:b/>
+          <w:bCs/>
+          <w:sz w:val="32"/>
+          <w:szCs w:val="32"/>
+          <w:lang w:val="en-US"/>
+        </w:rPr>
+      </w:pPr>
+    </w:p>
+    <w:p>
+      <w:pPr>
+        <w:spacing w:after="100"/>
+        <w:rPr>
+          <w:rFonts w:asciiTheme="majorBidi" w:hAnsiTheme="majorBidi" w:cstheme="majorBidi"/>
+          <w:b/>
+          <w:bCs/>
+          <w:sz w:val="32"/>
+          <w:szCs w:val="32"/>
+          <w:lang w:val="en-US"/>
+        </w:rPr>
+      </w:pPr>
+    </w:p>
+    <w:p>
+      <w:pPr>
+        <w:spacing w:after="100"/>
+        <w:rPr>
+          <w:rFonts w:asciiTheme="majorBidi" w:hAnsiTheme="majorBidi" w:cstheme="majorBidi"/>
+          <w:b/>
+          <w:bCs/>
+          <w:sz w:val="32"/>
+          <w:szCs w:val="32"/>
+          <w:lang w:val="en-US"/>
+        </w:rPr>
+      </w:pPr>
+    </w:p>
+    <w:p>
+      <w:pPr>
+        <w:spacing w:after="100"/>
+        <w:rPr>
+          <w:rFonts w:asciiTheme="majorBidi" w:hAnsiTheme="majorBidi" w:cstheme="majorBidi"/>
+          <w:b/>
+          <w:bCs/>
+          <w:sz w:val="32"/>
+          <w:szCs w:val="32"/>
+          <w:lang w:val="en-US"/>
+        </w:rPr>
+      </w:pPr>
+    </w:p>
+    <w:p>
+      <w:pPr>
+        <w:spacing w:after="100"/>
+        <w:rPr>
+          <w:rFonts w:asciiTheme="majorBidi" w:hAnsiTheme="majorBidi" w:cstheme="majorBidi"/>
+          <w:b/>
+          <w:bCs/>
+          <w:sz w:val="32"/>
+          <w:szCs w:val="32"/>
+          <w:lang w:val="en-US"/>
+        </w:rPr>
+      </w:pPr>
+    </w:p>
+    <w:p>
+      <w:pPr>
+        <w:spacing w:after="100"/>
+        <w:rPr>
+          <w:rFonts w:asciiTheme="majorBidi" w:hAnsiTheme="majorBidi" w:cstheme="majorBidi"/>
+          <w:b/>
+          <w:bCs/>
+          <w:sz w:val="32"/>
+          <w:szCs w:val="32"/>
+          <w:lang w:val="en-US"/>
+        </w:rPr>
+      </w:pPr>
+    </w:p>
+    <w:p>
+      <w:pPr>
+        <w:spacing w:after="100"/>
+        <w:rPr>
+          <w:rFonts w:ascii="Goudy Old Style" w:hAnsi="Goudy Old Style"/>
+          <w:b/>
+          <w:bCs/>
+          <w:sz w:val="72"/>
+          <w:szCs w:val="72"/>
+          <w:lang w:val="en-US"/>
+        </w:rPr>
+      </w:pPr>
+      <w:r>
+        <w:rPr>
+          <w:rFonts w:asciiTheme="majorBidi" w:hAnsiTheme="majorBidi" w:cstheme="majorBidi"/>
+          <w:b/>
+          <w:bCs/>
+          <w:sz w:val="32"/>
+          <w:szCs w:val="32"/>
+          <w:lang w:val="en-US"/>
+        </w:rPr>
+        <w:lastRenderedPageBreak/>
+        <w:t xml:space="preserve"> </w:t>
+      </w:r>
+      <w:r>
+        <w:rPr>
+          <w:rFonts w:ascii="Goudy Old Style" w:hAnsi="Goudy Old Style"/>
+          <w:b/>
+          <w:bCs/>
+          <w:sz w:val="72"/>
+          <w:szCs w:val="72"/>
+        </w:rPr>
+        <w:t>Children Management</w:t>
+      </w:r>
+    </w:p>
+    <w:p>
+      <w:pPr>
+        <w:spacing w:after="100"/>
+        <w:rPr>
+          <w:rFonts w:asciiTheme="majorBidi" w:hAnsiTheme="majorBidi" w:cstheme="majorBidi"/>
+          <w:b/>
+          <w:bCs/>
+          <w:sz w:val="18"/>
+          <w:szCs w:val="18"/>
+          <w:lang w:val="en-US"/>
+        </w:rPr>
+      </w:pPr>
+    </w:p>
+    <w:p>
+      <w:pPr>
+        <w:spacing w:after="100"/>
+        <w:rPr>
+          <w:rFonts w:asciiTheme="majorBidi" w:hAnsiTheme="majorBidi" w:cstheme="majorBidi"/>
+          <w:b/>
+          <w:bCs/>
+          <w:sz w:val="32"/>
+          <w:szCs w:val="32"/>
+          <w:lang w:val="en-US"/>
+        </w:rPr>
+      </w:pPr>
+      <w:r>
+        <w:rPr>
+          <w:rFonts w:asciiTheme="majorBidi" w:hAnsiTheme="majorBidi" w:cstheme="majorBidi"/>
+          <w:b/>
+          <w:bCs/>
+          <w:sz w:val="32"/>
+          <w:szCs w:val="32"/>
+          <w:lang w:val="en-US"/>
+        </w:rPr>
+        <w:drawing>
+          <wp:inline distT="0" distB="0" distL="0" distR="0" wp14:anchorId="6E2F03AA" wp14:editId="321713C4">
+            <wp:extent cx="5755640" cy="3778250"/>
+            <wp:effectExtent l="0" t="0" r="0" b="0"/>
+            <wp:docPr id="14" name="Image 14"/>
+            <wp:cNvGraphicFramePr>
+              <a:graphicFrameLocks xmlns:a="http://schemas.openxmlformats.org/drawingml/2006/main" noChangeAspect="1"/>
+            </wp:cNvGraphicFramePr>
+            <a:graphic xmlns:a="http://schemas.openxmlformats.org/drawingml/2006/main">
+              <a:graphicData uri="http://schemas.openxmlformats.org/drawingml/2006/picture">
+                <pic:pic xmlns:pic="http://schemas.openxmlformats.org/drawingml/2006/picture">
+                  <pic:nvPicPr>
+                    <pic:cNvPr id="1" name=""/>
+                    <pic:cNvPicPr/>
+                  </pic:nvPicPr>
+                  <pic:blipFill>
+                    <a:blip r:embed="rId23"/>
+                    <a:stretch>
+                      <a:fillRect/>
+                    </a:stretch>
+                  </pic:blipFill>
+                  <pic:spPr>
+                    <a:xfrm>
+                      <a:off x="0" y="0"/>
+                      <a:ext cx="5755640" cy="3778250"/>
+                    </a:xfrm>
+                    <a:prstGeom prst="rect">
+                      <a:avLst/>
+                    </a:prstGeom>
+                  </pic:spPr>
+                </pic:pic>
+              </a:graphicData>
+            </a:graphic>
+          </wp:inline>
+        </w:drawing>
+      </w:r>
+    </w:p>
+    <w:p>
+      <w:pPr>
+        <w:spacing w:after="100"/>
+        <w:rPr>
+          <w:rFonts w:asciiTheme="majorBidi" w:hAnsiTheme="majorBidi" w:cstheme="majorBidi"/>
+          <w:b/>
+          <w:bCs/>
+          <w:sz w:val="32"/>
+          <w:szCs w:val="32"/>
+          <w:lang w:val="en-US"/>
+        </w:rPr>
+      </w:pPr>
+      <w:r>
+        <w:rPr>
+          <w:rFonts w:asciiTheme="majorBidi" w:hAnsiTheme="majorBidi" w:cstheme="majorBidi"/>
+          <w:b/>
+          <w:bCs/>
+          <w:sz w:val="32"/>
+          <w:szCs w:val="32"/>
+          <w:lang w:val="en-US"/>
+        </w:rPr>
+        <w:t xml:space="preserve">                </w:t>
+      </w:r>
+      <w:r>
+        <w:rPr>
+          <w:rFonts w:asciiTheme="majorBidi" w:hAnsiTheme="majorBidi" w:cstheme="majorBidi"/>
+          <w:b/>
+          <w:bCs/>
+          <w:sz w:val="32"/>
+          <w:szCs w:val="32"/>
+          <w:lang w:val="en-US"/>
+        </w:rPr>
+        <w:t>Figure 2.2: Authentication Sequence Diagram</w:t>
+      </w:r>
+    </w:p>
+    <w:p>
+      <w:pPr>
+        <w:tabs>
+          <w:tab w:val="left" w:pos="1100"/>
+        </w:tabs>
+        <w:spacing w:after="100"/>
+        <w:rPr>
+          <w:rFonts w:asciiTheme="majorBidi" w:hAnsiTheme="majorBidi" w:cstheme="majorBidi"/>
+          <w:b/>
+          <w:bCs/>
+          <w:sz w:val="32"/>
+          <w:szCs w:val="32"/>
+          <w:lang w:val="en-US"/>
+        </w:rPr>
+      </w:pPr>
+    </w:p>
+    <w:p>
+      <w:pPr>
+        <w:tabs>
+          <w:tab w:val="left" w:pos="1100"/>
+        </w:tabs>
+        <w:spacing w:after="100"/>
+        <w:rPr>
+          <w:rFonts w:asciiTheme="majorBidi" w:hAnsiTheme="majorBidi" w:cstheme="majorBidi"/>
+          <w:b/>
+          <w:bCs/>
+          <w:sz w:val="32"/>
+          <w:szCs w:val="32"/>
+          <w:lang w:val="en-US"/>
+        </w:rPr>
+      </w:pPr>
+    </w:p>
+    <w:p>
+      <w:pPr>
+        <w:tabs>
+          <w:tab w:val="left" w:pos="1100"/>
+        </w:tabs>
+        <w:spacing w:after="100"/>
+        <w:rPr>
+          <w:rFonts w:asciiTheme="majorBidi" w:hAnsiTheme="majorBidi" w:cstheme="majorBidi"/>
+          <w:b/>
+          <w:bCs/>
+          <w:sz w:val="32"/>
+          <w:szCs w:val="32"/>
+          <w:lang w:val="en-US"/>
+        </w:rPr>
+      </w:pPr>
+      <w:r>
+        <w:rPr>
+          <w:rFonts w:ascii="Times New Roman" w:eastAsia="Times New Roman" w:hAnsi="Times New Roman" w:cs="Times New Roman"/>
+          <w:sz w:val="32"/>
+          <w:szCs w:val="32"/>
+          <w:lang w:val="en-US" w:eastAsia="fr-FR"/>
+        </w:rPr>
+        <w:t>-</w:t>
+      </w:r>
+      <w:r>
+        <w:rPr>
+          <w:rFonts w:ascii="Times New Roman" w:eastAsia="Times New Roman" w:hAnsi="Times New Roman" w:cs="Times New Roman"/>
+          <w:sz w:val="32"/>
+          <w:szCs w:val="32"/>
+          <w:lang w:val="en-US" w:eastAsia="fr-FR"/>
+        </w:rPr>
+        <w:t>This screen allows the administrator to manage all children enrolled in the daycare. The administrator can add new children, update their information, delete records, and search or filter the list. It also provides a quick view of each child’s basic information and payment status.</w:t>
+      </w:r>
+    </w:p>
+    <w:p>
+      <w:pPr>
+        <w:spacing w:after="100"/>
+        <w:rPr>
+          <w:rFonts w:asciiTheme="majorBidi" w:hAnsiTheme="majorBidi" w:cstheme="majorBidi"/>
+          <w:b/>
+          <w:bCs/>
+          <w:sz w:val="32"/>
+          <w:szCs w:val="32"/>
+          <w:lang w:val="en-US"/>
+        </w:rPr>
+      </w:pPr>
+    </w:p>
+    <w:p>
+      <w:pPr>
+        <w:spacing w:after="100"/>
+        <w:rPr>
+          <w:rFonts w:asciiTheme="majorBidi" w:hAnsiTheme="majorBidi" w:cstheme="majorBidi"/>
+          <w:b/>
+          <w:bCs/>
+          <w:sz w:val="32"/>
+          <w:szCs w:val="32"/>
+          <w:lang w:val="en-US"/>
+        </w:rPr>
+      </w:pPr>
+    </w:p>
+    <w:p>
+      <w:pPr>
+        <w:spacing w:after="100"/>
+        <w:rPr>
+          <w:rFonts w:asciiTheme="majorBidi" w:hAnsiTheme="majorBidi" w:cstheme="majorBidi"/>
+          <w:b/>
+          <w:bCs/>
+          <w:sz w:val="32"/>
+          <w:szCs w:val="32"/>
+          <w:lang w:val="en-US"/>
+        </w:rPr>
+      </w:pPr>
+    </w:p>
+    <w:p>
+      <w:pPr>
+        <w:spacing w:after="100"/>
+        <w:rPr>
+          <w:rFonts w:asciiTheme="majorBidi" w:hAnsiTheme="majorBidi" w:cstheme="majorBidi"/>
+          <w:b/>
+          <w:bCs/>
+          <w:sz w:val="32"/>
+          <w:szCs w:val="32"/>
+          <w:lang w:val="en-US"/>
+        </w:rPr>
+      </w:pPr>
+    </w:p>
+    <w:p>
+      <w:pPr>
+        <w:spacing w:after="100"/>
+        <w:rPr>
+          <w:rFonts w:asciiTheme="majorBidi" w:hAnsiTheme="majorBidi" w:cstheme="majorBidi"/>
+          <w:b/>
+          <w:bCs/>
+          <w:sz w:val="32"/>
+          <w:szCs w:val="32"/>
+          <w:lang w:val="en-US"/>
+        </w:rPr>
+      </w:pPr>
+    </w:p>
+    <w:p>
+      <w:pPr>
+        <w:spacing w:after="100"/>
+        <w:rPr>
+          <w:rFonts w:asciiTheme="majorBidi" w:hAnsiTheme="majorBidi" w:cstheme="majorBidi"/>
+          <w:b/>
+          <w:bCs/>
+          <w:sz w:val="32"/>
+          <w:szCs w:val="32"/>
+          <w:lang w:val="en-US"/>
+        </w:rPr>
+      </w:pPr>
+    </w:p>
+    <w:p>
+      <w:pPr>
+        <w:spacing w:after="100"/>
+        <w:rPr>
+          <w:rFonts w:asciiTheme="majorBidi" w:hAnsiTheme="majorBidi" w:cstheme="majorBidi"/>
+          <w:b/>
+          <w:bCs/>
+          <w:sz w:val="32"/>
+          <w:szCs w:val="32"/>
+          <w:lang w:val="en-US"/>
+        </w:rPr>
+      </w:pPr>
+    </w:p>
+    <w:p>
+      <w:pPr>
+        <w:spacing w:after="100"/>
+        <w:rPr>
+          <w:rFonts w:asciiTheme="majorBidi" w:hAnsiTheme="majorBidi" w:cstheme="majorBidi"/>
+          <w:b/>
+          <w:bCs/>
+          <w:sz w:val="32"/>
+          <w:szCs w:val="32"/>
+          <w:lang w:val="en-US"/>
+        </w:rPr>
+      </w:pPr>
+    </w:p>
+    <w:p>
+      <w:pPr>
+        <w:spacing w:after="100"/>
+        <w:rPr>
+          <w:rFonts w:asciiTheme="majorBidi" w:hAnsiTheme="majorBidi" w:cstheme="majorBidi"/>
+          <w:b/>
+          <w:bCs/>
+          <w:sz w:val="32"/>
+          <w:szCs w:val="32"/>
+          <w:lang w:val="en-US"/>
+        </w:rPr>
+      </w:pPr>
+    </w:p>
+    <w:p>
+      <w:pPr>
+        <w:spacing w:after="100"/>
+        <w:rPr>
+          <w:rFonts w:ascii="Goudy Old Style" w:hAnsi="Goudy Old Style"/>
+          <w:b/>
+          <w:bCs/>
+          <w:sz w:val="72"/>
+          <w:szCs w:val="72"/>
+          <w:lang w:val="en-US"/>
+        </w:rPr>
+      </w:pPr>
+      <w:r>
+        <w:rPr>
+          <w:rFonts w:ascii="Goudy Old Style" w:hAnsi="Goudy Old Style"/>
+          <w:b/>
+          <w:bCs/>
+          <w:sz w:val="72"/>
+          <w:szCs w:val="72"/>
+        </w:rPr>
+        <w:lastRenderedPageBreak/>
+        <w:t>Child Profile</w:t>
+      </w:r>
+    </w:p>
+    <w:p>
+      <w:pPr>
+        <w:spacing w:after="100"/>
+        <w:rPr>
+          <w:rFonts w:asciiTheme="majorBidi" w:hAnsiTheme="majorBidi" w:cstheme="majorBidi"/>
+          <w:b/>
+          <w:bCs/>
+          <w:sz w:val="16"/>
+          <w:szCs w:val="16"/>
+          <w:lang w:val="en-US"/>
+        </w:rPr>
+      </w:pPr>
+    </w:p>
+    <w:p>
+      <w:pPr>
+        <w:spacing w:after="100"/>
+        <w:rPr>
+          <w:rFonts w:asciiTheme="majorBidi" w:hAnsiTheme="majorBidi" w:cstheme="majorBidi"/>
+          <w:b/>
+          <w:bCs/>
+          <w:sz w:val="32"/>
+          <w:szCs w:val="32"/>
+          <w:lang w:val="en-US"/>
+        </w:rPr>
+      </w:pPr>
+      <w:r>
+        <w:rPr>
+          <w:rFonts w:asciiTheme="majorBidi" w:hAnsiTheme="majorBidi" w:cstheme="majorBidi"/>
+          <w:b/>
+          <w:bCs/>
+          <w:sz w:val="32"/>
+          <w:szCs w:val="32"/>
+          <w:lang w:val="en-US"/>
+        </w:rPr>
+        <w:drawing>
+          <wp:inline distT="0" distB="0" distL="0" distR="0" wp14:anchorId="3363761B" wp14:editId="61D64737">
+            <wp:extent cx="5865495" cy="4347713"/>
+            <wp:effectExtent l="0" t="0" r="1905" b="0"/>
+            <wp:docPr id="21" name="Image 21"/>
+            <wp:cNvGraphicFramePr>
+              <a:graphicFrameLocks xmlns:a="http://schemas.openxmlformats.org/drawingml/2006/main" noChangeAspect="1"/>
+            </wp:cNvGraphicFramePr>
+            <a:graphic xmlns:a="http://schemas.openxmlformats.org/drawingml/2006/main">
+              <a:graphicData uri="http://schemas.openxmlformats.org/drawingml/2006/picture">
+                <pic:pic xmlns:pic="http://schemas.openxmlformats.org/drawingml/2006/picture">
+                  <pic:nvPicPr>
+                    <pic:cNvPr id="1" name=""/>
+                    <pic:cNvPicPr/>
+                  </pic:nvPicPr>
+                  <pic:blipFill>
+                    <a:blip r:embed="rId24"/>
+                    <a:stretch>
+                      <a:fillRect/>
+                    </a:stretch>
+                  </pic:blipFill>
+                  <pic:spPr>
+                    <a:xfrm>
+                      <a:off x="0" y="0"/>
+                      <a:ext cx="5879046" cy="4357757"/>
+                    </a:xfrm>
+                    <a:prstGeom prst="rect">
+                      <a:avLst/>
+                    </a:prstGeom>
+                  </pic:spPr>
+                </pic:pic>
+              </a:graphicData>
+            </a:graphic>
+          </wp:inline>
+        </w:drawing>
+      </w:r>
+    </w:p>
+    <w:p>
+      <w:pPr>
+        <w:spacing w:after="100"/>
+        <w:rPr>
+          <w:rFonts w:asciiTheme="majorBidi" w:hAnsiTheme="majorBidi" w:cstheme="majorBidi"/>
+          <w:b/>
+          <w:bCs/>
+          <w:sz w:val="32"/>
+          <w:szCs w:val="32"/>
+          <w:lang w:val="en-US"/>
+        </w:rPr>
+      </w:pPr>
+      <w:r>
+        <w:rPr>
+          <w:rFonts w:asciiTheme="majorBidi" w:hAnsiTheme="majorBidi" w:cstheme="majorBidi"/>
+          <w:b/>
+          <w:bCs/>
+          <w:sz w:val="32"/>
+          <w:szCs w:val="32"/>
+          <w:lang w:val="en-US"/>
+        </w:rPr>
+        <w:t xml:space="preserve">                </w:t>
+      </w:r>
+      <w:r>
+        <w:rPr>
+          <w:rFonts w:asciiTheme="majorBidi" w:hAnsiTheme="majorBidi" w:cstheme="majorBidi"/>
+          <w:b/>
+          <w:bCs/>
+          <w:sz w:val="32"/>
+          <w:szCs w:val="32"/>
+          <w:lang w:val="en-US"/>
+        </w:rPr>
+        <w:t>Figure 2.2: Authentication Sequence Diagram</w:t>
+      </w:r>
+    </w:p>
+    <w:p>
+      <w:pPr>
+        <w:spacing w:after="100"/>
+        <w:rPr>
+          <w:rFonts w:asciiTheme="majorBidi" w:hAnsiTheme="majorBidi" w:cstheme="majorBidi"/>
+          <w:b/>
+          <w:bCs/>
+          <w:sz w:val="32"/>
+          <w:szCs w:val="32"/>
+          <w:lang w:val="en-US"/>
+        </w:rPr>
+      </w:pPr>
+    </w:p>
+    <w:p>
+      <w:pPr>
+        <w:tabs>
+          <w:tab w:val="left" w:pos="1100"/>
+        </w:tabs>
+        <w:spacing w:after="100"/>
+        <w:rPr>
+          <w:rFonts w:ascii="Times New Roman" w:eastAsia="Times New Roman" w:hAnsi="Times New Roman" w:cs="Times New Roman"/>
+          <w:sz w:val="32"/>
+          <w:szCs w:val="32"/>
+          <w:lang w:val="en-US" w:eastAsia="fr-FR"/>
+        </w:rPr>
+      </w:pPr>
+      <w:r>
+        <w:rPr>
+          <w:rFonts w:ascii="Times New Roman" w:eastAsia="Times New Roman" w:hAnsi="Times New Roman" w:cs="Times New Roman"/>
+          <w:sz w:val="32"/>
+          <w:szCs w:val="32"/>
+          <w:lang w:val="en-US" w:eastAsia="fr-FR"/>
+        </w:rPr>
+        <w:t>-</w:t>
+      </w:r>
+      <w:r>
+        <w:rPr>
+          <w:rFonts w:ascii="Times New Roman" w:eastAsia="Times New Roman" w:hAnsi="Times New Roman" w:cs="Times New Roman"/>
+          <w:sz w:val="32"/>
+          <w:szCs w:val="32"/>
+          <w:lang w:val="en-US" w:eastAsia="fr-FR"/>
+        </w:rPr>
+        <w:t>The child profile screen provides detailed information about a selected child. The administrator can view and update personal data, health information, parents’ details, and authorized pickup persons. It also allows access to attendance history and payment records, as well as printing the child’s file and ID card.</w:t>
+      </w:r>
+    </w:p>
+    <w:p>
+      <w:pPr>
+        <w:tabs>
+          <w:tab w:val="left" w:pos="1100"/>
+        </w:tabs>
+        <w:spacing w:after="100"/>
+        <w:rPr>
+          <w:rFonts w:ascii="Times New Roman" w:eastAsia="Times New Roman" w:hAnsi="Times New Roman" w:cs="Times New Roman"/>
+          <w:sz w:val="32"/>
+          <w:szCs w:val="32"/>
+          <w:lang w:val="en-US" w:eastAsia="fr-FR"/>
+        </w:rPr>
+      </w:pPr>
+    </w:p>
+    <w:p>
+      <w:pPr>
+        <w:tabs>
+          <w:tab w:val="left" w:pos="1100"/>
+        </w:tabs>
+        <w:spacing w:after="100"/>
+        <w:rPr>
+          <w:rFonts w:ascii="Times New Roman" w:eastAsia="Times New Roman" w:hAnsi="Times New Roman" w:cs="Times New Roman"/>
+          <w:sz w:val="32"/>
+          <w:szCs w:val="32"/>
+          <w:lang w:val="en-US" w:eastAsia="fr-FR"/>
+        </w:rPr>
+      </w:pPr>
+    </w:p>
+    <w:p>
+      <w:pPr>
+        <w:tabs>
+          <w:tab w:val="left" w:pos="1100"/>
+        </w:tabs>
+        <w:spacing w:after="100"/>
+        <w:rPr>
+          <w:rFonts w:ascii="Times New Roman" w:eastAsia="Times New Roman" w:hAnsi="Times New Roman" w:cs="Times New Roman"/>
+          <w:sz w:val="32"/>
+          <w:szCs w:val="32"/>
+          <w:lang w:val="en-US" w:eastAsia="fr-FR"/>
+        </w:rPr>
+      </w:pPr>
+    </w:p>
+    <w:p>
+      <w:pPr>
+        <w:tabs>
+          <w:tab w:val="left" w:pos="1100"/>
+        </w:tabs>
+        <w:spacing w:after="100"/>
+        <w:rPr>
+          <w:rFonts w:ascii="Times New Roman" w:eastAsia="Times New Roman" w:hAnsi="Times New Roman" w:cs="Times New Roman"/>
+          <w:sz w:val="32"/>
+          <w:szCs w:val="32"/>
+          <w:lang w:val="en-US" w:eastAsia="fr-FR"/>
+        </w:rPr>
+      </w:pPr>
+    </w:p>
+    <w:p>
+      <w:pPr>
+        <w:tabs>
+          <w:tab w:val="left" w:pos="1100"/>
+        </w:tabs>
+        <w:spacing w:after="100"/>
+        <w:rPr>
+          <w:rFonts w:ascii="Times New Roman" w:eastAsia="Times New Roman" w:hAnsi="Times New Roman" w:cs="Times New Roman"/>
+          <w:sz w:val="32"/>
+          <w:szCs w:val="32"/>
+          <w:lang w:val="en-US" w:eastAsia="fr-FR"/>
+        </w:rPr>
+      </w:pPr>
+    </w:p>
+    <w:p>
+      <w:pPr>
+        <w:tabs>
+          <w:tab w:val="left" w:pos="1100"/>
+        </w:tabs>
+        <w:spacing w:after="100"/>
+        <w:rPr>
+          <w:rFonts w:ascii="Times New Roman" w:eastAsia="Times New Roman" w:hAnsi="Times New Roman" w:cs="Times New Roman"/>
+          <w:sz w:val="32"/>
+          <w:szCs w:val="32"/>
+          <w:lang w:val="en-US" w:eastAsia="fr-FR"/>
+        </w:rPr>
+      </w:pPr>
+    </w:p>
+    <w:p>
+      <w:pPr>
+        <w:tabs>
+          <w:tab w:val="left" w:pos="1100"/>
+        </w:tabs>
+        <w:spacing w:after="100"/>
+        <w:rPr>
+          <w:rFonts w:ascii="Times New Roman" w:eastAsia="Times New Roman" w:hAnsi="Times New Roman" w:cs="Times New Roman"/>
+          <w:sz w:val="32"/>
+          <w:szCs w:val="32"/>
+          <w:lang w:val="en-US" w:eastAsia="fr-FR"/>
+        </w:rPr>
+      </w:pPr>
+    </w:p>
+    <w:p>
+      <w:pPr>
+        <w:spacing w:after="100"/>
+        <w:rPr>
+          <w:rFonts w:ascii="Goudy Old Style" w:hAnsi="Goudy Old Style"/>
+          <w:b/>
+          <w:bCs/>
+          <w:sz w:val="72"/>
+          <w:szCs w:val="72"/>
+          <w:lang w:val="en-US"/>
+        </w:rPr>
+      </w:pPr>
+      <w:r>
+        <w:rPr>
+          <w:rFonts w:ascii="Goudy Old Style" w:hAnsi="Goudy Old Style"/>
+          <w:b/>
+          <w:bCs/>
+          <w:sz w:val="72"/>
+          <w:szCs w:val="72"/>
+        </w:rPr>
+        <w:lastRenderedPageBreak/>
+        <w:t>Attendance History</w:t>
+      </w:r>
+    </w:p>
+    <w:p>
+      <w:pPr>
+        <w:tabs>
+          <w:tab w:val="left" w:pos="1100"/>
+        </w:tabs>
+        <w:spacing w:after="100"/>
+        <w:rPr>
+          <w:rFonts w:ascii="Times New Roman" w:eastAsia="Times New Roman" w:hAnsi="Times New Roman" w:cs="Times New Roman"/>
+          <w:sz w:val="32"/>
+          <w:szCs w:val="32"/>
+          <w:lang w:val="en-US" w:eastAsia="fr-FR"/>
+        </w:rPr>
+      </w:pPr>
+      <w:r>
+        <w:rPr>
+          <w:rFonts w:ascii="Times New Roman" w:eastAsia="Times New Roman" w:hAnsi="Times New Roman" w:cs="Times New Roman"/>
+          <w:sz w:val="32"/>
+          <w:szCs w:val="32"/>
+          <w:lang w:val="en-US" w:eastAsia="fr-FR"/>
+        </w:rPr>
+        <w:drawing>
+          <wp:inline distT="0" distB="0" distL="0" distR="0" wp14:anchorId="73E4E7F2" wp14:editId="23DBC186">
+            <wp:extent cx="5106670" cy="2950234"/>
+            <wp:effectExtent l="0" t="0" r="0" b="2540"/>
+            <wp:docPr id="26" name="Image 26"/>
+            <wp:cNvGraphicFramePr>
+              <a:graphicFrameLocks xmlns:a="http://schemas.openxmlformats.org/drawingml/2006/main" noChangeAspect="1"/>
+            </wp:cNvGraphicFramePr>
+            <a:graphic xmlns:a="http://schemas.openxmlformats.org/drawingml/2006/main">
+              <a:graphicData uri="http://schemas.openxmlformats.org/drawingml/2006/picture">
+                <pic:pic xmlns:pic="http://schemas.openxmlformats.org/drawingml/2006/picture">
+                  <pic:nvPicPr>
+                    <pic:cNvPr id="1" name=""/>
+                    <pic:cNvPicPr/>
+                  </pic:nvPicPr>
+                  <pic:blipFill>
+                    <a:blip r:embed="rId25"/>
+                    <a:stretch>
+                      <a:fillRect/>
+                    </a:stretch>
+                  </pic:blipFill>
+                  <pic:spPr>
+                    <a:xfrm>
+                      <a:off x="0" y="0"/>
+                      <a:ext cx="5145855" cy="2972872"/>
+                    </a:xfrm>
+                    <a:prstGeom prst="rect">
+                      <a:avLst/>
+                    </a:prstGeom>
+                  </pic:spPr>
+                </pic:pic>
+              </a:graphicData>
+            </a:graphic>
+          </wp:inline>
+        </w:drawing>
+      </w:r>
+    </w:p>
+    <w:p>
+      <w:pPr>
+        <w:spacing w:after="100"/>
+        <w:rPr>
+          <w:rFonts w:asciiTheme="majorBidi" w:hAnsiTheme="majorBidi" w:cstheme="majorBidi"/>
+          <w:b/>
+          <w:bCs/>
+          <w:sz w:val="32"/>
+          <w:szCs w:val="32"/>
+          <w:lang w:val="en-US"/>
+        </w:rPr>
+      </w:pPr>
+      <w:r>
+        <w:rPr>
+          <w:rFonts w:asciiTheme="majorBidi" w:hAnsiTheme="majorBidi" w:cstheme="majorBidi"/>
+          <w:b/>
+          <w:bCs/>
+          <w:sz w:val="32"/>
+          <w:szCs w:val="32"/>
+          <w:lang w:val="en-US"/>
+        </w:rPr>
+        <w:t xml:space="preserve">                </w:t>
+      </w:r>
+      <w:r>
+        <w:rPr>
+          <w:rFonts w:asciiTheme="majorBidi" w:hAnsiTheme="majorBidi" w:cstheme="majorBidi"/>
+          <w:b/>
+          <w:bCs/>
+          <w:sz w:val="32"/>
+          <w:szCs w:val="32"/>
+          <w:lang w:val="en-US"/>
+        </w:rPr>
+        <w:t>Figure 2.2: Authent</w:t>
+      </w:r>
+      <w:r>
+        <w:rPr>
+          <w:rFonts w:asciiTheme="majorBidi" w:hAnsiTheme="majorBidi" w:cstheme="majorBidi"/>
+          <w:b/>
+          <w:bCs/>
+          <w:sz w:val="32"/>
+          <w:szCs w:val="32"/>
+          <w:lang w:val="en-US"/>
+        </w:rPr>
+        <w:t>ication Sequence Diagram</w:t>
+      </w:r>
+    </w:p>
+    <w:p>
+      <w:pPr>
+        <w:tabs>
+          <w:tab w:val="left" w:pos="1100"/>
+        </w:tabs>
+        <w:spacing w:after="100"/>
+        <w:rPr>
+          <w:rFonts w:ascii="Times New Roman" w:eastAsia="Times New Roman" w:hAnsi="Times New Roman" w:cs="Times New Roman"/>
+          <w:sz w:val="32"/>
+          <w:szCs w:val="32"/>
+          <w:lang w:val="en-US" w:eastAsia="fr-FR"/>
+        </w:rPr>
+      </w:pPr>
+    </w:p>
+    <w:p>
+      <w:pPr>
+        <w:tabs>
+          <w:tab w:val="left" w:pos="1100"/>
+        </w:tabs>
+        <w:spacing w:after="100"/>
+        <w:rPr>
+          <w:rFonts w:ascii="Times New Roman" w:eastAsia="Times New Roman" w:hAnsi="Times New Roman" w:cs="Times New Roman"/>
+          <w:sz w:val="32"/>
+          <w:szCs w:val="32"/>
+          <w:lang w:val="en-US" w:eastAsia="fr-FR"/>
+        </w:rPr>
+      </w:pPr>
+    </w:p>
+    <w:p>
+      <w:pPr>
+        <w:spacing w:after="100"/>
+        <w:rPr>
+          <w:rFonts w:ascii="Goudy Old Style" w:hAnsi="Goudy Old Style"/>
+          <w:b/>
+          <w:bCs/>
+          <w:sz w:val="72"/>
+          <w:szCs w:val="72"/>
+          <w:lang w:val="en-US"/>
+        </w:rPr>
+      </w:pPr>
+      <w:r>
+        <w:rPr>
+          <w:rFonts w:ascii="Goudy Old Style" w:hAnsi="Goudy Old Style"/>
+          <w:b/>
+          <w:bCs/>
+          <w:sz w:val="72"/>
+          <w:szCs w:val="72"/>
+          <w:lang w:val="en-US"/>
+        </w:rPr>
+        <w:t>Payments</w:t>
+      </w:r>
+      <w:r>
+        <w:rPr>
+          <w:rFonts w:ascii="Goudy Old Style" w:hAnsi="Goudy Old Style"/>
+          <w:b/>
+          <w:bCs/>
+          <w:sz w:val="72"/>
+          <w:szCs w:val="72"/>
+          <w:lang w:val="en-US"/>
+        </w:rPr>
+        <w:t xml:space="preserve"> History</w:t>
+      </w:r>
+    </w:p>
+    <w:p>
+      <w:pPr>
+        <w:tabs>
+          <w:tab w:val="left" w:pos="1100"/>
+        </w:tabs>
+        <w:spacing w:after="100"/>
+        <w:rPr>
+          <w:rFonts w:ascii="Times New Roman" w:eastAsia="Times New Roman" w:hAnsi="Times New Roman" w:cs="Times New Roman"/>
+          <w:sz w:val="32"/>
+          <w:szCs w:val="32"/>
+          <w:lang w:val="en-US" w:eastAsia="fr-FR"/>
+        </w:rPr>
+      </w:pPr>
+      <w:r>
+        <w:rPr>
+          <w:rFonts w:ascii="Times New Roman" w:eastAsia="Times New Roman" w:hAnsi="Times New Roman" w:cs="Times New Roman"/>
+          <w:sz w:val="32"/>
+          <w:szCs w:val="32"/>
+          <w:lang w:val="en-US" w:eastAsia="fr-FR"/>
+        </w:rPr>
+        <w:drawing>
+          <wp:inline distT="0" distB="0" distL="0" distR="0" wp14:anchorId="4FCCA12D" wp14:editId="78501C01">
+            <wp:extent cx="5477510" cy="3347049"/>
+            <wp:effectExtent l="0" t="0" r="0" b="6350"/>
+            <wp:docPr id="27" name="Image 27"/>
+            <wp:cNvGraphicFramePr>
+              <a:graphicFrameLocks xmlns:a="http://schemas.openxmlformats.org/drawingml/2006/main" noChangeAspect="1"/>
+            </wp:cNvGraphicFramePr>
+            <a:graphic xmlns:a="http://schemas.openxmlformats.org/drawingml/2006/main">
+              <a:graphicData uri="http://schemas.openxmlformats.org/drawingml/2006/picture">
+                <pic:pic xmlns:pic="http://schemas.openxmlformats.org/drawingml/2006/picture">
+                  <pic:nvPicPr>
+                    <pic:cNvPr id="1" name=""/>
+                    <pic:cNvPicPr/>
+                  </pic:nvPicPr>
+                  <pic:blipFill>
+                    <a:blip r:embed="rId26"/>
+                    <a:stretch>
+                      <a:fillRect/>
+                    </a:stretch>
+                  </pic:blipFill>
+                  <pic:spPr>
+                    <a:xfrm>
+                      <a:off x="0" y="0"/>
+                      <a:ext cx="5562231" cy="3398818"/>
+                    </a:xfrm>
+                    <a:prstGeom prst="rect">
+                      <a:avLst/>
+                    </a:prstGeom>
+                  </pic:spPr>
+                </pic:pic>
+              </a:graphicData>
+            </a:graphic>
+          </wp:inline>
+        </w:drawing>
+      </w:r>
+    </w:p>
+    <w:p>
+      <w:pPr>
+        <w:spacing w:after="100"/>
+        <w:rPr>
+          <w:rFonts w:asciiTheme="majorBidi" w:hAnsiTheme="majorBidi" w:cstheme="majorBidi"/>
+          <w:b/>
+          <w:bCs/>
+          <w:sz w:val="32"/>
+          <w:szCs w:val="32"/>
+          <w:lang w:val="en-US"/>
+        </w:rPr>
+      </w:pPr>
+      <w:r>
+        <w:rPr>
+          <w:rFonts w:asciiTheme="majorBidi" w:hAnsiTheme="majorBidi" w:cstheme="majorBidi"/>
+          <w:b/>
+          <w:bCs/>
+          <w:sz w:val="32"/>
+          <w:szCs w:val="32"/>
+          <w:lang w:val="en-US"/>
+        </w:rPr>
+        <w:t xml:space="preserve">                </w:t>
+      </w:r>
+      <w:r>
+        <w:rPr>
+          <w:rFonts w:asciiTheme="majorBidi" w:hAnsiTheme="majorBidi" w:cstheme="majorBidi"/>
+          <w:b/>
+          <w:bCs/>
+          <w:sz w:val="32"/>
+          <w:szCs w:val="32"/>
+          <w:lang w:val="en-US"/>
+        </w:rPr>
+        <w:t>Figure 2.2: Authentication Sequence Diagram</w:t>
+      </w:r>
+    </w:p>
+    <w:p>
+      <w:pPr>
+        <w:spacing w:after="100"/>
+        <w:rPr>
+          <w:rFonts w:asciiTheme="majorBidi" w:hAnsiTheme="majorBidi" w:cstheme="majorBidi"/>
+          <w:b/>
+          <w:bCs/>
+          <w:sz w:val="32"/>
+          <w:szCs w:val="32"/>
+          <w:lang w:val="en-US"/>
+        </w:rPr>
+      </w:pPr>
+    </w:p>
+    <w:p>
+      <w:pPr>
+        <w:spacing w:after="100"/>
+        <w:rPr>
+          <w:rFonts w:ascii="Goudy Old Style" w:hAnsi="Goudy Old Style"/>
+          <w:b/>
+          <w:bCs/>
+          <w:sz w:val="72"/>
+          <w:szCs w:val="72"/>
+          <w:lang w:val="en-US"/>
+        </w:rPr>
+      </w:pPr>
+      <w:r>
+        <w:rPr>
+          <w:rFonts w:ascii="Goudy Old Style" w:hAnsi="Goudy Old Style"/>
+          <w:b/>
+          <w:bCs/>
+          <w:sz w:val="72"/>
+          <w:szCs w:val="72"/>
+          <w:lang w:val="en-US"/>
+        </w:rPr>
+        <w:lastRenderedPageBreak/>
+        <w:t>Evaluations</w:t>
+      </w:r>
+    </w:p>
+    <w:p>
+      <w:pPr>
+        <w:tabs>
+          <w:tab w:val="left" w:pos="1100"/>
+        </w:tabs>
+        <w:spacing w:after="100"/>
+        <w:rPr>
+          <w:rFonts w:ascii="Times New Roman" w:eastAsia="Times New Roman" w:hAnsi="Times New Roman" w:cs="Times New Roman"/>
+          <w:sz w:val="32"/>
+          <w:szCs w:val="32"/>
+          <w:lang w:val="en-US" w:eastAsia="fr-FR"/>
+        </w:rPr>
+      </w:pPr>
+      <w:r>
+        <w:rPr>
+          <w:rFonts w:ascii="Times New Roman" w:eastAsia="Times New Roman" w:hAnsi="Times New Roman" w:cs="Times New Roman"/>
+          <w:sz w:val="32"/>
+          <w:szCs w:val="32"/>
+          <w:lang w:val="en-US" w:eastAsia="fr-FR"/>
+        </w:rPr>
+        <w:drawing>
+          <wp:inline distT="0" distB="0" distL="0" distR="0" wp14:anchorId="790092DC" wp14:editId="66562153">
+            <wp:extent cx="5755640" cy="4799965"/>
+            <wp:effectExtent l="0" t="0" r="0" b="635"/>
+            <wp:docPr id="29" name="Image 29"/>
+            <wp:cNvGraphicFramePr>
+              <a:graphicFrameLocks xmlns:a="http://schemas.openxmlformats.org/drawingml/2006/main" noChangeAspect="1"/>
+            </wp:cNvGraphicFramePr>
+            <a:graphic xmlns:a="http://schemas.openxmlformats.org/drawingml/2006/main">
+              <a:graphicData uri="http://schemas.openxmlformats.org/drawingml/2006/picture">
+                <pic:pic xmlns:pic="http://schemas.openxmlformats.org/drawingml/2006/picture">
+                  <pic:nvPicPr>
+                    <pic:cNvPr id="1" name=""/>
+                    <pic:cNvPicPr/>
+                  </pic:nvPicPr>
+                  <pic:blipFill>
+                    <a:blip r:embed="rId27"/>
+                    <a:stretch>
+                      <a:fillRect/>
+                    </a:stretch>
+                  </pic:blipFill>
+                  <pic:spPr>
+                    <a:xfrm>
+                      <a:off x="0" y="0"/>
+                      <a:ext cx="5755640" cy="4799965"/>
+                    </a:xfrm>
+                    <a:prstGeom prst="rect">
+                      <a:avLst/>
+                    </a:prstGeom>
+                  </pic:spPr>
+                </pic:pic>
+              </a:graphicData>
+            </a:graphic>
+          </wp:inline>
+        </w:drawing>
+      </w:r>
+    </w:p>
+    <w:p>
+      <w:pPr>
+        <w:spacing w:after="100"/>
+        <w:rPr>
+          <w:rFonts w:asciiTheme="majorBidi" w:hAnsiTheme="majorBidi" w:cstheme="majorBidi"/>
+          <w:b/>
+          <w:bCs/>
+          <w:sz w:val="32"/>
+          <w:szCs w:val="32"/>
+          <w:lang w:val="en-US"/>
+        </w:rPr>
+      </w:pPr>
+      <w:r>
+        <w:rPr>
+          <w:rFonts w:asciiTheme="majorBidi" w:hAnsiTheme="majorBidi" w:cstheme="majorBidi"/>
+          <w:b/>
+          <w:bCs/>
+          <w:sz w:val="32"/>
+          <w:szCs w:val="32"/>
+          <w:lang w:val="en-US"/>
+        </w:rPr>
+        <w:t xml:space="preserve">                </w:t>
+      </w:r>
+      <w:r>
+        <w:rPr>
+          <w:rFonts w:asciiTheme="majorBidi" w:hAnsiTheme="majorBidi" w:cstheme="majorBidi"/>
+          <w:b/>
+          <w:bCs/>
+          <w:sz w:val="32"/>
+          <w:szCs w:val="32"/>
+          <w:lang w:val="en-US"/>
+        </w:rPr>
+        <w:t>Figure 2.2: Authentication Sequence Diagram</w:t>
+      </w:r>
+    </w:p>
+    <w:p>
+      <w:pPr>
+        <w:tabs>
+          <w:tab w:val="left" w:pos="1100"/>
+        </w:tabs>
+        <w:spacing w:after="100"/>
+        <w:rPr>
+          <w:rFonts w:ascii="Times New Roman" w:eastAsia="Times New Roman" w:hAnsi="Times New Roman" w:cs="Times New Roman"/>
+          <w:sz w:val="32"/>
+          <w:szCs w:val="32"/>
+          <w:lang w:val="en-US" w:eastAsia="fr-FR"/>
+        </w:rPr>
+      </w:pPr>
+    </w:p>
+    <w:p>
+      <w:pPr>
+        <w:tabs>
+          <w:tab w:val="left" w:pos="1100"/>
+        </w:tabs>
+        <w:spacing w:after="100"/>
+        <w:rPr>
+          <w:rFonts w:ascii="Times New Roman" w:eastAsia="Times New Roman" w:hAnsi="Times New Roman" w:cs="Times New Roman"/>
+          <w:sz w:val="32"/>
+          <w:szCs w:val="32"/>
+          <w:lang w:val="en-US" w:eastAsia="fr-FR"/>
+        </w:rPr>
+      </w:pPr>
+    </w:p>
+    <w:p>
+      <w:pPr>
+        <w:tabs>
+          <w:tab w:val="left" w:pos="1100"/>
+        </w:tabs>
+        <w:spacing w:after="100"/>
+        <w:rPr>
+          <w:rFonts w:ascii="Times New Roman" w:eastAsia="Times New Roman" w:hAnsi="Times New Roman" w:cs="Times New Roman"/>
+          <w:sz w:val="32"/>
+          <w:szCs w:val="32"/>
+          <w:lang w:val="en-US" w:eastAsia="fr-FR"/>
+        </w:rPr>
+      </w:pPr>
+    </w:p>
+    <w:p>
+      <w:pPr>
+        <w:tabs>
+          <w:tab w:val="left" w:pos="1100"/>
+        </w:tabs>
+        <w:spacing w:after="100"/>
+        <w:rPr>
+          <w:rFonts w:ascii="Times New Roman" w:eastAsia="Times New Roman" w:hAnsi="Times New Roman" w:cs="Times New Roman"/>
+          <w:sz w:val="32"/>
+          <w:szCs w:val="32"/>
+          <w:lang w:val="en-US" w:eastAsia="fr-FR"/>
+        </w:rPr>
+      </w:pPr>
+    </w:p>
+    <w:p>
+      <w:pPr>
+        <w:tabs>
+          <w:tab w:val="left" w:pos="1100"/>
+        </w:tabs>
+        <w:spacing w:after="100"/>
+        <w:rPr>
+          <w:rFonts w:ascii="Times New Roman" w:eastAsia="Times New Roman" w:hAnsi="Times New Roman" w:cs="Times New Roman"/>
+          <w:sz w:val="32"/>
+          <w:szCs w:val="32"/>
+          <w:lang w:val="en-US" w:eastAsia="fr-FR"/>
+        </w:rPr>
+      </w:pPr>
+    </w:p>
+    <w:p>
+      <w:pPr>
+        <w:tabs>
+          <w:tab w:val="left" w:pos="1100"/>
+        </w:tabs>
+        <w:spacing w:after="100"/>
+        <w:rPr>
+          <w:rFonts w:ascii="Times New Roman" w:eastAsia="Times New Roman" w:hAnsi="Times New Roman" w:cs="Times New Roman"/>
+          <w:sz w:val="32"/>
+          <w:szCs w:val="32"/>
+          <w:lang w:val="en-US" w:eastAsia="fr-FR"/>
+        </w:rPr>
+      </w:pPr>
+    </w:p>
+    <w:p>
+      <w:pPr>
+        <w:tabs>
+          <w:tab w:val="left" w:pos="1100"/>
+        </w:tabs>
+        <w:spacing w:after="100"/>
+        <w:rPr>
+          <w:rFonts w:ascii="Times New Roman" w:eastAsia="Times New Roman" w:hAnsi="Times New Roman" w:cs="Times New Roman"/>
+          <w:sz w:val="32"/>
+          <w:szCs w:val="32"/>
+          <w:lang w:val="en-US" w:eastAsia="fr-FR"/>
+        </w:rPr>
+      </w:pPr>
+    </w:p>
+    <w:p>
+      <w:pPr>
+        <w:tabs>
+          <w:tab w:val="left" w:pos="1100"/>
+        </w:tabs>
+        <w:spacing w:after="100"/>
+        <w:rPr>
+          <w:rFonts w:ascii="Times New Roman" w:eastAsia="Times New Roman" w:hAnsi="Times New Roman" w:cs="Times New Roman"/>
+          <w:sz w:val="32"/>
+          <w:szCs w:val="32"/>
+          <w:lang w:val="en-US" w:eastAsia="fr-FR"/>
+        </w:rPr>
+      </w:pPr>
+    </w:p>
+    <w:p>
+      <w:pPr>
+        <w:tabs>
+          <w:tab w:val="left" w:pos="1100"/>
+        </w:tabs>
+        <w:spacing w:after="100"/>
+        <w:rPr>
+          <w:rFonts w:ascii="Times New Roman" w:eastAsia="Times New Roman" w:hAnsi="Times New Roman" w:cs="Times New Roman"/>
+          <w:sz w:val="32"/>
+          <w:szCs w:val="32"/>
+          <w:lang w:val="en-US" w:eastAsia="fr-FR"/>
+        </w:rPr>
+      </w:pPr>
+    </w:p>
+    <w:p>
+      <w:pPr>
+        <w:tabs>
+          <w:tab w:val="left" w:pos="1100"/>
+        </w:tabs>
+        <w:spacing w:after="100"/>
+        <w:rPr>
+          <w:rFonts w:ascii="Times New Roman" w:eastAsia="Times New Roman" w:hAnsi="Times New Roman" w:cs="Times New Roman"/>
+          <w:sz w:val="32"/>
+          <w:szCs w:val="32"/>
+          <w:lang w:val="en-US" w:eastAsia="fr-FR"/>
+        </w:rPr>
+      </w:pPr>
+    </w:p>
+    <w:p>
+      <w:pPr>
+        <w:spacing w:after="100"/>
+        <w:rPr>
+          <w:rFonts w:ascii="Goudy Old Style" w:hAnsi="Goudy Old Style"/>
+          <w:b/>
+          <w:bCs/>
+          <w:sz w:val="72"/>
+          <w:szCs w:val="72"/>
+          <w:lang w:val="en-US"/>
+        </w:rPr>
+      </w:pPr>
+      <w:r>
+        <w:rPr>
+          <w:rFonts w:ascii="Goudy Old Style" w:hAnsi="Goudy Old Style"/>
+          <w:b/>
+          <w:bCs/>
+          <w:sz w:val="72"/>
+          <w:szCs w:val="72"/>
+        </w:rPr>
+        <w:lastRenderedPageBreak/>
+        <w:t>Attendance Managment</w:t>
+      </w:r>
+    </w:p>
+    <w:p>
+      <w:pPr>
+        <w:tabs>
+          <w:tab w:val="left" w:pos="1100"/>
+        </w:tabs>
+        <w:spacing w:after="100"/>
+        <w:rPr>
+          <w:rFonts w:asciiTheme="majorBidi" w:hAnsiTheme="majorBidi" w:cstheme="majorBidi"/>
+          <w:b/>
+          <w:bCs/>
+          <w:sz w:val="4"/>
+          <w:szCs w:val="4"/>
+          <w:lang w:val="en-US"/>
+        </w:rPr>
+      </w:pPr>
+    </w:p>
+    <w:p>
+      <w:pPr>
+        <w:tabs>
+          <w:tab w:val="left" w:pos="1100"/>
+        </w:tabs>
+        <w:spacing w:after="100"/>
+        <w:rPr>
+          <w:rFonts w:asciiTheme="majorBidi" w:hAnsiTheme="majorBidi" w:cstheme="majorBidi"/>
+          <w:b/>
+          <w:bCs/>
+          <w:sz w:val="32"/>
+          <w:szCs w:val="32"/>
+          <w:lang w:val="en-US"/>
+        </w:rPr>
+      </w:pPr>
+      <w:r>
+        <w:rPr>
+          <w:rFonts w:asciiTheme="majorBidi" w:hAnsiTheme="majorBidi" w:cstheme="majorBidi"/>
+          <w:b/>
+          <w:bCs/>
+          <w:sz w:val="32"/>
+          <w:szCs w:val="32"/>
+          <w:lang w:val="en-US"/>
+        </w:rPr>
+        <w:drawing>
+          <wp:inline distT="0" distB="0" distL="0" distR="0" wp14:anchorId="1C787D95" wp14:editId="61AEAA50">
+            <wp:extent cx="5755640" cy="4208145"/>
+            <wp:effectExtent l="0" t="0" r="0" b="1905"/>
+            <wp:docPr id="22" name="Image 22"/>
+            <wp:cNvGraphicFramePr>
+              <a:graphicFrameLocks xmlns:a="http://schemas.openxmlformats.org/drawingml/2006/main" noChangeAspect="1"/>
+            </wp:cNvGraphicFramePr>
+            <a:graphic xmlns:a="http://schemas.openxmlformats.org/drawingml/2006/main">
+              <a:graphicData uri="http://schemas.openxmlformats.org/drawingml/2006/picture">
+                <pic:pic xmlns:pic="http://schemas.openxmlformats.org/drawingml/2006/picture">
+                  <pic:nvPicPr>
+                    <pic:cNvPr id="1" name=""/>
+                    <pic:cNvPicPr/>
+                  </pic:nvPicPr>
+                  <pic:blipFill>
+                    <a:blip r:embed="rId28"/>
+                    <a:stretch>
+                      <a:fillRect/>
+                    </a:stretch>
+                  </pic:blipFill>
+                  <pic:spPr>
+                    <a:xfrm>
+                      <a:off x="0" y="0"/>
+                      <a:ext cx="5755640" cy="4208145"/>
+                    </a:xfrm>
+                    <a:prstGeom prst="rect">
+                      <a:avLst/>
+                    </a:prstGeom>
+                  </pic:spPr>
+                </pic:pic>
+              </a:graphicData>
+            </a:graphic>
+          </wp:inline>
+        </w:drawing>
+      </w:r>
+    </w:p>
+    <w:p>
+      <w:pPr>
+        <w:spacing w:after="100"/>
+        <w:rPr>
+          <w:rFonts w:asciiTheme="majorBidi" w:hAnsiTheme="majorBidi" w:cstheme="majorBidi"/>
+          <w:b/>
+          <w:bCs/>
+          <w:sz w:val="32"/>
+          <w:szCs w:val="32"/>
+          <w:lang w:val="en-US"/>
+        </w:rPr>
+      </w:pPr>
+      <w:r>
+        <w:rPr>
+          <w:rFonts w:asciiTheme="majorBidi" w:hAnsiTheme="majorBidi" w:cstheme="majorBidi"/>
+          <w:b/>
+          <w:bCs/>
+          <w:sz w:val="32"/>
+          <w:szCs w:val="32"/>
+          <w:lang w:val="en-US"/>
+        </w:rPr>
+        <w:t xml:space="preserve">                </w:t>
+      </w:r>
+      <w:r>
+        <w:rPr>
+          <w:rFonts w:asciiTheme="majorBidi" w:hAnsiTheme="majorBidi" w:cstheme="majorBidi"/>
+          <w:b/>
+          <w:bCs/>
+          <w:sz w:val="32"/>
+          <w:szCs w:val="32"/>
+          <w:lang w:val="en-US"/>
+        </w:rPr>
+        <w:t>Figure 2.2: Authentication Sequence Diagram</w:t>
+      </w:r>
+    </w:p>
+    <w:p>
+      <w:pPr>
+        <w:spacing w:after="100"/>
+        <w:rPr>
+          <w:rFonts w:asciiTheme="majorBidi" w:hAnsiTheme="majorBidi" w:cstheme="majorBidi"/>
+          <w:b/>
+          <w:bCs/>
+          <w:sz w:val="32"/>
+          <w:szCs w:val="32"/>
+          <w:lang w:val="en-US"/>
+        </w:rPr>
+      </w:pPr>
+    </w:p>
+    <w:p>
+      <w:pPr>
+        <w:tabs>
+          <w:tab w:val="left" w:pos="1100"/>
+        </w:tabs>
+        <w:spacing w:after="100"/>
+        <w:rPr>
+          <w:rFonts w:asciiTheme="majorBidi" w:hAnsiTheme="majorBidi" w:cstheme="majorBidi"/>
+          <w:b/>
+          <w:bCs/>
+          <w:sz w:val="32"/>
+          <w:szCs w:val="32"/>
+          <w:lang w:val="en-US"/>
+        </w:rPr>
+      </w:pPr>
+      <w:r>
+        <w:rPr>
+          <w:rFonts w:ascii="Times New Roman" w:eastAsia="Times New Roman" w:hAnsi="Times New Roman" w:cs="Times New Roman"/>
+          <w:sz w:val="32"/>
+          <w:szCs w:val="32"/>
+          <w:lang w:val="en-US" w:eastAsia="fr-FR"/>
+        </w:rPr>
+        <w:t>-</w:t>
+      </w:r>
+      <w:r>
+        <w:rPr>
+          <w:rFonts w:ascii="Times New Roman" w:eastAsia="Times New Roman" w:hAnsi="Times New Roman" w:cs="Times New Roman"/>
+          <w:sz w:val="32"/>
+          <w:szCs w:val="32"/>
+          <w:lang w:val="en-US" w:eastAsia="fr-FR"/>
+        </w:rPr>
+        <w:t>This screen allows the administrator to track and manage children’s attendance. The administrator can mark children as present or absent and view attendance history in a calendar format. It helps in monitoring daily presence and ensuring accurate records.</w:t>
+      </w:r>
+    </w:p>
+    <w:p>
+      <w:pPr>
+        <w:spacing w:after="100"/>
+        <w:rPr>
+          <w:rFonts w:asciiTheme="majorBidi" w:hAnsiTheme="majorBidi" w:cstheme="majorBidi"/>
+          <w:b/>
+          <w:bCs/>
+          <w:sz w:val="32"/>
+          <w:szCs w:val="32"/>
+          <w:lang w:val="en-US"/>
+        </w:rPr>
+      </w:pPr>
+    </w:p>
+    <w:p>
+      <w:pPr>
+        <w:spacing w:after="100"/>
+        <w:rPr>
+          <w:rFonts w:asciiTheme="majorBidi" w:hAnsiTheme="majorBidi" w:cstheme="majorBidi"/>
+          <w:b/>
+          <w:bCs/>
+          <w:sz w:val="32"/>
+          <w:szCs w:val="32"/>
+          <w:lang w:val="en-US"/>
+        </w:rPr>
+      </w:pPr>
+    </w:p>
+    <w:p>
+      <w:pPr>
+        <w:spacing w:after="100"/>
+        <w:rPr>
+          <w:rFonts w:asciiTheme="majorBidi" w:hAnsiTheme="majorBidi" w:cstheme="majorBidi"/>
+          <w:b/>
+          <w:bCs/>
+          <w:sz w:val="32"/>
+          <w:szCs w:val="32"/>
+          <w:lang w:val="en-US"/>
+        </w:rPr>
+      </w:pPr>
+    </w:p>
+    <w:p>
+      <w:pPr>
+        <w:spacing w:after="100"/>
+        <w:rPr>
+          <w:rFonts w:asciiTheme="majorBidi" w:hAnsiTheme="majorBidi" w:cstheme="majorBidi"/>
+          <w:b/>
+          <w:bCs/>
+          <w:sz w:val="32"/>
+          <w:szCs w:val="32"/>
+          <w:lang w:val="en-US"/>
+        </w:rPr>
+      </w:pPr>
+    </w:p>
+    <w:p>
+      <w:pPr>
+        <w:spacing w:after="100"/>
+        <w:rPr>
+          <w:rFonts w:asciiTheme="majorBidi" w:hAnsiTheme="majorBidi" w:cstheme="majorBidi"/>
+          <w:b/>
+          <w:bCs/>
+          <w:sz w:val="32"/>
+          <w:szCs w:val="32"/>
+          <w:lang w:val="en-US"/>
+        </w:rPr>
+      </w:pPr>
+    </w:p>
+    <w:p>
+      <w:pPr>
+        <w:spacing w:after="100"/>
+        <w:rPr>
+          <w:rFonts w:asciiTheme="majorBidi" w:hAnsiTheme="majorBidi" w:cstheme="majorBidi"/>
+          <w:b/>
+          <w:bCs/>
+          <w:sz w:val="32"/>
+          <w:szCs w:val="32"/>
+          <w:lang w:val="en-US"/>
+        </w:rPr>
+      </w:pPr>
+    </w:p>
+    <w:p>
+      <w:pPr>
+        <w:spacing w:after="100"/>
+        <w:rPr>
+          <w:rFonts w:asciiTheme="majorBidi" w:hAnsiTheme="majorBidi" w:cstheme="majorBidi"/>
+          <w:b/>
+          <w:bCs/>
+          <w:sz w:val="32"/>
+          <w:szCs w:val="32"/>
+          <w:lang w:val="en-US"/>
+        </w:rPr>
+      </w:pPr>
+    </w:p>
+    <w:p>
+      <w:pPr>
+        <w:spacing w:after="100"/>
+        <w:rPr>
+          <w:rFonts w:asciiTheme="majorBidi" w:hAnsiTheme="majorBidi" w:cstheme="majorBidi"/>
+          <w:b/>
+          <w:bCs/>
+          <w:sz w:val="32"/>
+          <w:szCs w:val="32"/>
+          <w:lang w:val="en-US"/>
+        </w:rPr>
+      </w:pPr>
+    </w:p>
+    <w:p>
+      <w:pPr>
+        <w:spacing w:after="100"/>
+        <w:rPr>
+          <w:rFonts w:ascii="Goudy Old Style" w:hAnsi="Goudy Old Style"/>
+          <w:b/>
+          <w:bCs/>
+          <w:sz w:val="72"/>
+          <w:szCs w:val="72"/>
+          <w:lang w:val="en-US"/>
+        </w:rPr>
+      </w:pPr>
+      <w:r>
+        <w:rPr>
+          <w:rFonts w:ascii="Goudy Old Style" w:hAnsi="Goudy Old Style"/>
+          <w:b/>
+          <w:bCs/>
+          <w:sz w:val="72"/>
+          <w:szCs w:val="72"/>
+        </w:rPr>
+        <w:lastRenderedPageBreak/>
+        <w:t>Employee</w:t>
+      </w:r>
+      <w:r>
+        <w:rPr>
+          <w:rFonts w:ascii="Goudy Old Style" w:hAnsi="Goudy Old Style"/>
+          <w:b/>
+          <w:bCs/>
+          <w:sz w:val="72"/>
+          <w:szCs w:val="72"/>
+        </w:rPr>
+        <w:t xml:space="preserve"> Managment</w:t>
+      </w:r>
+    </w:p>
+    <w:p>
+      <w:pPr>
+        <w:spacing w:after="100"/>
+        <w:rPr>
+          <w:rFonts w:asciiTheme="majorBidi" w:hAnsiTheme="majorBidi" w:cstheme="majorBidi"/>
+          <w:b/>
+          <w:bCs/>
+          <w:sz w:val="32"/>
+          <w:szCs w:val="32"/>
+          <w:lang w:val="en-US"/>
+        </w:rPr>
+      </w:pPr>
+      <w:r>
+        <w:rPr>
+          <w:rFonts w:asciiTheme="majorBidi" w:hAnsiTheme="majorBidi" w:cstheme="majorBidi"/>
+          <w:b/>
+          <w:bCs/>
+          <w:sz w:val="32"/>
+          <w:szCs w:val="32"/>
+          <w:lang w:val="en-US"/>
+        </w:rPr>
+        <w:drawing>
+          <wp:inline distT="0" distB="0" distL="0" distR="0" wp14:anchorId="0FEC27B9" wp14:editId="79B23FE0">
+            <wp:extent cx="5755640" cy="3528203"/>
+            <wp:effectExtent l="0" t="0" r="0" b="0"/>
+            <wp:docPr id="24" name="Image 24"/>
+            <wp:cNvGraphicFramePr>
+              <a:graphicFrameLocks xmlns:a="http://schemas.openxmlformats.org/drawingml/2006/main" noChangeAspect="1"/>
+            </wp:cNvGraphicFramePr>
+            <a:graphic xmlns:a="http://schemas.openxmlformats.org/drawingml/2006/main">
+              <a:graphicData uri="http://schemas.openxmlformats.org/drawingml/2006/picture">
+                <pic:pic xmlns:pic="http://schemas.openxmlformats.org/drawingml/2006/picture">
+                  <pic:nvPicPr>
+                    <pic:cNvPr id="1" name=""/>
+                    <pic:cNvPicPr/>
+                  </pic:nvPicPr>
+                  <pic:blipFill>
+                    <a:blip r:embed="rId29"/>
+                    <a:stretch>
+                      <a:fillRect/>
+                    </a:stretch>
+                  </pic:blipFill>
+                  <pic:spPr>
+                    <a:xfrm>
+                      <a:off x="0" y="0"/>
+                      <a:ext cx="5768631" cy="3536166"/>
+                    </a:xfrm>
+                    <a:prstGeom prst="rect">
+                      <a:avLst/>
+                    </a:prstGeom>
+                  </pic:spPr>
+                </pic:pic>
+              </a:graphicData>
+            </a:graphic>
+          </wp:inline>
+        </w:drawing>
+      </w:r>
+    </w:p>
+    <w:p>
+      <w:pPr>
+        <w:spacing w:after="100"/>
+        <w:rPr>
+          <w:rFonts w:asciiTheme="majorBidi" w:hAnsiTheme="majorBidi" w:cstheme="majorBidi"/>
+          <w:b/>
+          <w:bCs/>
+          <w:sz w:val="32"/>
+          <w:szCs w:val="32"/>
+          <w:lang w:val="en-US"/>
+        </w:rPr>
+      </w:pPr>
+      <w:r>
+        <w:rPr>
+          <w:rFonts w:asciiTheme="majorBidi" w:hAnsiTheme="majorBidi" w:cstheme="majorBidi"/>
+          <w:b/>
+          <w:bCs/>
+          <w:sz w:val="32"/>
+          <w:szCs w:val="32"/>
+          <w:lang w:val="en-US"/>
+        </w:rPr>
+        <w:t xml:space="preserve">                </w:t>
+      </w:r>
+      <w:r>
+        <w:rPr>
+          <w:rFonts w:asciiTheme="majorBidi" w:hAnsiTheme="majorBidi" w:cstheme="majorBidi"/>
+          <w:b/>
+          <w:bCs/>
+          <w:sz w:val="32"/>
+          <w:szCs w:val="32"/>
+          <w:lang w:val="en-US"/>
+        </w:rPr>
+        <w:t>Figure 2.2: Authentication Sequence Diagram</w:t>
+      </w:r>
+    </w:p>
+    <w:p>
+      <w:pPr>
+        <w:spacing w:after="100"/>
+        <w:rPr>
+          <w:rFonts w:asciiTheme="majorBidi" w:hAnsiTheme="majorBidi" w:cstheme="majorBidi"/>
+          <w:b/>
+          <w:bCs/>
+          <w:sz w:val="32"/>
+          <w:szCs w:val="32"/>
+          <w:lang w:val="en-US"/>
+        </w:rPr>
+      </w:pPr>
+    </w:p>
+    <w:p>
+      <w:pPr>
+        <w:spacing w:after="100"/>
+        <w:rPr>
+          <w:rFonts w:asciiTheme="majorBidi" w:hAnsiTheme="majorBidi" w:cstheme="majorBidi"/>
+          <w:b/>
+          <w:bCs/>
+          <w:sz w:val="32"/>
+          <w:szCs w:val="32"/>
+          <w:lang w:val="en-US"/>
+        </w:rPr>
+      </w:pPr>
+      <w:r>
+        <w:rPr>
+          <w:rFonts w:asciiTheme="majorBidi" w:hAnsiTheme="majorBidi" w:cstheme="majorBidi"/>
+          <w:b/>
+          <w:bCs/>
+          <w:sz w:val="32"/>
+          <w:szCs w:val="32"/>
+          <w:lang w:val="en-US"/>
+        </w:rPr>
+        <w:t>-</w:t>
+      </w:r>
+      <w:r>
+        <w:rPr>
+          <w:rFonts w:ascii="Times New Roman" w:eastAsia="Times New Roman" w:hAnsi="Times New Roman" w:cs="Times New Roman"/>
+          <w:sz w:val="32"/>
+          <w:szCs w:val="32"/>
+          <w:lang w:val="en-US" w:eastAsia="fr-FR"/>
+        </w:rPr>
+        <w:t xml:space="preserve"> The employee management screen enables the administrator to manage staff information. The administrator can add new employees, update their details, delete records, and view their profiles. </w:t>
+      </w:r>
+      <w:r>
+        <w:rPr>
+          <w:rFonts w:ascii="Times New Roman" w:eastAsia="Times New Roman" w:hAnsi="Times New Roman" w:cs="Times New Roman"/>
+          <w:sz w:val="32"/>
+          <w:szCs w:val="32"/>
+          <w:lang w:eastAsia="fr-FR"/>
+        </w:rPr>
+        <w:t>This helps in organizing the daycare staff efficiently</w:t>
+      </w:r>
+    </w:p>
+    <w:p>
+      <w:pPr>
+        <w:spacing w:after="100"/>
+        <w:rPr>
+          <w:rFonts w:asciiTheme="majorBidi" w:hAnsiTheme="majorBidi" w:cstheme="majorBidi"/>
+          <w:b/>
+          <w:bCs/>
+          <w:sz w:val="32"/>
+          <w:szCs w:val="32"/>
+          <w:lang w:val="en-US"/>
+        </w:rPr>
+      </w:pPr>
+    </w:p>
+    <w:p>
+      <w:pPr>
+        <w:spacing w:after="100"/>
+        <w:rPr>
+          <w:rFonts w:asciiTheme="majorBidi" w:hAnsiTheme="majorBidi" w:cstheme="majorBidi"/>
+          <w:b/>
+          <w:bCs/>
+          <w:sz w:val="32"/>
+          <w:szCs w:val="32"/>
+          <w:lang w:val="en-US"/>
+        </w:rPr>
+      </w:pPr>
+    </w:p>
+    <w:p>
+      <w:pPr>
+        <w:spacing w:after="100"/>
+        <w:rPr>
+          <w:rFonts w:asciiTheme="majorBidi" w:hAnsiTheme="majorBidi" w:cstheme="majorBidi"/>
+          <w:b/>
+          <w:bCs/>
+          <w:sz w:val="32"/>
+          <w:szCs w:val="32"/>
+          <w:lang w:val="en-US"/>
+        </w:rPr>
+      </w:pPr>
+    </w:p>
+    <w:p>
+      <w:pPr>
+        <w:spacing w:after="100"/>
+        <w:rPr>
+          <w:rFonts w:asciiTheme="majorBidi" w:hAnsiTheme="majorBidi" w:cstheme="majorBidi"/>
+          <w:b/>
+          <w:bCs/>
+          <w:sz w:val="32"/>
+          <w:szCs w:val="32"/>
+          <w:lang w:val="en-US"/>
+        </w:rPr>
+      </w:pPr>
+    </w:p>
+    <w:p>
+      <w:pPr>
+        <w:spacing w:after="100"/>
+        <w:rPr>
+          <w:rFonts w:asciiTheme="majorBidi" w:hAnsiTheme="majorBidi" w:cstheme="majorBidi"/>
+          <w:b/>
+          <w:bCs/>
+          <w:sz w:val="32"/>
+          <w:szCs w:val="32"/>
+          <w:lang w:val="en-US"/>
+        </w:rPr>
+      </w:pPr>
+    </w:p>
+    <w:p>
+      <w:pPr>
+        <w:spacing w:after="100"/>
+        <w:rPr>
+          <w:rFonts w:asciiTheme="majorBidi" w:hAnsiTheme="majorBidi" w:cstheme="majorBidi"/>
+          <w:b/>
+          <w:bCs/>
+          <w:sz w:val="32"/>
+          <w:szCs w:val="32"/>
+          <w:lang w:val="en-US"/>
+        </w:rPr>
+      </w:pPr>
+    </w:p>
+    <w:p>
+      <w:pPr>
+        <w:spacing w:after="100"/>
+        <w:rPr>
+          <w:rFonts w:asciiTheme="majorBidi" w:hAnsiTheme="majorBidi" w:cstheme="majorBidi"/>
+          <w:b/>
+          <w:bCs/>
+          <w:sz w:val="32"/>
+          <w:szCs w:val="32"/>
+          <w:lang w:val="en-US"/>
+        </w:rPr>
+      </w:pPr>
+    </w:p>
+    <w:p>
+      <w:pPr>
+        <w:spacing w:after="100"/>
+        <w:rPr>
+          <w:rFonts w:asciiTheme="majorBidi" w:hAnsiTheme="majorBidi" w:cstheme="majorBidi"/>
+          <w:b/>
+          <w:bCs/>
+          <w:sz w:val="32"/>
+          <w:szCs w:val="32"/>
+          <w:lang w:val="en-US"/>
+        </w:rPr>
+      </w:pPr>
+    </w:p>
+    <w:p>
+      <w:pPr>
+        <w:spacing w:after="100"/>
+        <w:rPr>
+          <w:rFonts w:asciiTheme="majorBidi" w:hAnsiTheme="majorBidi" w:cstheme="majorBidi"/>
+          <w:b/>
+          <w:bCs/>
+          <w:sz w:val="32"/>
+          <w:szCs w:val="32"/>
+          <w:lang w:val="en-US"/>
+        </w:rPr>
+      </w:pPr>
+    </w:p>
+    <w:p>
+      <w:pPr>
+        <w:spacing w:after="100"/>
+        <w:rPr>
+          <w:rFonts w:asciiTheme="majorBidi" w:hAnsiTheme="majorBidi" w:cstheme="majorBidi"/>
+          <w:b/>
+          <w:bCs/>
+          <w:sz w:val="32"/>
+          <w:szCs w:val="32"/>
+          <w:lang w:val="en-US"/>
+        </w:rPr>
+      </w:pPr>
+    </w:p>
+    <w:p>
+      <w:pPr>
+        <w:spacing w:after="100"/>
+        <w:rPr>
+          <w:rFonts w:asciiTheme="majorBidi" w:hAnsiTheme="majorBidi" w:cstheme="majorBidi"/>
+          <w:b/>
+          <w:bCs/>
+          <w:sz w:val="32"/>
+          <w:szCs w:val="32"/>
+          <w:lang w:val="en-US"/>
+        </w:rPr>
+      </w:pPr>
+    </w:p>
+    <w:p>
+      <w:pPr>
+        <w:spacing w:after="100"/>
+        <w:rPr>
+          <w:rFonts w:ascii="Goudy Old Style" w:hAnsi="Goudy Old Style"/>
+          <w:b/>
+          <w:bCs/>
+          <w:sz w:val="72"/>
+          <w:szCs w:val="72"/>
+        </w:rPr>
+      </w:pPr>
+      <w:r>
+        <w:rPr>
+          <w:rFonts w:ascii="Goudy Old Style" w:hAnsi="Goudy Old Style"/>
+          <w:b/>
+          <w:bCs/>
+          <w:sz w:val="72"/>
+          <w:szCs w:val="72"/>
+        </w:rPr>
+        <w:lastRenderedPageBreak/>
+        <w:t>Activities</w:t>
+      </w:r>
+      <w:r>
+        <w:rPr>
+          <w:rFonts w:ascii="Goudy Old Style" w:hAnsi="Goudy Old Style"/>
+          <w:b/>
+          <w:bCs/>
+          <w:sz w:val="72"/>
+          <w:szCs w:val="72"/>
+        </w:rPr>
+        <w:t xml:space="preserve"> Managment</w:t>
+      </w:r>
+    </w:p>
+    <w:p>
+      <w:pPr>
+        <w:spacing w:after="100"/>
+        <w:rPr>
+          <w:rFonts w:ascii="Goudy Old Style" w:hAnsi="Goudy Old Style"/>
+          <w:b/>
+          <w:bCs/>
+          <w:sz w:val="72"/>
+          <w:szCs w:val="72"/>
+          <w:lang w:val="en-US"/>
+        </w:rPr>
+      </w:pPr>
+      <w:r>
+        <w:rPr>
+          <w:rFonts w:ascii="Goudy Old Style" w:hAnsi="Goudy Old Style"/>
+          <w:b/>
+          <w:bCs/>
+          <w:sz w:val="72"/>
+          <w:szCs w:val="72"/>
+          <w:lang w:val="en-US"/>
+        </w:rPr>
+        <w:drawing>
+          <wp:inline distT="0" distB="0" distL="0" distR="0" wp14:anchorId="402E8247" wp14:editId="26372907">
+            <wp:extent cx="5755640" cy="4323080"/>
+            <wp:effectExtent l="0" t="0" r="0" b="1270"/>
+            <wp:docPr id="25" name="Image 25"/>
+            <wp:cNvGraphicFramePr>
+              <a:graphicFrameLocks xmlns:a="http://schemas.openxmlformats.org/drawingml/2006/main" noChangeAspect="1"/>
+            </wp:cNvGraphicFramePr>
+            <a:graphic xmlns:a="http://schemas.openxmlformats.org/drawingml/2006/main">
+              <a:graphicData uri="http://schemas.openxmlformats.org/drawingml/2006/picture">
+                <pic:pic xmlns:pic="http://schemas.openxmlformats.org/drawingml/2006/picture">
+                  <pic:nvPicPr>
+                    <pic:cNvPr id="1" name=""/>
+                    <pic:cNvPicPr/>
+                  </pic:nvPicPr>
+                  <pic:blipFill>
+                    <a:blip r:embed="rId30"/>
+                    <a:stretch>
+                      <a:fillRect/>
+                    </a:stretch>
+                  </pic:blipFill>
+                  <pic:spPr>
+                    <a:xfrm>
+                      <a:off x="0" y="0"/>
+                      <a:ext cx="5755640" cy="4323080"/>
+                    </a:xfrm>
+                    <a:prstGeom prst="rect">
+                      <a:avLst/>
+                    </a:prstGeom>
+                  </pic:spPr>
+                </pic:pic>
+              </a:graphicData>
+            </a:graphic>
+          </wp:inline>
+        </w:drawing>
+      </w:r>
+    </w:p>
+    <w:p>
+      <w:pPr>
+        <w:spacing w:after="100"/>
+        <w:rPr>
+          <w:rFonts w:asciiTheme="majorBidi" w:hAnsiTheme="majorBidi" w:cstheme="majorBidi"/>
+          <w:b/>
+          <w:bCs/>
+          <w:sz w:val="32"/>
+          <w:szCs w:val="32"/>
+          <w:lang w:val="en-US"/>
+        </w:rPr>
+      </w:pPr>
+      <w:r>
+        <w:rPr>
+          <w:rFonts w:asciiTheme="majorBidi" w:hAnsiTheme="majorBidi" w:cstheme="majorBidi"/>
+          <w:b/>
+          <w:bCs/>
+          <w:sz w:val="32"/>
+          <w:szCs w:val="32"/>
+          <w:lang w:val="en-US"/>
+        </w:rPr>
+        <w:t xml:space="preserve">                </w:t>
+      </w:r>
+      <w:r>
+        <w:rPr>
+          <w:rFonts w:asciiTheme="majorBidi" w:hAnsiTheme="majorBidi" w:cstheme="majorBidi"/>
+          <w:b/>
+          <w:bCs/>
+          <w:sz w:val="32"/>
+          <w:szCs w:val="32"/>
+          <w:lang w:val="en-US"/>
+        </w:rPr>
+        <w:t>Figure 2.2: Authentication Sequence Diagram</w:t>
+      </w:r>
+    </w:p>
+    <w:p>
+      <w:pPr>
+        <w:spacing w:after="100"/>
+        <w:rPr>
+          <w:rFonts w:asciiTheme="majorBidi" w:hAnsiTheme="majorBidi" w:cstheme="majorBidi"/>
+          <w:b/>
+          <w:bCs/>
+          <w:sz w:val="32"/>
+          <w:szCs w:val="32"/>
+          <w:lang w:val="en-US"/>
+        </w:rPr>
+      </w:pPr>
+    </w:p>
+    <w:p>
+      <w:pPr>
+        <w:spacing w:after="100"/>
+        <w:rPr>
+          <w:rFonts w:asciiTheme="majorBidi" w:hAnsiTheme="majorBidi" w:cstheme="majorBidi"/>
+          <w:sz w:val="32"/>
+          <w:szCs w:val="32"/>
+          <w:lang w:val="en-US"/>
+        </w:rPr>
+      </w:pPr>
+      <w:r>
+        <w:rPr>
+          <w:rFonts w:asciiTheme="majorBidi" w:hAnsiTheme="majorBidi" w:cstheme="majorBidi"/>
+          <w:sz w:val="32"/>
+          <w:szCs w:val="32"/>
+          <w:lang w:val="en-US"/>
+        </w:rPr>
+        <w:t>-</w:t>
+      </w:r>
+      <w:r>
+        <w:rPr>
+          <w:rFonts w:asciiTheme="majorBidi" w:hAnsiTheme="majorBidi" w:cstheme="majorBidi"/>
+          <w:sz w:val="32"/>
+          <w:szCs w:val="32"/>
+          <w:lang w:val="en-US"/>
+        </w:rPr>
+        <w:t>This screen allows the administrator to organize and manage children’s activities and planning. The administrator can create schedules, assign activities, and ensure proper organization of daily programs.</w:t>
+      </w:r>
+    </w:p>
+    <w:p>
+      <w:pPr>
+        <w:spacing w:after="100"/>
+        <w:rPr>
+          <w:rFonts w:asciiTheme="majorBidi" w:hAnsiTheme="majorBidi" w:cstheme="majorBidi"/>
+          <w:sz w:val="32"/>
+          <w:szCs w:val="32"/>
+          <w:lang w:val="en-US"/>
+        </w:rPr>
+      </w:pPr>
+    </w:p>
+    <w:p>
+      <w:pPr>
+        <w:spacing w:after="100"/>
+        <w:rPr>
+          <w:rFonts w:asciiTheme="majorBidi" w:hAnsiTheme="majorBidi" w:cstheme="majorBidi"/>
+          <w:sz w:val="32"/>
+          <w:szCs w:val="32"/>
+          <w:lang w:val="en-US"/>
+        </w:rPr>
+      </w:pPr>
+    </w:p>
+    <w:p>
+      <w:pPr>
+        <w:spacing w:after="100"/>
+        <w:rPr>
+          <w:rFonts w:asciiTheme="majorBidi" w:hAnsiTheme="majorBidi" w:cstheme="majorBidi"/>
+          <w:sz w:val="32"/>
+          <w:szCs w:val="32"/>
+          <w:lang w:val="en-US"/>
+        </w:rPr>
+      </w:pPr>
+    </w:p>
+    <w:p>
+      <w:pPr>
+        <w:spacing w:after="100"/>
+        <w:rPr>
+          <w:rFonts w:asciiTheme="majorBidi" w:hAnsiTheme="majorBidi" w:cstheme="majorBidi"/>
+          <w:sz w:val="32"/>
+          <w:szCs w:val="32"/>
+          <w:lang w:val="en-US"/>
+        </w:rPr>
+      </w:pPr>
+    </w:p>
+    <w:p>
+      <w:pPr>
+        <w:spacing w:after="100"/>
+        <w:rPr>
+          <w:rFonts w:asciiTheme="majorBidi" w:hAnsiTheme="majorBidi" w:cstheme="majorBidi"/>
+          <w:sz w:val="32"/>
+          <w:szCs w:val="32"/>
+          <w:lang w:val="en-US"/>
+        </w:rPr>
+      </w:pPr>
+    </w:p>
+    <w:p>
+      <w:pPr>
+        <w:spacing w:after="100"/>
+        <w:rPr>
+          <w:rFonts w:asciiTheme="majorBidi" w:hAnsiTheme="majorBidi" w:cstheme="majorBidi"/>
+          <w:sz w:val="32"/>
+          <w:szCs w:val="32"/>
+          <w:lang w:val="en-US"/>
+        </w:rPr>
+      </w:pPr>
+    </w:p>
+    <w:p>
+      <w:pPr>
+        <w:spacing w:after="100"/>
+        <w:rPr>
+          <w:rFonts w:asciiTheme="majorBidi" w:hAnsiTheme="majorBidi" w:cstheme="majorBidi"/>
+          <w:sz w:val="32"/>
+          <w:szCs w:val="32"/>
+          <w:lang w:val="en-US"/>
+        </w:rPr>
+      </w:pPr>
+    </w:p>
+    <w:p>
+      <w:pPr>
+        <w:spacing w:after="100"/>
+        <w:rPr>
+          <w:rFonts w:asciiTheme="majorBidi" w:hAnsiTheme="majorBidi" w:cstheme="majorBidi"/>
+          <w:sz w:val="32"/>
+          <w:szCs w:val="32"/>
+          <w:lang w:val="en-US"/>
+        </w:rPr>
+      </w:pPr>
+    </w:p>
+    <w:p>
+      <w:pPr>
+        <w:spacing w:after="100"/>
+        <w:rPr>
+          <w:rFonts w:asciiTheme="majorBidi" w:hAnsiTheme="majorBidi" w:cstheme="majorBidi"/>
+          <w:sz w:val="32"/>
+          <w:szCs w:val="32"/>
+          <w:lang w:val="en-US"/>
+        </w:rPr>
+      </w:pPr>
+    </w:p>
+    <w:p>
+      <w:pPr>
+        <w:spacing w:after="100"/>
+        <w:rPr>
+          <w:rFonts w:ascii="Goudy Old Style" w:hAnsi="Goudy Old Style"/>
+          <w:b/>
+          <w:bCs/>
+          <w:sz w:val="72"/>
+          <w:szCs w:val="72"/>
+        </w:rPr>
+      </w:pPr>
+      <w:r>
+        <w:rPr>
+          <w:rFonts w:ascii="Goudy Old Style" w:hAnsi="Goudy Old Style"/>
+          <w:b/>
+          <w:bCs/>
+          <w:sz w:val="72"/>
+          <w:szCs w:val="72"/>
+        </w:rPr>
+        <w:lastRenderedPageBreak/>
+        <w:t>Expenses Managment</w:t>
+      </w:r>
+    </w:p>
+    <w:p>
+      <w:pPr>
+        <w:spacing w:after="100"/>
+        <w:rPr>
+          <w:rFonts w:asciiTheme="majorBidi" w:hAnsiTheme="majorBidi" w:cstheme="majorBidi"/>
+          <w:sz w:val="32"/>
+          <w:szCs w:val="32"/>
+          <w:lang w:val="en-US"/>
+        </w:rPr>
+      </w:pPr>
+      <w:r>
+        <w:rPr>
+          <w:rFonts w:asciiTheme="majorBidi" w:hAnsiTheme="majorBidi" w:cstheme="majorBidi"/>
+          <w:sz w:val="32"/>
+          <w:szCs w:val="32"/>
+          <w:lang w:val="en-US"/>
+        </w:rPr>
+        <w:drawing>
+          <wp:inline distT="0" distB="0" distL="0" distR="0" wp14:anchorId="7C552E85" wp14:editId="56F51659">
+            <wp:extent cx="5755640" cy="4237990"/>
+            <wp:effectExtent l="0" t="0" r="0" b="0"/>
+            <wp:docPr id="31" name="Image 31"/>
+            <wp:cNvGraphicFramePr>
+              <a:graphicFrameLocks xmlns:a="http://schemas.openxmlformats.org/drawingml/2006/main" noChangeAspect="1"/>
+            </wp:cNvGraphicFramePr>
+            <a:graphic xmlns:a="http://schemas.openxmlformats.org/drawingml/2006/main">
+              <a:graphicData uri="http://schemas.openxmlformats.org/drawingml/2006/picture">
+                <pic:pic xmlns:pic="http://schemas.openxmlformats.org/drawingml/2006/picture">
+                  <pic:nvPicPr>
+                    <pic:cNvPr id="1" name=""/>
+                    <pic:cNvPicPr/>
+                  </pic:nvPicPr>
+                  <pic:blipFill>
+                    <a:blip r:embed="rId31"/>
+                    <a:stretch>
+                      <a:fillRect/>
+                    </a:stretch>
+                  </pic:blipFill>
+                  <pic:spPr>
+                    <a:xfrm>
+                      <a:off x="0" y="0"/>
+                      <a:ext cx="5755640" cy="4237990"/>
+                    </a:xfrm>
+                    <a:prstGeom prst="rect">
+                      <a:avLst/>
+                    </a:prstGeom>
+                  </pic:spPr>
+                </pic:pic>
+              </a:graphicData>
+            </a:graphic>
+          </wp:inline>
+        </w:drawing>
+      </w:r>
+    </w:p>
+    <w:p>
+      <w:pPr>
+        <w:spacing w:after="100"/>
+        <w:rPr>
+          <w:rFonts w:asciiTheme="majorBidi" w:hAnsiTheme="majorBidi" w:cstheme="majorBidi"/>
+          <w:b/>
+          <w:bCs/>
+          <w:sz w:val="32"/>
+          <w:szCs w:val="32"/>
+          <w:lang w:val="en-US"/>
+        </w:rPr>
+      </w:pPr>
+      <w:r>
+        <w:rPr>
+          <w:rFonts w:asciiTheme="majorBidi" w:hAnsiTheme="majorBidi" w:cstheme="majorBidi"/>
+          <w:b/>
+          <w:bCs/>
+          <w:sz w:val="32"/>
+          <w:szCs w:val="32"/>
+          <w:lang w:val="en-US"/>
+        </w:rPr>
+        <w:t xml:space="preserve">                </w:t>
+      </w:r>
+      <w:r>
+        <w:rPr>
+          <w:rFonts w:asciiTheme="majorBidi" w:hAnsiTheme="majorBidi" w:cstheme="majorBidi"/>
+          <w:b/>
+          <w:bCs/>
+          <w:sz w:val="32"/>
+          <w:szCs w:val="32"/>
+          <w:lang w:val="en-US"/>
+        </w:rPr>
+        <w:t>Figure 2.2: Authentication Sequence Diagram</w:t>
+      </w:r>
+    </w:p>
+    <w:p>
+      <w:pPr>
+        <w:spacing w:after="100"/>
+        <w:rPr>
+          <w:rFonts w:asciiTheme="majorBidi" w:hAnsiTheme="majorBidi" w:cstheme="majorBidi"/>
+          <w:sz w:val="32"/>
+          <w:szCs w:val="32"/>
+          <w:lang w:val="en-US"/>
+        </w:rPr>
+      </w:pPr>
+    </w:p>
+    <w:p>
+      <w:pPr>
+        <w:spacing w:after="100"/>
+        <w:rPr>
+          <w:rFonts w:asciiTheme="majorBidi" w:hAnsiTheme="majorBidi" w:cstheme="majorBidi"/>
+          <w:sz w:val="32"/>
+          <w:szCs w:val="32"/>
+          <w:lang w:val="en-US"/>
+        </w:rPr>
+      </w:pPr>
+      <w:r>
+        <w:rPr>
+          <w:rFonts w:asciiTheme="majorBidi" w:hAnsiTheme="majorBidi" w:cstheme="majorBidi"/>
+          <w:sz w:val="32"/>
+          <w:szCs w:val="32"/>
+          <w:lang w:val="en-US"/>
+        </w:rPr>
+        <w:t>-</w:t>
+      </w:r>
+      <w:r>
+        <w:rPr>
+          <w:lang w:val="en-US"/>
+        </w:rPr>
+        <w:t xml:space="preserve"> </w:t>
+      </w:r>
+      <w:r>
+        <w:rPr>
+          <w:rFonts w:asciiTheme="majorBidi" w:hAnsiTheme="majorBidi" w:cstheme="majorBidi"/>
+          <w:sz w:val="32"/>
+          <w:szCs w:val="32"/>
+          <w:lang w:val="en-US"/>
+        </w:rPr>
+        <w:t>This screen allows the administrator to manage the daycare’s expenses. The administrator can add, update, and track different types of expenses, helping to maintain better financial control.</w:t>
+      </w:r>
+    </w:p>
+    <w:p>
+      <w:pPr>
+        <w:spacing w:after="100"/>
+        <w:rPr>
+          <w:rFonts w:asciiTheme="majorBidi" w:hAnsiTheme="majorBidi" w:cstheme="majorBidi"/>
+          <w:sz w:val="32"/>
+          <w:szCs w:val="32"/>
+          <w:lang w:val="en-US"/>
+        </w:rPr>
+      </w:pPr>
+    </w:p>
+    <w:p>
+      <w:pPr>
+        <w:spacing w:after="100"/>
+        <w:rPr>
+          <w:rFonts w:asciiTheme="majorBidi" w:hAnsiTheme="majorBidi" w:cstheme="majorBidi"/>
+          <w:sz w:val="32"/>
+          <w:szCs w:val="32"/>
+          <w:lang w:val="en-US"/>
+        </w:rPr>
+      </w:pPr>
+    </w:p>
+    <w:p>
+      <w:pPr>
+        <w:spacing w:after="100"/>
+        <w:rPr>
+          <w:rFonts w:asciiTheme="majorBidi" w:hAnsiTheme="majorBidi" w:cstheme="majorBidi"/>
+          <w:sz w:val="32"/>
+          <w:szCs w:val="32"/>
+          <w:lang w:val="en-US"/>
+        </w:rPr>
+      </w:pPr>
+    </w:p>
+    <w:p>
+      <w:pPr>
+        <w:spacing w:after="100"/>
+        <w:rPr>
+          <w:rFonts w:asciiTheme="majorBidi" w:hAnsiTheme="majorBidi" w:cstheme="majorBidi"/>
+          <w:sz w:val="32"/>
+          <w:szCs w:val="32"/>
+          <w:lang w:val="en-US"/>
+        </w:rPr>
+      </w:pPr>
+    </w:p>
+    <w:p>
+      <w:pPr>
+        <w:spacing w:after="100"/>
+        <w:rPr>
+          <w:rFonts w:asciiTheme="majorBidi" w:hAnsiTheme="majorBidi" w:cstheme="majorBidi"/>
+          <w:sz w:val="32"/>
+          <w:szCs w:val="32"/>
+          <w:lang w:val="en-US"/>
+        </w:rPr>
+      </w:pPr>
+    </w:p>
+    <w:p>
+      <w:pPr>
+        <w:spacing w:after="100"/>
+        <w:rPr>
+          <w:rFonts w:asciiTheme="majorBidi" w:hAnsiTheme="majorBidi" w:cstheme="majorBidi"/>
+          <w:sz w:val="32"/>
+          <w:szCs w:val="32"/>
+          <w:lang w:val="en-US"/>
+        </w:rPr>
+      </w:pPr>
+    </w:p>
+    <w:p>
+      <w:pPr>
+        <w:spacing w:after="100"/>
+        <w:rPr>
+          <w:rFonts w:asciiTheme="majorBidi" w:hAnsiTheme="majorBidi" w:cstheme="majorBidi"/>
+          <w:sz w:val="32"/>
+          <w:szCs w:val="32"/>
+          <w:lang w:val="en-US"/>
+        </w:rPr>
+      </w:pPr>
+    </w:p>
+    <w:p>
+      <w:pPr>
+        <w:spacing w:after="100"/>
+        <w:rPr>
+          <w:rFonts w:asciiTheme="majorBidi" w:hAnsiTheme="majorBidi" w:cstheme="majorBidi"/>
+          <w:sz w:val="32"/>
+          <w:szCs w:val="32"/>
+          <w:lang w:val="en-US"/>
+        </w:rPr>
+      </w:pPr>
+    </w:p>
+    <w:p>
+      <w:pPr>
+        <w:spacing w:after="100"/>
+        <w:rPr>
+          <w:rFonts w:asciiTheme="majorBidi" w:hAnsiTheme="majorBidi" w:cstheme="majorBidi"/>
+          <w:sz w:val="32"/>
+          <w:szCs w:val="32"/>
+          <w:lang w:val="en-US"/>
+        </w:rPr>
+      </w:pPr>
+    </w:p>
+    <w:p>
+      <w:pPr>
+        <w:spacing w:after="100"/>
+        <w:rPr>
+          <w:rFonts w:ascii="Goudy Old Style" w:hAnsi="Goudy Old Style"/>
+          <w:b/>
+          <w:bCs/>
+          <w:sz w:val="72"/>
+          <w:szCs w:val="72"/>
+          <w:lang w:val="en-US"/>
+        </w:rPr>
+      </w:pPr>
+      <w:r>
+        <w:rPr>
+          <w:rFonts w:ascii="Goudy Old Style" w:hAnsi="Goudy Old Style"/>
+          <w:b/>
+          <w:bCs/>
+          <w:sz w:val="72"/>
+          <w:szCs w:val="72"/>
+          <w:lang w:val="en-US"/>
+        </w:rPr>
+        <w:lastRenderedPageBreak/>
+        <w:t>Payments Mangament</w:t>
+      </w:r>
+    </w:p>
+    <w:p>
+      <w:pPr>
+        <w:spacing w:after="100"/>
+        <w:rPr>
+          <w:rFonts w:asciiTheme="majorBidi" w:hAnsiTheme="majorBidi" w:cstheme="majorBidi"/>
+          <w:sz w:val="32"/>
+          <w:szCs w:val="32"/>
+          <w:lang w:val="en-US"/>
+        </w:rPr>
+      </w:pPr>
+      <w:r>
+        <w:rPr>
+          <w:rFonts w:asciiTheme="majorBidi" w:hAnsiTheme="majorBidi" w:cstheme="majorBidi"/>
+          <w:sz w:val="32"/>
+          <w:szCs w:val="32"/>
+          <w:lang w:val="en-US"/>
+        </w:rPr>
+        <w:drawing>
+          <wp:inline distT="0" distB="0" distL="0" distR="0" wp14:anchorId="26ECBD9D" wp14:editId="64BB9309">
+            <wp:extent cx="5755640" cy="4232275"/>
+            <wp:effectExtent l="0" t="0" r="0" b="0"/>
+            <wp:docPr id="32" name="Image 32"/>
+            <wp:cNvGraphicFramePr>
+              <a:graphicFrameLocks xmlns:a="http://schemas.openxmlformats.org/drawingml/2006/main" noChangeAspect="1"/>
+            </wp:cNvGraphicFramePr>
+            <a:graphic xmlns:a="http://schemas.openxmlformats.org/drawingml/2006/main">
+              <a:graphicData uri="http://schemas.openxmlformats.org/drawingml/2006/picture">
+                <pic:pic xmlns:pic="http://schemas.openxmlformats.org/drawingml/2006/picture">
+                  <pic:nvPicPr>
+                    <pic:cNvPr id="1" name=""/>
+                    <pic:cNvPicPr/>
+                  </pic:nvPicPr>
+                  <pic:blipFill>
+                    <a:blip r:embed="rId32"/>
+                    <a:stretch>
+                      <a:fillRect/>
+                    </a:stretch>
+                  </pic:blipFill>
+                  <pic:spPr>
+                    <a:xfrm>
+                      <a:off x="0" y="0"/>
+                      <a:ext cx="5755640" cy="4232275"/>
+                    </a:xfrm>
+                    <a:prstGeom prst="rect">
+                      <a:avLst/>
+                    </a:prstGeom>
+                  </pic:spPr>
+                </pic:pic>
+              </a:graphicData>
+            </a:graphic>
+          </wp:inline>
+        </w:drawing>
+      </w:r>
+    </w:p>
+    <w:p>
+      <w:pPr>
+        <w:spacing w:after="100"/>
+        <w:rPr>
+          <w:rFonts w:asciiTheme="majorBidi" w:hAnsiTheme="majorBidi" w:cstheme="majorBidi"/>
+          <w:b/>
+          <w:bCs/>
+          <w:sz w:val="32"/>
+          <w:szCs w:val="32"/>
+          <w:lang w:val="en-US"/>
+        </w:rPr>
+      </w:pPr>
+      <w:r>
+        <w:rPr>
+          <w:rFonts w:asciiTheme="majorBidi" w:hAnsiTheme="majorBidi" w:cstheme="majorBidi"/>
+          <w:sz w:val="32"/>
+          <w:szCs w:val="32"/>
+          <w:lang w:val="en-US"/>
+        </w:rPr>
+        <w:t xml:space="preserve">             </w:t>
+      </w:r>
+      <w:r>
+        <w:rPr>
+          <w:rFonts w:asciiTheme="majorBidi" w:hAnsiTheme="majorBidi" w:cstheme="majorBidi"/>
+          <w:b/>
+          <w:bCs/>
+          <w:sz w:val="32"/>
+          <w:szCs w:val="32"/>
+          <w:lang w:val="en-US"/>
+        </w:rPr>
+        <w:t xml:space="preserve"> </w:t>
+      </w:r>
+      <w:r>
+        <w:rPr>
+          <w:rFonts w:asciiTheme="majorBidi" w:hAnsiTheme="majorBidi" w:cstheme="majorBidi"/>
+          <w:b/>
+          <w:bCs/>
+          <w:sz w:val="32"/>
+          <w:szCs w:val="32"/>
+          <w:lang w:val="en-US"/>
+        </w:rPr>
+        <w:t>Figure 2.2: Authentication Sequence Diagram</w:t>
+      </w:r>
+    </w:p>
+    <w:p>
+      <w:pPr>
+        <w:spacing w:after="100"/>
+        <w:rPr>
+          <w:rFonts w:asciiTheme="majorBidi" w:hAnsiTheme="majorBidi" w:cstheme="majorBidi"/>
+          <w:sz w:val="32"/>
+          <w:szCs w:val="32"/>
+          <w:lang w:val="en-US"/>
+        </w:rPr>
+      </w:pPr>
+    </w:p>
+    <w:p>
+      <w:pPr>
+        <w:spacing w:after="100"/>
+        <w:rPr>
+          <w:rFonts w:asciiTheme="majorBidi" w:hAnsiTheme="majorBidi" w:cstheme="majorBidi"/>
+          <w:sz w:val="32"/>
+          <w:szCs w:val="32"/>
+          <w:lang w:val="en-US"/>
+        </w:rPr>
+      </w:pPr>
+      <w:r>
+        <w:rPr>
+          <w:rFonts w:asciiTheme="majorBidi" w:hAnsiTheme="majorBidi" w:cstheme="majorBidi"/>
+          <w:sz w:val="32"/>
+          <w:szCs w:val="32"/>
+          <w:lang w:val="en-US"/>
+        </w:rPr>
+        <w:t>-</w:t>
+      </w:r>
+      <w:r>
+        <w:rPr>
+          <w:lang w:val="en-US"/>
+        </w:rPr>
+        <w:t xml:space="preserve"> </w:t>
+      </w:r>
+      <w:r>
+        <w:rPr>
+          <w:rFonts w:asciiTheme="majorBidi" w:hAnsiTheme="majorBidi" w:cstheme="majorBidi"/>
+          <w:sz w:val="32"/>
+          <w:szCs w:val="32"/>
+          <w:lang w:val="en-US"/>
+        </w:rPr>
+        <w:t>The payment management screen allows the administrator to handle all financial transactions related to children. The administrator can record payments, track payment status (paid, unpaid, partial), and view payment history. It also supports generating payment receipts.</w:t>
+      </w:r>
+    </w:p>
+    <w:p>
+      <w:pPr>
+        <w:spacing w:after="100"/>
+        <w:rPr>
+          <w:rFonts w:asciiTheme="majorBidi" w:hAnsiTheme="majorBidi" w:cstheme="majorBidi"/>
+          <w:sz w:val="32"/>
+          <w:szCs w:val="32"/>
+          <w:lang w:val="en-US"/>
+        </w:rPr>
+      </w:pPr>
+    </w:p>
+    <w:p>
+      <w:pPr>
+        <w:spacing w:after="100"/>
+        <w:rPr>
+          <w:rFonts w:asciiTheme="majorBidi" w:hAnsiTheme="majorBidi" w:cstheme="majorBidi"/>
+          <w:sz w:val="32"/>
+          <w:szCs w:val="32"/>
+          <w:lang w:val="en-US"/>
+        </w:rPr>
+      </w:pPr>
+    </w:p>
+    <w:p>
+      <w:pPr>
+        <w:spacing w:after="100"/>
+        <w:rPr>
+          <w:rFonts w:asciiTheme="majorBidi" w:hAnsiTheme="majorBidi" w:cstheme="majorBidi"/>
+          <w:sz w:val="32"/>
+          <w:szCs w:val="32"/>
+          <w:lang w:val="en-US"/>
+        </w:rPr>
+      </w:pPr>
+    </w:p>
+    <w:p>
+      <w:pPr>
+        <w:spacing w:after="100"/>
+        <w:rPr>
+          <w:rFonts w:asciiTheme="majorBidi" w:hAnsiTheme="majorBidi" w:cstheme="majorBidi"/>
+          <w:sz w:val="32"/>
+          <w:szCs w:val="32"/>
+          <w:lang w:val="en-US"/>
+        </w:rPr>
+      </w:pPr>
+    </w:p>
+    <w:p>
+      <w:pPr>
+        <w:spacing w:after="100"/>
+        <w:rPr>
+          <w:rFonts w:asciiTheme="majorBidi" w:hAnsiTheme="majorBidi" w:cstheme="majorBidi"/>
+          <w:sz w:val="32"/>
+          <w:szCs w:val="32"/>
+          <w:lang w:val="en-US"/>
+        </w:rPr>
+      </w:pPr>
+    </w:p>
+    <w:p>
+      <w:pPr>
+        <w:spacing w:after="100"/>
+        <w:rPr>
+          <w:rFonts w:asciiTheme="majorBidi" w:hAnsiTheme="majorBidi" w:cstheme="majorBidi"/>
+          <w:sz w:val="32"/>
+          <w:szCs w:val="32"/>
+          <w:lang w:val="en-US"/>
+        </w:rPr>
+      </w:pPr>
+    </w:p>
+    <w:p>
+      <w:pPr>
+        <w:spacing w:after="100"/>
+        <w:rPr>
+          <w:rFonts w:asciiTheme="majorBidi" w:hAnsiTheme="majorBidi" w:cstheme="majorBidi"/>
+          <w:sz w:val="32"/>
+          <w:szCs w:val="32"/>
+          <w:lang w:val="en-US"/>
+        </w:rPr>
+      </w:pPr>
+    </w:p>
+    <w:p>
+      <w:pPr>
+        <w:spacing w:after="100"/>
+        <w:rPr>
+          <w:rFonts w:asciiTheme="majorBidi" w:hAnsiTheme="majorBidi" w:cstheme="majorBidi"/>
+          <w:sz w:val="32"/>
+          <w:szCs w:val="32"/>
+          <w:lang w:val="en-US"/>
+        </w:rPr>
+      </w:pPr>
+    </w:p>
+    <w:p>
+      <w:pPr>
+        <w:spacing w:after="100"/>
+        <w:rPr>
+          <w:rFonts w:asciiTheme="majorBidi" w:hAnsiTheme="majorBidi" w:cstheme="majorBidi"/>
+          <w:sz w:val="32"/>
+          <w:szCs w:val="32"/>
+          <w:lang w:val="en-US"/>
+        </w:rPr>
+      </w:pPr>
+    </w:p>
+    <w:p>
+      <w:pPr>
+        <w:spacing w:after="100"/>
+        <w:rPr>
+          <w:rFonts w:ascii="Goudy Old Style" w:hAnsi="Goudy Old Style"/>
+          <w:b/>
+          <w:bCs/>
+          <w:sz w:val="72"/>
+          <w:szCs w:val="72"/>
+        </w:rPr>
+      </w:pPr>
+      <w:r>
+        <w:rPr>
+          <w:rFonts w:ascii="Goudy Old Style" w:hAnsi="Goudy Old Style"/>
+          <w:b/>
+          <w:bCs/>
+          <w:sz w:val="72"/>
+          <w:szCs w:val="72"/>
+        </w:rPr>
+        <w:lastRenderedPageBreak/>
+        <w:t xml:space="preserve">Statistics and Charts </w:t>
+      </w:r>
+    </w:p>
+    <w:p>
+      <w:pPr>
+        <w:spacing w:after="100"/>
+        <w:rPr>
+          <w:rFonts w:asciiTheme="majorBidi" w:hAnsiTheme="majorBidi" w:cstheme="majorBidi"/>
+          <w:sz w:val="32"/>
+          <w:szCs w:val="32"/>
+          <w:lang w:val="en-US"/>
+        </w:rPr>
+      </w:pPr>
+      <w:r>
+        <w:rPr>
+          <w:rFonts w:asciiTheme="majorBidi" w:hAnsiTheme="majorBidi" w:cstheme="majorBidi"/>
+          <w:sz w:val="32"/>
+          <w:szCs w:val="32"/>
+          <w:lang w:val="en-US"/>
+        </w:rPr>
+        <w:drawing>
+          <wp:inline distT="0" distB="0" distL="0" distR="0" wp14:anchorId="6CDB7B79" wp14:editId="31EBE09C">
+            <wp:extent cx="5755640" cy="4224020"/>
+            <wp:effectExtent l="0" t="0" r="0" b="5080"/>
+            <wp:docPr id="30" name="Image 30"/>
+            <wp:cNvGraphicFramePr>
+              <a:graphicFrameLocks xmlns:a="http://schemas.openxmlformats.org/drawingml/2006/main" noChangeAspect="1"/>
+            </wp:cNvGraphicFramePr>
+            <a:graphic xmlns:a="http://schemas.openxmlformats.org/drawingml/2006/main">
+              <a:graphicData uri="http://schemas.openxmlformats.org/drawingml/2006/picture">
+                <pic:pic xmlns:pic="http://schemas.openxmlformats.org/drawingml/2006/picture">
+                  <pic:nvPicPr>
+                    <pic:cNvPr id="1" name=""/>
+                    <pic:cNvPicPr/>
+                  </pic:nvPicPr>
+                  <pic:blipFill>
+                    <a:blip r:embed="rId33"/>
+                    <a:stretch>
+                      <a:fillRect/>
+                    </a:stretch>
+                  </pic:blipFill>
+                  <pic:spPr>
+                    <a:xfrm>
+                      <a:off x="0" y="0"/>
+                      <a:ext cx="5755640" cy="4224020"/>
+                    </a:xfrm>
+                    <a:prstGeom prst="rect">
+                      <a:avLst/>
+                    </a:prstGeom>
+                  </pic:spPr>
+                </pic:pic>
+              </a:graphicData>
+            </a:graphic>
+          </wp:inline>
+        </w:drawing>
+      </w:r>
+    </w:p>
+    <w:p>
+      <w:pPr>
+        <w:spacing w:after="100"/>
+        <w:rPr>
+          <w:rFonts w:asciiTheme="majorBidi" w:hAnsiTheme="majorBidi" w:cstheme="majorBidi"/>
+          <w:b/>
+          <w:bCs/>
+          <w:sz w:val="32"/>
+          <w:szCs w:val="32"/>
+          <w:lang w:val="en-US"/>
+        </w:rPr>
+      </w:pPr>
+      <w:r>
+        <w:rPr>
+          <w:rFonts w:asciiTheme="majorBidi" w:hAnsiTheme="majorBidi" w:cstheme="majorBidi"/>
+          <w:b/>
+          <w:bCs/>
+          <w:sz w:val="32"/>
+          <w:szCs w:val="32"/>
+          <w:lang w:val="en-US"/>
+        </w:rPr>
+        <w:t xml:space="preserve">                Figure 2.2: Authentication Sequence Diagram</w:t>
+      </w:r>
+    </w:p>
+    <w:p>
+      <w:pPr>
+        <w:spacing w:after="100"/>
+        <w:rPr>
+          <w:rFonts w:asciiTheme="majorBidi" w:hAnsiTheme="majorBidi" w:cstheme="majorBidi"/>
+          <w:sz w:val="32"/>
+          <w:szCs w:val="32"/>
+          <w:lang w:val="en-US"/>
+        </w:rPr>
+      </w:pPr>
+    </w:p>
+    <w:p>
+      <w:pPr>
+        <w:spacing w:after="100"/>
+        <w:rPr>
+          <w:rFonts w:asciiTheme="majorBidi" w:hAnsiTheme="majorBidi" w:cstheme="majorBidi"/>
+          <w:sz w:val="32"/>
+          <w:szCs w:val="32"/>
+          <w:lang w:val="en-US"/>
+        </w:rPr>
+      </w:pPr>
+      <w:r>
+        <w:rPr>
+          <w:rFonts w:asciiTheme="majorBidi" w:hAnsiTheme="majorBidi" w:cstheme="majorBidi"/>
+          <w:sz w:val="32"/>
+          <w:szCs w:val="32"/>
+          <w:lang w:val="en-US"/>
+        </w:rPr>
+        <w:t>-</w:t>
+      </w:r>
+      <w:r>
+        <w:rPr>
+          <w:lang w:val="en-US"/>
+        </w:rPr>
+        <w:t xml:space="preserve"> </w:t>
+      </w:r>
+      <w:r>
+        <w:rPr>
+          <w:rFonts w:asciiTheme="majorBidi" w:hAnsiTheme="majorBidi" w:cstheme="majorBidi"/>
+          <w:sz w:val="32"/>
+          <w:szCs w:val="32"/>
+          <w:lang w:val="en-US"/>
+        </w:rPr>
+        <w:t>The statistics screen provides visual reports about the daycare’s activity. The administrator can view charts related to children, attendance, and payments, which helps in analyzing performance and making better decisions.</w:t>
+      </w:r>
+    </w:p>
+    <w:p>
+      <w:pPr>
+        <w:spacing w:after="100"/>
+        <w:rPr>
+          <w:rFonts w:asciiTheme="majorBidi" w:hAnsiTheme="majorBidi" w:cstheme="majorBidi"/>
+          <w:sz w:val="32"/>
+          <w:szCs w:val="32"/>
+          <w:lang w:val="en-US"/>
+        </w:rPr>
+      </w:pPr>
+    </w:p>
+    <w:p>
+      <w:pPr>
+        <w:spacing w:after="100"/>
+        <w:rPr>
+          <w:rFonts w:asciiTheme="majorBidi" w:hAnsiTheme="majorBidi" w:cstheme="majorBidi"/>
+          <w:sz w:val="32"/>
+          <w:szCs w:val="32"/>
+          <w:lang w:val="en-US"/>
+        </w:rPr>
+      </w:pPr>
+    </w:p>
+    <w:p>
+      <w:pPr>
+        <w:spacing w:after="100"/>
+        <w:rPr>
+          <w:rFonts w:asciiTheme="majorBidi" w:hAnsiTheme="majorBidi" w:cstheme="majorBidi"/>
+          <w:sz w:val="32"/>
+          <w:szCs w:val="32"/>
+          <w:lang w:val="en-US"/>
+        </w:rPr>
+      </w:pPr>
+    </w:p>
+    <w:p>
+      <w:pPr>
+        <w:spacing w:after="100"/>
+        <w:rPr>
+          <w:rFonts w:asciiTheme="majorBidi" w:hAnsiTheme="majorBidi" w:cstheme="majorBidi"/>
+          <w:sz w:val="32"/>
+          <w:szCs w:val="32"/>
+          <w:lang w:val="en-US"/>
+        </w:rPr>
+      </w:pPr>
+    </w:p>
+    <w:p>
+      <w:pPr>
+        <w:spacing w:after="100"/>
+        <w:rPr>
+          <w:rFonts w:asciiTheme="majorBidi" w:hAnsiTheme="majorBidi" w:cstheme="majorBidi"/>
+          <w:sz w:val="32"/>
+          <w:szCs w:val="32"/>
+          <w:lang w:val="en-US"/>
+        </w:rPr>
+      </w:pPr>
+    </w:p>
+    <w:p>
+      <w:pPr>
+        <w:spacing w:after="100"/>
+        <w:rPr>
+          <w:rFonts w:asciiTheme="majorBidi" w:hAnsiTheme="majorBidi" w:cstheme="majorBidi"/>
+          <w:sz w:val="32"/>
+          <w:szCs w:val="32"/>
+          <w:lang w:val="en-US"/>
+        </w:rPr>
+      </w:pPr>
+    </w:p>
+    <w:p>
+      <w:pPr>
+        <w:spacing w:after="100"/>
+        <w:rPr>
+          <w:rFonts w:asciiTheme="majorBidi" w:hAnsiTheme="majorBidi" w:cstheme="majorBidi"/>
+          <w:sz w:val="32"/>
+          <w:szCs w:val="32"/>
+          <w:lang w:val="en-US"/>
+        </w:rPr>
+      </w:pPr>
+    </w:p>
+    <w:p>
+      <w:pPr>
+        <w:spacing w:after="100"/>
+        <w:rPr>
+          <w:rFonts w:asciiTheme="majorBidi" w:hAnsiTheme="majorBidi" w:cstheme="majorBidi"/>
+          <w:sz w:val="32"/>
+          <w:szCs w:val="32"/>
+          <w:lang w:val="en-US"/>
+        </w:rPr>
+      </w:pPr>
+    </w:p>
+    <w:p>
+      <w:pPr>
+        <w:spacing w:after="100"/>
+        <w:rPr>
+          <w:rFonts w:asciiTheme="majorBidi" w:hAnsiTheme="majorBidi" w:cstheme="majorBidi"/>
+          <w:sz w:val="32"/>
+          <w:szCs w:val="32"/>
+          <w:lang w:val="en-US"/>
+        </w:rPr>
+      </w:pPr>
+    </w:p>
+    <w:p>
+      <w:pPr>
+        <w:spacing w:after="100"/>
+        <w:rPr>
+          <w:rFonts w:ascii="Goudy Old Style" w:hAnsi="Goudy Old Style"/>
+          <w:b/>
+          <w:bCs/>
+          <w:sz w:val="72"/>
+          <w:szCs w:val="72"/>
+        </w:rPr>
+      </w:pPr>
+      <w:r>
+        <w:rPr>
+          <w:rFonts w:ascii="Goudy Old Style" w:hAnsi="Goudy Old Style"/>
+          <w:b/>
+          <w:bCs/>
+          <w:sz w:val="72"/>
+          <w:szCs w:val="72"/>
+        </w:rPr>
+        <w:lastRenderedPageBreak/>
+        <w:t>Settings</w:t>
+      </w:r>
+    </w:p>
+    <w:p>
+      <w:pPr>
+        <w:spacing w:after="100"/>
+        <w:rPr>
+          <w:rFonts w:asciiTheme="majorBidi" w:hAnsiTheme="majorBidi" w:cstheme="majorBidi"/>
+          <w:sz w:val="32"/>
+          <w:szCs w:val="32"/>
+          <w:lang w:val="en-US"/>
+        </w:rPr>
+      </w:pPr>
+      <w:r>
+        <w:rPr>
+          <w:rFonts w:asciiTheme="majorBidi" w:hAnsiTheme="majorBidi" w:cstheme="majorBidi"/>
+          <w:sz w:val="32"/>
+          <w:szCs w:val="32"/>
+          <w:lang w:val="en-US"/>
+        </w:rPr>
+        <w:drawing>
+          <wp:inline distT="0" distB="0" distL="0" distR="0" wp14:anchorId="00C0425F" wp14:editId="09328D22">
+            <wp:extent cx="5755640" cy="3942080"/>
+            <wp:effectExtent l="0" t="0" r="0" b="1270"/>
+            <wp:docPr id="33" name="Image 33"/>
+            <wp:cNvGraphicFramePr>
+              <a:graphicFrameLocks xmlns:a="http://schemas.openxmlformats.org/drawingml/2006/main" noChangeAspect="1"/>
+            </wp:cNvGraphicFramePr>
+            <a:graphic xmlns:a="http://schemas.openxmlformats.org/drawingml/2006/main">
+              <a:graphicData uri="http://schemas.openxmlformats.org/drawingml/2006/picture">
+                <pic:pic xmlns:pic="http://schemas.openxmlformats.org/drawingml/2006/picture">
+                  <pic:nvPicPr>
+                    <pic:cNvPr id="1" name=""/>
+                    <pic:cNvPicPr/>
+                  </pic:nvPicPr>
+                  <pic:blipFill>
+                    <a:blip r:embed="rId34"/>
+                    <a:stretch>
+                      <a:fillRect/>
+                    </a:stretch>
+                  </pic:blipFill>
+                  <pic:spPr>
+                    <a:xfrm>
+                      <a:off x="0" y="0"/>
+                      <a:ext cx="5755640" cy="3942080"/>
+                    </a:xfrm>
+                    <a:prstGeom prst="rect">
+                      <a:avLst/>
+                    </a:prstGeom>
+                  </pic:spPr>
+                </pic:pic>
+              </a:graphicData>
+            </a:graphic>
+          </wp:inline>
+        </w:drawing>
+      </w:r>
+    </w:p>
+    <w:p>
+      <w:pPr>
+        <w:spacing w:after="100"/>
+        <w:rPr>
+          <w:rFonts w:asciiTheme="majorBidi" w:hAnsiTheme="majorBidi" w:cstheme="majorBidi"/>
+          <w:b/>
+          <w:bCs/>
+          <w:sz w:val="32"/>
+          <w:szCs w:val="32"/>
+          <w:lang w:val="en-US"/>
+        </w:rPr>
+      </w:pPr>
+      <w:r>
+        <w:rPr>
+          <w:rFonts w:asciiTheme="majorBidi" w:hAnsiTheme="majorBidi" w:cstheme="majorBidi"/>
+          <w:b/>
+          <w:bCs/>
+          <w:sz w:val="32"/>
+          <w:szCs w:val="32"/>
+          <w:lang w:val="en-US"/>
+        </w:rPr>
+        <w:t xml:space="preserve">               </w:t>
+      </w:r>
+      <w:r>
+        <w:rPr>
+          <w:rFonts w:asciiTheme="majorBidi" w:hAnsiTheme="majorBidi" w:cstheme="majorBidi"/>
+          <w:b/>
+          <w:bCs/>
+          <w:sz w:val="32"/>
+          <w:szCs w:val="32"/>
+          <w:lang w:val="en-US"/>
+        </w:rPr>
+        <w:t>Figure 2.2: Authentication Sequence Diagram</w:t>
+      </w:r>
+    </w:p>
+    <w:p>
+      <w:pPr>
+        <w:spacing w:after="100"/>
+        <w:rPr>
+          <w:rFonts w:asciiTheme="majorBidi" w:hAnsiTheme="majorBidi" w:cstheme="majorBidi"/>
+          <w:sz w:val="32"/>
+          <w:szCs w:val="32"/>
+          <w:lang w:val="en-US"/>
+        </w:rPr>
+      </w:pPr>
+    </w:p>
+    <w:p>
+      <w:pPr>
+        <w:spacing w:after="100"/>
+        <w:rPr>
+          <w:rFonts w:asciiTheme="majorBidi" w:hAnsiTheme="majorBidi" w:cstheme="majorBidi"/>
+          <w:sz w:val="32"/>
+          <w:szCs w:val="32"/>
           <w:rtl/>
           <w:lang w:val="en-US"/>
         </w:rPr>
@@ -12781,35 +16332,20 @@
       <w:r>
         <w:rPr>
           <w:rFonts w:asciiTheme="majorBidi" w:hAnsiTheme="majorBidi" w:cstheme="majorBidi"/>
-          <w:b/>
-          <w:bCs/>
-          <w:sz w:val="32"/>
-          <w:szCs w:val="32"/>
-          <w:lang w:val="en-US"/>
-        </w:rPr>
-        <w:t xml:space="preserve">               </w:t>
-      </w:r>
-      <w:r>
-        <w:rPr>
-          <w:rFonts w:asciiTheme="majorBidi" w:hAnsiTheme="majorBidi" w:cstheme="majorBidi"/>
-          <w:b/>
-          <w:bCs/>
-          <w:sz w:val="32"/>
-          <w:szCs w:val="32"/>
-          <w:lang w:val="en-US"/>
-        </w:rPr>
-        <w:t xml:space="preserve"> </w:t>
-      </w:r>
-      <w:r>
-        <w:rPr>
-          <w:rFonts w:asciiTheme="majorBidi" w:hAnsiTheme="majorBidi" w:cstheme="majorBidi"/>
-          <w:b/>
-          <w:bCs/>
-          <w:sz w:val="32"/>
-          <w:szCs w:val="32"/>
-          <w:lang w:val="en-US"/>
-        </w:rPr>
-        <w:t>Figure 2.2: Authentication Sequence Diagram</w:t>
+          <w:sz w:val="32"/>
+          <w:szCs w:val="32"/>
+          <w:lang w:val="en-US"/>
+        </w:rPr>
+        <w:t>-</w:t>
+      </w:r>
+      <w:r>
+        <w:rPr>
+          <w:rFonts w:asciiTheme="majorBidi" w:hAnsiTheme="majorBidi" w:cstheme="majorBidi"/>
+          <w:sz w:val="32"/>
+          <w:szCs w:val="32"/>
+          <w:lang w:val="en-US"/>
+        </w:rPr>
+        <w:t>The settings screen allows the administrator to configure the application. It may include options for managing user accounts, updating preferences, and controlling general system settings</w:t>
       </w:r>
       <w:bookmarkStart w:id="0" w:name="_GoBack"/>
       <w:bookmarkEnd w:id="0"/>
@@ -14184,7 +17720,7 @@
   <w:style w:type="paragraph" w:default="1" w:styleId="Normal">
     <w:name w:val="Normal"/>
     <w:qFormat/>
-    <w:rsid w:val="001474C7"/>
+    <w:rsid w:val="00BA4365"/>
   </w:style>
   <w:style w:type="paragraph" w:styleId="Titre1">
     <w:name w:val="heading 1"/>

</xml_diff>